<commit_message>
New race ratio plots
</commit_message>
<xml_diff>
--- a/10_draft/output/write.docx
+++ b/10_draft/output/write.docx
@@ -23,7 +23,7 @@
         <w:pStyle w:val="Date"/>
       </w:pPr>
       <w:r>
-        <w:t xml:space="preserve">March 05, 2026</w:t>
+        <w:t xml:space="preserve">March 11, 2026</w:t>
       </w:r>
     </w:p>
     <w:bookmarkStart w:id="9" w:name="abstract"/>
@@ -348,7 +348,7 @@
       </w:r>
     </w:p>
     <w:bookmarkEnd w:id="12"/>
-    <w:bookmarkStart w:id="22" w:name="results"/>
+    <w:bookmarkStart w:id="25" w:name="results"/>
     <w:p>
       <w:pPr>
         <w:pStyle w:val="Heading1"/>
@@ -431,7 +431,7 @@
           <w:i/>
           <w:iCs/>
         </w:rPr>
-        <w:t xml:space="preserve">Note: Gini coefficients are estimated from weighted data using PSID family and clan weights. Weighted mean income is $107,534 for households and $415,687 for clans. Weighted mean wealth is $490,457 for households and $1,884,939 for clans (wealth includes home equity). Income Gini for households rose by 16.0% (0.41 in 1969 to 0.48 in 2023); for clans by 20.6% (0.30 to 0.36). Wealth Gini for households rose by 4.5% (0.78 in 1984 to 0.81 in 2023); for clans by 4.4% (0.61 to 0.64). Solid lines = households; dotted lines = clans.</w:t>
+        <w:t xml:space="preserve">Note: Gini coefficients estimated from weighted PSID data. Weighted mean income: $107,534 (households), $415,687 (clans). Weighted mean wealth: $490,457 (households), $1,884,939 (clans; includes home equity). Income Gini changed by 16.0% for households (0.41 in 1969 to 0.48 in 2023) and by 20.6% for clans (0.30 to 0.36). Wealth Gini changed by 4.5% for households (0.78 in 1984 to 0.81 in 2023) and by 4.4% for clans (0.61 to 0.64). On average across all years, the income Gini is 0.123 higher for households than clans; the wealth Gini is 0.160 higher. Solid lines = households; dotted lines = clans.</w:t>
       </w:r>
     </w:p>
     <w:p>
@@ -634,332 +634,40 @@
           </wp:inline>
         </w:drawing>
       </w:r>
-      <w:r>
-        <w:t xml:space="preserve"> </w:t>
-      </w:r>
+    </w:p>
+    <w:p>
+      <w:pPr>
+        <w:pStyle w:val="BodyText"/>
+      </w:pPr>
       <w:r>
         <w:rPr>
           <w:i/>
           <w:iCs/>
         </w:rPr>
-        <w:t xml:space="preserve">Note: Lines show the ratio of weighted mean income (Panel A) or wealth (Panel B) for Black households and clans relative to Non-Black households and clans. Estimates are weighted, A value of 1 indicates parity between Black and non-Black households or clans.For income, the household ratio was 0.65 in the first year and 0.62 in the last year; the clan ratio was 0.63 and 0.58. For wealth, the household ratio was 0.18 in the first year and 0.18 in the last year; the clan ratio was 0.23 and 0.20. Wealth includes home equity.</w:t>
+        <w:t xml:space="preserve">Note: Lines show the ratio of weighted mean income (Panel A) or wealth (Panel B) for Black relative to Non-Black households and clans. Weighted mean income for Black HH is $36,205, $56,600 for Non-Black HH, $60,000 for Black clans, and $108,522 for Non-Black clans. The income ratio changed by -5.2% for households (0.65 in 1969 to 0.62 in 2023) and -7.8% for clans (0.63 to 0.58). Weighted mean wealth for Black HH is $89,761, $476,552 for Non-Black HH, $147,662 for Black clans, and $818,198 for Non-Black clans (includes home equity). The wealth ratio changed by 1.0% for households (0.18 in 1984 to 0.18 in 2023) and -13.7% for clans (0.23 to 0.20). On average across all years, the income ratio is -0.006 lower for households than clans, and the wealth ratio is 0.014 higher for households than clans. Solid lines = households; dotted lines = clans.</w:t>
       </w:r>
     </w:p>
     <w:p>
       <w:pPr>
         <w:pStyle w:val="BodyText"/>
       </w:pPr>
-      <w:r>
-        <w:rPr>
-          <w:b/>
-          <w:bCs/>
-        </w:rPr>
-        <w:t xml:space="preserve">Sensitivity of difference between household- and clan-level Gini coefficients.</w:t>
-      </w:r>
-      <w:r>
-        <w:t xml:space="preserve"> </w:t>
-      </w:r>
-      <w:r>
-        <w:t xml:space="preserve">Across all specifications, estimated inequality is lower when using clans rather than households as the unit of analysis. This finding is robust across race, different inclusion criteria for income and wealth measures, different samples, alternative measures of inequality, and when adjusting for household and clan size. Results from sensitivity analyses are available in Appendix C and D.</w:t>
-      </w:r>
-    </w:p>
-    <w:bookmarkEnd w:id="22"/>
-    <w:bookmarkStart w:id="23" w:name="discussion"/>
-    <w:p>
-      <w:pPr>
-        <w:pStyle w:val="Heading1"/>
-      </w:pPr>
-      <w:r>
-        <w:t xml:space="preserve">Discussion</w:t>
-      </w:r>
-    </w:p>
-    <w:p>
-      <w:pPr>
-        <w:pStyle w:val="FirstParagraph"/>
-      </w:pPr>
-      <w:r>
-        <w:t xml:space="preserve">Our analyses explored what income and wealth inequality in the U.S. look like when examined not only at the household level but also at the level of intergenerational extended families. We found that both income and wealth inequality were more extreme, as per Gini coefficients, when examining society as a collection of households (the standard in the literature) rather than a collection of clans. Income inequality was about 6 points higher for households than for clans, and wealth inequality was about 12 points higher, indicating fewer disparities on average between extended family networks than between households. In other words, an individual’s extended family was more economically similar on average to other extended families than their household was to other households. Thus, claims that current estimates, which focus on households, underestimate inequality</w:t>
-      </w:r>
-      <w:r>
-        <w:t xml:space="preserve"> </w:t>
-      </w:r>
-      <w:r>
-        <w:t xml:space="preserve">[10]</w:t>
-      </w:r>
-      <w:r>
-        <w:t xml:space="preserve"> </w:t>
-      </w:r>
-      <w:r>
-        <w:t xml:space="preserve">may be exaggerated. Inequality between larger family units is lower than inequality between households.</w:t>
-      </w:r>
-    </w:p>
-    <w:p>
-      <w:pPr>
-        <w:pStyle w:val="BodyText"/>
-      </w:pPr>
-      <w:r>
-        <w:t xml:space="preserve">Our analyses provided an important complement to existing scholarship on income and wealth inequality that typically measures inequality at the household level (or in some cases the individual level). Our aim is not to downplay the importance of households as units of analysis, but rather to show that considering multiple units of analysis—including households and clans—is helpful for fully understanding inequality as a complex societal phenomenon. The choice of analytical unit matters in part because different historical periods generate changes in inequality at some levels more than others. For example, our analyses showed that clan-level income inequality has increased more rapidly than household-level income inequality over the study period. By contrast, trends in household and clan inequality were similar for wealth over time. This may reflect the cumulative nature of wealth, which is more durably concentrated within kinship networks</w:t>
-      </w:r>
-      <w:r>
-        <w:t xml:space="preserve"> </w:t>
-      </w:r>
-      <w:r>
-        <w:t xml:space="preserve">[11, 13, 20]</w:t>
-      </w:r>
-      <w:r>
-        <w:t xml:space="preserve">, or limitations of the PSID’s coverage of the top of the wealth distribution, where much wealth inequality is generated. Together, these patterns reinforce the importance of examining inequality at multiple levels of social organization.</w:t>
-      </w:r>
-    </w:p>
-    <w:p>
-      <w:pPr>
-        <w:pStyle w:val="BodyText"/>
-      </w:pPr>
-      <w:r>
-        <w:t xml:space="preserve">Differences in historical patterns between households and clans may reflect changes in mobility over time. Mechanically, lower mobility produces greater homogeneity within clans over time, whereas higher mobility has the opposite effect. Conversely, inequality across extended families may build atop inequality across households in reducing mobility. If resources and constraints are transmitted within clans then rising inequality may further reduce mobility for those in disadvantaged households. In other words, the prevalent concern that high inequality undermines intergenerational mobility</w:t>
-      </w:r>
-      <w:r>
-        <w:t xml:space="preserve"> </w:t>
-      </w:r>
-      <w:r>
-        <w:t xml:space="preserve">[21–23]</w:t>
-      </w:r>
-      <w:r>
-        <w:t xml:space="preserve"> </w:t>
-      </w:r>
-      <w:r>
-        <w:t xml:space="preserve">may operate on both the household and clan levels, fueling future differences in inequality between households and clans. Although our analyses focused on the macro level, they highlighted a clear need for additional research on how extended families structure social life at the micro level. One key question raised by our findings concerns the prevalence and scale of resource transfers within extended families, an issue beyond the scope of this study. Methodologically, our project suggests the need for data and research designs that capture resource flows across kinship networks rather than limiting analysis to households. Taken together, our findings demonstrate that understanding economic inequality requires moving beyond a sole focus on households to also account for the extended family structures through which resources, advantage, and disadvantage are transmitted across generations.</w:t>
-      </w:r>
-    </w:p>
-    <w:bookmarkEnd w:id="23"/>
-    <w:bookmarkStart w:id="24" w:name="materials-and-methods"/>
-    <w:p>
-      <w:pPr>
-        <w:pStyle w:val="Heading1"/>
-      </w:pPr>
-      <w:r>
-        <w:t xml:space="preserve">Materials and Methods</w:t>
-      </w:r>
-    </w:p>
-    <w:p>
-      <w:pPr>
-        <w:pStyle w:val="FirstParagraph"/>
-      </w:pPr>
-      <w:r>
-        <w:rPr>
-          <w:b/>
-          <w:bCs/>
-        </w:rPr>
-        <w:t xml:space="preserve">Data and sample.</w:t>
-      </w:r>
-      <w:r>
-        <w:t xml:space="preserve"> </w:t>
-      </w:r>
-      <w:r>
-        <w:t xml:space="preserve">We use the genealogical design of the Panel Study of Income Dynamics (PSID) to compare estimates of inequality when using households and clans as the unit of analysis. The PSID began in 1968, surveying families annually until 1997 and biennially thereafter. It follows descendants of the original sample across generations and maintains national representativeness. Data from the PSID produce estimates that mostly align with other national surveys</w:t>
-      </w:r>
-      <w:r>
-        <w:t xml:space="preserve"> </w:t>
-      </w:r>
-      <w:r>
-        <w:t xml:space="preserve">[18]</w:t>
-      </w:r>
-      <w:r>
-        <w:t xml:space="preserve">.</w:t>
-      </w:r>
-    </w:p>
-    <w:p>
-      <w:pPr>
-        <w:pStyle w:val="BodyText"/>
-      </w:pPr>
-      <w:r>
-        <w:t xml:space="preserve">The PSID facilitates two linked units of analysis: households and clans. Households consist of economically interdependent individuals living in the same dwelling, with one member reporting data on income and wealth for all members. Household composition changes over time with transitions such as divorce or childbirth; individuals who leave receive a new household identifier. As a result, unique households cannot be identified over time in the PSID. In contrast, clans include all descendants of households sampled in 1968, linked through a PSID-generated identifier, which we refer to as a clan identifier. Households added after 1968 receive their own clan identifier upon entry. Unlike household identifiers, clan membership remains fixed for individuals and can be compared over time. A small number of households (134 household-years) contain couples belonging to different clans; these cases were assigned to both clans.</w:t>
-      </w:r>
-    </w:p>
-    <w:p>
-      <w:pPr>
-        <w:pStyle w:val="BodyText"/>
-      </w:pPr>
-      <w:r>
-        <w:t xml:space="preserve">The PSID has collected income data since its inception but began collecting wealth data only in 1984. As a result, analytic samples differ: income analyses include 242,200 household-years and 64,292 clan-years, representing 2,906 unique clans; wealth analyses include 122,069 household-years and 26,655 clan-years, representing 2,636 unique clans.</w:t>
-      </w:r>
-    </w:p>
-    <w:p>
-      <w:pPr>
-        <w:pStyle w:val="BodyText"/>
-      </w:pPr>
-      <w:r>
-        <w:rPr>
-          <w:b/>
-          <w:bCs/>
-        </w:rPr>
-        <w:t xml:space="preserve">Measures of income and wealth.</w:t>
-      </w:r>
-      <w:r>
-        <w:t xml:space="preserve"> </w:t>
-      </w:r>
-      <w:r>
-        <w:t xml:space="preserve">We measure both income and wealth to capture distinct dimensions of economic inequality. This choice follows from research identifying divergent patterns depending on choice of financial indicator because mechanisms driving wealth inequality are distinct from those driving income inequality</w:t>
-      </w:r>
-      <w:r>
-        <w:t xml:space="preserve"> </w:t>
-      </w:r>
-      <w:r>
-        <w:t xml:space="preserve">[5, 17, 20]</w:t>
-      </w:r>
-      <w:r>
-        <w:t xml:space="preserve">. Aggregate measures for income and wealth are provided by the PSID. Income includes earnings, asset income, transfers, and income from farming and gardening. Wealth includes non-primary real estate, business equity, stocks, bonds, vehicles, retirement accounts, and bank accounts, and includes home equity.</w:t>
-      </w:r>
-    </w:p>
-    <w:p>
-      <w:pPr>
-        <w:pStyle w:val="BodyText"/>
-      </w:pPr>
-      <w:r>
-        <w:t xml:space="preserve">Missing data for components of income and wealth are imputed by the PSID. Concerns about measurement error, especially for wealth, are minimal, as imputation methods utilized by the PSID explain little of the variation in wealth over time</w:t>
-      </w:r>
-      <w:r>
-        <w:t xml:space="preserve"> </w:t>
-      </w:r>
-      <w:r>
-        <w:t xml:space="preserve">[20, 24]</w:t>
-      </w:r>
-      <w:r>
-        <w:t xml:space="preserve">. All income and wealth values are adjusted for inflation. Additionally, analyses set negative values of income and wealth to zero so that Gini coefficients remain in the 0 to 1 range (see Appendix D1 and F1). To construct clan-level measures, we aggregate household income and wealth for all households in a clan within each clan-year.</w:t>
-      </w:r>
-    </w:p>
-    <w:p>
-      <w:pPr>
-        <w:pStyle w:val="BodyText"/>
-      </w:pPr>
-      <w:r>
-        <w:t xml:space="preserve">All results presented are weighted. Using weights does not meaningfully change results (see Appendix D4 and F4). Household-level weights are provided by the PSID. The PSID constructs family weights from individual weights using the fair shares method, which assumes that the probability of observing any individual within a family equals the probability of observing the family itself. We extend this approach to construct clan-level weights using the same fair shares principle. Clan weights assume that the probability of observing a family within a clan equals the probability of observing the clan itself. These weights are applied to total clan income or wealth (rather than mean income or wealth) to avoid double standardization by household counts. In effect, clan weights already incorporate the number of households within a clan. As a result, each clan’s influence reflects the representation of the average household within that clan, rather than scaling mechanically with the clan’s total number of households.</w:t>
-      </w:r>
-    </w:p>
-    <w:p>
-      <w:pPr>
-        <w:pStyle w:val="BodyText"/>
-      </w:pPr>
-      <w:r>
-        <w:rPr>
-          <w:b/>
-          <w:bCs/>
-        </w:rPr>
-        <w:t xml:space="preserve">Measures of race.</w:t>
-      </w:r>
-      <w:r>
-        <w:t xml:space="preserve"> </w:t>
-      </w:r>
-      <w:r>
-        <w:t xml:space="preserve">The PSID collects race data from household heads and, in some years, from spouses. If a respondent ever identifies as Black, then that value is imputed for all years that respondent appears in the data</w:t>
-      </w:r>
-      <w:r>
-        <w:t xml:space="preserve"> </w:t>
-      </w:r>
-      <w:r>
-        <w:t xml:space="preserve">[25]</w:t>
-      </w:r>
-      <w:r>
-        <w:t xml:space="preserve">. Black households are all households with a Black head of household. Black clans are clans in which more than half of the households within it identify as Black. Analyses by race and ethnicity are limited to Black and non-Black categories because there are relatively few clans in the PSID data (2,906 for income and 2,636 for wealth). Additionally, the genealogical design of the PSID reflects the demographics of the United States at the time the survey began in 1968, which constrains analyses of clans for demographic groups that were not prominent at that time. Although the PSID incorporated additional samples over time to reflect the changing demographics of the United States in the PSID sample, ethnicity analyses remain limited because Hispanic/Latino households do not form consistent multigenerational lineages over the full panel and therefore have limited clans.</w:t>
-      </w:r>
-    </w:p>
-    <w:p>
-      <w:pPr>
-        <w:pStyle w:val="BodyText"/>
-      </w:pPr>
-      <w:r>
-        <w:rPr>
-          <w:b/>
-          <w:bCs/>
-        </w:rPr>
-        <w:t xml:space="preserve">Indexing inequality with the Gini coefficient.</w:t>
-      </w:r>
-      <w:r>
-        <w:t xml:space="preserve"> </w:t>
-      </w:r>
-      <w:r>
-        <w:t xml:space="preserve">Inequality is measured using the standard Gini coefficient, which ranges from 0 (perfect equality) to 1 (perfect inequality). Although widely used, the Gini has well-known limitations: it cannot distinguish between different inequality patterns and is most sensitive to variation in the middle of the income or wealth distribution</w:t>
-      </w:r>
-      <w:r>
-        <w:t xml:space="preserve"> </w:t>
-      </w:r>
-      <w:r>
-        <w:t xml:space="preserve">[26–28]</w:t>
-      </w:r>
-      <w:r>
-        <w:t xml:space="preserve">. These features make it well suited to the PSID, which underrepresents wealthy households compared with surveys such as the Survey of Consumer Finance.</w:t>
-      </w:r>
-    </w:p>
-    <w:p>
-      <w:pPr>
-        <w:pStyle w:val="BodyText"/>
-      </w:pPr>
-      <w:r>
-        <w:t xml:space="preserve">Gini coefficients are calculated separately for income and wealth to reflect their distinct dimensions of inequality. Estimates of Gini coefficients in our data are comparable to estimates that other studies have found, though there is more variation in wealth coefficients, likely because the PSID excludes wealthy households (see Appendix B).</w:t>
-      </w:r>
-    </w:p>
-    <w:bookmarkEnd w:id="24"/>
-    <w:bookmarkStart w:id="36" w:name="appendix"/>
-    <w:p>
-      <w:pPr>
-        <w:pStyle w:val="Heading1"/>
-      </w:pPr>
-      <w:r>
-        <w:t xml:space="preserve">Appendix</w:t>
-      </w:r>
-    </w:p>
-    <w:bookmarkStart w:id="34" w:name="appendix-a-simulating-gini-coefficients"/>
-    <w:p>
-      <w:pPr>
-        <w:pStyle w:val="Heading2"/>
-      </w:pPr>
-      <w:r>
-        <w:t xml:space="preserve">Appendix A: Simulating Gini Coefficients</w:t>
-      </w:r>
-    </w:p>
-    <w:p>
-      <w:pPr>
-        <w:pStyle w:val="FirstParagraph"/>
-      </w:pPr>
-      <w:r>
-        <w:t xml:space="preserve">Appendix A illustrates extreme cases from simulated household and clan data. The simulation demonstrates that clan-level Gini coefficients are not necessarily lower than household-level Gini coefficients. The direction of the difference depends on the relationship between clan size, the overall distribution of resources, and the selection of households into clans. Appendix A1 shows the minimum possible difference between clan and household Gini coefficients in the simulated data, while Appendix A2 shows the maximum possible difference. Curves show that Gini coefficients at the clan level can exceed those of households. Appendix A3 illustrates that, while it is more likely for Gini coefficients at the household level to exceed Gini coefficients at the clan level, whether this effect is observed depends on the combination between clan size and income or wealth distribution.</w:t>
-      </w:r>
-    </w:p>
-    <w:p>
-      <w:r>
-        <w:br w:type="page"/>
-      </w:r>
-    </w:p>
-    <w:p>
-      <w:pPr>
-        <w:pStyle w:val="BodyText"/>
-      </w:pPr>
-      <w:r>
-        <w:rPr>
-          <w:b/>
-          <w:bCs/>
-        </w:rPr>
-        <w:t xml:space="preserve">Appendix A1: Case with lowest simulated clan-household Gini difference</w:t>
-      </w:r>
-      <w:r>
-        <w:t xml:space="preserve"> </w:t>
-      </w:r>
       <w:r>
         <w:drawing>
           <wp:inline>
-            <wp:extent cx="5334000" cy="4000500"/>
+            <wp:extent cx="5334000" cy="4191000"/>
             <wp:effectExtent b="0" l="0" r="0" t="0"/>
-            <wp:docPr descr="" title="" id="26" name="Picture"/>
+            <wp:docPr descr="" title="" id="23" name="Picture"/>
             <a:graphic>
               <a:graphicData uri="http://schemas.openxmlformats.org/drawingml/2006/picture">
                 <pic:pic>
                   <pic:nvPicPr>
-                    <pic:cNvPr descr="/Users/amanda/Desktop/clan_project/10_draft/output/write_files/figure-docx/appendix-a1-1.png" id="27" name="Picture"/>
+                    <pic:cNvPr descr="../9_figures/output/figure4.pdf" id="24" name="Picture"/>
                     <pic:cNvPicPr>
                       <a:picLocks noChangeArrowheads="1" noChangeAspect="1"/>
                     </pic:cNvPicPr>
                   </pic:nvPicPr>
                   <pic:blipFill>
-                    <a:blip r:embed="rId25"/>
+                    <a:blip r:embed="rId22"/>
                     <a:stretch>
                       <a:fillRect/>
                     </a:stretch>
@@ -967,7 +675,7 @@
                   <pic:spPr bwMode="auto">
                     <a:xfrm>
                       <a:off x="0" y="0"/>
-                      <a:ext cx="5334000" cy="4000500"/>
+                      <a:ext cx="5334000" cy="4191000"/>
                     </a:xfrm>
                     <a:prstGeom prst="rect">
                       <a:avLst/>
@@ -992,10 +700,1861 @@
       </w:pPr>
       <w:r>
         <w:rPr>
+          <w:i/>
+          <w:iCs/>
+        </w:rPr>
+        <w:t xml:space="preserve">Note: Lines show the ratio of weighted median income (Panel A) or wealth (Panel B) for Black relative to Non-Black households and clans. The weighted median income for Black HHs is $17,621, $29,233 for Non-Black HHs, $36,562 for Black clans, and $62,916 for Non-Black clans. The income ratio changed by 5.8% for households (0.59 in 1969 to 0.62 in 2023) and 0.2% for clans (0.57 to 0.57). Weighted median wealth for Black HHs is $6,908, $79,216 for Non-Black HHs, $58,326 for Black clans, and $306,988 for Non-Black clans (includes home equity). The wealth ratio changed by -4.6% for households (0.07 in 1984 to 0.07 in 2023) and 7.5% for clans (0.20 to 0.22). On average across all years, the income ratio is -0.044 lower for households than clans, and the wealth ratio is -0.112 lower for households than clans. Solid lines = households; dotted lines = clans.</w:t>
+      </w:r>
+    </w:p>
+    <w:p xmlns:w="http://schemas.openxmlformats.org/wordprocessingml/2006/main" xmlns:wp="http://schemas.openxmlformats.org/drawingml/2006/wordprocessingDrawing" xmlns:r="http://schemas.openxmlformats.org/officeDocument/2006/relationships" xmlns:w14="http://schemas.microsoft.com/office/word/2010/wordml">
+      <w:pPr>
+        <w:pStyle w:val="TableCaption"/>
+        <w:jc w:val="center"/>
+        <w:keepNext/>
+        <w:pBdr>
+          <w:bottom w:val="none" w:sz="0" w:space="0" w:color="000000"/>
+          <w:top w:val="none" w:sz="0" w:space="0" w:color="000000"/>
+          <w:left w:val="none" w:sz="0" w:space="0" w:color="000000"/>
+          <w:right w:val="none" w:sz="0" w:space="0" w:color="000000"/>
+        </w:pBdr>
+        <w:spacing w:after="60" w:before="60" w:line="240"/>
+        <w:ind w:left="60" w:right="60" w:firstLine="0" w:firstLineChars="0"/>
+      </w:pPr>
+      <w:r>
+        <w:t xml:space="preserve">Table 1. Median Income and Wealth by Race: Households vs. Clans</w:t>
+      </w:r>
+    </w:p>
+    <w:tbl xmlns:w="http://schemas.openxmlformats.org/wordprocessingml/2006/main" xmlns:r="http://schemas.openxmlformats.org/officeDocument/2006/relationships" xmlns:w14="http://schemas.microsoft.com/office/word/2010/wordml" xmlns:wp="http://schemas.openxmlformats.org/drawingml/2006/wordprocessingDrawing" xmlns:a="http://schemas.openxmlformats.org/drawingml/2006/main" xmlns:pic="http://schemas.openxmlformats.org/drawingml/2006/picture">
+      <w:tblPr>
+        <w:tblLayout w:type="fixed"/>
+        <w:jc w:val="center"/>
+        <w:tblLook w:firstRow="1" w:lastRow="0" w:firstColumn="0" w:lastColumn="0" w:noHBand="0" w:noVBand="1"/>
+      </w:tblPr>
+      <w:tblGrid>
+        <w:gridCol w:w="1080"/>
+        <w:gridCol w:w="1080"/>
+        <w:gridCol w:w="1080"/>
+        <w:gridCol w:w="1080"/>
+        <w:gridCol w:w="1080"/>
+        <w:gridCol w:w="1080"/>
+        <w:gridCol w:w="1080"/>
+      </w:tblGrid>
+      <w:tr>
+        <w:trPr>
+          <w:trHeight w:val="360" w:hRule="auto"/>
+          <w:tblHeader/>
+        </w:trPr>
+        header1
+        <w:tc>
+          <w:tcPr>
+            <w:tcBorders>
+              <w:bottom w:val="single" w:sz="12" w:space="0" w:color="666666"/>
+              <w:top w:val="single" w:sz="12" w:space="0" w:color="666666"/>
+              <w:left w:val="none" w:sz="0" w:space="0" w:color="000000"/>
+              <w:right w:val="none" w:sz="0" w:space="0" w:color="000000"/>
+            </w:tcBorders>
+            <w:shd w:val="clear" w:color="auto" w:fill="F2F2F2"/>
+            <w:tcMar>
+              <w:top w:w="0" w:type="dxa"/>
+              <w:bottom w:w="0" w:type="dxa"/>
+              <w:left w:w="0" w:type="dxa"/>
+              <w:right w:w="0" w:type="dxa"/>
+            </w:tcMar>
+            <w:vAlign w:val="center"/>
+          </w:tcPr>
+          <w:p>
+            <w:pPr>
+              <w:jc w:val="center"/>
+              <w:pBdr>
+                <w:bottom w:val="none" w:sz="0" w:space="0" w:color="000000"/>
+                <w:top w:val="none" w:sz="0" w:space="0" w:color="000000"/>
+                <w:left w:val="none" w:sz="0" w:space="0" w:color="000000"/>
+                <w:right w:val="none" w:sz="0" w:space="0" w:color="000000"/>
+              </w:pBdr>
+              <w:spacing w:after="100" w:before="100" w:line="240"/>
+              <w:ind w:left="100" w:right="100" w:firstLine="0" w:firstLineChars="0"/>
+              <w:rPr>
+                <w:rFonts w:ascii="serif" w:hAnsi="serif" w:eastAsia="serif" w:cs="serif"/>
+                <w:i w:val="false"/>
+                <w:b w:val="true"/>
+                <w:u w:val="none"/>
+                <w:sz w:val="20"/>
+                <w:szCs w:val="20"/>
+                <w:color w:val="000000"/>
+              </w:rPr>
+            </w:pPr>
+            <w:r xmlns:w="http://schemas.openxmlformats.org/wordprocessingml/2006/main" xmlns:wp="http://schemas.openxmlformats.org/drawingml/2006/wordprocessingDrawing" xmlns:r="http://schemas.openxmlformats.org/officeDocument/2006/relationships" xmlns:w14="http://schemas.microsoft.com/office/word/2010/wordml">
+              <w:rPr>
+                <w:rFonts w:ascii="serif" w:hAnsi="serif" w:eastAsia="serif" w:cs="serif"/>
+                <w:i w:val="false"/>
+                <w:b w:val="true"/>
+                <w:u w:val="none"/>
+                <w:sz w:val="20"/>
+                <w:szCs w:val="20"/>
+                <w:color w:val="000000"/>
+              </w:rPr>
+              <w:t xml:space="preserve">Group</w:t>
+            </w:r>
+          </w:p>
+        </w:tc>
+        <w:tc>
+          <w:tcPr>
+            <w:tcBorders>
+              <w:bottom w:val="single" w:sz="12" w:space="0" w:color="666666"/>
+              <w:top w:val="single" w:sz="12" w:space="0" w:color="666666"/>
+              <w:left w:val="none" w:sz="0" w:space="0" w:color="000000"/>
+              <w:right w:val="none" w:sz="0" w:space="0" w:color="000000"/>
+            </w:tcBorders>
+            <w:shd w:val="clear" w:color="auto" w:fill="F2F2F2"/>
+            <w:tcMar>
+              <w:top w:w="0" w:type="dxa"/>
+              <w:bottom w:w="0" w:type="dxa"/>
+              <w:left w:w="0" w:type="dxa"/>
+              <w:right w:w="0" w:type="dxa"/>
+            </w:tcMar>
+            <w:vAlign w:val="center"/>
+          </w:tcPr>
+          <w:p>
+            <w:pPr>
+              <w:jc w:val="center"/>
+              <w:pBdr>
+                <w:bottom w:val="none" w:sz="0" w:space="0" w:color="000000"/>
+                <w:top w:val="none" w:sz="0" w:space="0" w:color="000000"/>
+                <w:left w:val="none" w:sz="0" w:space="0" w:color="000000"/>
+                <w:right w:val="none" w:sz="0" w:space="0" w:color="000000"/>
+              </w:pBdr>
+              <w:spacing w:after="100" w:before="100" w:line="240"/>
+              <w:ind w:left="100" w:right="100" w:firstLine="0" w:firstLineChars="0"/>
+              <w:rPr>
+                <w:rFonts w:ascii="serif" w:hAnsi="serif" w:eastAsia="serif" w:cs="serif"/>
+                <w:i w:val="false"/>
+                <w:b w:val="true"/>
+                <w:u w:val="none"/>
+                <w:sz w:val="20"/>
+                <w:szCs w:val="20"/>
+                <w:color w:val="000000"/>
+              </w:rPr>
+            </w:pPr>
+            <w:r xmlns:w="http://schemas.openxmlformats.org/wordprocessingml/2006/main" xmlns:wp="http://schemas.openxmlformats.org/drawingml/2006/wordprocessingDrawing" xmlns:r="http://schemas.openxmlformats.org/officeDocument/2006/relationships" xmlns:w14="http://schemas.microsoft.com/office/word/2010/wordml">
+              <w:rPr>
+                <w:rFonts w:ascii="serif" w:hAnsi="serif" w:eastAsia="serif" w:cs="serif"/>
+                <w:i w:val="false"/>
+                <w:b w:val="true"/>
+                <w:u w:val="none"/>
+                <w:sz w:val="20"/>
+                <w:szCs w:val="20"/>
+                <w:color w:val="000000"/>
+              </w:rPr>
+              <w:t xml:space="preserve">Median Income HH</w:t>
+            </w:r>
+          </w:p>
+        </w:tc>
+        <w:tc>
+          <w:tcPr>
+            <w:tcBorders>
+              <w:bottom w:val="single" w:sz="12" w:space="0" w:color="666666"/>
+              <w:top w:val="single" w:sz="12" w:space="0" w:color="666666"/>
+              <w:left w:val="none" w:sz="0" w:space="0" w:color="000000"/>
+              <w:right w:val="none" w:sz="0" w:space="0" w:color="000000"/>
+            </w:tcBorders>
+            <w:shd w:val="clear" w:color="auto" w:fill="F2F2F2"/>
+            <w:tcMar>
+              <w:top w:w="0" w:type="dxa"/>
+              <w:bottom w:w="0" w:type="dxa"/>
+              <w:left w:w="0" w:type="dxa"/>
+              <w:right w:w="0" w:type="dxa"/>
+            </w:tcMar>
+            <w:vAlign w:val="center"/>
+          </w:tcPr>
+          <w:p>
+            <w:pPr>
+              <w:jc w:val="center"/>
+              <w:pBdr>
+                <w:bottom w:val="none" w:sz="0" w:space="0" w:color="000000"/>
+                <w:top w:val="none" w:sz="0" w:space="0" w:color="000000"/>
+                <w:left w:val="none" w:sz="0" w:space="0" w:color="000000"/>
+                <w:right w:val="none" w:sz="0" w:space="0" w:color="000000"/>
+              </w:pBdr>
+              <w:spacing w:after="100" w:before="100" w:line="240"/>
+              <w:ind w:left="100" w:right="100" w:firstLine="0" w:firstLineChars="0"/>
+              <w:rPr>
+                <w:rFonts w:ascii="serif" w:hAnsi="serif" w:eastAsia="serif" w:cs="serif"/>
+                <w:i w:val="false"/>
+                <w:b w:val="true"/>
+                <w:u w:val="none"/>
+                <w:sz w:val="20"/>
+                <w:szCs w:val="20"/>
+                <w:color w:val="000000"/>
+              </w:rPr>
+            </w:pPr>
+            <w:r xmlns:w="http://schemas.openxmlformats.org/wordprocessingml/2006/main" xmlns:wp="http://schemas.openxmlformats.org/drawingml/2006/wordprocessingDrawing" xmlns:r="http://schemas.openxmlformats.org/officeDocument/2006/relationships" xmlns:w14="http://schemas.microsoft.com/office/word/2010/wordml">
+              <w:rPr>
+                <w:rFonts w:ascii="serif" w:hAnsi="serif" w:eastAsia="serif" w:cs="serif"/>
+                <w:i w:val="false"/>
+                <w:b w:val="true"/>
+                <w:u w:val="none"/>
+                <w:sz w:val="20"/>
+                <w:szCs w:val="20"/>
+                <w:color w:val="000000"/>
+              </w:rPr>
+              <w:t xml:space="preserve">Median Income Clan</w:t>
+            </w:r>
+          </w:p>
+        </w:tc>
+        <w:tc>
+          <w:tcPr>
+            <w:tcBorders>
+              <w:bottom w:val="single" w:sz="12" w:space="0" w:color="666666"/>
+              <w:top w:val="single" w:sz="12" w:space="0" w:color="666666"/>
+              <w:left w:val="none" w:sz="0" w:space="0" w:color="000000"/>
+              <w:right w:val="none" w:sz="0" w:space="0" w:color="000000"/>
+            </w:tcBorders>
+            <w:shd w:val="clear" w:color="auto" w:fill="F2F2F2"/>
+            <w:tcMar>
+              <w:top w:w="0" w:type="dxa"/>
+              <w:bottom w:w="0" w:type="dxa"/>
+              <w:left w:w="0" w:type="dxa"/>
+              <w:right w:w="0" w:type="dxa"/>
+            </w:tcMar>
+            <w:vAlign w:val="center"/>
+          </w:tcPr>
+          <w:p>
+            <w:pPr>
+              <w:jc w:val="center"/>
+              <w:pBdr>
+                <w:bottom w:val="none" w:sz="0" w:space="0" w:color="000000"/>
+                <w:top w:val="none" w:sz="0" w:space="0" w:color="000000"/>
+                <w:left w:val="none" w:sz="0" w:space="0" w:color="000000"/>
+                <w:right w:val="none" w:sz="0" w:space="0" w:color="000000"/>
+              </w:pBdr>
+              <w:spacing w:after="100" w:before="100" w:line="240"/>
+              <w:ind w:left="100" w:right="100" w:firstLine="0" w:firstLineChars="0"/>
+              <w:rPr>
+                <w:rFonts w:ascii="serif" w:hAnsi="serif" w:eastAsia="serif" w:cs="serif"/>
+                <w:i w:val="false"/>
+                <w:b w:val="true"/>
+                <w:u w:val="none"/>
+                <w:sz w:val="20"/>
+                <w:szCs w:val="20"/>
+                <w:color w:val="000000"/>
+              </w:rPr>
+            </w:pPr>
+            <w:r xmlns:w="http://schemas.openxmlformats.org/wordprocessingml/2006/main" xmlns:wp="http://schemas.openxmlformats.org/drawingml/2006/wordprocessingDrawing" xmlns:r="http://schemas.openxmlformats.org/officeDocument/2006/relationships" xmlns:w14="http://schemas.microsoft.com/office/word/2010/wordml">
+              <w:rPr>
+                <w:rFonts w:ascii="serif" w:hAnsi="serif" w:eastAsia="serif" w:cs="serif"/>
+                <w:i w:val="false"/>
+                <w:b w:val="true"/>
+                <w:u w:val="none"/>
+                <w:sz w:val="20"/>
+                <w:szCs w:val="20"/>
+                <w:color w:val="000000"/>
+              </w:rPr>
+              <w:t xml:space="preserve">Median Wealth HH</w:t>
+            </w:r>
+          </w:p>
+        </w:tc>
+        <w:tc>
+          <w:tcPr>
+            <w:tcBorders>
+              <w:bottom w:val="single" w:sz="12" w:space="0" w:color="666666"/>
+              <w:top w:val="single" w:sz="12" w:space="0" w:color="666666"/>
+              <w:left w:val="none" w:sz="0" w:space="0" w:color="000000"/>
+              <w:right w:val="none" w:sz="0" w:space="0" w:color="000000"/>
+            </w:tcBorders>
+            <w:shd w:val="clear" w:color="auto" w:fill="F2F2F2"/>
+            <w:tcMar>
+              <w:top w:w="0" w:type="dxa"/>
+              <w:bottom w:w="0" w:type="dxa"/>
+              <w:left w:w="0" w:type="dxa"/>
+              <w:right w:w="0" w:type="dxa"/>
+            </w:tcMar>
+            <w:vAlign w:val="center"/>
+          </w:tcPr>
+          <w:p>
+            <w:pPr>
+              <w:jc w:val="center"/>
+              <w:pBdr>
+                <w:bottom w:val="none" w:sz="0" w:space="0" w:color="000000"/>
+                <w:top w:val="none" w:sz="0" w:space="0" w:color="000000"/>
+                <w:left w:val="none" w:sz="0" w:space="0" w:color="000000"/>
+                <w:right w:val="none" w:sz="0" w:space="0" w:color="000000"/>
+              </w:pBdr>
+              <w:spacing w:after="100" w:before="100" w:line="240"/>
+              <w:ind w:left="100" w:right="100" w:firstLine="0" w:firstLineChars="0"/>
+              <w:rPr>
+                <w:rFonts w:ascii="serif" w:hAnsi="serif" w:eastAsia="serif" w:cs="serif"/>
+                <w:i w:val="false"/>
+                <w:b w:val="true"/>
+                <w:u w:val="none"/>
+                <w:sz w:val="20"/>
+                <w:szCs w:val="20"/>
+                <w:color w:val="000000"/>
+              </w:rPr>
+            </w:pPr>
+            <w:r xmlns:w="http://schemas.openxmlformats.org/wordprocessingml/2006/main" xmlns:wp="http://schemas.openxmlformats.org/drawingml/2006/wordprocessingDrawing" xmlns:r="http://schemas.openxmlformats.org/officeDocument/2006/relationships" xmlns:w14="http://schemas.microsoft.com/office/word/2010/wordml">
+              <w:rPr>
+                <w:rFonts w:ascii="serif" w:hAnsi="serif" w:eastAsia="serif" w:cs="serif"/>
+                <w:i w:val="false"/>
+                <w:b w:val="true"/>
+                <w:u w:val="none"/>
+                <w:sz w:val="20"/>
+                <w:szCs w:val="20"/>
+                <w:color w:val="000000"/>
+              </w:rPr>
+              <w:t xml:space="preserve">Median Wealth Clan</w:t>
+            </w:r>
+          </w:p>
+        </w:tc>
+        <w:tc>
+          <w:tcPr>
+            <w:tcBorders>
+              <w:bottom w:val="single" w:sz="12" w:space="0" w:color="666666"/>
+              <w:top w:val="single" w:sz="12" w:space="0" w:color="666666"/>
+              <w:left w:val="none" w:sz="0" w:space="0" w:color="000000"/>
+              <w:right w:val="none" w:sz="0" w:space="0" w:color="000000"/>
+            </w:tcBorders>
+            <w:shd w:val="clear" w:color="auto" w:fill="F2F2F2"/>
+            <w:tcMar>
+              <w:top w:w="0" w:type="dxa"/>
+              <w:bottom w:w="0" w:type="dxa"/>
+              <w:left w:w="0" w:type="dxa"/>
+              <w:right w:w="0" w:type="dxa"/>
+            </w:tcMar>
+            <w:vAlign w:val="center"/>
+          </w:tcPr>
+          <w:p>
+            <w:pPr>
+              <w:jc w:val="center"/>
+              <w:pBdr>
+                <w:bottom w:val="none" w:sz="0" w:space="0" w:color="000000"/>
+                <w:top w:val="none" w:sz="0" w:space="0" w:color="000000"/>
+                <w:left w:val="none" w:sz="0" w:space="0" w:color="000000"/>
+                <w:right w:val="none" w:sz="0" w:space="0" w:color="000000"/>
+              </w:pBdr>
+              <w:spacing w:after="100" w:before="100" w:line="240"/>
+              <w:ind w:left="100" w:right="100" w:firstLine="0" w:firstLineChars="0"/>
+              <w:rPr>
+                <w:rFonts w:ascii="serif" w:hAnsi="serif" w:eastAsia="serif" w:cs="serif"/>
+                <w:i w:val="false"/>
+                <w:b w:val="true"/>
+                <w:u w:val="none"/>
+                <w:sz w:val="20"/>
+                <w:szCs w:val="20"/>
+                <w:color w:val="000000"/>
+              </w:rPr>
+            </w:pPr>
+            <w:r xmlns:w="http://schemas.openxmlformats.org/wordprocessingml/2006/main" xmlns:wp="http://schemas.openxmlformats.org/drawingml/2006/wordprocessingDrawing" xmlns:r="http://schemas.openxmlformats.org/officeDocument/2006/relationships" xmlns:w14="http://schemas.microsoft.com/office/word/2010/wordml">
+              <w:rPr>
+                <w:rFonts w:ascii="serif" w:hAnsi="serif" w:eastAsia="serif" w:cs="serif"/>
+                <w:i w:val="false"/>
+                <w:b w:val="true"/>
+                <w:u w:val="none"/>
+                <w:sz w:val="20"/>
+                <w:szCs w:val="20"/>
+                <w:color w:val="000000"/>
+              </w:rPr>
+              <w:t xml:space="preserve">HH with 0 Wealth</w:t>
+            </w:r>
+          </w:p>
+        </w:tc>
+        <w:tc>
+          <w:tcPr>
+            <w:tcBorders>
+              <w:bottom w:val="single" w:sz="12" w:space="0" w:color="666666"/>
+              <w:top w:val="single" w:sz="12" w:space="0" w:color="666666"/>
+              <w:left w:val="none" w:sz="0" w:space="0" w:color="000000"/>
+              <w:right w:val="none" w:sz="0" w:space="0" w:color="000000"/>
+            </w:tcBorders>
+            <w:shd w:val="clear" w:color="auto" w:fill="F2F2F2"/>
+            <w:tcMar>
+              <w:top w:w="0" w:type="dxa"/>
+              <w:bottom w:w="0" w:type="dxa"/>
+              <w:left w:w="0" w:type="dxa"/>
+              <w:right w:w="0" w:type="dxa"/>
+            </w:tcMar>
+            <w:vAlign w:val="center"/>
+          </w:tcPr>
+          <w:p>
+            <w:pPr>
+              <w:jc w:val="center"/>
+              <w:pBdr>
+                <w:bottom w:val="none" w:sz="0" w:space="0" w:color="000000"/>
+                <w:top w:val="none" w:sz="0" w:space="0" w:color="000000"/>
+                <w:left w:val="none" w:sz="0" w:space="0" w:color="000000"/>
+                <w:right w:val="none" w:sz="0" w:space="0" w:color="000000"/>
+              </w:pBdr>
+              <w:spacing w:after="100" w:before="100" w:line="240"/>
+              <w:ind w:left="100" w:right="100" w:firstLine="0" w:firstLineChars="0"/>
+              <w:rPr>
+                <w:rFonts w:ascii="serif" w:hAnsi="serif" w:eastAsia="serif" w:cs="serif"/>
+                <w:i w:val="false"/>
+                <w:b w:val="true"/>
+                <w:u w:val="none"/>
+                <w:sz w:val="20"/>
+                <w:szCs w:val="20"/>
+                <w:color w:val="000000"/>
+              </w:rPr>
+            </w:pPr>
+            <w:r xmlns:w="http://schemas.openxmlformats.org/wordprocessingml/2006/main" xmlns:wp="http://schemas.openxmlformats.org/drawingml/2006/wordprocessingDrawing" xmlns:r="http://schemas.openxmlformats.org/officeDocument/2006/relationships" xmlns:w14="http://schemas.microsoft.com/office/word/2010/wordml">
+              <w:rPr>
+                <w:rFonts w:ascii="serif" w:hAnsi="serif" w:eastAsia="serif" w:cs="serif"/>
+                <w:i w:val="false"/>
+                <w:b w:val="true"/>
+                <w:u w:val="none"/>
+                <w:sz w:val="20"/>
+                <w:szCs w:val="20"/>
+                <w:color w:val="000000"/>
+              </w:rPr>
+              <w:t xml:space="preserve">Clans with 0 Wealth</w:t>
+            </w:r>
+          </w:p>
+        </w:tc>
+      </w:tr>
+      <w:tr>
+        <w:trPr>
+          <w:trHeight w:val="360" w:hRule="auto"/>
+        </w:trPr>
+        body1
+        <w:tc>
+          <w:tcPr>
+            <w:tcBorders>
+              <w:bottom w:val="none" w:sz="0" w:space="0" w:color="000000"/>
+              <w:top w:val="single" w:sz="12" w:space="0" w:color="666666"/>
+              <w:left w:val="none" w:sz="0" w:space="0" w:color="000000"/>
+              <w:right w:val="none" w:sz="0" w:space="0" w:color="000000"/>
+            </w:tcBorders>
+            <w:shd w:val="clear" w:color="auto" w:fill="FFFFFF"/>
+            <w:tcMar>
+              <w:top w:w="0" w:type="dxa"/>
+              <w:bottom w:w="0" w:type="dxa"/>
+              <w:left w:w="0" w:type="dxa"/>
+              <w:right w:w="0" w:type="dxa"/>
+            </w:tcMar>
+            <w:vAlign w:val="center"/>
+          </w:tcPr>
+          <w:p>
+            <w:pPr>
+              <w:jc w:val="left"/>
+              <w:pBdr>
+                <w:bottom w:val="none" w:sz="0" w:space="0" w:color="000000"/>
+                <w:top w:val="none" w:sz="0" w:space="0" w:color="000000"/>
+                <w:left w:val="none" w:sz="0" w:space="0" w:color="000000"/>
+                <w:right w:val="none" w:sz="0" w:space="0" w:color="000000"/>
+              </w:pBdr>
+              <w:spacing w:after="100" w:before="100" w:line="240"/>
+              <w:ind w:left="100" w:right="100" w:firstLine="0" w:firstLineChars="0"/>
+              <w:rPr>
+                <w:rFonts w:ascii="serif" w:hAnsi="serif" w:eastAsia="serif" w:cs="serif"/>
+                <w:i w:val="false"/>
+                <w:b w:val="true"/>
+                <w:u w:val="none"/>
+                <w:sz w:val="20"/>
+                <w:szCs w:val="20"/>
+                <w:color w:val="000000"/>
+              </w:rPr>
+            </w:pPr>
+            <w:r xmlns:w="http://schemas.openxmlformats.org/wordprocessingml/2006/main" xmlns:wp="http://schemas.openxmlformats.org/drawingml/2006/wordprocessingDrawing" xmlns:r="http://schemas.openxmlformats.org/officeDocument/2006/relationships" xmlns:w14="http://schemas.microsoft.com/office/word/2010/wordml">
+              <w:rPr>
+                <w:rFonts w:ascii="serif" w:hAnsi="serif" w:eastAsia="serif" w:cs="serif"/>
+                <w:i w:val="false"/>
+                <w:b w:val="true"/>
+                <w:u w:val="none"/>
+                <w:sz w:val="20"/>
+                <w:szCs w:val="20"/>
+                <w:color w:val="000000"/>
+              </w:rPr>
+              <w:t xml:space="preserve">Black</w:t>
+            </w:r>
+          </w:p>
+        </w:tc>
+        <w:tc>
+          <w:tcPr>
+            <w:tcBorders>
+              <w:bottom w:val="none" w:sz="0" w:space="0" w:color="000000"/>
+              <w:top w:val="single" w:sz="12" w:space="0" w:color="666666"/>
+              <w:left w:val="none" w:sz="0" w:space="0" w:color="000000"/>
+              <w:right w:val="none" w:sz="0" w:space="0" w:color="000000"/>
+            </w:tcBorders>
+            <w:shd w:val="clear" w:color="auto" w:fill="FFFFFF"/>
+            <w:tcMar>
+              <w:top w:w="0" w:type="dxa"/>
+              <w:bottom w:w="0" w:type="dxa"/>
+              <w:left w:w="0" w:type="dxa"/>
+              <w:right w:w="0" w:type="dxa"/>
+            </w:tcMar>
+            <w:vAlign w:val="center"/>
+          </w:tcPr>
+          <w:p>
+            <w:pPr>
+              <w:jc w:val="center"/>
+              <w:pBdr>
+                <w:bottom w:val="none" w:sz="0" w:space="0" w:color="000000"/>
+                <w:top w:val="none" w:sz="0" w:space="0" w:color="000000"/>
+                <w:left w:val="none" w:sz="0" w:space="0" w:color="000000"/>
+                <w:right w:val="none" w:sz="0" w:space="0" w:color="000000"/>
+              </w:pBdr>
+              <w:spacing w:after="100" w:before="100" w:line="240"/>
+              <w:ind w:left="100" w:right="100" w:firstLine="0" w:firstLineChars="0"/>
+              <w:rPr>
+                <w:rFonts w:ascii="serif" w:hAnsi="serif" w:eastAsia="serif" w:cs="serif"/>
+                <w:i w:val="false"/>
+                <w:b w:val="false"/>
+                <w:u w:val="none"/>
+                <w:sz w:val="20"/>
+                <w:szCs w:val="20"/>
+                <w:color w:val="000000"/>
+              </w:rPr>
+            </w:pPr>
+            <w:r xmlns:w="http://schemas.openxmlformats.org/wordprocessingml/2006/main" xmlns:wp="http://schemas.openxmlformats.org/drawingml/2006/wordprocessingDrawing" xmlns:r="http://schemas.openxmlformats.org/officeDocument/2006/relationships" xmlns:w14="http://schemas.microsoft.com/office/word/2010/wordml">
+              <w:rPr>
+                <w:rFonts w:ascii="serif" w:hAnsi="serif" w:eastAsia="serif" w:cs="serif"/>
+                <w:i w:val="false"/>
+                <w:b w:val="false"/>
+                <w:u w:val="none"/>
+                <w:sz w:val="20"/>
+                <w:szCs w:val="20"/>
+                <w:color w:val="000000"/>
+              </w:rPr>
+              <w:t xml:space="preserve">17,621</w:t>
+            </w:r>
+          </w:p>
+        </w:tc>
+        <w:tc>
+          <w:tcPr>
+            <w:tcBorders>
+              <w:bottom w:val="none" w:sz="0" w:space="0" w:color="000000"/>
+              <w:top w:val="single" w:sz="12" w:space="0" w:color="666666"/>
+              <w:left w:val="none" w:sz="0" w:space="0" w:color="000000"/>
+              <w:right w:val="none" w:sz="0" w:space="0" w:color="000000"/>
+            </w:tcBorders>
+            <w:shd w:val="clear" w:color="auto" w:fill="FFFFFF"/>
+            <w:tcMar>
+              <w:top w:w="0" w:type="dxa"/>
+              <w:bottom w:w="0" w:type="dxa"/>
+              <w:left w:w="0" w:type="dxa"/>
+              <w:right w:w="0" w:type="dxa"/>
+            </w:tcMar>
+            <w:vAlign w:val="center"/>
+          </w:tcPr>
+          <w:p>
+            <w:pPr>
+              <w:jc w:val="center"/>
+              <w:pBdr>
+                <w:bottom w:val="none" w:sz="0" w:space="0" w:color="000000"/>
+                <w:top w:val="none" w:sz="0" w:space="0" w:color="000000"/>
+                <w:left w:val="none" w:sz="0" w:space="0" w:color="000000"/>
+                <w:right w:val="none" w:sz="0" w:space="0" w:color="000000"/>
+              </w:pBdr>
+              <w:spacing w:after="100" w:before="100" w:line="240"/>
+              <w:ind w:left="100" w:right="100" w:firstLine="0" w:firstLineChars="0"/>
+              <w:rPr>
+                <w:rFonts w:ascii="serif" w:hAnsi="serif" w:eastAsia="serif" w:cs="serif"/>
+                <w:i w:val="false"/>
+                <w:b w:val="false"/>
+                <w:u w:val="none"/>
+                <w:sz w:val="20"/>
+                <w:szCs w:val="20"/>
+                <w:color w:val="000000"/>
+              </w:rPr>
+            </w:pPr>
+            <w:r xmlns:w="http://schemas.openxmlformats.org/wordprocessingml/2006/main" xmlns:wp="http://schemas.openxmlformats.org/drawingml/2006/wordprocessingDrawing" xmlns:r="http://schemas.openxmlformats.org/officeDocument/2006/relationships" xmlns:w14="http://schemas.microsoft.com/office/word/2010/wordml">
+              <w:rPr>
+                <w:rFonts w:ascii="serif" w:hAnsi="serif" w:eastAsia="serif" w:cs="serif"/>
+                <w:i w:val="false"/>
+                <w:b w:val="false"/>
+                <w:u w:val="none"/>
+                <w:sz w:val="20"/>
+                <w:szCs w:val="20"/>
+                <w:color w:val="000000"/>
+              </w:rPr>
+              <w:t xml:space="preserve">36,562</w:t>
+            </w:r>
+          </w:p>
+        </w:tc>
+        <w:tc>
+          <w:tcPr>
+            <w:tcBorders>
+              <w:bottom w:val="none" w:sz="0" w:space="0" w:color="000000"/>
+              <w:top w:val="single" w:sz="12" w:space="0" w:color="666666"/>
+              <w:left w:val="none" w:sz="0" w:space="0" w:color="000000"/>
+              <w:right w:val="none" w:sz="0" w:space="0" w:color="000000"/>
+            </w:tcBorders>
+            <w:shd w:val="clear" w:color="auto" w:fill="FFFFFF"/>
+            <w:tcMar>
+              <w:top w:w="0" w:type="dxa"/>
+              <w:bottom w:w="0" w:type="dxa"/>
+              <w:left w:w="0" w:type="dxa"/>
+              <w:right w:w="0" w:type="dxa"/>
+            </w:tcMar>
+            <w:vAlign w:val="center"/>
+          </w:tcPr>
+          <w:p>
+            <w:pPr>
+              <w:jc w:val="center"/>
+              <w:pBdr>
+                <w:bottom w:val="none" w:sz="0" w:space="0" w:color="000000"/>
+                <w:top w:val="none" w:sz="0" w:space="0" w:color="000000"/>
+                <w:left w:val="none" w:sz="0" w:space="0" w:color="000000"/>
+                <w:right w:val="none" w:sz="0" w:space="0" w:color="000000"/>
+              </w:pBdr>
+              <w:spacing w:after="100" w:before="100" w:line="240"/>
+              <w:ind w:left="100" w:right="100" w:firstLine="0" w:firstLineChars="0"/>
+              <w:rPr>
+                <w:rFonts w:ascii="serif" w:hAnsi="serif" w:eastAsia="serif" w:cs="serif"/>
+                <w:i w:val="false"/>
+                <w:b w:val="false"/>
+                <w:u w:val="none"/>
+                <w:sz w:val="20"/>
+                <w:szCs w:val="20"/>
+                <w:color w:val="000000"/>
+              </w:rPr>
+            </w:pPr>
+            <w:r xmlns:w="http://schemas.openxmlformats.org/wordprocessingml/2006/main" xmlns:wp="http://schemas.openxmlformats.org/drawingml/2006/wordprocessingDrawing" xmlns:r="http://schemas.openxmlformats.org/officeDocument/2006/relationships" xmlns:w14="http://schemas.microsoft.com/office/word/2010/wordml">
+              <w:rPr>
+                <w:rFonts w:ascii="serif" w:hAnsi="serif" w:eastAsia="serif" w:cs="serif"/>
+                <w:i w:val="false"/>
+                <w:b w:val="false"/>
+                <w:u w:val="none"/>
+                <w:sz w:val="20"/>
+                <w:szCs w:val="20"/>
+                <w:color w:val="000000"/>
+              </w:rPr>
+              <w:t xml:space="preserve">6,908</w:t>
+            </w:r>
+          </w:p>
+        </w:tc>
+        <w:tc>
+          <w:tcPr>
+            <w:tcBorders>
+              <w:bottom w:val="none" w:sz="0" w:space="0" w:color="000000"/>
+              <w:top w:val="single" w:sz="12" w:space="0" w:color="666666"/>
+              <w:left w:val="none" w:sz="0" w:space="0" w:color="000000"/>
+              <w:right w:val="none" w:sz="0" w:space="0" w:color="000000"/>
+            </w:tcBorders>
+            <w:shd w:val="clear" w:color="auto" w:fill="FFFFFF"/>
+            <w:tcMar>
+              <w:top w:w="0" w:type="dxa"/>
+              <w:bottom w:w="0" w:type="dxa"/>
+              <w:left w:w="0" w:type="dxa"/>
+              <w:right w:w="0" w:type="dxa"/>
+            </w:tcMar>
+            <w:vAlign w:val="center"/>
+          </w:tcPr>
+          <w:p>
+            <w:pPr>
+              <w:jc w:val="center"/>
+              <w:pBdr>
+                <w:bottom w:val="none" w:sz="0" w:space="0" w:color="000000"/>
+                <w:top w:val="none" w:sz="0" w:space="0" w:color="000000"/>
+                <w:left w:val="none" w:sz="0" w:space="0" w:color="000000"/>
+                <w:right w:val="none" w:sz="0" w:space="0" w:color="000000"/>
+              </w:pBdr>
+              <w:spacing w:after="100" w:before="100" w:line="240"/>
+              <w:ind w:left="100" w:right="100" w:firstLine="0" w:firstLineChars="0"/>
+              <w:rPr>
+                <w:rFonts w:ascii="serif" w:hAnsi="serif" w:eastAsia="serif" w:cs="serif"/>
+                <w:i w:val="false"/>
+                <w:b w:val="false"/>
+                <w:u w:val="none"/>
+                <w:sz w:val="20"/>
+                <w:szCs w:val="20"/>
+                <w:color w:val="000000"/>
+              </w:rPr>
+            </w:pPr>
+            <w:r xmlns:w="http://schemas.openxmlformats.org/wordprocessingml/2006/main" xmlns:wp="http://schemas.openxmlformats.org/drawingml/2006/wordprocessingDrawing" xmlns:r="http://schemas.openxmlformats.org/officeDocument/2006/relationships" xmlns:w14="http://schemas.microsoft.com/office/word/2010/wordml">
+              <w:rPr>
+                <w:rFonts w:ascii="serif" w:hAnsi="serif" w:eastAsia="serif" w:cs="serif"/>
+                <w:i w:val="false"/>
+                <w:b w:val="false"/>
+                <w:u w:val="none"/>
+                <w:sz w:val="20"/>
+                <w:szCs w:val="20"/>
+                <w:color w:val="000000"/>
+              </w:rPr>
+              <w:t xml:space="preserve">58,326</w:t>
+            </w:r>
+          </w:p>
+        </w:tc>
+        <w:tc>
+          <w:tcPr>
+            <w:tcBorders>
+              <w:bottom w:val="none" w:sz="0" w:space="0" w:color="000000"/>
+              <w:top w:val="single" w:sz="12" w:space="0" w:color="666666"/>
+              <w:left w:val="none" w:sz="0" w:space="0" w:color="000000"/>
+              <w:right w:val="none" w:sz="0" w:space="0" w:color="000000"/>
+            </w:tcBorders>
+            <w:shd w:val="clear" w:color="auto" w:fill="FFFFFF"/>
+            <w:tcMar>
+              <w:top w:w="0" w:type="dxa"/>
+              <w:bottom w:w="0" w:type="dxa"/>
+              <w:left w:w="0" w:type="dxa"/>
+              <w:right w:w="0" w:type="dxa"/>
+            </w:tcMar>
+            <w:vAlign w:val="center"/>
+          </w:tcPr>
+          <w:p>
+            <w:pPr>
+              <w:jc w:val="center"/>
+              <w:pBdr>
+                <w:bottom w:val="none" w:sz="0" w:space="0" w:color="000000"/>
+                <w:top w:val="none" w:sz="0" w:space="0" w:color="000000"/>
+                <w:left w:val="none" w:sz="0" w:space="0" w:color="000000"/>
+                <w:right w:val="none" w:sz="0" w:space="0" w:color="000000"/>
+              </w:pBdr>
+              <w:spacing w:after="100" w:before="100" w:line="240"/>
+              <w:ind w:left="100" w:right="100" w:firstLine="0" w:firstLineChars="0"/>
+              <w:rPr>
+                <w:rFonts w:ascii="serif" w:hAnsi="serif" w:eastAsia="serif" w:cs="serif"/>
+                <w:i w:val="false"/>
+                <w:b w:val="false"/>
+                <w:u w:val="none"/>
+                <w:sz w:val="20"/>
+                <w:szCs w:val="20"/>
+                <w:color w:val="000000"/>
+              </w:rPr>
+            </w:pPr>
+            <w:r xmlns:w="http://schemas.openxmlformats.org/wordprocessingml/2006/main" xmlns:wp="http://schemas.openxmlformats.org/drawingml/2006/wordprocessingDrawing" xmlns:r="http://schemas.openxmlformats.org/officeDocument/2006/relationships" xmlns:w14="http://schemas.microsoft.com/office/word/2010/wordml">
+              <w:rPr>
+                <w:rFonts w:ascii="serif" w:hAnsi="serif" w:eastAsia="serif" w:cs="serif"/>
+                <w:i w:val="false"/>
+                <w:b w:val="false"/>
+                <w:u w:val="none"/>
+                <w:sz w:val="20"/>
+                <w:szCs w:val="20"/>
+                <w:color w:val="000000"/>
+              </w:rPr>
+              <w:t xml:space="preserve">32.7%</w:t>
+            </w:r>
+          </w:p>
+        </w:tc>
+        <w:tc>
+          <w:tcPr>
+            <w:tcBorders>
+              <w:bottom w:val="none" w:sz="0" w:space="0" w:color="000000"/>
+              <w:top w:val="single" w:sz="12" w:space="0" w:color="666666"/>
+              <w:left w:val="none" w:sz="0" w:space="0" w:color="000000"/>
+              <w:right w:val="none" w:sz="0" w:space="0" w:color="000000"/>
+            </w:tcBorders>
+            <w:shd w:val="clear" w:color="auto" w:fill="FFFFFF"/>
+            <w:tcMar>
+              <w:top w:w="0" w:type="dxa"/>
+              <w:bottom w:w="0" w:type="dxa"/>
+              <w:left w:w="0" w:type="dxa"/>
+              <w:right w:w="0" w:type="dxa"/>
+            </w:tcMar>
+            <w:vAlign w:val="center"/>
+          </w:tcPr>
+          <w:p>
+            <w:pPr>
+              <w:jc w:val="center"/>
+              <w:pBdr>
+                <w:bottom w:val="none" w:sz="0" w:space="0" w:color="000000"/>
+                <w:top w:val="none" w:sz="0" w:space="0" w:color="000000"/>
+                <w:left w:val="none" w:sz="0" w:space="0" w:color="000000"/>
+                <w:right w:val="none" w:sz="0" w:space="0" w:color="000000"/>
+              </w:pBdr>
+              <w:spacing w:after="100" w:before="100" w:line="240"/>
+              <w:ind w:left="100" w:right="100" w:firstLine="0" w:firstLineChars="0"/>
+              <w:rPr>
+                <w:rFonts w:ascii="serif" w:hAnsi="serif" w:eastAsia="serif" w:cs="serif"/>
+                <w:i w:val="false"/>
+                <w:b w:val="false"/>
+                <w:u w:val="none"/>
+                <w:sz w:val="20"/>
+                <w:szCs w:val="20"/>
+                <w:color w:val="000000"/>
+              </w:rPr>
+            </w:pPr>
+            <w:r xmlns:w="http://schemas.openxmlformats.org/wordprocessingml/2006/main" xmlns:wp="http://schemas.openxmlformats.org/drawingml/2006/wordprocessingDrawing" xmlns:r="http://schemas.openxmlformats.org/officeDocument/2006/relationships" xmlns:w14="http://schemas.microsoft.com/office/word/2010/wordml">
+              <w:rPr>
+                <w:rFonts w:ascii="serif" w:hAnsi="serif" w:eastAsia="serif" w:cs="serif"/>
+                <w:i w:val="false"/>
+                <w:b w:val="false"/>
+                <w:u w:val="none"/>
+                <w:sz w:val="20"/>
+                <w:szCs w:val="20"/>
+                <w:color w:val="000000"/>
+              </w:rPr>
+              <w:t xml:space="preserve">10.1%</w:t>
+            </w:r>
+          </w:p>
+        </w:tc>
+      </w:tr>
+      <w:tr>
+        <w:trPr>
+          <w:trHeight w:val="360" w:hRule="auto"/>
+        </w:trPr>
+        body2
+        <w:tc>
+          <w:tcPr>
+            <w:tcBorders>
+              <w:bottom w:val="single" w:sz="4" w:space="0" w:color="999999"/>
+              <w:top w:val="none" w:sz="0" w:space="0" w:color="000000"/>
+              <w:left w:val="none" w:sz="0" w:space="0" w:color="000000"/>
+              <w:right w:val="none" w:sz="0" w:space="0" w:color="000000"/>
+            </w:tcBorders>
+            <w:shd w:val="clear" w:color="auto" w:fill="FFFFFF"/>
+            <w:tcMar>
+              <w:top w:w="0" w:type="dxa"/>
+              <w:bottom w:w="0" w:type="dxa"/>
+              <w:left w:w="0" w:type="dxa"/>
+              <w:right w:w="0" w:type="dxa"/>
+            </w:tcMar>
+            <w:vAlign w:val="center"/>
+          </w:tcPr>
+          <w:p>
+            <w:pPr>
+              <w:jc w:val="left"/>
+              <w:pBdr>
+                <w:bottom w:val="none" w:sz="0" w:space="0" w:color="000000"/>
+                <w:top w:val="none" w:sz="0" w:space="0" w:color="000000"/>
+                <w:left w:val="none" w:sz="0" w:space="0" w:color="000000"/>
+                <w:right w:val="none" w:sz="0" w:space="0" w:color="000000"/>
+              </w:pBdr>
+              <w:spacing w:after="100" w:before="100" w:line="240"/>
+              <w:ind w:left="100" w:right="100" w:firstLine="0" w:firstLineChars="0"/>
+              <w:rPr>
+                <w:rFonts w:ascii="serif" w:hAnsi="serif" w:eastAsia="serif" w:cs="serif"/>
+                <w:i w:val="false"/>
+                <w:b w:val="true"/>
+                <w:u w:val="none"/>
+                <w:sz w:val="20"/>
+                <w:szCs w:val="20"/>
+                <w:color w:val="000000"/>
+              </w:rPr>
+            </w:pPr>
+            <w:r xmlns:w="http://schemas.openxmlformats.org/wordprocessingml/2006/main" xmlns:wp="http://schemas.openxmlformats.org/drawingml/2006/wordprocessingDrawing" xmlns:r="http://schemas.openxmlformats.org/officeDocument/2006/relationships" xmlns:w14="http://schemas.microsoft.com/office/word/2010/wordml">
+              <w:rPr>
+                <w:rFonts w:ascii="serif" w:hAnsi="serif" w:eastAsia="serif" w:cs="serif"/>
+                <w:i w:val="false"/>
+                <w:b w:val="true"/>
+                <w:u w:val="none"/>
+                <w:sz w:val="20"/>
+                <w:szCs w:val="20"/>
+                <w:color w:val="000000"/>
+              </w:rPr>
+              <w:t xml:space="preserve">Non-Black</w:t>
+            </w:r>
+          </w:p>
+        </w:tc>
+        <w:tc>
+          <w:tcPr>
+            <w:tcBorders>
+              <w:bottom w:val="single" w:sz="4" w:space="0" w:color="999999"/>
+              <w:top w:val="none" w:sz="0" w:space="0" w:color="000000"/>
+              <w:left w:val="none" w:sz="0" w:space="0" w:color="000000"/>
+              <w:right w:val="none" w:sz="0" w:space="0" w:color="000000"/>
+            </w:tcBorders>
+            <w:shd w:val="clear" w:color="auto" w:fill="FFFFFF"/>
+            <w:tcMar>
+              <w:top w:w="0" w:type="dxa"/>
+              <w:bottom w:w="0" w:type="dxa"/>
+              <w:left w:w="0" w:type="dxa"/>
+              <w:right w:w="0" w:type="dxa"/>
+            </w:tcMar>
+            <w:vAlign w:val="center"/>
+          </w:tcPr>
+          <w:p>
+            <w:pPr>
+              <w:jc w:val="center"/>
+              <w:pBdr>
+                <w:bottom w:val="none" w:sz="0" w:space="0" w:color="000000"/>
+                <w:top w:val="none" w:sz="0" w:space="0" w:color="000000"/>
+                <w:left w:val="none" w:sz="0" w:space="0" w:color="000000"/>
+                <w:right w:val="none" w:sz="0" w:space="0" w:color="000000"/>
+              </w:pBdr>
+              <w:spacing w:after="100" w:before="100" w:line="240"/>
+              <w:ind w:left="100" w:right="100" w:firstLine="0" w:firstLineChars="0"/>
+              <w:rPr>
+                <w:rFonts w:ascii="serif" w:hAnsi="serif" w:eastAsia="serif" w:cs="serif"/>
+                <w:i w:val="false"/>
+                <w:b w:val="false"/>
+                <w:u w:val="none"/>
+                <w:sz w:val="20"/>
+                <w:szCs w:val="20"/>
+                <w:color w:val="000000"/>
+              </w:rPr>
+            </w:pPr>
+            <w:r xmlns:w="http://schemas.openxmlformats.org/wordprocessingml/2006/main" xmlns:wp="http://schemas.openxmlformats.org/drawingml/2006/wordprocessingDrawing" xmlns:r="http://schemas.openxmlformats.org/officeDocument/2006/relationships" xmlns:w14="http://schemas.microsoft.com/office/word/2010/wordml">
+              <w:rPr>
+                <w:rFonts w:ascii="serif" w:hAnsi="serif" w:eastAsia="serif" w:cs="serif"/>
+                <w:i w:val="false"/>
+                <w:b w:val="false"/>
+                <w:u w:val="none"/>
+                <w:sz w:val="20"/>
+                <w:szCs w:val="20"/>
+                <w:color w:val="000000"/>
+              </w:rPr>
+              <w:t xml:space="preserve">29,233</w:t>
+            </w:r>
+          </w:p>
+        </w:tc>
+        <w:tc>
+          <w:tcPr>
+            <w:tcBorders>
+              <w:bottom w:val="single" w:sz="4" w:space="0" w:color="999999"/>
+              <w:top w:val="none" w:sz="0" w:space="0" w:color="000000"/>
+              <w:left w:val="none" w:sz="0" w:space="0" w:color="000000"/>
+              <w:right w:val="none" w:sz="0" w:space="0" w:color="000000"/>
+            </w:tcBorders>
+            <w:shd w:val="clear" w:color="auto" w:fill="FFFFFF"/>
+            <w:tcMar>
+              <w:top w:w="0" w:type="dxa"/>
+              <w:bottom w:w="0" w:type="dxa"/>
+              <w:left w:w="0" w:type="dxa"/>
+              <w:right w:w="0" w:type="dxa"/>
+            </w:tcMar>
+            <w:vAlign w:val="center"/>
+          </w:tcPr>
+          <w:p>
+            <w:pPr>
+              <w:jc w:val="center"/>
+              <w:pBdr>
+                <w:bottom w:val="none" w:sz="0" w:space="0" w:color="000000"/>
+                <w:top w:val="none" w:sz="0" w:space="0" w:color="000000"/>
+                <w:left w:val="none" w:sz="0" w:space="0" w:color="000000"/>
+                <w:right w:val="none" w:sz="0" w:space="0" w:color="000000"/>
+              </w:pBdr>
+              <w:spacing w:after="100" w:before="100" w:line="240"/>
+              <w:ind w:left="100" w:right="100" w:firstLine="0" w:firstLineChars="0"/>
+              <w:rPr>
+                <w:rFonts w:ascii="serif" w:hAnsi="serif" w:eastAsia="serif" w:cs="serif"/>
+                <w:i w:val="false"/>
+                <w:b w:val="false"/>
+                <w:u w:val="none"/>
+                <w:sz w:val="20"/>
+                <w:szCs w:val="20"/>
+                <w:color w:val="000000"/>
+              </w:rPr>
+            </w:pPr>
+            <w:r xmlns:w="http://schemas.openxmlformats.org/wordprocessingml/2006/main" xmlns:wp="http://schemas.openxmlformats.org/drawingml/2006/wordprocessingDrawing" xmlns:r="http://schemas.openxmlformats.org/officeDocument/2006/relationships" xmlns:w14="http://schemas.microsoft.com/office/word/2010/wordml">
+              <w:rPr>
+                <w:rFonts w:ascii="serif" w:hAnsi="serif" w:eastAsia="serif" w:cs="serif"/>
+                <w:i w:val="false"/>
+                <w:b w:val="false"/>
+                <w:u w:val="none"/>
+                <w:sz w:val="20"/>
+                <w:szCs w:val="20"/>
+                <w:color w:val="000000"/>
+              </w:rPr>
+              <w:t xml:space="preserve">62,916</w:t>
+            </w:r>
+          </w:p>
+        </w:tc>
+        <w:tc>
+          <w:tcPr>
+            <w:tcBorders>
+              <w:bottom w:val="single" w:sz="4" w:space="0" w:color="999999"/>
+              <w:top w:val="none" w:sz="0" w:space="0" w:color="000000"/>
+              <w:left w:val="none" w:sz="0" w:space="0" w:color="000000"/>
+              <w:right w:val="none" w:sz="0" w:space="0" w:color="000000"/>
+            </w:tcBorders>
+            <w:shd w:val="clear" w:color="auto" w:fill="FFFFFF"/>
+            <w:tcMar>
+              <w:top w:w="0" w:type="dxa"/>
+              <w:bottom w:w="0" w:type="dxa"/>
+              <w:left w:w="0" w:type="dxa"/>
+              <w:right w:w="0" w:type="dxa"/>
+            </w:tcMar>
+            <w:vAlign w:val="center"/>
+          </w:tcPr>
+          <w:p>
+            <w:pPr>
+              <w:jc w:val="center"/>
+              <w:pBdr>
+                <w:bottom w:val="none" w:sz="0" w:space="0" w:color="000000"/>
+                <w:top w:val="none" w:sz="0" w:space="0" w:color="000000"/>
+                <w:left w:val="none" w:sz="0" w:space="0" w:color="000000"/>
+                <w:right w:val="none" w:sz="0" w:space="0" w:color="000000"/>
+              </w:pBdr>
+              <w:spacing w:after="100" w:before="100" w:line="240"/>
+              <w:ind w:left="100" w:right="100" w:firstLine="0" w:firstLineChars="0"/>
+              <w:rPr>
+                <w:rFonts w:ascii="serif" w:hAnsi="serif" w:eastAsia="serif" w:cs="serif"/>
+                <w:i w:val="false"/>
+                <w:b w:val="false"/>
+                <w:u w:val="none"/>
+                <w:sz w:val="20"/>
+                <w:szCs w:val="20"/>
+                <w:color w:val="000000"/>
+              </w:rPr>
+            </w:pPr>
+            <w:r xmlns:w="http://schemas.openxmlformats.org/wordprocessingml/2006/main" xmlns:wp="http://schemas.openxmlformats.org/drawingml/2006/wordprocessingDrawing" xmlns:r="http://schemas.openxmlformats.org/officeDocument/2006/relationships" xmlns:w14="http://schemas.microsoft.com/office/word/2010/wordml">
+              <w:rPr>
+                <w:rFonts w:ascii="serif" w:hAnsi="serif" w:eastAsia="serif" w:cs="serif"/>
+                <w:i w:val="false"/>
+                <w:b w:val="false"/>
+                <w:u w:val="none"/>
+                <w:sz w:val="20"/>
+                <w:szCs w:val="20"/>
+                <w:color w:val="000000"/>
+              </w:rPr>
+              <w:t xml:space="preserve">79,216</w:t>
+            </w:r>
+          </w:p>
+        </w:tc>
+        <w:tc>
+          <w:tcPr>
+            <w:tcBorders>
+              <w:bottom w:val="single" w:sz="4" w:space="0" w:color="999999"/>
+              <w:top w:val="none" w:sz="0" w:space="0" w:color="000000"/>
+              <w:left w:val="none" w:sz="0" w:space="0" w:color="000000"/>
+              <w:right w:val="none" w:sz="0" w:space="0" w:color="000000"/>
+            </w:tcBorders>
+            <w:shd w:val="clear" w:color="auto" w:fill="FFFFFF"/>
+            <w:tcMar>
+              <w:top w:w="0" w:type="dxa"/>
+              <w:bottom w:w="0" w:type="dxa"/>
+              <w:left w:w="0" w:type="dxa"/>
+              <w:right w:w="0" w:type="dxa"/>
+            </w:tcMar>
+            <w:vAlign w:val="center"/>
+          </w:tcPr>
+          <w:p>
+            <w:pPr>
+              <w:jc w:val="center"/>
+              <w:pBdr>
+                <w:bottom w:val="none" w:sz="0" w:space="0" w:color="000000"/>
+                <w:top w:val="none" w:sz="0" w:space="0" w:color="000000"/>
+                <w:left w:val="none" w:sz="0" w:space="0" w:color="000000"/>
+                <w:right w:val="none" w:sz="0" w:space="0" w:color="000000"/>
+              </w:pBdr>
+              <w:spacing w:after="100" w:before="100" w:line="240"/>
+              <w:ind w:left="100" w:right="100" w:firstLine="0" w:firstLineChars="0"/>
+              <w:rPr>
+                <w:rFonts w:ascii="serif" w:hAnsi="serif" w:eastAsia="serif" w:cs="serif"/>
+                <w:i w:val="false"/>
+                <w:b w:val="false"/>
+                <w:u w:val="none"/>
+                <w:sz w:val="20"/>
+                <w:szCs w:val="20"/>
+                <w:color w:val="000000"/>
+              </w:rPr>
+            </w:pPr>
+            <w:r xmlns:w="http://schemas.openxmlformats.org/wordprocessingml/2006/main" xmlns:wp="http://schemas.openxmlformats.org/drawingml/2006/wordprocessingDrawing" xmlns:r="http://schemas.openxmlformats.org/officeDocument/2006/relationships" xmlns:w14="http://schemas.microsoft.com/office/word/2010/wordml">
+              <w:rPr>
+                <w:rFonts w:ascii="serif" w:hAnsi="serif" w:eastAsia="serif" w:cs="serif"/>
+                <w:i w:val="false"/>
+                <w:b w:val="false"/>
+                <w:u w:val="none"/>
+                <w:sz w:val="20"/>
+                <w:szCs w:val="20"/>
+                <w:color w:val="000000"/>
+              </w:rPr>
+              <w:t xml:space="preserve">306,988</w:t>
+            </w:r>
+          </w:p>
+        </w:tc>
+        <w:tc>
+          <w:tcPr>
+            <w:tcBorders>
+              <w:bottom w:val="single" w:sz="4" w:space="0" w:color="999999"/>
+              <w:top w:val="none" w:sz="0" w:space="0" w:color="000000"/>
+              <w:left w:val="none" w:sz="0" w:space="0" w:color="000000"/>
+              <w:right w:val="none" w:sz="0" w:space="0" w:color="000000"/>
+            </w:tcBorders>
+            <w:shd w:val="clear" w:color="auto" w:fill="FFFFFF"/>
+            <w:tcMar>
+              <w:top w:w="0" w:type="dxa"/>
+              <w:bottom w:w="0" w:type="dxa"/>
+              <w:left w:w="0" w:type="dxa"/>
+              <w:right w:w="0" w:type="dxa"/>
+            </w:tcMar>
+            <w:vAlign w:val="center"/>
+          </w:tcPr>
+          <w:p>
+            <w:pPr>
+              <w:jc w:val="center"/>
+              <w:pBdr>
+                <w:bottom w:val="none" w:sz="0" w:space="0" w:color="000000"/>
+                <w:top w:val="none" w:sz="0" w:space="0" w:color="000000"/>
+                <w:left w:val="none" w:sz="0" w:space="0" w:color="000000"/>
+                <w:right w:val="none" w:sz="0" w:space="0" w:color="000000"/>
+              </w:pBdr>
+              <w:spacing w:after="100" w:before="100" w:line="240"/>
+              <w:ind w:left="100" w:right="100" w:firstLine="0" w:firstLineChars="0"/>
+              <w:rPr>
+                <w:rFonts w:ascii="serif" w:hAnsi="serif" w:eastAsia="serif" w:cs="serif"/>
+                <w:i w:val="false"/>
+                <w:b w:val="false"/>
+                <w:u w:val="none"/>
+                <w:sz w:val="20"/>
+                <w:szCs w:val="20"/>
+                <w:color w:val="000000"/>
+              </w:rPr>
+            </w:pPr>
+            <w:r xmlns:w="http://schemas.openxmlformats.org/wordprocessingml/2006/main" xmlns:wp="http://schemas.openxmlformats.org/drawingml/2006/wordprocessingDrawing" xmlns:r="http://schemas.openxmlformats.org/officeDocument/2006/relationships" xmlns:w14="http://schemas.microsoft.com/office/word/2010/wordml">
+              <w:rPr>
+                <w:rFonts w:ascii="serif" w:hAnsi="serif" w:eastAsia="serif" w:cs="serif"/>
+                <w:i w:val="false"/>
+                <w:b w:val="false"/>
+                <w:u w:val="none"/>
+                <w:sz w:val="20"/>
+                <w:szCs w:val="20"/>
+                <w:color w:val="000000"/>
+              </w:rPr>
+              <w:t xml:space="preserve">13.4%</w:t>
+            </w:r>
+          </w:p>
+        </w:tc>
+        <w:tc>
+          <w:tcPr>
+            <w:tcBorders>
+              <w:bottom w:val="single" w:sz="4" w:space="0" w:color="999999"/>
+              <w:top w:val="none" w:sz="0" w:space="0" w:color="000000"/>
+              <w:left w:val="none" w:sz="0" w:space="0" w:color="000000"/>
+              <w:right w:val="none" w:sz="0" w:space="0" w:color="000000"/>
+            </w:tcBorders>
+            <w:shd w:val="clear" w:color="auto" w:fill="FFFFFF"/>
+            <w:tcMar>
+              <w:top w:w="0" w:type="dxa"/>
+              <w:bottom w:w="0" w:type="dxa"/>
+              <w:left w:w="0" w:type="dxa"/>
+              <w:right w:w="0" w:type="dxa"/>
+            </w:tcMar>
+            <w:vAlign w:val="center"/>
+          </w:tcPr>
+          <w:p>
+            <w:pPr>
+              <w:jc w:val="center"/>
+              <w:pBdr>
+                <w:bottom w:val="none" w:sz="0" w:space="0" w:color="000000"/>
+                <w:top w:val="none" w:sz="0" w:space="0" w:color="000000"/>
+                <w:left w:val="none" w:sz="0" w:space="0" w:color="000000"/>
+                <w:right w:val="none" w:sz="0" w:space="0" w:color="000000"/>
+              </w:pBdr>
+              <w:spacing w:after="100" w:before="100" w:line="240"/>
+              <w:ind w:left="100" w:right="100" w:firstLine="0" w:firstLineChars="0"/>
+              <w:rPr>
+                <w:rFonts w:ascii="serif" w:hAnsi="serif" w:eastAsia="serif" w:cs="serif"/>
+                <w:i w:val="false"/>
+                <w:b w:val="false"/>
+                <w:u w:val="none"/>
+                <w:sz w:val="20"/>
+                <w:szCs w:val="20"/>
+                <w:color w:val="000000"/>
+              </w:rPr>
+            </w:pPr>
+            <w:r xmlns:w="http://schemas.openxmlformats.org/wordprocessingml/2006/main" xmlns:wp="http://schemas.openxmlformats.org/drawingml/2006/wordprocessingDrawing" xmlns:r="http://schemas.openxmlformats.org/officeDocument/2006/relationships" xmlns:w14="http://schemas.microsoft.com/office/word/2010/wordml">
+              <w:rPr>
+                <w:rFonts w:ascii="serif" w:hAnsi="serif" w:eastAsia="serif" w:cs="serif"/>
+                <w:i w:val="false"/>
+                <w:b w:val="false"/>
+                <w:u w:val="none"/>
+                <w:sz w:val="20"/>
+                <w:szCs w:val="20"/>
+                <w:color w:val="000000"/>
+              </w:rPr>
+              <w:t xml:space="preserve">3.2%</w:t>
+            </w:r>
+          </w:p>
+        </w:tc>
+      </w:tr>
+      <w:tr>
+        <w:trPr>
+          <w:trHeight w:val="360" w:hRule="auto"/>
+        </w:trPr>
+        body3
+        <w:tc>
+          <w:tcPr>
+            <w:tcBorders>
+              <w:bottom w:val="single" w:sz="12" w:space="0" w:color="666666"/>
+              <w:top w:val="single" w:sz="4" w:space="0" w:color="999999"/>
+              <w:left w:val="none" w:sz="0" w:space="0" w:color="000000"/>
+              <w:right w:val="none" w:sz="0" w:space="0" w:color="000000"/>
+            </w:tcBorders>
+            <w:shd w:val="clear" w:color="auto" w:fill="F2F2F2"/>
+            <w:tcMar>
+              <w:top w:w="0" w:type="dxa"/>
+              <w:bottom w:w="0" w:type="dxa"/>
+              <w:left w:w="0" w:type="dxa"/>
+              <w:right w:w="0" w:type="dxa"/>
+            </w:tcMar>
+            <w:vAlign w:val="center"/>
+          </w:tcPr>
+          <w:p>
+            <w:pPr>
+              <w:jc w:val="left"/>
+              <w:pBdr>
+                <w:bottom w:val="none" w:sz="0" w:space="0" w:color="000000"/>
+                <w:top w:val="none" w:sz="0" w:space="0" w:color="000000"/>
+                <w:left w:val="none" w:sz="0" w:space="0" w:color="000000"/>
+                <w:right w:val="none" w:sz="0" w:space="0" w:color="000000"/>
+              </w:pBdr>
+              <w:spacing w:after="100" w:before="100" w:line="240"/>
+              <w:ind w:left="100" w:right="100" w:firstLine="0" w:firstLineChars="0"/>
+              <w:rPr>
+                <w:rFonts w:ascii="serif" w:hAnsi="serif" w:eastAsia="serif" w:cs="serif"/>
+                <w:i w:val="false"/>
+                <w:b w:val="true"/>
+                <w:u w:val="none"/>
+                <w:sz w:val="20"/>
+                <w:szCs w:val="20"/>
+                <w:color w:val="000000"/>
+              </w:rPr>
+            </w:pPr>
+            <w:r xmlns:w="http://schemas.openxmlformats.org/wordprocessingml/2006/main" xmlns:wp="http://schemas.openxmlformats.org/drawingml/2006/wordprocessingDrawing" xmlns:r="http://schemas.openxmlformats.org/officeDocument/2006/relationships" xmlns:w14="http://schemas.microsoft.com/office/word/2010/wordml">
+              <w:rPr>
+                <w:rFonts w:ascii="serif" w:hAnsi="serif" w:eastAsia="serif" w:cs="serif"/>
+                <w:i w:val="false"/>
+                <w:b w:val="true"/>
+                <w:u w:val="none"/>
+                <w:sz w:val="20"/>
+                <w:szCs w:val="20"/>
+                <w:color w:val="000000"/>
+              </w:rPr>
+              <w:t xml:space="preserve">Ratio</w:t>
+            </w:r>
+          </w:p>
+        </w:tc>
+        <w:tc>
+          <w:tcPr>
+            <w:tcBorders>
+              <w:bottom w:val="single" w:sz="12" w:space="0" w:color="666666"/>
+              <w:top w:val="single" w:sz="4" w:space="0" w:color="999999"/>
+              <w:left w:val="none" w:sz="0" w:space="0" w:color="000000"/>
+              <w:right w:val="none" w:sz="0" w:space="0" w:color="000000"/>
+            </w:tcBorders>
+            <w:shd w:val="clear" w:color="auto" w:fill="F2F2F2"/>
+            <w:tcMar>
+              <w:top w:w="0" w:type="dxa"/>
+              <w:bottom w:w="0" w:type="dxa"/>
+              <w:left w:w="0" w:type="dxa"/>
+              <w:right w:w="0" w:type="dxa"/>
+            </w:tcMar>
+            <w:vAlign w:val="center"/>
+          </w:tcPr>
+          <w:p>
+            <w:pPr>
+              <w:jc w:val="center"/>
+              <w:pBdr>
+                <w:bottom w:val="none" w:sz="0" w:space="0" w:color="000000"/>
+                <w:top w:val="none" w:sz="0" w:space="0" w:color="000000"/>
+                <w:left w:val="none" w:sz="0" w:space="0" w:color="000000"/>
+                <w:right w:val="none" w:sz="0" w:space="0" w:color="000000"/>
+              </w:pBdr>
+              <w:spacing w:after="100" w:before="100" w:line="240"/>
+              <w:ind w:left="100" w:right="100" w:firstLine="0" w:firstLineChars="0"/>
+              <w:rPr>
+                <w:rFonts w:ascii="serif" w:hAnsi="serif" w:eastAsia="serif" w:cs="serif"/>
+                <w:i w:val="false"/>
+                <w:b w:val="false"/>
+                <w:u w:val="none"/>
+                <w:sz w:val="20"/>
+                <w:szCs w:val="20"/>
+                <w:color w:val="000000"/>
+              </w:rPr>
+            </w:pPr>
+            <w:r xmlns:w="http://schemas.openxmlformats.org/wordprocessingml/2006/main" xmlns:wp="http://schemas.openxmlformats.org/drawingml/2006/wordprocessingDrawing" xmlns:r="http://schemas.openxmlformats.org/officeDocument/2006/relationships" xmlns:w14="http://schemas.microsoft.com/office/word/2010/wordml">
+              <w:rPr>
+                <w:rFonts w:ascii="serif" w:hAnsi="serif" w:eastAsia="serif" w:cs="serif"/>
+                <w:i w:val="false"/>
+                <w:b w:val="false"/>
+                <w:u w:val="none"/>
+                <w:sz w:val="20"/>
+                <w:szCs w:val="20"/>
+                <w:color w:val="000000"/>
+              </w:rPr>
+              <w:t xml:space="preserve">0.60</w:t>
+            </w:r>
+          </w:p>
+        </w:tc>
+        <w:tc>
+          <w:tcPr>
+            <w:tcBorders>
+              <w:bottom w:val="single" w:sz="12" w:space="0" w:color="666666"/>
+              <w:top w:val="single" w:sz="4" w:space="0" w:color="999999"/>
+              <w:left w:val="none" w:sz="0" w:space="0" w:color="000000"/>
+              <w:right w:val="none" w:sz="0" w:space="0" w:color="000000"/>
+            </w:tcBorders>
+            <w:shd w:val="clear" w:color="auto" w:fill="F2F2F2"/>
+            <w:tcMar>
+              <w:top w:w="0" w:type="dxa"/>
+              <w:bottom w:w="0" w:type="dxa"/>
+              <w:left w:w="0" w:type="dxa"/>
+              <w:right w:w="0" w:type="dxa"/>
+            </w:tcMar>
+            <w:vAlign w:val="center"/>
+          </w:tcPr>
+          <w:p>
+            <w:pPr>
+              <w:jc w:val="center"/>
+              <w:pBdr>
+                <w:bottom w:val="none" w:sz="0" w:space="0" w:color="000000"/>
+                <w:top w:val="none" w:sz="0" w:space="0" w:color="000000"/>
+                <w:left w:val="none" w:sz="0" w:space="0" w:color="000000"/>
+                <w:right w:val="none" w:sz="0" w:space="0" w:color="000000"/>
+              </w:pBdr>
+              <w:spacing w:after="100" w:before="100" w:line="240"/>
+              <w:ind w:left="100" w:right="100" w:firstLine="0" w:firstLineChars="0"/>
+              <w:rPr>
+                <w:rFonts w:ascii="serif" w:hAnsi="serif" w:eastAsia="serif" w:cs="serif"/>
+                <w:i w:val="false"/>
+                <w:b w:val="false"/>
+                <w:u w:val="none"/>
+                <w:sz w:val="20"/>
+                <w:szCs w:val="20"/>
+                <w:color w:val="000000"/>
+              </w:rPr>
+            </w:pPr>
+            <w:r xmlns:w="http://schemas.openxmlformats.org/wordprocessingml/2006/main" xmlns:wp="http://schemas.openxmlformats.org/drawingml/2006/wordprocessingDrawing" xmlns:r="http://schemas.openxmlformats.org/officeDocument/2006/relationships" xmlns:w14="http://schemas.microsoft.com/office/word/2010/wordml">
+              <w:rPr>
+                <w:rFonts w:ascii="serif" w:hAnsi="serif" w:eastAsia="serif" w:cs="serif"/>
+                <w:i w:val="false"/>
+                <w:b w:val="false"/>
+                <w:u w:val="none"/>
+                <w:sz w:val="20"/>
+                <w:szCs w:val="20"/>
+                <w:color w:val="000000"/>
+              </w:rPr>
+              <w:t xml:space="preserve">0.58</w:t>
+            </w:r>
+          </w:p>
+        </w:tc>
+        <w:tc>
+          <w:tcPr>
+            <w:tcBorders>
+              <w:bottom w:val="single" w:sz="12" w:space="0" w:color="666666"/>
+              <w:top w:val="single" w:sz="4" w:space="0" w:color="999999"/>
+              <w:left w:val="none" w:sz="0" w:space="0" w:color="000000"/>
+              <w:right w:val="none" w:sz="0" w:space="0" w:color="000000"/>
+            </w:tcBorders>
+            <w:shd w:val="clear" w:color="auto" w:fill="F2F2F2"/>
+            <w:tcMar>
+              <w:top w:w="0" w:type="dxa"/>
+              <w:bottom w:w="0" w:type="dxa"/>
+              <w:left w:w="0" w:type="dxa"/>
+              <w:right w:w="0" w:type="dxa"/>
+            </w:tcMar>
+            <w:vAlign w:val="center"/>
+          </w:tcPr>
+          <w:p>
+            <w:pPr>
+              <w:jc w:val="center"/>
+              <w:pBdr>
+                <w:bottom w:val="none" w:sz="0" w:space="0" w:color="000000"/>
+                <w:top w:val="none" w:sz="0" w:space="0" w:color="000000"/>
+                <w:left w:val="none" w:sz="0" w:space="0" w:color="000000"/>
+                <w:right w:val="none" w:sz="0" w:space="0" w:color="000000"/>
+              </w:pBdr>
+              <w:spacing w:after="100" w:before="100" w:line="240"/>
+              <w:ind w:left="100" w:right="100" w:firstLine="0" w:firstLineChars="0"/>
+              <w:rPr>
+                <w:rFonts w:ascii="serif" w:hAnsi="serif" w:eastAsia="serif" w:cs="serif"/>
+                <w:i w:val="false"/>
+                <w:b w:val="false"/>
+                <w:u w:val="none"/>
+                <w:sz w:val="20"/>
+                <w:szCs w:val="20"/>
+                <w:color w:val="000000"/>
+              </w:rPr>
+            </w:pPr>
+            <w:r xmlns:w="http://schemas.openxmlformats.org/wordprocessingml/2006/main" xmlns:wp="http://schemas.openxmlformats.org/drawingml/2006/wordprocessingDrawing" xmlns:r="http://schemas.openxmlformats.org/officeDocument/2006/relationships" xmlns:w14="http://schemas.microsoft.com/office/word/2010/wordml">
+              <w:rPr>
+                <w:rFonts w:ascii="serif" w:hAnsi="serif" w:eastAsia="serif" w:cs="serif"/>
+                <w:i w:val="false"/>
+                <w:b w:val="false"/>
+                <w:u w:val="none"/>
+                <w:sz w:val="20"/>
+                <w:szCs w:val="20"/>
+                <w:color w:val="000000"/>
+              </w:rPr>
+              <w:t xml:space="preserve">0.09</w:t>
+            </w:r>
+          </w:p>
+        </w:tc>
+        <w:tc>
+          <w:tcPr>
+            <w:tcBorders>
+              <w:bottom w:val="single" w:sz="12" w:space="0" w:color="666666"/>
+              <w:top w:val="single" w:sz="4" w:space="0" w:color="999999"/>
+              <w:left w:val="none" w:sz="0" w:space="0" w:color="000000"/>
+              <w:right w:val="none" w:sz="0" w:space="0" w:color="000000"/>
+            </w:tcBorders>
+            <w:shd w:val="clear" w:color="auto" w:fill="F2F2F2"/>
+            <w:tcMar>
+              <w:top w:w="0" w:type="dxa"/>
+              <w:bottom w:w="0" w:type="dxa"/>
+              <w:left w:w="0" w:type="dxa"/>
+              <w:right w:w="0" w:type="dxa"/>
+            </w:tcMar>
+            <w:vAlign w:val="center"/>
+          </w:tcPr>
+          <w:p>
+            <w:pPr>
+              <w:jc w:val="center"/>
+              <w:pBdr>
+                <w:bottom w:val="none" w:sz="0" w:space="0" w:color="000000"/>
+                <w:top w:val="none" w:sz="0" w:space="0" w:color="000000"/>
+                <w:left w:val="none" w:sz="0" w:space="0" w:color="000000"/>
+                <w:right w:val="none" w:sz="0" w:space="0" w:color="000000"/>
+              </w:pBdr>
+              <w:spacing w:after="100" w:before="100" w:line="240"/>
+              <w:ind w:left="100" w:right="100" w:firstLine="0" w:firstLineChars="0"/>
+              <w:rPr>
+                <w:rFonts w:ascii="serif" w:hAnsi="serif" w:eastAsia="serif" w:cs="serif"/>
+                <w:i w:val="false"/>
+                <w:b w:val="false"/>
+                <w:u w:val="none"/>
+                <w:sz w:val="20"/>
+                <w:szCs w:val="20"/>
+                <w:color w:val="000000"/>
+              </w:rPr>
+            </w:pPr>
+            <w:r xmlns:w="http://schemas.openxmlformats.org/wordprocessingml/2006/main" xmlns:wp="http://schemas.openxmlformats.org/drawingml/2006/wordprocessingDrawing" xmlns:r="http://schemas.openxmlformats.org/officeDocument/2006/relationships" xmlns:w14="http://schemas.microsoft.com/office/word/2010/wordml">
+              <w:rPr>
+                <w:rFonts w:ascii="serif" w:hAnsi="serif" w:eastAsia="serif" w:cs="serif"/>
+                <w:i w:val="false"/>
+                <w:b w:val="false"/>
+                <w:u w:val="none"/>
+                <w:sz w:val="20"/>
+                <w:szCs w:val="20"/>
+                <w:color w:val="000000"/>
+              </w:rPr>
+              <w:t xml:space="preserve">0.19</w:t>
+            </w:r>
+          </w:p>
+        </w:tc>
+        <w:tc>
+          <w:tcPr>
+            <w:tcBorders>
+              <w:bottom w:val="single" w:sz="12" w:space="0" w:color="666666"/>
+              <w:top w:val="single" w:sz="4" w:space="0" w:color="999999"/>
+              <w:left w:val="none" w:sz="0" w:space="0" w:color="000000"/>
+              <w:right w:val="none" w:sz="0" w:space="0" w:color="000000"/>
+            </w:tcBorders>
+            <w:shd w:val="clear" w:color="auto" w:fill="F2F2F2"/>
+            <w:tcMar>
+              <w:top w:w="0" w:type="dxa"/>
+              <w:bottom w:w="0" w:type="dxa"/>
+              <w:left w:w="0" w:type="dxa"/>
+              <w:right w:w="0" w:type="dxa"/>
+            </w:tcMar>
+            <w:vAlign w:val="center"/>
+          </w:tcPr>
+          <w:p>
+            <w:pPr>
+              <w:jc w:val="center"/>
+              <w:pBdr>
+                <w:bottom w:val="none" w:sz="0" w:space="0" w:color="000000"/>
+                <w:top w:val="none" w:sz="0" w:space="0" w:color="000000"/>
+                <w:left w:val="none" w:sz="0" w:space="0" w:color="000000"/>
+                <w:right w:val="none" w:sz="0" w:space="0" w:color="000000"/>
+              </w:pBdr>
+              <w:spacing w:after="100" w:before="100" w:line="240"/>
+              <w:ind w:left="100" w:right="100" w:firstLine="0" w:firstLineChars="0"/>
+              <w:rPr>
+                <w:rFonts w:ascii="serif" w:hAnsi="serif" w:eastAsia="serif" w:cs="serif"/>
+                <w:i w:val="false"/>
+                <w:b w:val="false"/>
+                <w:u w:val="none"/>
+                <w:sz w:val="20"/>
+                <w:szCs w:val="20"/>
+                <w:color w:val="000000"/>
+              </w:rPr>
+            </w:pPr>
+            <w:r xmlns:w="http://schemas.openxmlformats.org/wordprocessingml/2006/main" xmlns:wp="http://schemas.openxmlformats.org/drawingml/2006/wordprocessingDrawing" xmlns:r="http://schemas.openxmlformats.org/officeDocument/2006/relationships" xmlns:w14="http://schemas.microsoft.com/office/word/2010/wordml">
+              <w:rPr>
+                <w:rFonts w:ascii="serif" w:hAnsi="serif" w:eastAsia="serif" w:cs="serif"/>
+                <w:i w:val="false"/>
+                <w:b w:val="false"/>
+                <w:u w:val="none"/>
+                <w:sz w:val="20"/>
+                <w:szCs w:val="20"/>
+                <w:color w:val="000000"/>
+              </w:rPr>
+              <w:t xml:space="preserve">2.44</w:t>
+            </w:r>
+          </w:p>
+        </w:tc>
+        <w:tc>
+          <w:tcPr>
+            <w:tcBorders>
+              <w:bottom w:val="single" w:sz="12" w:space="0" w:color="666666"/>
+              <w:top w:val="single" w:sz="4" w:space="0" w:color="999999"/>
+              <w:left w:val="none" w:sz="0" w:space="0" w:color="000000"/>
+              <w:right w:val="none" w:sz="0" w:space="0" w:color="000000"/>
+            </w:tcBorders>
+            <w:shd w:val="clear" w:color="auto" w:fill="F2F2F2"/>
+            <w:tcMar>
+              <w:top w:w="0" w:type="dxa"/>
+              <w:bottom w:w="0" w:type="dxa"/>
+              <w:left w:w="0" w:type="dxa"/>
+              <w:right w:w="0" w:type="dxa"/>
+            </w:tcMar>
+            <w:vAlign w:val="center"/>
+          </w:tcPr>
+          <w:p>
+            <w:pPr>
+              <w:jc w:val="center"/>
+              <w:pBdr>
+                <w:bottom w:val="none" w:sz="0" w:space="0" w:color="000000"/>
+                <w:top w:val="none" w:sz="0" w:space="0" w:color="000000"/>
+                <w:left w:val="none" w:sz="0" w:space="0" w:color="000000"/>
+                <w:right w:val="none" w:sz="0" w:space="0" w:color="000000"/>
+              </w:pBdr>
+              <w:spacing w:after="100" w:before="100" w:line="240"/>
+              <w:ind w:left="100" w:right="100" w:firstLine="0" w:firstLineChars="0"/>
+              <w:rPr>
+                <w:rFonts w:ascii="serif" w:hAnsi="serif" w:eastAsia="serif" w:cs="serif"/>
+                <w:i w:val="false"/>
+                <w:b w:val="false"/>
+                <w:u w:val="none"/>
+                <w:sz w:val="20"/>
+                <w:szCs w:val="20"/>
+                <w:color w:val="000000"/>
+              </w:rPr>
+            </w:pPr>
+            <w:r xmlns:w="http://schemas.openxmlformats.org/wordprocessingml/2006/main" xmlns:wp="http://schemas.openxmlformats.org/drawingml/2006/wordprocessingDrawing" xmlns:r="http://schemas.openxmlformats.org/officeDocument/2006/relationships" xmlns:w14="http://schemas.microsoft.com/office/word/2010/wordml">
+              <w:rPr>
+                <w:rFonts w:ascii="serif" w:hAnsi="serif" w:eastAsia="serif" w:cs="serif"/>
+                <w:i w:val="false"/>
+                <w:b w:val="false"/>
+                <w:u w:val="none"/>
+                <w:sz w:val="20"/>
+                <w:szCs w:val="20"/>
+                <w:color w:val="000000"/>
+              </w:rPr>
+              <w:t xml:space="preserve">3.18</w:t>
+            </w:r>
+          </w:p>
+        </w:tc>
+      </w:tr>
+    </w:tbl>
+    <w:p>
+      <w:pPr>
+        <w:pStyle w:val="BodyText"/>
+      </w:pPr>
+      <w:r>
+        <w:rPr>
+          <w:i/>
+          <w:iCs/>
+        </w:rPr>
+        <w:t xml:space="preserve">Note: All values are weighted using PSID family and clan weights and pooled across all years. Income and wealth are size-standardised (divided by household or clan size). Wealth includes home equity.</w:t>
+      </w:r>
+      <w:r>
+        <w:rPr>
+          <w:i/>
+          <w:iCs/>
+        </w:rPr>
+        <w:t xml:space="preserve"> </w:t>
+      </w:r>
+      <w:r>
+        <w:rPr>
+          <w:i/>
+          <w:iCs/>
+        </w:rPr>
+        <w:t xml:space="preserve">‘0 Wealth’</w:t>
+      </w:r>
+      <w:r>
+        <w:rPr>
+          <w:i/>
+          <w:iCs/>
+        </w:rPr>
+        <w:t xml:space="preserve"> </w:t>
+      </w:r>
+      <w:r>
+        <w:rPr>
+          <w:i/>
+          <w:iCs/>
+        </w:rPr>
+        <w:t xml:space="preserve">indicates wealth &lt;= 0. Ratio row shows Black / Non-Black.</w:t>
+      </w:r>
+    </w:p>
+    <w:p>
+      <w:pPr>
+        <w:pStyle w:val="BodyText"/>
+      </w:pPr>
+      <w:r>
+        <w:rPr>
           <w:b/>
           <w:bCs/>
         </w:rPr>
-        <w:t xml:space="preserve">Appendix A2: Case with highest simulated clan-household Gini difference</w:t>
+        <w:t xml:space="preserve">Sensitivity of difference between household- and clan-level Gini coefficients.</w:t>
+      </w:r>
+      <w:r>
+        <w:t xml:space="preserve"> </w:t>
+      </w:r>
+      <w:r>
+        <w:t xml:space="preserve">Across all specifications, estimated inequality is lower when using clans rather than households as the unit of analysis. This finding is robust across race, different inclusion criteria for income and wealth measures, different samples, alternative measures of inequality, and when adjusting for household and clan size. Results from sensitivity analyses are available in Appendix C and D.</w:t>
+      </w:r>
+    </w:p>
+    <w:bookmarkEnd w:id="25"/>
+    <w:bookmarkStart w:id="26" w:name="discussion"/>
+    <w:p>
+      <w:pPr>
+        <w:pStyle w:val="Heading1"/>
+      </w:pPr>
+      <w:r>
+        <w:t xml:space="preserve">Discussion</w:t>
+      </w:r>
+    </w:p>
+    <w:p>
+      <w:pPr>
+        <w:pStyle w:val="FirstParagraph"/>
+      </w:pPr>
+      <w:r>
+        <w:t xml:space="preserve">Our analyses explored what income and wealth inequality in the U.S. look like when examined not only at the household level but also at the level of intergenerational extended families. We found that both income and wealth inequality were more extreme, as per Gini coefficients, when examining society as a collection of households (the standard in the literature) rather than a collection of clans. Income inequality was about 6 points higher for households than for clans, and wealth inequality was about 12 points higher, indicating fewer disparities on average between extended family networks than between households. In other words, an individual’s extended family was more economically similar on average to other extended families than their household was to other households. Thus, claims that current estimates, which focus on households, underestimate inequality</w:t>
+      </w:r>
+      <w:r>
+        <w:t xml:space="preserve"> </w:t>
+      </w:r>
+      <w:r>
+        <w:t xml:space="preserve">[10]</w:t>
+      </w:r>
+      <w:r>
+        <w:t xml:space="preserve"> </w:t>
+      </w:r>
+      <w:r>
+        <w:t xml:space="preserve">may be exaggerated. Inequality between larger family units is lower than inequality between households.</w:t>
+      </w:r>
+    </w:p>
+    <w:p>
+      <w:pPr>
+        <w:pStyle w:val="BodyText"/>
+      </w:pPr>
+      <w:r>
+        <w:t xml:space="preserve">Our analyses provided an important complement to existing scholarship on income and wealth inequality that typically measures inequality at the household level (or in some cases the individual level). Our aim is not to downplay the importance of households as units of analysis, but rather to show that considering multiple units of analysis—including households and clans—is helpful for fully understanding inequality as a complex societal phenomenon. The choice of analytical unit matters in part because different historical periods generate changes in inequality at some levels more than others. For example, our analyses showed that clan-level income inequality has increased more rapidly than household-level income inequality over the study period. By contrast, trends in household and clan inequality were similar for wealth over time. This may reflect the cumulative nature of wealth, which is more durably concentrated within kinship networks</w:t>
+      </w:r>
+      <w:r>
+        <w:t xml:space="preserve"> </w:t>
+      </w:r>
+      <w:r>
+        <w:t xml:space="preserve">[11, 13, 20]</w:t>
+      </w:r>
+      <w:r>
+        <w:t xml:space="preserve">, or limitations of the PSID’s coverage of the top of the wealth distribution, where much wealth inequality is generated. Together, these patterns reinforce the importance of examining inequality at multiple levels of social organization.</w:t>
+      </w:r>
+    </w:p>
+    <w:p>
+      <w:pPr>
+        <w:pStyle w:val="BodyText"/>
+      </w:pPr>
+      <w:r>
+        <w:t xml:space="preserve">Differences in historical patterns between households and clans may reflect changes in mobility over time. Mechanically, lower mobility produces greater homogeneity within clans over time, whereas higher mobility has the opposite effect. Conversely, inequality across extended families may build atop inequality across households in reducing mobility. If resources and constraints are transmitted within clans then rising inequality may further reduce mobility for those in disadvantaged households. In other words, the prevalent concern that high inequality undermines intergenerational mobility</w:t>
+      </w:r>
+      <w:r>
+        <w:t xml:space="preserve"> </w:t>
+      </w:r>
+      <w:r>
+        <w:t xml:space="preserve">[21–23]</w:t>
+      </w:r>
+      <w:r>
+        <w:t xml:space="preserve"> </w:t>
+      </w:r>
+      <w:r>
+        <w:t xml:space="preserve">may operate on both the household and clan levels, fueling future differences in inequality between households and clans. Although our analyses focused on the macro level, they highlighted a clear need for additional research on how extended families structure social life at the micro level. One key question raised by our findings concerns the prevalence and scale of resource transfers within extended families, an issue beyond the scope of this study. Methodologically, our project suggests the need for data and research designs that capture resource flows across kinship networks rather than limiting analysis to households. Taken together, our findings demonstrate that understanding economic inequality requires moving beyond a sole focus on households to also account for the extended family structures through which resources, advantage, and disadvantage are transmitted across generations.</w:t>
+      </w:r>
+    </w:p>
+    <w:bookmarkEnd w:id="26"/>
+    <w:bookmarkStart w:id="27" w:name="materials-and-methods"/>
+    <w:p>
+      <w:pPr>
+        <w:pStyle w:val="Heading1"/>
+      </w:pPr>
+      <w:r>
+        <w:t xml:space="preserve">Materials and Methods</w:t>
+      </w:r>
+    </w:p>
+    <w:p>
+      <w:pPr>
+        <w:pStyle w:val="FirstParagraph"/>
+      </w:pPr>
+      <w:r>
+        <w:rPr>
+          <w:b/>
+          <w:bCs/>
+        </w:rPr>
+        <w:t xml:space="preserve">Data and sample.</w:t>
+      </w:r>
+      <w:r>
+        <w:t xml:space="preserve"> </w:t>
+      </w:r>
+      <w:r>
+        <w:t xml:space="preserve">We use the genealogical design of the Panel Study of Income Dynamics (PSID) to compare estimates of inequality when using households and clans as the unit of analysis. The PSID began in 1968, surveying families annually until 1997 and biennially thereafter. It follows descendants of the original sample across generations and maintains national representativeness. Data from the PSID produce estimates that mostly align with other national surveys</w:t>
+      </w:r>
+      <w:r>
+        <w:t xml:space="preserve"> </w:t>
+      </w:r>
+      <w:r>
+        <w:t xml:space="preserve">[18]</w:t>
+      </w:r>
+      <w:r>
+        <w:t xml:space="preserve">.</w:t>
+      </w:r>
+    </w:p>
+    <w:p>
+      <w:pPr>
+        <w:pStyle w:val="BodyText"/>
+      </w:pPr>
+      <w:r>
+        <w:t xml:space="preserve">The PSID facilitates two linked units of analysis: households and clans. Households consist of economically interdependent individuals living in the same dwelling, with one member reporting data on income and wealth for all members. Household composition changes over time with transitions such as divorce or childbirth; individuals who leave receive a new household identifier. As a result, unique households cannot be identified over time in the PSID. In contrast, clans include all descendants of households sampled in 1968, linked through a PSID-generated identifier, which we refer to as a clan identifier. Households added after 1968 receive their own clan identifier upon entry. Unlike household identifiers, clan membership remains fixed for individuals and can be compared over time. A small number of households (134 household-years) contain couples belonging to different clans; these cases were assigned to both clans.</w:t>
+      </w:r>
+    </w:p>
+    <w:p>
+      <w:pPr>
+        <w:pStyle w:val="BodyText"/>
+      </w:pPr>
+      <w:r>
+        <w:t xml:space="preserve">The PSID has collected income data since its inception but began collecting wealth data only in 1984. As a result, analytic samples differ: income analyses include 242,200 household-years and 64,292 clan-years, representing 2,906 unique clans; wealth analyses include 122,069 household-years and 26,655 clan-years, representing 2,636 unique clans.</w:t>
+      </w:r>
+    </w:p>
+    <w:p>
+      <w:pPr>
+        <w:pStyle w:val="BodyText"/>
+      </w:pPr>
+      <w:r>
+        <w:rPr>
+          <w:b/>
+          <w:bCs/>
+        </w:rPr>
+        <w:t xml:space="preserve">Measures of income and wealth.</w:t>
+      </w:r>
+      <w:r>
+        <w:t xml:space="preserve"> </w:t>
+      </w:r>
+      <w:r>
+        <w:t xml:space="preserve">We measure both income and wealth to capture distinct dimensions of economic inequality. This choice follows from research identifying divergent patterns depending on choice of financial indicator because mechanisms driving wealth inequality are distinct from those driving income inequality</w:t>
+      </w:r>
+      <w:r>
+        <w:t xml:space="preserve"> </w:t>
+      </w:r>
+      <w:r>
+        <w:t xml:space="preserve">[5, 17, 20]</w:t>
+      </w:r>
+      <w:r>
+        <w:t xml:space="preserve">. Aggregate measures for income and wealth are provided by the PSID. Income includes earnings, asset income, transfers, and income from farming and gardening. Wealth includes non-primary real estate, business equity, stocks, bonds, vehicles, retirement accounts, and bank accounts, and includes home equity.</w:t>
+      </w:r>
+    </w:p>
+    <w:p>
+      <w:pPr>
+        <w:pStyle w:val="BodyText"/>
+      </w:pPr>
+      <w:r>
+        <w:t xml:space="preserve">Missing data for components of income and wealth are imputed by the PSID. Concerns about measurement error, especially for wealth, are minimal, as imputation methods utilized by the PSID explain little of the variation in wealth over time</w:t>
+      </w:r>
+      <w:r>
+        <w:t xml:space="preserve"> </w:t>
+      </w:r>
+      <w:r>
+        <w:t xml:space="preserve">[20, 24]</w:t>
+      </w:r>
+      <w:r>
+        <w:t xml:space="preserve">. All income and wealth values are adjusted for inflation. Additionally, analyses set negative values of income and wealth to zero so that Gini coefficients remain in the 0 to 1 range (see Appendix D1 and F1). To construct clan-level measures, we aggregate household income and wealth for all households in a clan within each clan-year.</w:t>
+      </w:r>
+    </w:p>
+    <w:p>
+      <w:pPr>
+        <w:pStyle w:val="BodyText"/>
+      </w:pPr>
+      <w:r>
+        <w:t xml:space="preserve">All results presented are weighted. Using weights does not meaningfully change results (see Appendix D4 and F4). Household-level weights are provided by the PSID. The PSID constructs family weights from individual weights using the fair shares method, which assumes that the probability of observing any individual within a family equals the probability of observing the family itself. We extend this approach to construct clan-level weights using the same fair shares principle. Clan weights assume that the probability of observing a family within a clan equals the probability of observing the clan itself. These weights are applied to total clan income or wealth (rather than mean income or wealth) to avoid double standardization by household counts. In effect, clan weights already incorporate the number of households within a clan. As a result, each clan’s influence reflects the representation of the average household within that clan, rather than scaling mechanically with the clan’s total number of households.</w:t>
+      </w:r>
+    </w:p>
+    <w:p>
+      <w:pPr>
+        <w:pStyle w:val="BodyText"/>
+      </w:pPr>
+      <w:r>
+        <w:rPr>
+          <w:b/>
+          <w:bCs/>
+        </w:rPr>
+        <w:t xml:space="preserve">Measures of race.</w:t>
+      </w:r>
+      <w:r>
+        <w:t xml:space="preserve"> </w:t>
+      </w:r>
+      <w:r>
+        <w:t xml:space="preserve">The PSID collects race data from household heads and, in some years, from spouses. If a respondent ever identifies as Black, then that value is imputed for all years that respondent appears in the data</w:t>
+      </w:r>
+      <w:r>
+        <w:t xml:space="preserve"> </w:t>
+      </w:r>
+      <w:r>
+        <w:t xml:space="preserve">[25]</w:t>
+      </w:r>
+      <w:r>
+        <w:t xml:space="preserve">. Black households are all households with a Black head of household. Black clans are clans in which more than half of the households within it identify as Black. Analyses by race and ethnicity are limited to Black and non-Black categories because there are relatively few clans in the PSID data (2,906 for income and 2,636 for wealth). Additionally, the genealogical design of the PSID reflects the demographics of the United States at the time the survey began in 1968, which constrains analyses of clans for demographic groups that were not prominent at that time. Although the PSID incorporated additional samples over time to reflect the changing demographics of the United States in the PSID sample, ethnicity analyses remain limited because Hispanic/Latino households do not form consistent multigenerational lineages over the full panel and therefore have limited clans.</w:t>
+      </w:r>
+    </w:p>
+    <w:p>
+      <w:pPr>
+        <w:pStyle w:val="BodyText"/>
+      </w:pPr>
+      <w:r>
+        <w:rPr>
+          <w:b/>
+          <w:bCs/>
+        </w:rPr>
+        <w:t xml:space="preserve">Indexing inequality with the Gini coefficient.</w:t>
+      </w:r>
+      <w:r>
+        <w:t xml:space="preserve"> </w:t>
+      </w:r>
+      <w:r>
+        <w:t xml:space="preserve">Inequality is measured using the standard Gini coefficient, which ranges from 0 (perfect equality) to 1 (perfect inequality). Although widely used, the Gini has well-known limitations: it cannot distinguish between different inequality patterns and is most sensitive to variation in the middle of the income or wealth distribution</w:t>
+      </w:r>
+      <w:r>
+        <w:t xml:space="preserve"> </w:t>
+      </w:r>
+      <w:r>
+        <w:t xml:space="preserve">[26–28]</w:t>
+      </w:r>
+      <w:r>
+        <w:t xml:space="preserve">. These features make it well suited to the PSID, which underrepresents wealthy households compared with surveys such as the Survey of Consumer Finance.</w:t>
+      </w:r>
+    </w:p>
+    <w:p>
+      <w:pPr>
+        <w:pStyle w:val="BodyText"/>
+      </w:pPr>
+      <w:r>
+        <w:t xml:space="preserve">Gini coefficients are calculated separately for income and wealth to reflect their distinct dimensions of inequality. Estimates of Gini coefficients in our data are comparable to estimates that other studies have found, though there is more variation in wealth coefficients, likely because the PSID excludes wealthy households (see Appendix B).</w:t>
+      </w:r>
+    </w:p>
+    <w:bookmarkEnd w:id="27"/>
+    <w:bookmarkStart w:id="39" w:name="appendix"/>
+    <w:p>
+      <w:pPr>
+        <w:pStyle w:val="Heading1"/>
+      </w:pPr>
+      <w:r>
+        <w:t xml:space="preserve">Appendix</w:t>
+      </w:r>
+    </w:p>
+    <w:bookmarkStart w:id="37" w:name="appendix-a-simulating-gini-coefficients"/>
+    <w:p>
+      <w:pPr>
+        <w:pStyle w:val="Heading2"/>
+      </w:pPr>
+      <w:r>
+        <w:t xml:space="preserve">Appendix A: Simulating Gini Coefficients</w:t>
+      </w:r>
+    </w:p>
+    <w:p>
+      <w:pPr>
+        <w:pStyle w:val="FirstParagraph"/>
+      </w:pPr>
+      <w:r>
+        <w:t xml:space="preserve">Appendix A illustrates extreme cases from simulated household and clan data. The simulation demonstrates that clan-level Gini coefficients are not necessarily lower than household-level Gini coefficients. The direction of the difference depends on the relationship between clan size, the overall distribution of resources, and the selection of households into clans. Appendix A1 shows the minimum possible difference between clan and household Gini coefficients in the simulated data, while Appendix A2 shows the maximum possible difference. Curves show that Gini coefficients at the clan level can exceed those of households. Appendix A3 illustrates that, while it is more likely for Gini coefficients at the household level to exceed Gini coefficients at the clan level, whether this effect is observed depends on the combination between clan size and income or wealth distribution.</w:t>
+      </w:r>
+    </w:p>
+    <w:p>
+      <w:r>
+        <w:br w:type="page"/>
+      </w:r>
+    </w:p>
+    <w:p>
+      <w:pPr>
+        <w:pStyle w:val="BodyText"/>
+      </w:pPr>
+      <w:r>
+        <w:rPr>
+          <w:b/>
+          <w:bCs/>
+        </w:rPr>
+        <w:t xml:space="preserve">Appendix A1: Case with lowest simulated clan-household Gini difference</w:t>
       </w:r>
       <w:r>
         <w:t xml:space="preserve"> </w:t>
@@ -1010,7 +2569,7 @@
               <a:graphicData uri="http://schemas.openxmlformats.org/drawingml/2006/picture">
                 <pic:pic>
                   <pic:nvPicPr>
-                    <pic:cNvPr descr="/Users/amanda/Desktop/clan_project/10_draft/output/write_files/figure-docx/appendix-a2-1.png" id="30" name="Picture"/>
+                    <pic:cNvPr descr="/Users/amanda/Desktop/clan_project/10_draft/output/write_files/figure-docx/appendix-a1-1.png" id="30" name="Picture"/>
                     <pic:cNvPicPr>
                       <a:picLocks noChangeArrowheads="1" noChangeAspect="1"/>
                     </pic:cNvPicPr>
@@ -1044,11 +2603,6 @@
       </w:r>
     </w:p>
     <w:p>
-      <w:r>
-        <w:br w:type="page"/>
-      </w:r>
-    </w:p>
-    <w:p>
       <w:pPr>
         <w:pStyle w:val="BodyText"/>
       </w:pPr>
@@ -1057,7 +2611,7 @@
           <w:b/>
           <w:bCs/>
         </w:rPr>
-        <w:t xml:space="preserve">Appendix A3: Summary of extreme cases</w:t>
+        <w:t xml:space="preserve">Appendix A2: Case with highest simulated clan-household Gini difference</w:t>
       </w:r>
       <w:r>
         <w:t xml:space="preserve"> </w:t>
@@ -1065,20 +2619,82 @@
       <w:r>
         <w:drawing>
           <wp:inline>
-            <wp:extent cx="5334000" cy="4103076"/>
+            <wp:extent cx="5334000" cy="4000500"/>
             <wp:effectExtent b="0" l="0" r="0" t="0"/>
             <wp:docPr descr="" title="" id="32" name="Picture"/>
             <a:graphic>
               <a:graphicData uri="http://schemas.openxmlformats.org/drawingml/2006/picture">
                 <pic:pic>
                   <pic:nvPicPr>
-                    <pic:cNvPr descr="/Users/amanda/Desktop/clan_project/10_draft/output/write_files/figure-docx/appendix-a3-1.png" id="33" name="Picture"/>
+                    <pic:cNvPr descr="/Users/amanda/Desktop/clan_project/10_draft/output/write_files/figure-docx/appendix-a2-1.png" id="33" name="Picture"/>
                     <pic:cNvPicPr>
                       <a:picLocks noChangeArrowheads="1" noChangeAspect="1"/>
                     </pic:cNvPicPr>
                   </pic:nvPicPr>
                   <pic:blipFill>
                     <a:blip r:embed="rId31"/>
+                    <a:stretch>
+                      <a:fillRect/>
+                    </a:stretch>
+                  </pic:blipFill>
+                  <pic:spPr bwMode="auto">
+                    <a:xfrm>
+                      <a:off x="0" y="0"/>
+                      <a:ext cx="5334000" cy="4000500"/>
+                    </a:xfrm>
+                    <a:prstGeom prst="rect">
+                      <a:avLst/>
+                    </a:prstGeom>
+                    <a:noFill/>
+                    <a:ln w="9525">
+                      <a:noFill/>
+                      <a:headEnd/>
+                      <a:tailEnd/>
+                    </a:ln>
+                  </pic:spPr>
+                </pic:pic>
+              </a:graphicData>
+            </a:graphic>
+          </wp:inline>
+        </w:drawing>
+      </w:r>
+    </w:p>
+    <w:p>
+      <w:r>
+        <w:br w:type="page"/>
+      </w:r>
+    </w:p>
+    <w:p>
+      <w:pPr>
+        <w:pStyle w:val="BodyText"/>
+      </w:pPr>
+      <w:r>
+        <w:rPr>
+          <w:b/>
+          <w:bCs/>
+        </w:rPr>
+        <w:t xml:space="preserve">Appendix A3: Summary of extreme cases</w:t>
+      </w:r>
+      <w:r>
+        <w:t xml:space="preserve"> </w:t>
+      </w:r>
+      <w:r>
+        <w:drawing>
+          <wp:inline>
+            <wp:extent cx="5334000" cy="4103076"/>
+            <wp:effectExtent b="0" l="0" r="0" t="0"/>
+            <wp:docPr descr="" title="" id="35" name="Picture"/>
+            <a:graphic>
+              <a:graphicData uri="http://schemas.openxmlformats.org/drawingml/2006/picture">
+                <pic:pic>
+                  <pic:nvPicPr>
+                    <pic:cNvPr descr="/Users/amanda/Desktop/clan_project/10_draft/output/write_files/figure-docx/appendix-a3-1.png" id="36" name="Picture"/>
+                    <pic:cNvPicPr>
+                      <a:picLocks noChangeArrowheads="1" noChangeAspect="1"/>
+                    </pic:cNvPicPr>
+                  </pic:nvPicPr>
+                  <pic:blipFill>
+                    <a:blip r:embed="rId34"/>
                     <a:stretch>
                       <a:fillRect/>
                     </a:stretch>
@@ -1110,8 +2726,8 @@
         <w:br w:type="page"/>
       </w:r>
     </w:p>
-    <w:bookmarkEnd w:id="34"/>
-    <w:bookmarkStart w:id="35" w:name="X8f4b25e330c8c7d4282a452909c1adb149e7ace"/>
+    <w:bookmarkEnd w:id="37"/>
+    <w:bookmarkStart w:id="38" w:name="X8f4b25e330c8c7d4282a452909c1adb149e7ace"/>
     <w:p>
       <w:pPr>
         <w:pStyle w:val="Heading2"/>
@@ -5308,9 +6924,9 @@
         </w:tc>
       </w:tr>
     </w:tbl>
-    <w:bookmarkEnd w:id="35"/>
-    <w:bookmarkEnd w:id="36"/>
-    <w:bookmarkStart w:id="40" w:name="X0725f81ad50d659f5f315d5b9354a8278899984"/>
+    <w:bookmarkEnd w:id="38"/>
+    <w:bookmarkEnd w:id="39"/>
+    <w:bookmarkStart w:id="43" w:name="X0725f81ad50d659f5f315d5b9354a8278899984"/>
     <w:p>
       <w:pPr>
         <w:pStyle w:val="Heading1"/>
@@ -5328,18 +6944,18 @@
           <wp:inline>
             <wp:extent cx="5334000" cy="4953000"/>
             <wp:effectExtent b="0" l="0" r="0" t="0"/>
-            <wp:docPr descr="" title="" id="38" name="Picture"/>
+            <wp:docPr descr="" title="" id="41" name="Picture"/>
             <a:graphic>
               <a:graphicData uri="http://schemas.openxmlformats.org/drawingml/2006/picture">
                 <pic:pic>
                   <pic:nvPicPr>
-                    <pic:cNvPr descr="/Users/amanda/Desktop/clan_project/10_draft/output/write_files/figure-docx/appendix-c-1.png" id="39" name="Picture"/>
+                    <pic:cNvPr descr="/Users/amanda/Desktop/clan_project/10_draft/output/write_files/figure-docx/appendix-c-1.png" id="42" name="Picture"/>
                     <pic:cNvPicPr>
                       <a:picLocks noChangeArrowheads="1" noChangeAspect="1"/>
                     </pic:cNvPicPr>
                   </pic:nvPicPr>
                   <pic:blipFill>
-                    <a:blip r:embed="rId37"/>
+                    <a:blip r:embed="rId40"/>
                     <a:stretch>
                       <a:fillRect/>
                     </a:stretch>
@@ -5366,8 +6982,8 @@
         </w:drawing>
       </w:r>
     </w:p>
-    <w:bookmarkEnd w:id="40"/>
-    <w:bookmarkStart w:id="44" w:name="appendix-d1-sensitivity-negative-values"/>
+    <w:bookmarkEnd w:id="43"/>
+    <w:bookmarkStart w:id="47" w:name="appendix-d1-sensitivity-negative-values"/>
     <w:p>
       <w:pPr>
         <w:pStyle w:val="Heading1"/>
@@ -5385,18 +7001,18 @@
           <wp:inline>
             <wp:extent cx="5334000" cy="4191000"/>
             <wp:effectExtent b="0" l="0" r="0" t="0"/>
-            <wp:docPr descr="" title="" id="42" name="Picture"/>
+            <wp:docPr descr="" title="" id="45" name="Picture"/>
             <a:graphic>
               <a:graphicData uri="http://schemas.openxmlformats.org/drawingml/2006/picture">
                 <pic:pic>
                   <pic:nvPicPr>
-                    <pic:cNvPr descr="/Users/amanda/Desktop/clan_project/10_draft/output/write_files/figure-docx/appendix-d1-1.png" id="43" name="Picture"/>
+                    <pic:cNvPr descr="/Users/amanda/Desktop/clan_project/10_draft/output/write_files/figure-docx/appendix-d1-1.png" id="46" name="Picture"/>
                     <pic:cNvPicPr>
                       <a:picLocks noChangeArrowheads="1" noChangeAspect="1"/>
                     </pic:cNvPicPr>
                   </pic:nvPicPr>
                   <pic:blipFill>
-                    <a:blip r:embed="rId41"/>
+                    <a:blip r:embed="rId44"/>
                     <a:stretch>
                       <a:fillRect/>
                     </a:stretch>
@@ -5423,8 +7039,8 @@
         </w:drawing>
       </w:r>
     </w:p>
-    <w:bookmarkEnd w:id="44"/>
-    <w:bookmarkStart w:id="48" w:name="X2c0ca198151b488f0a5fd9ab3a13059241107bf"/>
+    <w:bookmarkEnd w:id="47"/>
+    <w:bookmarkStart w:id="51" w:name="X2c0ca198151b488f0a5fd9ab3a13059241107bf"/>
     <w:p>
       <w:pPr>
         <w:pStyle w:val="Heading1"/>
@@ -5442,18 +7058,18 @@
           <wp:inline>
             <wp:extent cx="5334000" cy="2667000"/>
             <wp:effectExtent b="0" l="0" r="0" t="0"/>
-            <wp:docPr descr="" title="" id="46" name="Picture"/>
+            <wp:docPr descr="" title="" id="49" name="Picture"/>
             <a:graphic>
               <a:graphicData uri="http://schemas.openxmlformats.org/drawingml/2006/picture">
                 <pic:pic>
                   <pic:nvPicPr>
-                    <pic:cNvPr descr="/Users/amanda/Desktop/clan_project/10_draft/output/write_files/figure-docx/appendix-d2-1.png" id="47" name="Picture"/>
+                    <pic:cNvPr descr="/Users/amanda/Desktop/clan_project/10_draft/output/write_files/figure-docx/appendix-d2-1.png" id="50" name="Picture"/>
                     <pic:cNvPicPr>
                       <a:picLocks noChangeArrowheads="1" noChangeAspect="1"/>
                     </pic:cNvPicPr>
                   </pic:nvPicPr>
                   <pic:blipFill>
-                    <a:blip r:embed="rId45"/>
+                    <a:blip r:embed="rId48"/>
                     <a:stretch>
                       <a:fillRect/>
                     </a:stretch>
@@ -5480,8 +7096,8 @@
         </w:drawing>
       </w:r>
     </w:p>
-    <w:bookmarkEnd w:id="48"/>
-    <w:bookmarkStart w:id="52" w:name="X796f0aa327689e7912dc08c18898cdb7c82e5b7"/>
+    <w:bookmarkEnd w:id="51"/>
+    <w:bookmarkStart w:id="55" w:name="X796f0aa327689e7912dc08c18898cdb7c82e5b7"/>
     <w:p>
       <w:pPr>
         <w:pStyle w:val="Heading1"/>
@@ -5499,18 +7115,18 @@
           <wp:inline>
             <wp:extent cx="5334000" cy="4191000"/>
             <wp:effectExtent b="0" l="0" r="0" t="0"/>
-            <wp:docPr descr="" title="" id="50" name="Picture"/>
+            <wp:docPr descr="" title="" id="53" name="Picture"/>
             <a:graphic>
               <a:graphicData uri="http://schemas.openxmlformats.org/drawingml/2006/picture">
                 <pic:pic>
                   <pic:nvPicPr>
-                    <pic:cNvPr descr="/Users/amanda/Desktop/clan_project/10_draft/output/write_files/figure-docx/appendix-d3-1.png" id="51" name="Picture"/>
+                    <pic:cNvPr descr="/Users/amanda/Desktop/clan_project/10_draft/output/write_files/figure-docx/appendix-d3-1.png" id="54" name="Picture"/>
                     <pic:cNvPicPr>
                       <a:picLocks noChangeArrowheads="1" noChangeAspect="1"/>
                     </pic:cNvPicPr>
                   </pic:nvPicPr>
                   <pic:blipFill>
-                    <a:blip r:embed="rId49"/>
+                    <a:blip r:embed="rId52"/>
                     <a:stretch>
                       <a:fillRect/>
                     </a:stretch>
@@ -5537,8 +7153,8 @@
         </w:drawing>
       </w:r>
     </w:p>
-    <w:bookmarkEnd w:id="52"/>
-    <w:bookmarkStart w:id="56" w:name="appendix-d4-sensitivity-weighting"/>
+    <w:bookmarkEnd w:id="55"/>
+    <w:bookmarkStart w:id="59" w:name="appendix-d4-sensitivity-weighting"/>
     <w:p>
       <w:pPr>
         <w:pStyle w:val="Heading1"/>
@@ -5556,18 +7172,18 @@
           <wp:inline>
             <wp:extent cx="5334000" cy="4191000"/>
             <wp:effectExtent b="0" l="0" r="0" t="0"/>
-            <wp:docPr descr="" title="" id="54" name="Picture"/>
+            <wp:docPr descr="" title="" id="57" name="Picture"/>
             <a:graphic>
               <a:graphicData uri="http://schemas.openxmlformats.org/drawingml/2006/picture">
                 <pic:pic>
                   <pic:nvPicPr>
-                    <pic:cNvPr descr="/Users/amanda/Desktop/clan_project/10_draft/output/write_files/figure-docx/appendix-d4-1.png" id="55" name="Picture"/>
+                    <pic:cNvPr descr="/Users/amanda/Desktop/clan_project/10_draft/output/write_files/figure-docx/appendix-d4-1.png" id="58" name="Picture"/>
                     <pic:cNvPicPr>
                       <a:picLocks noChangeArrowheads="1" noChangeAspect="1"/>
                     </pic:cNvPicPr>
                   </pic:nvPicPr>
                   <pic:blipFill>
-                    <a:blip r:embed="rId53"/>
+                    <a:blip r:embed="rId56"/>
                     <a:stretch>
                       <a:fillRect/>
                     </a:stretch>
@@ -5594,8 +7210,8 @@
         </w:drawing>
       </w:r>
     </w:p>
-    <w:bookmarkEnd w:id="56"/>
-    <w:bookmarkStart w:id="60" w:name="X47e0622b93f76056e7f4ad3b772b6ce26b8cfe3"/>
+    <w:bookmarkEnd w:id="59"/>
+    <w:bookmarkStart w:id="63" w:name="X47e0622b93f76056e7f4ad3b772b6ce26b8cfe3"/>
     <w:p>
       <w:pPr>
         <w:pStyle w:val="Heading1"/>
@@ -5613,18 +7229,18 @@
           <wp:inline>
             <wp:extent cx="5334000" cy="4191000"/>
             <wp:effectExtent b="0" l="0" r="0" t="0"/>
-            <wp:docPr descr="" title="" id="58" name="Picture"/>
+            <wp:docPr descr="" title="" id="61" name="Picture"/>
             <a:graphic>
               <a:graphicData uri="http://schemas.openxmlformats.org/drawingml/2006/picture">
                 <pic:pic>
                   <pic:nvPicPr>
-                    <pic:cNvPr descr="/Users/amanda/Desktop/clan_project/10_draft/output/write_files/figure-docx/appendix-d5-1.png" id="59" name="Picture"/>
+                    <pic:cNvPr descr="/Users/amanda/Desktop/clan_project/10_draft/output/write_files/figure-docx/appendix-d5-1.png" id="62" name="Picture"/>
                     <pic:cNvPicPr>
                       <a:picLocks noChangeArrowheads="1" noChangeAspect="1"/>
                     </pic:cNvPicPr>
                   </pic:nvPicPr>
                   <pic:blipFill>
-                    <a:blip r:embed="rId57"/>
+                    <a:blip r:embed="rId60"/>
                     <a:stretch>
                       <a:fillRect/>
                     </a:stretch>
@@ -5651,8 +7267,8 @@
         </w:drawing>
       </w:r>
     </w:p>
-    <w:bookmarkEnd w:id="60"/>
-    <w:bookmarkStart w:id="64" w:name="X750f075da32d67249c4b5a4cf57648e8a17e2c3"/>
+    <w:bookmarkEnd w:id="63"/>
+    <w:bookmarkStart w:id="67" w:name="X750f075da32d67249c4b5a4cf57648e8a17e2c3"/>
     <w:p>
       <w:pPr>
         <w:pStyle w:val="Heading1"/>
@@ -5670,18 +7286,18 @@
           <wp:inline>
             <wp:extent cx="5334000" cy="4191000"/>
             <wp:effectExtent b="0" l="0" r="0" t="0"/>
-            <wp:docPr descr="" title="" id="62" name="Picture"/>
+            <wp:docPr descr="" title="" id="65" name="Picture"/>
             <a:graphic>
               <a:graphicData uri="http://schemas.openxmlformats.org/drawingml/2006/picture">
                 <pic:pic>
                   <pic:nvPicPr>
-                    <pic:cNvPr descr="/Users/amanda/Desktop/clan_project/10_draft/output/write_files/figure-docx/appendix-d6-1.png" id="63" name="Picture"/>
+                    <pic:cNvPr descr="/Users/amanda/Desktop/clan_project/10_draft/output/write_files/figure-docx/appendix-d6-1.png" id="66" name="Picture"/>
                     <pic:cNvPicPr>
                       <a:picLocks noChangeArrowheads="1" noChangeAspect="1"/>
                     </pic:cNvPicPr>
                   </pic:nvPicPr>
                   <pic:blipFill>
-                    <a:blip r:embed="rId61"/>
+                    <a:blip r:embed="rId64"/>
                     <a:stretch>
                       <a:fillRect/>
                     </a:stretch>
@@ -5708,8 +7324,8 @@
         </w:drawing>
       </w:r>
     </w:p>
-    <w:bookmarkEnd w:id="64"/>
-    <w:bookmarkStart w:id="68" w:name="X3ca48920e7b797c3dd18e23810b9df77528cee2"/>
+    <w:bookmarkEnd w:id="67"/>
+    <w:bookmarkStart w:id="71" w:name="X3ca48920e7b797c3dd18e23810b9df77528cee2"/>
     <w:p>
       <w:pPr>
         <w:pStyle w:val="Heading1"/>
@@ -5727,18 +7343,18 @@
           <wp:inline>
             <wp:extent cx="5334000" cy="4191000"/>
             <wp:effectExtent b="0" l="0" r="0" t="0"/>
-            <wp:docPr descr="" title="" id="66" name="Picture"/>
+            <wp:docPr descr="" title="" id="69" name="Picture"/>
             <a:graphic>
               <a:graphicData uri="http://schemas.openxmlformats.org/drawingml/2006/picture">
                 <pic:pic>
                   <pic:nvPicPr>
-                    <pic:cNvPr descr="/Users/amanda/Desktop/clan_project/10_draft/output/write_files/figure-docx/appendix-e-1.png" id="67" name="Picture"/>
+                    <pic:cNvPr descr="/Users/amanda/Desktop/clan_project/10_draft/output/write_files/figure-docx/appendix-e-1.png" id="70" name="Picture"/>
                     <pic:cNvPicPr>
                       <a:picLocks noChangeArrowheads="1" noChangeAspect="1"/>
                     </pic:cNvPicPr>
                   </pic:nvPicPr>
                   <pic:blipFill>
-                    <a:blip r:embed="rId65"/>
+                    <a:blip r:embed="rId68"/>
                     <a:stretch>
                       <a:fillRect/>
                     </a:stretch>
@@ -5765,8 +7381,8 @@
         </w:drawing>
       </w:r>
     </w:p>
-    <w:bookmarkEnd w:id="68"/>
-    <w:bookmarkStart w:id="72" w:name="appendix-f1-race-ratios-negative-values"/>
+    <w:bookmarkEnd w:id="71"/>
+    <w:bookmarkStart w:id="75" w:name="appendix-f1-race-ratios-negative-values"/>
     <w:p>
       <w:pPr>
         <w:pStyle w:val="Heading1"/>
@@ -5784,18 +7400,18 @@
           <wp:inline>
             <wp:extent cx="5334000" cy="4191000"/>
             <wp:effectExtent b="0" l="0" r="0" t="0"/>
-            <wp:docPr descr="" title="" id="70" name="Picture"/>
+            <wp:docPr descr="" title="" id="73" name="Picture"/>
             <a:graphic>
               <a:graphicData uri="http://schemas.openxmlformats.org/drawingml/2006/picture">
                 <pic:pic>
                   <pic:nvPicPr>
-                    <pic:cNvPr descr="/Users/amanda/Desktop/clan_project/10_draft/output/write_files/figure-docx/appendix-f1-1.png" id="71" name="Picture"/>
+                    <pic:cNvPr descr="/Users/amanda/Desktop/clan_project/10_draft/output/write_files/figure-docx/appendix-f1-1.png" id="74" name="Picture"/>
                     <pic:cNvPicPr>
                       <a:picLocks noChangeArrowheads="1" noChangeAspect="1"/>
                     </pic:cNvPicPr>
                   </pic:nvPicPr>
                   <pic:blipFill>
-                    <a:blip r:embed="rId69"/>
+                    <a:blip r:embed="rId72"/>
                     <a:stretch>
                       <a:fillRect/>
                     </a:stretch>
@@ -5822,8 +7438,8 @@
         </w:drawing>
       </w:r>
     </w:p>
-    <w:bookmarkEnd w:id="72"/>
-    <w:bookmarkStart w:id="76" w:name="Xe408c392d53d71a7a9d72befc7a6c94911a5caf"/>
+    <w:bookmarkEnd w:id="75"/>
+    <w:bookmarkStart w:id="79" w:name="Xe408c392d53d71a7a9d72befc7a6c94911a5caf"/>
     <w:p>
       <w:pPr>
         <w:pStyle w:val="Heading1"/>
@@ -5841,18 +7457,18 @@
           <wp:inline>
             <wp:extent cx="5334000" cy="2667000"/>
             <wp:effectExtent b="0" l="0" r="0" t="0"/>
-            <wp:docPr descr="" title="" id="74" name="Picture"/>
+            <wp:docPr descr="" title="" id="77" name="Picture"/>
             <a:graphic>
               <a:graphicData uri="http://schemas.openxmlformats.org/drawingml/2006/picture">
                 <pic:pic>
                   <pic:nvPicPr>
-                    <pic:cNvPr descr="/Users/amanda/Desktop/clan_project/10_draft/output/write_files/figure-docx/appendix-f2-1.png" id="75" name="Picture"/>
+                    <pic:cNvPr descr="/Users/amanda/Desktop/clan_project/10_draft/output/write_files/figure-docx/appendix-f2-1.png" id="78" name="Picture"/>
                     <pic:cNvPicPr>
                       <a:picLocks noChangeArrowheads="1" noChangeAspect="1"/>
                     </pic:cNvPicPr>
                   </pic:nvPicPr>
                   <pic:blipFill>
-                    <a:blip r:embed="rId73"/>
+                    <a:blip r:embed="rId76"/>
                     <a:stretch>
                       <a:fillRect/>
                     </a:stretch>
@@ -5879,8 +7495,8 @@
         </w:drawing>
       </w:r>
     </w:p>
-    <w:bookmarkEnd w:id="76"/>
-    <w:bookmarkStart w:id="80" w:name="X9f0dd96eadad89e8a50793fc4b191c5f1b6409e"/>
+    <w:bookmarkEnd w:id="79"/>
+    <w:bookmarkStart w:id="83" w:name="X9f0dd96eadad89e8a50793fc4b191c5f1b6409e"/>
     <w:p>
       <w:pPr>
         <w:pStyle w:val="Heading1"/>
@@ -5898,18 +7514,18 @@
           <wp:inline>
             <wp:extent cx="5334000" cy="4191000"/>
             <wp:effectExtent b="0" l="0" r="0" t="0"/>
-            <wp:docPr descr="" title="" id="78" name="Picture"/>
+            <wp:docPr descr="" title="" id="81" name="Picture"/>
             <a:graphic>
               <a:graphicData uri="http://schemas.openxmlformats.org/drawingml/2006/picture">
                 <pic:pic>
                   <pic:nvPicPr>
-                    <pic:cNvPr descr="/Users/amanda/Desktop/clan_project/10_draft/output/write_files/figure-docx/appendix-f3-1.png" id="79" name="Picture"/>
+                    <pic:cNvPr descr="/Users/amanda/Desktop/clan_project/10_draft/output/write_files/figure-docx/appendix-f3-1.png" id="82" name="Picture"/>
                     <pic:cNvPicPr>
                       <a:picLocks noChangeArrowheads="1" noChangeAspect="1"/>
                     </pic:cNvPicPr>
                   </pic:nvPicPr>
                   <pic:blipFill>
-                    <a:blip r:embed="rId77"/>
+                    <a:blip r:embed="rId80"/>
                     <a:stretch>
                       <a:fillRect/>
                     </a:stretch>
@@ -5936,8 +7552,8 @@
         </w:drawing>
       </w:r>
     </w:p>
-    <w:bookmarkEnd w:id="80"/>
-    <w:bookmarkStart w:id="151" w:name="appendix-f4-race-ratios-weighting"/>
+    <w:bookmarkEnd w:id="83"/>
+    <w:bookmarkStart w:id="154" w:name="appendix-f4-race-ratios-weighting"/>
     <w:p>
       <w:pPr>
         <w:pStyle w:val="Heading1"/>
@@ -5955,18 +7571,18 @@
           <wp:inline>
             <wp:extent cx="5334000" cy="4191000"/>
             <wp:effectExtent b="0" l="0" r="0" t="0"/>
-            <wp:docPr descr="" title="" id="82" name="Picture"/>
+            <wp:docPr descr="" title="" id="85" name="Picture"/>
             <a:graphic>
               <a:graphicData uri="http://schemas.openxmlformats.org/drawingml/2006/picture">
                 <pic:pic>
                   <pic:nvPicPr>
-                    <pic:cNvPr descr="/Users/amanda/Desktop/clan_project/10_draft/output/write_files/figure-docx/appendix-f4-1.png" id="83" name="Picture"/>
+                    <pic:cNvPr descr="/Users/amanda/Desktop/clan_project/10_draft/output/write_files/figure-docx/appendix-f4-1.png" id="86" name="Picture"/>
                     <pic:cNvPicPr>
                       <a:picLocks noChangeArrowheads="1" noChangeAspect="1"/>
                     </pic:cNvPicPr>
                   </pic:nvPicPr>
                   <pic:blipFill>
-                    <a:blip r:embed="rId81"/>
+                    <a:blip r:embed="rId84"/>
                     <a:stretch>
                       <a:fillRect/>
                     </a:stretch>
@@ -5993,8 +7609,8 @@
         </w:drawing>
       </w:r>
     </w:p>
-    <w:bookmarkStart w:id="150" w:name="refs"/>
-    <w:bookmarkStart w:id="85" w:name="ref-fred_gini_2025"/>
+    <w:bookmarkStart w:id="153" w:name="refs"/>
+    <w:bookmarkStart w:id="88" w:name="ref-fred_gini_2025"/>
     <w:p>
       <w:pPr>
         <w:pStyle w:val="Bibliography"/>
@@ -6047,7 +7663,7 @@
       <w:r>
         <w:t xml:space="preserve"> </w:t>
       </w:r>
-      <w:hyperlink r:id="rId84">
+      <w:hyperlink r:id="rId87">
         <w:r>
           <w:rPr>
             <w:rStyle w:val="Hyperlink"/>
@@ -6056,8 +7672,8 @@
         </w:r>
       </w:hyperlink>
     </w:p>
-    <w:bookmarkEnd w:id="85"/>
-    <w:bookmarkStart w:id="87" w:name="ref-barro_decline_2020"/>
+    <w:bookmarkEnd w:id="88"/>
+    <w:bookmarkStart w:id="90" w:name="ref-barro_decline_2020"/>
     <w:p>
       <w:pPr>
         <w:pStyle w:val="Bibliography"/>
@@ -6128,7 +7744,7 @@
       <w:r>
         <w:t xml:space="preserve"> </w:t>
       </w:r>
-      <w:hyperlink r:id="rId86">
+      <w:hyperlink r:id="rId89">
         <w:r>
           <w:rPr>
             <w:rStyle w:val="Hyperlink"/>
@@ -6137,8 +7753,8 @@
         </w:r>
       </w:hyperlink>
     </w:p>
-    <w:bookmarkEnd w:id="87"/>
-    <w:bookmarkStart w:id="90" w:name="ref-kuhn_income_2025"/>
+    <w:bookmarkEnd w:id="90"/>
+    <w:bookmarkStart w:id="93" w:name="ref-kuhn_income_2025"/>
     <w:p>
       <w:pPr>
         <w:pStyle w:val="Bibliography"/>
@@ -6224,7 +7840,7 @@
       <w:r>
         <w:t xml:space="preserve"> </w:t>
       </w:r>
-      <w:hyperlink r:id="rId88">
+      <w:hyperlink r:id="rId91">
         <w:r>
           <w:rPr>
             <w:rStyle w:val="Hyperlink"/>
@@ -6235,7 +7851,7 @@
       <w:r>
         <w:t xml:space="preserve">. doi:</w:t>
       </w:r>
-      <w:hyperlink r:id="rId89">
+      <w:hyperlink r:id="rId92">
         <w:r>
           <w:rPr>
             <w:rStyle w:val="Hyperlink"/>
@@ -6244,8 +7860,8 @@
         </w:r>
       </w:hyperlink>
     </w:p>
-    <w:bookmarkEnd w:id="90"/>
-    <w:bookmarkStart w:id="93" w:name="ref-auten_income_2024"/>
+    <w:bookmarkEnd w:id="93"/>
+    <w:bookmarkStart w:id="96" w:name="ref-auten_income_2024"/>
     <w:p>
       <w:pPr>
         <w:pStyle w:val="Bibliography"/>
@@ -6343,7 +7959,7 @@
       <w:r>
         <w:t xml:space="preserve"> </w:t>
       </w:r>
-      <w:hyperlink r:id="rId91">
+      <w:hyperlink r:id="rId94">
         <w:r>
           <w:rPr>
             <w:rStyle w:val="Hyperlink"/>
@@ -6354,7 +7970,7 @@
       <w:r>
         <w:t xml:space="preserve">. doi:</w:t>
       </w:r>
-      <w:hyperlink r:id="rId92">
+      <w:hyperlink r:id="rId95">
         <w:r>
           <w:rPr>
             <w:rStyle w:val="Hyperlink"/>
@@ -6363,8 +7979,8 @@
         </w:r>
       </w:hyperlink>
     </w:p>
-    <w:bookmarkEnd w:id="93"/>
-    <w:bookmarkStart w:id="96" w:name="ref-killewald_wealth_2017"/>
+    <w:bookmarkEnd w:id="96"/>
+    <w:bookmarkStart w:id="99" w:name="ref-killewald_wealth_2017"/>
     <w:p>
       <w:pPr>
         <w:pStyle w:val="Bibliography"/>
@@ -6405,7 +8021,7 @@
       <w:r>
         <w:t xml:space="preserve"> </w:t>
       </w:r>
-      <w:hyperlink r:id="rId94">
+      <w:hyperlink r:id="rId97">
         <w:r>
           <w:rPr>
             <w:rStyle w:val="Hyperlink"/>
@@ -6416,7 +8032,7 @@
       <w:r>
         <w:t xml:space="preserve">. doi:</w:t>
       </w:r>
-      <w:hyperlink r:id="rId95">
+      <w:hyperlink r:id="rId98">
         <w:r>
           <w:rPr>
             <w:rStyle w:val="Hyperlink"/>
@@ -6425,8 +8041,8 @@
         </w:r>
       </w:hyperlink>
     </w:p>
-    <w:bookmarkEnd w:id="96"/>
-    <w:bookmarkStart w:id="98" w:name="ref-saez_wealth_2016"/>
+    <w:bookmarkEnd w:id="99"/>
+    <w:bookmarkStart w:id="101" w:name="ref-saez_wealth_2016"/>
     <w:p>
       <w:pPr>
         <w:pStyle w:val="Bibliography"/>
@@ -6518,7 +8134,7 @@
       <w:r>
         <w:t xml:space="preserve"> </w:t>
       </w:r>
-      <w:hyperlink r:id="rId97">
+      <w:hyperlink r:id="rId100">
         <w:r>
           <w:rPr>
             <w:rStyle w:val="Hyperlink"/>
@@ -6529,7 +8145,7 @@
       <w:r>
         <w:t xml:space="preserve">. doi:</w:t>
       </w:r>
-      <w:hyperlink r:id="rId97">
+      <w:hyperlink r:id="rId100">
         <w:r>
           <w:rPr>
             <w:rStyle w:val="Hyperlink"/>
@@ -6538,8 +8154,8 @@
         </w:r>
       </w:hyperlink>
     </w:p>
-    <w:bookmarkEnd w:id="98"/>
-    <w:bookmarkStart w:id="99" w:name="ref-goode_world_1963"/>
+    <w:bookmarkEnd w:id="101"/>
+    <w:bookmarkStart w:id="102" w:name="ref-goode_world_1963"/>
     <w:p>
       <w:pPr>
         <w:pStyle w:val="Bibliography"/>
@@ -6557,8 +8173,8 @@
         <w:t xml:space="preserve">Goode WJ. World revolution and family patterns. Oxford, England: Free Press Glencoe; 1963.</w:t>
       </w:r>
     </w:p>
-    <w:bookmarkEnd w:id="99"/>
-    <w:bookmarkStart w:id="101" w:name="ref-parsons_essays_1954"/>
+    <w:bookmarkEnd w:id="102"/>
+    <w:bookmarkStart w:id="104" w:name="ref-parsons_essays_1954"/>
     <w:p>
       <w:pPr>
         <w:pStyle w:val="Bibliography"/>
@@ -6590,7 +8206,7 @@
       <w:r>
         <w:t xml:space="preserve">. 2nd ed. New York, NY, US: MacMillan Co; 1954. doi:</w:t>
       </w:r>
-      <w:hyperlink r:id="rId100">
+      <w:hyperlink r:id="rId103">
         <w:r>
           <w:rPr>
             <w:rStyle w:val="Hyperlink"/>
@@ -6599,8 +8215,8 @@
         </w:r>
       </w:hyperlink>
     </w:p>
-    <w:bookmarkEnd w:id="101"/>
-    <w:bookmarkStart w:id="103" w:name="ref-pilkauskas_beyond_2018"/>
+    <w:bookmarkEnd w:id="104"/>
+    <w:bookmarkStart w:id="106" w:name="ref-pilkauskas_beyond_2018"/>
     <w:p>
       <w:pPr>
         <w:pStyle w:val="Bibliography"/>
@@ -6680,7 +8296,7 @@
       <w:r>
         <w:t xml:space="preserve"> </w:t>
       </w:r>
-      <w:hyperlink r:id="rId102">
+      <w:hyperlink r:id="rId105">
         <w:r>
           <w:rPr>
             <w:rStyle w:val="Hyperlink"/>
@@ -6691,7 +8307,7 @@
       <w:r>
         <w:t xml:space="preserve">. doi:</w:t>
       </w:r>
-      <w:hyperlink r:id="rId102">
+      <w:hyperlink r:id="rId105">
         <w:r>
           <w:rPr>
             <w:rStyle w:val="Hyperlink"/>
@@ -6700,8 +8316,8 @@
         </w:r>
       </w:hyperlink>
     </w:p>
-    <w:bookmarkEnd w:id="103"/>
-    <w:bookmarkStart w:id="105" w:name="ref-mare_multigenerational_2011"/>
+    <w:bookmarkEnd w:id="106"/>
+    <w:bookmarkStart w:id="108" w:name="ref-mare_multigenerational_2011"/>
     <w:p>
       <w:pPr>
         <w:pStyle w:val="Bibliography"/>
@@ -6748,7 +8364,7 @@
       <w:r>
         <w:t xml:space="preserve"> </w:t>
       </w:r>
-      <w:hyperlink r:id="rId104">
+      <w:hyperlink r:id="rId107">
         <w:r>
           <w:rPr>
             <w:rStyle w:val="Hyperlink"/>
@@ -6759,7 +8375,7 @@
       <w:r>
         <w:t xml:space="preserve">. doi:</w:t>
       </w:r>
-      <w:hyperlink r:id="rId104">
+      <w:hyperlink r:id="rId107">
         <w:r>
           <w:rPr>
             <w:rStyle w:val="Hyperlink"/>
@@ -6768,8 +8384,8 @@
         </w:r>
       </w:hyperlink>
     </w:p>
-    <w:bookmarkEnd w:id="105"/>
-    <w:bookmarkStart w:id="107" w:name="ref-obrien_family_2024"/>
+    <w:bookmarkEnd w:id="108"/>
+    <w:bookmarkStart w:id="110" w:name="ref-obrien_family_2024"/>
     <w:p>
       <w:pPr>
         <w:pStyle w:val="Bibliography"/>
@@ -6801,7 +8417,7 @@
       <w:r>
         <w:t xml:space="preserve"> </w:t>
       </w:r>
-      <w:hyperlink r:id="rId106">
+      <w:hyperlink r:id="rId109">
         <w:r>
           <w:rPr>
             <w:rStyle w:val="Hyperlink"/>
@@ -6812,7 +8428,7 @@
       <w:r>
         <w:t xml:space="preserve">. doi:</w:t>
       </w:r>
-      <w:hyperlink r:id="rId106">
+      <w:hyperlink r:id="rId109">
         <w:r>
           <w:rPr>
             <w:rStyle w:val="Hyperlink"/>
@@ -6821,8 +8437,8 @@
         </w:r>
       </w:hyperlink>
     </w:p>
-    <w:bookmarkEnd w:id="107"/>
-    <w:bookmarkStart w:id="109" w:name="ref-shiffer-sebba_keeping_2025"/>
+    <w:bookmarkEnd w:id="110"/>
+    <w:bookmarkStart w:id="112" w:name="ref-shiffer-sebba_keeping_2025"/>
     <w:p>
       <w:pPr>
         <w:pStyle w:val="Bibliography"/>
@@ -6902,7 +8518,7 @@
       <w:r>
         <w:t xml:space="preserve"> </w:t>
       </w:r>
-      <w:hyperlink r:id="rId108">
+      <w:hyperlink r:id="rId111">
         <w:r>
           <w:rPr>
             <w:rStyle w:val="Hyperlink"/>
@@ -6913,7 +8529,7 @@
       <w:r>
         <w:t xml:space="preserve">. doi:</w:t>
       </w:r>
-      <w:hyperlink r:id="rId108">
+      <w:hyperlink r:id="rId111">
         <w:r>
           <w:rPr>
             <w:rStyle w:val="Hyperlink"/>
@@ -6922,8 +8538,8 @@
         </w:r>
       </w:hyperlink>
     </w:p>
-    <w:bookmarkEnd w:id="109"/>
-    <w:bookmarkStart w:id="112" w:name="ref-adermon_dynastic_2021"/>
+    <w:bookmarkEnd w:id="112"/>
+    <w:bookmarkStart w:id="115" w:name="ref-adermon_dynastic_2021"/>
     <w:p>
       <w:pPr>
         <w:pStyle w:val="Bibliography"/>
@@ -6982,7 +8598,7 @@
       <w:r>
         <w:t xml:space="preserve"> </w:t>
       </w:r>
-      <w:hyperlink r:id="rId110">
+      <w:hyperlink r:id="rId113">
         <w:r>
           <w:rPr>
             <w:rStyle w:val="Hyperlink"/>
@@ -6993,7 +8609,7 @@
       <w:r>
         <w:t xml:space="preserve">. doi:</w:t>
       </w:r>
-      <w:hyperlink r:id="rId111">
+      <w:hyperlink r:id="rId114">
         <w:r>
           <w:rPr>
             <w:rStyle w:val="Hyperlink"/>
@@ -7002,8 +8618,8 @@
         </w:r>
       </w:hyperlink>
     </w:p>
-    <w:bookmarkEnd w:id="112"/>
-    <w:bookmarkStart w:id="115" w:name="ref-hallsten_shadow_2023"/>
+    <w:bookmarkEnd w:id="115"/>
+    <w:bookmarkStart w:id="118" w:name="ref-hallsten_shadow_2023"/>
     <w:p>
       <w:pPr>
         <w:pStyle w:val="Bibliography"/>
@@ -7101,7 +8717,7 @@
       <w:r>
         <w:t xml:space="preserve"> </w:t>
       </w:r>
-      <w:hyperlink r:id="rId113">
+      <w:hyperlink r:id="rId116">
         <w:r>
           <w:rPr>
             <w:rStyle w:val="Hyperlink"/>
@@ -7112,7 +8728,7 @@
       <w:r>
         <w:t xml:space="preserve">. doi:</w:t>
       </w:r>
-      <w:hyperlink r:id="rId114">
+      <w:hyperlink r:id="rId117">
         <w:r>
           <w:rPr>
             <w:rStyle w:val="Hyperlink"/>
@@ -7121,8 +8737,8 @@
         </w:r>
       </w:hyperlink>
     </w:p>
-    <w:bookmarkEnd w:id="115"/>
-    <w:bookmarkStart w:id="117" w:name="ref-song_shared_2019"/>
+    <w:bookmarkEnd w:id="118"/>
+    <w:bookmarkStart w:id="120" w:name="ref-song_shared_2019"/>
     <w:p>
       <w:pPr>
         <w:pStyle w:val="Bibliography"/>
@@ -7178,7 +8794,7 @@
       <w:r>
         <w:t xml:space="preserve">. Demography. 2019;56(3):891–916. doi:</w:t>
       </w:r>
-      <w:hyperlink r:id="rId116">
+      <w:hyperlink r:id="rId119">
         <w:r>
           <w:rPr>
             <w:rStyle w:val="Hyperlink"/>
@@ -7187,8 +8803,8 @@
         </w:r>
       </w:hyperlink>
     </w:p>
-    <w:bookmarkEnd w:id="117"/>
-    <w:bookmarkStart w:id="118" w:name="ref-shiffer-sebba_concentration_2022"/>
+    <w:bookmarkEnd w:id="120"/>
+    <w:bookmarkStart w:id="121" w:name="ref-shiffer-sebba_concentration_2022"/>
     <w:p>
       <w:pPr>
         <w:pStyle w:val="Bibliography"/>
@@ -7278,8 +8894,8 @@
         <w:t xml:space="preserve">. 2022.</w:t>
       </w:r>
     </w:p>
-    <w:bookmarkEnd w:id="118"/>
-    <w:bookmarkStart w:id="120" w:name="ref-hallsten_grand_2017"/>
+    <w:bookmarkEnd w:id="121"/>
+    <w:bookmarkStart w:id="123" w:name="ref-hallsten_grand_2017"/>
     <w:p>
       <w:pPr>
         <w:pStyle w:val="Bibliography"/>
@@ -7359,7 +8975,7 @@
       <w:r>
         <w:t xml:space="preserve">. American Sociological Review. 2017;82(2):328–360. doi:</w:t>
       </w:r>
-      <w:hyperlink r:id="rId119">
+      <w:hyperlink r:id="rId122">
         <w:r>
           <w:rPr>
             <w:rStyle w:val="Hyperlink"/>
@@ -7368,8 +8984,8 @@
         </w:r>
       </w:hyperlink>
     </w:p>
-    <w:bookmarkEnd w:id="120"/>
-    <w:bookmarkStart w:id="121" w:name="ref-insolera_overview_2021"/>
+    <w:bookmarkEnd w:id="123"/>
+    <w:bookmarkStart w:id="124" w:name="ref-insolera_overview_2021"/>
     <w:p>
       <w:pPr>
         <w:pStyle w:val="Bibliography"/>
@@ -7471,8 +9087,8 @@
         <w:t xml:space="preserve">).</w:t>
       </w:r>
     </w:p>
-    <w:bookmarkEnd w:id="121"/>
-    <w:bookmarkStart w:id="123" w:name="ref-pfeffer_measuring_2016"/>
+    <w:bookmarkEnd w:id="124"/>
+    <w:bookmarkStart w:id="126" w:name="ref-pfeffer_measuring_2016"/>
     <w:p>
       <w:pPr>
         <w:pStyle w:val="Bibliography"/>
@@ -7552,7 +9168,7 @@
       <w:r>
         <w:t xml:space="preserve">. Journal of Economic and Social Measurement. 2016;41(2):103–120. doi:</w:t>
       </w:r>
-      <w:hyperlink r:id="rId122">
+      <w:hyperlink r:id="rId125">
         <w:r>
           <w:rPr>
             <w:rStyle w:val="Hyperlink"/>
@@ -7561,8 +9177,8 @@
         </w:r>
       </w:hyperlink>
     </w:p>
-    <w:bookmarkEnd w:id="123"/>
-    <w:bookmarkStart w:id="124" w:name="ref-pfeffer_determinants_2017"/>
+    <w:bookmarkEnd w:id="126"/>
+    <w:bookmarkStart w:id="127" w:name="ref-pfeffer_determinants_2017"/>
     <w:p>
       <w:pPr>
         <w:pStyle w:val="Bibliography"/>
@@ -7595,8 +9211,8 @@
         <w:t xml:space="preserve">. PWIE. 2017;11(1):87–108.</w:t>
       </w:r>
     </w:p>
-    <w:bookmarkEnd w:id="124"/>
-    <w:bookmarkStart w:id="127" w:name="ref-corak_income_2013"/>
+    <w:bookmarkEnd w:id="127"/>
+    <w:bookmarkStart w:id="130" w:name="ref-corak_income_2013"/>
     <w:p>
       <w:pPr>
         <w:pStyle w:val="Bibliography"/>
@@ -7661,7 +9277,7 @@
       <w:r>
         <w:t xml:space="preserve"> </w:t>
       </w:r>
-      <w:hyperlink r:id="rId125">
+      <w:hyperlink r:id="rId128">
         <w:r>
           <w:rPr>
             <w:rStyle w:val="Hyperlink"/>
@@ -7672,7 +9288,7 @@
       <w:r>
         <w:t xml:space="preserve">. doi:</w:t>
       </w:r>
-      <w:hyperlink r:id="rId126">
+      <w:hyperlink r:id="rId129">
         <w:r>
           <w:rPr>
             <w:rStyle w:val="Hyperlink"/>
@@ -7681,8 +9297,8 @@
         </w:r>
       </w:hyperlink>
     </w:p>
-    <w:bookmarkEnd w:id="127"/>
-    <w:bookmarkStart w:id="129" w:name="ref-ermisch_parents_2012"/>
+    <w:bookmarkEnd w:id="130"/>
+    <w:bookmarkStart w:id="132" w:name="ref-ermisch_parents_2012"/>
     <w:p>
       <w:pPr>
         <w:pStyle w:val="Bibliography"/>
@@ -7756,7 +9372,7 @@
       <w:r>
         <w:t xml:space="preserve"> </w:t>
       </w:r>
-      <w:hyperlink r:id="rId128">
+      <w:hyperlink r:id="rId131">
         <w:r>
           <w:rPr>
             <w:rStyle w:val="Hyperlink"/>
@@ -7765,8 +9381,8 @@
         </w:r>
       </w:hyperlink>
     </w:p>
-    <w:bookmarkEnd w:id="129"/>
-    <w:bookmarkStart w:id="131" w:name="ref-jerrim_income_2015"/>
+    <w:bookmarkEnd w:id="132"/>
+    <w:bookmarkStart w:id="134" w:name="ref-jerrim_income_2015"/>
     <w:p>
       <w:pPr>
         <w:pStyle w:val="Bibliography"/>
@@ -7855,7 +9471,7 @@
       <w:r>
         <w:t xml:space="preserve">? Social Forces. 2015;94. doi:</w:t>
       </w:r>
-      <w:hyperlink r:id="rId130">
+      <w:hyperlink r:id="rId133">
         <w:r>
           <w:rPr>
             <w:rStyle w:val="Hyperlink"/>
@@ -7864,8 +9480,8 @@
         </w:r>
       </w:hyperlink>
     </w:p>
-    <w:bookmarkEnd w:id="131"/>
-    <w:bookmarkStart w:id="134" w:name="ref-si_multiple_2021"/>
+    <w:bookmarkEnd w:id="134"/>
+    <w:bookmarkStart w:id="137" w:name="ref-si_multiple_2021"/>
     <w:p>
       <w:pPr>
         <w:pStyle w:val="Bibliography"/>
@@ -7963,7 +9579,7 @@
       <w:r>
         <w:t xml:space="preserve"> </w:t>
       </w:r>
-      <w:hyperlink r:id="rId132">
+      <w:hyperlink r:id="rId135">
         <w:r>
           <w:rPr>
             <w:rStyle w:val="Hyperlink"/>
@@ -7974,7 +9590,7 @@
       <w:r>
         <w:t xml:space="preserve">. doi:</w:t>
       </w:r>
-      <w:hyperlink r:id="rId133">
+      <w:hyperlink r:id="rId136">
         <w:r>
           <w:rPr>
             <w:rStyle w:val="Hyperlink"/>
@@ -7983,8 +9599,8 @@
         </w:r>
       </w:hyperlink>
     </w:p>
-    <w:bookmarkEnd w:id="134"/>
-    <w:bookmarkStart w:id="135" w:name="ref-sayer_women_2004"/>
+    <w:bookmarkEnd w:id="137"/>
+    <w:bookmarkStart w:id="138" w:name="ref-sayer_women_2004"/>
     <w:p>
       <w:pPr>
         <w:pStyle w:val="Bibliography"/>
@@ -8020,8 +9636,8 @@
         <w:t xml:space="preserve">. Russell Sage Foundation; 2004.</w:t>
       </w:r>
     </w:p>
-    <w:bookmarkEnd w:id="135"/>
-    <w:bookmarkStart w:id="138" w:name="ref-de_maio_income_2007"/>
+    <w:bookmarkEnd w:id="138"/>
+    <w:bookmarkStart w:id="141" w:name="ref-de_maio_income_2007"/>
     <w:p>
       <w:pPr>
         <w:pStyle w:val="Bibliography"/>
@@ -8056,7 +9672,7 @@
       <w:r>
         <w:t xml:space="preserve"> </w:t>
       </w:r>
-      <w:hyperlink r:id="rId136">
+      <w:hyperlink r:id="rId139">
         <w:r>
           <w:rPr>
             <w:rStyle w:val="Hyperlink"/>
@@ -8067,7 +9683,7 @@
       <w:r>
         <w:t xml:space="preserve">. doi:</w:t>
       </w:r>
-      <w:hyperlink r:id="rId137">
+      <w:hyperlink r:id="rId140">
         <w:r>
           <w:rPr>
             <w:rStyle w:val="Hyperlink"/>
@@ -8076,8 +9692,8 @@
         </w:r>
       </w:hyperlink>
     </w:p>
-    <w:bookmarkEnd w:id="138"/>
-    <w:bookmarkStart w:id="141" w:name="ref-kawachi_relationship_1997"/>
+    <w:bookmarkEnd w:id="141"/>
+    <w:bookmarkStart w:id="144" w:name="ref-kawachi_relationship_1997"/>
     <w:p>
       <w:pPr>
         <w:pStyle w:val="Bibliography"/>
@@ -8109,7 +9725,7 @@
       <w:r>
         <w:t xml:space="preserve"> </w:t>
       </w:r>
-      <w:hyperlink r:id="rId139">
+      <w:hyperlink r:id="rId142">
         <w:r>
           <w:rPr>
             <w:rStyle w:val="Hyperlink"/>
@@ -8120,7 +9736,7 @@
       <w:r>
         <w:t xml:space="preserve">. doi:</w:t>
       </w:r>
-      <w:hyperlink r:id="rId140">
+      <w:hyperlink r:id="rId143">
         <w:r>
           <w:rPr>
             <w:rStyle w:val="Hyperlink"/>
@@ -8129,8 +9745,8 @@
         </w:r>
       </w:hyperlink>
     </w:p>
-    <w:bookmarkEnd w:id="141"/>
-    <w:bookmarkStart w:id="144" w:name="ref-aaberge_ginis_2007"/>
+    <w:bookmarkEnd w:id="144"/>
+    <w:bookmarkStart w:id="147" w:name="ref-aaberge_ginis_2007"/>
     <w:p>
       <w:pPr>
         <w:pStyle w:val="Bibliography"/>
@@ -8150,7 +9766,7 @@
       <w:r>
         <w:t xml:space="preserve"> </w:t>
       </w:r>
-      <w:hyperlink r:id="rId142">
+      <w:hyperlink r:id="rId145">
         <w:r>
           <w:rPr>
             <w:rStyle w:val="Hyperlink"/>
@@ -8161,7 +9777,7 @@
       <w:r>
         <w:t xml:space="preserve">. doi:</w:t>
       </w:r>
-      <w:hyperlink r:id="rId143">
+      <w:hyperlink r:id="rId146">
         <w:r>
           <w:rPr>
             <w:rStyle w:val="Hyperlink"/>
@@ -8170,8 +9786,8 @@
         </w:r>
       </w:hyperlink>
     </w:p>
-    <w:bookmarkEnd w:id="144"/>
-    <w:bookmarkStart w:id="146" w:name="ref-noauthor_table_nodate"/>
+    <w:bookmarkEnd w:id="147"/>
+    <w:bookmarkStart w:id="149" w:name="ref-noauthor_table_nodate"/>
     <w:p>
       <w:pPr>
         <w:pStyle w:val="Bibliography"/>
@@ -8269,7 +9885,7 @@
       <w:r>
         <w:t xml:space="preserve"> </w:t>
       </w:r>
-      <w:hyperlink r:id="rId145">
+      <w:hyperlink r:id="rId148">
         <w:r>
           <w:rPr>
             <w:rStyle w:val="Hyperlink"/>
@@ -8278,8 +9894,8 @@
         </w:r>
       </w:hyperlink>
     </w:p>
-    <w:bookmarkEnd w:id="146"/>
-    <w:bookmarkStart w:id="147" w:name="ref-wolff_size_209"/>
+    <w:bookmarkEnd w:id="149"/>
+    <w:bookmarkStart w:id="150" w:name="ref-wolff_size_209"/>
     <w:p>
       <w:pPr>
         <w:pStyle w:val="Bibliography"/>
@@ -8438,8 +10054,8 @@
         <w:t xml:space="preserve">. Panel Study of Income Dynamics; 209 AD.</w:t>
       </w:r>
     </w:p>
-    <w:bookmarkEnd w:id="147"/>
-    <w:bookmarkStart w:id="149" w:name="ref-pfeffer_wealth_2013"/>
+    <w:bookmarkEnd w:id="150"/>
+    <w:bookmarkStart w:id="152" w:name="ref-pfeffer_wealth_2013"/>
     <w:p>
       <w:pPr>
         <w:pStyle w:val="Bibliography"/>
@@ -8483,7 +10099,7 @@
       <w:r>
         <w:t xml:space="preserve">. The Annals of the American Academy of Political and Social Science. 2013;650(1):98–123. doi:</w:t>
       </w:r>
-      <w:hyperlink r:id="rId148">
+      <w:hyperlink r:id="rId151">
         <w:r>
           <w:rPr>
             <w:rStyle w:val="Hyperlink"/>
@@ -8492,9 +10108,9 @@
         </w:r>
       </w:hyperlink>
     </w:p>
-    <w:bookmarkEnd w:id="149"/>
-    <w:bookmarkEnd w:id="150"/>
-    <w:bookmarkEnd w:id="151"/>
+    <w:bookmarkEnd w:id="152"/>
+    <w:bookmarkEnd w:id="153"/>
+    <w:bookmarkEnd w:id="154"/>
     <w:sectPr>
       <w:footnotePr>
         <w:numRestart w:val="eachSect"/>

</xml_diff>

<commit_message>
Race tables and sensitivity
</commit_message>
<xml_diff>
--- a/10_draft/output/write.docx
+++ b/10_draft/output/write.docx
@@ -15,7 +15,7 @@
         <w:pStyle w:val="Author"/>
       </w:pPr>
       <w:r>
-        <w:t xml:space="preserve">Author Name(s)</w:t>
+        <w:t xml:space="preserve">Names</w:t>
       </w:r>
     </w:p>
     <w:p>
@@ -23,7 +23,7 @@
         <w:pStyle w:val="Date"/>
       </w:pPr>
       <w:r>
-        <w:t xml:space="preserve">March 11, 2026</w:t>
+        <w:t xml:space="preserve">March 12, 2026</w:t>
       </w:r>
     </w:p>
     <w:bookmarkStart w:id="9" w:name="abstract"/>
@@ -593,46 +593,25 @@
         <w:t xml:space="preserve"> </w:t>
       </w:r>
       <w:r>
-        <w:drawing>
-          <wp:inline>
-            <wp:extent cx="5334000" cy="4191000"/>
-            <wp:effectExtent b="0" l="0" r="0" t="0"/>
-            <wp:docPr descr="" title="" id="20" name="Picture"/>
-            <a:graphic>
-              <a:graphicData uri="http://schemas.openxmlformats.org/drawingml/2006/picture">
-                <pic:pic>
-                  <pic:nvPicPr>
-                    <pic:cNvPr descr="../9_figures/output/figure3.pdf" id="21" name="Picture"/>
-                    <pic:cNvPicPr>
-                      <a:picLocks noChangeArrowheads="1" noChangeAspect="1"/>
-                    </pic:cNvPicPr>
-                  </pic:nvPicPr>
-                  <pic:blipFill>
-                    <a:blip r:embed="rId19"/>
-                    <a:stretch>
-                      <a:fillRect/>
-                    </a:stretch>
-                  </pic:blipFill>
-                  <pic:spPr bwMode="auto">
-                    <a:xfrm>
-                      <a:off x="0" y="0"/>
-                      <a:ext cx="5334000" cy="4191000"/>
-                    </a:xfrm>
-                    <a:prstGeom prst="rect">
-                      <a:avLst/>
-                    </a:prstGeom>
-                    <a:noFill/>
-                    <a:ln w="9525">
-                      <a:noFill/>
-                      <a:headEnd/>
-                      <a:tailEnd/>
-                    </a:ln>
-                  </pic:spPr>
-                </pic:pic>
-              </a:graphicData>
-            </a:graphic>
-          </wp:inline>
-        </w:drawing>
+        <w:t xml:space="preserve">Scholars document a persistent racial wealth gap between Black and non-Black households</w:t>
+      </w:r>
+      <w:r>
+        <w:t xml:space="preserve"> </w:t>
+      </w:r>
+      <w:r>
+        <w:t xml:space="preserve">[5, 20]</w:t>
+      </w:r>
+      <w:r>
+        <w:t xml:space="preserve">, while also highlighting the unique role of kinship networks in shaping economic outcomes by race</w:t>
+      </w:r>
+      <w:r>
+        <w:t xml:space="preserve"> </w:t>
+      </w:r>
+      <w:r>
+        <w:t xml:space="preserve">[21, 22]</w:t>
+      </w:r>
+      <w:r>
+        <w:t xml:space="preserve">. Given these findings, one might expect the choice of unit of analysis to affect inequality estimates differently across racial groups. While there is higher inequality among Black households and clans overall, the direction of the household–clan difference in Gini coefficients is consistent across racial groups (see Appendix C1).</w:t>
       </w:r>
     </w:p>
     <w:p>
@@ -640,11 +619,7 @@
         <w:pStyle w:val="BodyText"/>
       </w:pPr>
       <w:r>
-        <w:rPr>
-          <w:i/>
-          <w:iCs/>
-        </w:rPr>
-        <w:t xml:space="preserve">Note: Lines show the ratio of weighted mean income (Panel A) or wealth (Panel B) for Black relative to Non-Black households and clans. Weighted mean income for Black HH is $36,205, $56,600 for Non-Black HH, $60,000 for Black clans, and $108,522 for Non-Black clans. The income ratio changed by -5.2% for households (0.65 in 1969 to 0.62 in 2023) and -7.8% for clans (0.63 to 0.58). Weighted mean wealth for Black HH is $89,761, $476,552 for Non-Black HH, $147,662 for Black clans, and $818,198 for Non-Black clans (includes home equity). The wealth ratio changed by 1.0% for households (0.18 in 1984 to 0.18 in 2023) and -13.7% for clans (0.23 to 0.20). On average across all years, the income ratio is -0.006 lower for households than clans, and the wealth ratio is 0.014 higher for households than clans. Solid lines = households; dotted lines = clans.</w:t>
+        <w:t xml:space="preserve">Measuring inequality at the clan-level reveals less inequality across racial subgroups. However, using clans as the unit of analysis does not eliminate racial wealth gaps between groups. Table 4 shows racial wealth gaps at both the household and clans levels for mean and median wealth. When using the mean, Black households hold 19 cents for every dollar of wealth held by non-Black households, and Black clans hold 18 cents for every dollar held by non-Black clans. A similar pattern appears when examining median wealth among clans, where Black clans hold 19 cents for every dollar held by non-Black clans. However, the median reveals an even starker disparity at the household level: the typical Black household holds only 9 cents for every dollar of wealth held by the typical non-Black household. These patterns suggest that while Black households hold substantially less wealth on average, wealth among them is also distributed with greater inequality. At both levels, inequality is about the same or lower between clans than between households, though Black clans hold considerably less wealth than non-Black ones.</w:t>
       </w:r>
     </w:p>
     <w:p>
@@ -652,58 +627,16 @@
         <w:pStyle w:val="BodyText"/>
       </w:pPr>
       <w:r>
-        <w:drawing>
-          <wp:inline>
-            <wp:extent cx="5334000" cy="4191000"/>
-            <wp:effectExtent b="0" l="0" r="0" t="0"/>
-            <wp:docPr descr="" title="" id="23" name="Picture"/>
-            <a:graphic>
-              <a:graphicData uri="http://schemas.openxmlformats.org/drawingml/2006/picture">
-                <pic:pic>
-                  <pic:nvPicPr>
-                    <pic:cNvPr descr="../9_figures/output/figure4.pdf" id="24" name="Picture"/>
-                    <pic:cNvPicPr>
-                      <a:picLocks noChangeArrowheads="1" noChangeAspect="1"/>
-                    </pic:cNvPicPr>
-                  </pic:nvPicPr>
-                  <pic:blipFill>
-                    <a:blip r:embed="rId22"/>
-                    <a:stretch>
-                      <a:fillRect/>
-                    </a:stretch>
-                  </pic:blipFill>
-                  <pic:spPr bwMode="auto">
-                    <a:xfrm>
-                      <a:off x="0" y="0"/>
-                      <a:ext cx="5334000" cy="4191000"/>
-                    </a:xfrm>
-                    <a:prstGeom prst="rect">
-                      <a:avLst/>
-                    </a:prstGeom>
-                    <a:noFill/>
-                    <a:ln w="9525">
-                      <a:noFill/>
-                      <a:headEnd/>
-                      <a:tailEnd/>
-                    </a:ln>
-                  </pic:spPr>
-                </pic:pic>
-              </a:graphicData>
-            </a:graphic>
-          </wp:inline>
-        </w:drawing>
-      </w:r>
-    </w:p>
-    <w:p>
-      <w:pPr>
-        <w:pStyle w:val="BodyText"/>
-      </w:pPr>
-      <w:r>
-        <w:rPr>
-          <w:i/>
-          <w:iCs/>
-        </w:rPr>
-        <w:t xml:space="preserve">Note: Lines show the ratio of weighted median income (Panel A) or wealth (Panel B) for Black relative to Non-Black households and clans. The weighted median income for Black HHs is $17,621, $29,233 for Non-Black HHs, $36,562 for Black clans, and $62,916 for Non-Black clans. The income ratio changed by 5.8% for households (0.59 in 1969 to 0.62 in 2023) and 0.2% for clans (0.57 to 0.57). Weighted median wealth for Black HHs is $6,908, $79,216 for Non-Black HHs, $58,326 for Black clans, and $306,988 for Non-Black clans (includes home equity). The wealth ratio changed by -4.6% for households (0.07 in 1984 to 0.07 in 2023) and 7.5% for clans (0.20 to 0.22). On average across all years, the income ratio is -0.044 lower for households than clans, and the wealth ratio is -0.112 lower for households than clans. Solid lines = households; dotted lines = clans.</w:t>
+        <w:t xml:space="preserve">Examining the share of households and clans with zero wealth further illustrates the racial wealth gap at the household and clan levels and how this inequality appears lesser at the clan-level. Following</w:t>
+      </w:r>
+      <w:r>
+        <w:t xml:space="preserve"> </w:t>
+      </w:r>
+      <w:r>
+        <w:t xml:space="preserve">[20]</w:t>
+      </w:r>
+      <w:r>
+        <w:t xml:space="preserve">, 32.66% of Black households report no wealth, compared to just 13.40% of non-Black households. At the clan level, however, the share with zero wealth drops considerably. Non-Black clans exhibit extremely low levels of zero wealth, with only 3.16% reporting none, suggesting that most non-Black individuals have some wealth within their extended family networks. Black clans also experience a decline in zero-wealth, falling to 10.07%. In percentage terms, the transition from the household to clan level represents a 69.2% reduction in zero-wealth for Black households and a 76.4% reduction for non-Black households. As a result, the extent of inequality appears less stark when wealth is considered at the clan level rather than at the household level, though the decrease in inequality is higher for non-Black clans.</w:t>
       </w:r>
     </w:p>
     <w:p xmlns:w="http://schemas.openxmlformats.org/wordprocessingml/2006/main" xmlns:wp="http://schemas.openxmlformats.org/drawingml/2006/wordprocessingDrawing" xmlns:r="http://schemas.openxmlformats.org/officeDocument/2006/relationships" xmlns:w14="http://schemas.microsoft.com/office/word/2010/wordml">
@@ -721,7 +654,7 @@
         <w:ind w:left="60" w:right="60" w:firstLine="0" w:firstLineChars="0"/>
       </w:pPr>
       <w:r>
-        <w:t xml:space="preserve">Table 1. Median Income and Wealth by Race: Households vs. Clans</w:t>
+        <w:t xml:space="preserve">Table A. Mean and Median Wealth by Race: Households vs. Clans</w:t>
       </w:r>
     </w:p>
     <w:tbl xmlns:w="http://schemas.openxmlformats.org/wordprocessingml/2006/main" xmlns:r="http://schemas.openxmlformats.org/officeDocument/2006/relationships" xmlns:w14="http://schemas.microsoft.com/office/word/2010/wordml" xmlns:wp="http://schemas.openxmlformats.org/drawingml/2006/wordprocessingDrawing" xmlns:a="http://schemas.openxmlformats.org/drawingml/2006/main" xmlns:pic="http://schemas.openxmlformats.org/drawingml/2006/picture">
@@ -845,7 +778,7 @@
                 <w:szCs w:val="20"/>
                 <w:color w:val="000000"/>
               </w:rPr>
-              <w:t xml:space="preserve">Median Income HH</w:t>
+              <w:t xml:space="preserve">Mean Wealth HH</w:t>
             </w:r>
           </w:p>
         </w:tc>
@@ -897,7 +830,7 @@
                 <w:szCs w:val="20"/>
                 <w:color w:val="000000"/>
               </w:rPr>
-              <w:t xml:space="preserve">Median Income Clan</w:t>
+              <w:t xml:space="preserve">Mean Wealth Clan</w:t>
             </w:r>
           </w:p>
         </w:tc>
@@ -1215,7 +1148,7 @@
                 <w:szCs w:val="20"/>
                 <w:color w:val="000000"/>
               </w:rPr>
-              <w:t xml:space="preserve">17,621</w:t>
+              <w:t xml:space="preserve">89,761</w:t>
             </w:r>
           </w:p>
         </w:tc>
@@ -1267,7 +1200,7 @@
                 <w:szCs w:val="20"/>
                 <w:color w:val="000000"/>
               </w:rPr>
-              <w:t xml:space="preserve">36,562</w:t>
+              <w:t xml:space="preserve">147,662</w:t>
             </w:r>
           </w:p>
         </w:tc>
@@ -1585,7 +1518,7 @@
                 <w:szCs w:val="20"/>
                 <w:color w:val="000000"/>
               </w:rPr>
-              <w:t xml:space="preserve">29,233</w:t>
+              <w:t xml:space="preserve">476,552</w:t>
             </w:r>
           </w:p>
         </w:tc>
@@ -1637,7 +1570,7 @@
                 <w:szCs w:val="20"/>
                 <w:color w:val="000000"/>
               </w:rPr>
-              <w:t xml:space="preserve">62,916</w:t>
+              <w:t xml:space="preserve">818,198</w:t>
             </w:r>
           </w:p>
         </w:tc>
@@ -1955,6 +1888,1393 @@
                 <w:szCs w:val="20"/>
                 <w:color w:val="000000"/>
               </w:rPr>
+              <w:t xml:space="preserve">0.19</w:t>
+            </w:r>
+          </w:p>
+        </w:tc>
+        <w:tc>
+          <w:tcPr>
+            <w:tcBorders>
+              <w:bottom w:val="single" w:sz="12" w:space="0" w:color="666666"/>
+              <w:top w:val="single" w:sz="4" w:space="0" w:color="999999"/>
+              <w:left w:val="none" w:sz="0" w:space="0" w:color="000000"/>
+              <w:right w:val="none" w:sz="0" w:space="0" w:color="000000"/>
+            </w:tcBorders>
+            <w:shd w:val="clear" w:color="auto" w:fill="F2F2F2"/>
+            <w:tcMar>
+              <w:top w:w="0" w:type="dxa"/>
+              <w:bottom w:w="0" w:type="dxa"/>
+              <w:left w:w="0" w:type="dxa"/>
+              <w:right w:w="0" w:type="dxa"/>
+            </w:tcMar>
+            <w:vAlign w:val="center"/>
+          </w:tcPr>
+          <w:p>
+            <w:pPr>
+              <w:jc w:val="center"/>
+              <w:pBdr>
+                <w:bottom w:val="none" w:sz="0" w:space="0" w:color="000000"/>
+                <w:top w:val="none" w:sz="0" w:space="0" w:color="000000"/>
+                <w:left w:val="none" w:sz="0" w:space="0" w:color="000000"/>
+                <w:right w:val="none" w:sz="0" w:space="0" w:color="000000"/>
+              </w:pBdr>
+              <w:spacing w:after="100" w:before="100" w:line="240"/>
+              <w:ind w:left="100" w:right="100" w:firstLine="0" w:firstLineChars="0"/>
+              <w:rPr>
+                <w:rFonts w:ascii="serif" w:hAnsi="serif" w:eastAsia="serif" w:cs="serif"/>
+                <w:i w:val="false"/>
+                <w:b w:val="false"/>
+                <w:u w:val="none"/>
+                <w:sz w:val="20"/>
+                <w:szCs w:val="20"/>
+                <w:color w:val="000000"/>
+              </w:rPr>
+            </w:pPr>
+            <w:r xmlns:w="http://schemas.openxmlformats.org/wordprocessingml/2006/main" xmlns:wp="http://schemas.openxmlformats.org/drawingml/2006/wordprocessingDrawing" xmlns:r="http://schemas.openxmlformats.org/officeDocument/2006/relationships" xmlns:w14="http://schemas.microsoft.com/office/word/2010/wordml">
+              <w:rPr>
+                <w:rFonts w:ascii="serif" w:hAnsi="serif" w:eastAsia="serif" w:cs="serif"/>
+                <w:i w:val="false"/>
+                <w:b w:val="false"/>
+                <w:u w:val="none"/>
+                <w:sz w:val="20"/>
+                <w:szCs w:val="20"/>
+                <w:color w:val="000000"/>
+              </w:rPr>
+              <w:t xml:space="preserve">0.18</w:t>
+            </w:r>
+          </w:p>
+        </w:tc>
+        <w:tc>
+          <w:tcPr>
+            <w:tcBorders>
+              <w:bottom w:val="single" w:sz="12" w:space="0" w:color="666666"/>
+              <w:top w:val="single" w:sz="4" w:space="0" w:color="999999"/>
+              <w:left w:val="none" w:sz="0" w:space="0" w:color="000000"/>
+              <w:right w:val="none" w:sz="0" w:space="0" w:color="000000"/>
+            </w:tcBorders>
+            <w:shd w:val="clear" w:color="auto" w:fill="F2F2F2"/>
+            <w:tcMar>
+              <w:top w:w="0" w:type="dxa"/>
+              <w:bottom w:w="0" w:type="dxa"/>
+              <w:left w:w="0" w:type="dxa"/>
+              <w:right w:w="0" w:type="dxa"/>
+            </w:tcMar>
+            <w:vAlign w:val="center"/>
+          </w:tcPr>
+          <w:p>
+            <w:pPr>
+              <w:jc w:val="center"/>
+              <w:pBdr>
+                <w:bottom w:val="none" w:sz="0" w:space="0" w:color="000000"/>
+                <w:top w:val="none" w:sz="0" w:space="0" w:color="000000"/>
+                <w:left w:val="none" w:sz="0" w:space="0" w:color="000000"/>
+                <w:right w:val="none" w:sz="0" w:space="0" w:color="000000"/>
+              </w:pBdr>
+              <w:spacing w:after="100" w:before="100" w:line="240"/>
+              <w:ind w:left="100" w:right="100" w:firstLine="0" w:firstLineChars="0"/>
+              <w:rPr>
+                <w:rFonts w:ascii="serif" w:hAnsi="serif" w:eastAsia="serif" w:cs="serif"/>
+                <w:i w:val="false"/>
+                <w:b w:val="false"/>
+                <w:u w:val="none"/>
+                <w:sz w:val="20"/>
+                <w:szCs w:val="20"/>
+                <w:color w:val="000000"/>
+              </w:rPr>
+            </w:pPr>
+            <w:r xmlns:w="http://schemas.openxmlformats.org/wordprocessingml/2006/main" xmlns:wp="http://schemas.openxmlformats.org/drawingml/2006/wordprocessingDrawing" xmlns:r="http://schemas.openxmlformats.org/officeDocument/2006/relationships" xmlns:w14="http://schemas.microsoft.com/office/word/2010/wordml">
+              <w:rPr>
+                <w:rFonts w:ascii="serif" w:hAnsi="serif" w:eastAsia="serif" w:cs="serif"/>
+                <w:i w:val="false"/>
+                <w:b w:val="false"/>
+                <w:u w:val="none"/>
+                <w:sz w:val="20"/>
+                <w:szCs w:val="20"/>
+                <w:color w:val="000000"/>
+              </w:rPr>
+              <w:t xml:space="preserve">0.09</w:t>
+            </w:r>
+          </w:p>
+        </w:tc>
+        <w:tc>
+          <w:tcPr>
+            <w:tcBorders>
+              <w:bottom w:val="single" w:sz="12" w:space="0" w:color="666666"/>
+              <w:top w:val="single" w:sz="4" w:space="0" w:color="999999"/>
+              <w:left w:val="none" w:sz="0" w:space="0" w:color="000000"/>
+              <w:right w:val="none" w:sz="0" w:space="0" w:color="000000"/>
+            </w:tcBorders>
+            <w:shd w:val="clear" w:color="auto" w:fill="F2F2F2"/>
+            <w:tcMar>
+              <w:top w:w="0" w:type="dxa"/>
+              <w:bottom w:w="0" w:type="dxa"/>
+              <w:left w:w="0" w:type="dxa"/>
+              <w:right w:w="0" w:type="dxa"/>
+            </w:tcMar>
+            <w:vAlign w:val="center"/>
+          </w:tcPr>
+          <w:p>
+            <w:pPr>
+              <w:jc w:val="center"/>
+              <w:pBdr>
+                <w:bottom w:val="none" w:sz="0" w:space="0" w:color="000000"/>
+                <w:top w:val="none" w:sz="0" w:space="0" w:color="000000"/>
+                <w:left w:val="none" w:sz="0" w:space="0" w:color="000000"/>
+                <w:right w:val="none" w:sz="0" w:space="0" w:color="000000"/>
+              </w:pBdr>
+              <w:spacing w:after="100" w:before="100" w:line="240"/>
+              <w:ind w:left="100" w:right="100" w:firstLine="0" w:firstLineChars="0"/>
+              <w:rPr>
+                <w:rFonts w:ascii="serif" w:hAnsi="serif" w:eastAsia="serif" w:cs="serif"/>
+                <w:i w:val="false"/>
+                <w:b w:val="false"/>
+                <w:u w:val="none"/>
+                <w:sz w:val="20"/>
+                <w:szCs w:val="20"/>
+                <w:color w:val="000000"/>
+              </w:rPr>
+            </w:pPr>
+            <w:r xmlns:w="http://schemas.openxmlformats.org/wordprocessingml/2006/main" xmlns:wp="http://schemas.openxmlformats.org/drawingml/2006/wordprocessingDrawing" xmlns:r="http://schemas.openxmlformats.org/officeDocument/2006/relationships" xmlns:w14="http://schemas.microsoft.com/office/word/2010/wordml">
+              <w:rPr>
+                <w:rFonts w:ascii="serif" w:hAnsi="serif" w:eastAsia="serif" w:cs="serif"/>
+                <w:i w:val="false"/>
+                <w:b w:val="false"/>
+                <w:u w:val="none"/>
+                <w:sz w:val="20"/>
+                <w:szCs w:val="20"/>
+                <w:color w:val="000000"/>
+              </w:rPr>
+              <w:t xml:space="preserve">0.19</w:t>
+            </w:r>
+          </w:p>
+        </w:tc>
+        <w:tc>
+          <w:tcPr>
+            <w:tcBorders>
+              <w:bottom w:val="single" w:sz="12" w:space="0" w:color="666666"/>
+              <w:top w:val="single" w:sz="4" w:space="0" w:color="999999"/>
+              <w:left w:val="none" w:sz="0" w:space="0" w:color="000000"/>
+              <w:right w:val="none" w:sz="0" w:space="0" w:color="000000"/>
+            </w:tcBorders>
+            <w:shd w:val="clear" w:color="auto" w:fill="F2F2F2"/>
+            <w:tcMar>
+              <w:top w:w="0" w:type="dxa"/>
+              <w:bottom w:w="0" w:type="dxa"/>
+              <w:left w:w="0" w:type="dxa"/>
+              <w:right w:w="0" w:type="dxa"/>
+            </w:tcMar>
+            <w:vAlign w:val="center"/>
+          </w:tcPr>
+          <w:p>
+            <w:pPr>
+              <w:jc w:val="center"/>
+              <w:pBdr>
+                <w:bottom w:val="none" w:sz="0" w:space="0" w:color="000000"/>
+                <w:top w:val="none" w:sz="0" w:space="0" w:color="000000"/>
+                <w:left w:val="none" w:sz="0" w:space="0" w:color="000000"/>
+                <w:right w:val="none" w:sz="0" w:space="0" w:color="000000"/>
+              </w:pBdr>
+              <w:spacing w:after="100" w:before="100" w:line="240"/>
+              <w:ind w:left="100" w:right="100" w:firstLine="0" w:firstLineChars="0"/>
+              <w:rPr>
+                <w:rFonts w:ascii="serif" w:hAnsi="serif" w:eastAsia="serif" w:cs="serif"/>
+                <w:i w:val="false"/>
+                <w:b w:val="false"/>
+                <w:u w:val="none"/>
+                <w:sz w:val="20"/>
+                <w:szCs w:val="20"/>
+                <w:color w:val="000000"/>
+              </w:rPr>
+            </w:pPr>
+            <w:r xmlns:w="http://schemas.openxmlformats.org/wordprocessingml/2006/main" xmlns:wp="http://schemas.openxmlformats.org/drawingml/2006/wordprocessingDrawing" xmlns:r="http://schemas.openxmlformats.org/officeDocument/2006/relationships" xmlns:w14="http://schemas.microsoft.com/office/word/2010/wordml">
+              <w:rPr>
+                <w:rFonts w:ascii="serif" w:hAnsi="serif" w:eastAsia="serif" w:cs="serif"/>
+                <w:i w:val="false"/>
+                <w:b w:val="false"/>
+                <w:u w:val="none"/>
+                <w:sz w:val="20"/>
+                <w:szCs w:val="20"/>
+                <w:color w:val="000000"/>
+              </w:rPr>
+              <w:t xml:space="preserve">2.44</w:t>
+            </w:r>
+          </w:p>
+        </w:tc>
+        <w:tc>
+          <w:tcPr>
+            <w:tcBorders>
+              <w:bottom w:val="single" w:sz="12" w:space="0" w:color="666666"/>
+              <w:top w:val="single" w:sz="4" w:space="0" w:color="999999"/>
+              <w:left w:val="none" w:sz="0" w:space="0" w:color="000000"/>
+              <w:right w:val="none" w:sz="0" w:space="0" w:color="000000"/>
+            </w:tcBorders>
+            <w:shd w:val="clear" w:color="auto" w:fill="F2F2F2"/>
+            <w:tcMar>
+              <w:top w:w="0" w:type="dxa"/>
+              <w:bottom w:w="0" w:type="dxa"/>
+              <w:left w:w="0" w:type="dxa"/>
+              <w:right w:w="0" w:type="dxa"/>
+            </w:tcMar>
+            <w:vAlign w:val="center"/>
+          </w:tcPr>
+          <w:p>
+            <w:pPr>
+              <w:jc w:val="center"/>
+              <w:pBdr>
+                <w:bottom w:val="none" w:sz="0" w:space="0" w:color="000000"/>
+                <w:top w:val="none" w:sz="0" w:space="0" w:color="000000"/>
+                <w:left w:val="none" w:sz="0" w:space="0" w:color="000000"/>
+                <w:right w:val="none" w:sz="0" w:space="0" w:color="000000"/>
+              </w:pBdr>
+              <w:spacing w:after="100" w:before="100" w:line="240"/>
+              <w:ind w:left="100" w:right="100" w:firstLine="0" w:firstLineChars="0"/>
+              <w:rPr>
+                <w:rFonts w:ascii="serif" w:hAnsi="serif" w:eastAsia="serif" w:cs="serif"/>
+                <w:i w:val="false"/>
+                <w:b w:val="false"/>
+                <w:u w:val="none"/>
+                <w:sz w:val="20"/>
+                <w:szCs w:val="20"/>
+                <w:color w:val="000000"/>
+              </w:rPr>
+            </w:pPr>
+            <w:r xmlns:w="http://schemas.openxmlformats.org/wordprocessingml/2006/main" xmlns:wp="http://schemas.openxmlformats.org/drawingml/2006/wordprocessingDrawing" xmlns:r="http://schemas.openxmlformats.org/officeDocument/2006/relationships" xmlns:w14="http://schemas.microsoft.com/office/word/2010/wordml">
+              <w:rPr>
+                <w:rFonts w:ascii="serif" w:hAnsi="serif" w:eastAsia="serif" w:cs="serif"/>
+                <w:i w:val="false"/>
+                <w:b w:val="false"/>
+                <w:u w:val="none"/>
+                <w:sz w:val="20"/>
+                <w:szCs w:val="20"/>
+                <w:color w:val="000000"/>
+              </w:rPr>
+              <w:t xml:space="preserve">3.18</w:t>
+            </w:r>
+          </w:p>
+        </w:tc>
+      </w:tr>
+    </w:tbl>
+    <w:p>
+      <w:pPr>
+        <w:pStyle w:val="BodyText"/>
+      </w:pPr>
+      <w:r>
+        <w:rPr>
+          <w:i/>
+          <w:iCs/>
+        </w:rPr>
+        <w:t xml:space="preserve">Note: All values are weighted using PSID family and clan weights and pooled across all years. Income and wealth are size-standardised (divided by household or clan size). Wealth includes home equity.</w:t>
+      </w:r>
+      <w:r>
+        <w:rPr>
+          <w:i/>
+          <w:iCs/>
+        </w:rPr>
+        <w:t xml:space="preserve"> </w:t>
+      </w:r>
+      <w:r>
+        <w:rPr>
+          <w:i/>
+          <w:iCs/>
+        </w:rPr>
+        <w:t xml:space="preserve">‘0 Wealth’</w:t>
+      </w:r>
+      <w:r>
+        <w:rPr>
+          <w:i/>
+          <w:iCs/>
+        </w:rPr>
+        <w:t xml:space="preserve"> </w:t>
+      </w:r>
+      <w:r>
+        <w:rPr>
+          <w:i/>
+          <w:iCs/>
+        </w:rPr>
+        <w:t xml:space="preserve">indicates wealth &lt;= 0. Ratio row shows Black / Non-Black.</w:t>
+      </w:r>
+    </w:p>
+    <w:p>
+      <w:pPr>
+        <w:pStyle w:val="BodyText"/>
+      </w:pPr>
+      <w:r>
+        <w:rPr>
+          <w:i/>
+          <w:iCs/>
+        </w:rPr>
+        <w:t xml:space="preserve">We are really talking about the racial wealth, not income, gap. It would probably make sense to exclude the table below but it is here in case you want to see it. The race ratio for clans is</w:t>
+      </w:r>
+      <w:r>
+        <w:rPr>
+          <w:i/>
+          <w:iCs/>
+        </w:rPr>
+        <w:t xml:space="preserve"> </w:t>
+      </w:r>
+      <w:r>
+        <w:rPr>
+          <w:b/>
+          <w:bCs/>
+          <w:i/>
+          <w:iCs/>
+        </w:rPr>
+        <w:t xml:space="preserve">worse</w:t>
+      </w:r>
+      <w:r>
+        <w:rPr>
+          <w:i/>
+          <w:iCs/>
+        </w:rPr>
+        <w:t xml:space="preserve"> </w:t>
+      </w:r>
+      <w:r>
+        <w:rPr>
+          <w:i/>
+          <w:iCs/>
+        </w:rPr>
+        <w:t xml:space="preserve">than it is for households for income.</w:t>
+      </w:r>
+    </w:p>
+    <w:p xmlns:w="http://schemas.openxmlformats.org/wordprocessingml/2006/main" xmlns:wp="http://schemas.openxmlformats.org/drawingml/2006/wordprocessingDrawing" xmlns:r="http://schemas.openxmlformats.org/officeDocument/2006/relationships" xmlns:w14="http://schemas.microsoft.com/office/word/2010/wordml">
+      <w:pPr>
+        <w:pStyle w:val="TableCaption"/>
+        <w:jc w:val="center"/>
+        <w:keepNext/>
+        <w:pBdr>
+          <w:bottom w:val="none" w:sz="0" w:space="0" w:color="000000"/>
+          <w:top w:val="none" w:sz="0" w:space="0" w:color="000000"/>
+          <w:left w:val="none" w:sz="0" w:space="0" w:color="000000"/>
+          <w:right w:val="none" w:sz="0" w:space="0" w:color="000000"/>
+        </w:pBdr>
+        <w:spacing w:after="60" w:before="60" w:line="240"/>
+        <w:ind w:left="60" w:right="60" w:firstLine="0" w:firstLineChars="0"/>
+      </w:pPr>
+      <w:r>
+        <w:t xml:space="preserve">Table B. Mean and Median Income by Race: Households vs. Clans</w:t>
+      </w:r>
+    </w:p>
+    <w:tbl xmlns:w="http://schemas.openxmlformats.org/wordprocessingml/2006/main" xmlns:r="http://schemas.openxmlformats.org/officeDocument/2006/relationships" xmlns:w14="http://schemas.microsoft.com/office/word/2010/wordml" xmlns:wp="http://schemas.openxmlformats.org/drawingml/2006/wordprocessingDrawing" xmlns:a="http://schemas.openxmlformats.org/drawingml/2006/main" xmlns:pic="http://schemas.openxmlformats.org/drawingml/2006/picture">
+      <w:tblPr>
+        <w:tblLayout w:type="fixed"/>
+        <w:jc w:val="center"/>
+        <w:tblLook w:firstRow="1" w:lastRow="0" w:firstColumn="0" w:lastColumn="0" w:noHBand="0" w:noVBand="1"/>
+      </w:tblPr>
+      <w:tblGrid>
+        <w:gridCol w:w="1080"/>
+        <w:gridCol w:w="1080"/>
+        <w:gridCol w:w="1080"/>
+        <w:gridCol w:w="1080"/>
+        <w:gridCol w:w="1080"/>
+      </w:tblGrid>
+      <w:tr>
+        <w:trPr>
+          <w:trHeight w:val="360" w:hRule="auto"/>
+          <w:tblHeader/>
+        </w:trPr>
+        header1
+        <w:tc>
+          <w:tcPr>
+            <w:tcBorders>
+              <w:bottom w:val="single" w:sz="12" w:space="0" w:color="666666"/>
+              <w:top w:val="single" w:sz="12" w:space="0" w:color="666666"/>
+              <w:left w:val="none" w:sz="0" w:space="0" w:color="000000"/>
+              <w:right w:val="none" w:sz="0" w:space="0" w:color="000000"/>
+            </w:tcBorders>
+            <w:shd w:val="clear" w:color="auto" w:fill="F2F2F2"/>
+            <w:tcMar>
+              <w:top w:w="0" w:type="dxa"/>
+              <w:bottom w:w="0" w:type="dxa"/>
+              <w:left w:w="0" w:type="dxa"/>
+              <w:right w:w="0" w:type="dxa"/>
+            </w:tcMar>
+            <w:vAlign w:val="center"/>
+          </w:tcPr>
+          <w:p>
+            <w:pPr>
+              <w:jc w:val="center"/>
+              <w:pBdr>
+                <w:bottom w:val="none" w:sz="0" w:space="0" w:color="000000"/>
+                <w:top w:val="none" w:sz="0" w:space="0" w:color="000000"/>
+                <w:left w:val="none" w:sz="0" w:space="0" w:color="000000"/>
+                <w:right w:val="none" w:sz="0" w:space="0" w:color="000000"/>
+              </w:pBdr>
+              <w:spacing w:after="100" w:before="100" w:line="240"/>
+              <w:ind w:left="100" w:right="100" w:firstLine="0" w:firstLineChars="0"/>
+              <w:rPr>
+                <w:rFonts w:ascii="serif" w:hAnsi="serif" w:eastAsia="serif" w:cs="serif"/>
+                <w:i w:val="false"/>
+                <w:b w:val="true"/>
+                <w:u w:val="none"/>
+                <w:sz w:val="20"/>
+                <w:szCs w:val="20"/>
+                <w:color w:val="000000"/>
+              </w:rPr>
+            </w:pPr>
+            <w:r xmlns:w="http://schemas.openxmlformats.org/wordprocessingml/2006/main" xmlns:wp="http://schemas.openxmlformats.org/drawingml/2006/wordprocessingDrawing" xmlns:r="http://schemas.openxmlformats.org/officeDocument/2006/relationships" xmlns:w14="http://schemas.microsoft.com/office/word/2010/wordml">
+              <w:rPr>
+                <w:rFonts w:ascii="serif" w:hAnsi="serif" w:eastAsia="serif" w:cs="serif"/>
+                <w:i w:val="false"/>
+                <w:b w:val="true"/>
+                <w:u w:val="none"/>
+                <w:sz w:val="20"/>
+                <w:szCs w:val="20"/>
+                <w:color w:val="000000"/>
+              </w:rPr>
+              <w:t xml:space="preserve">Group</w:t>
+            </w:r>
+          </w:p>
+        </w:tc>
+        <w:tc>
+          <w:tcPr>
+            <w:tcBorders>
+              <w:bottom w:val="single" w:sz="12" w:space="0" w:color="666666"/>
+              <w:top w:val="single" w:sz="12" w:space="0" w:color="666666"/>
+              <w:left w:val="none" w:sz="0" w:space="0" w:color="000000"/>
+              <w:right w:val="none" w:sz="0" w:space="0" w:color="000000"/>
+            </w:tcBorders>
+            <w:shd w:val="clear" w:color="auto" w:fill="F2F2F2"/>
+            <w:tcMar>
+              <w:top w:w="0" w:type="dxa"/>
+              <w:bottom w:w="0" w:type="dxa"/>
+              <w:left w:w="0" w:type="dxa"/>
+              <w:right w:w="0" w:type="dxa"/>
+            </w:tcMar>
+            <w:vAlign w:val="center"/>
+          </w:tcPr>
+          <w:p>
+            <w:pPr>
+              <w:jc w:val="center"/>
+              <w:pBdr>
+                <w:bottom w:val="none" w:sz="0" w:space="0" w:color="000000"/>
+                <w:top w:val="none" w:sz="0" w:space="0" w:color="000000"/>
+                <w:left w:val="none" w:sz="0" w:space="0" w:color="000000"/>
+                <w:right w:val="none" w:sz="0" w:space="0" w:color="000000"/>
+              </w:pBdr>
+              <w:spacing w:after="100" w:before="100" w:line="240"/>
+              <w:ind w:left="100" w:right="100" w:firstLine="0" w:firstLineChars="0"/>
+              <w:rPr>
+                <w:rFonts w:ascii="serif" w:hAnsi="serif" w:eastAsia="serif" w:cs="serif"/>
+                <w:i w:val="false"/>
+                <w:b w:val="true"/>
+                <w:u w:val="none"/>
+                <w:sz w:val="20"/>
+                <w:szCs w:val="20"/>
+                <w:color w:val="000000"/>
+              </w:rPr>
+            </w:pPr>
+            <w:r xmlns:w="http://schemas.openxmlformats.org/wordprocessingml/2006/main" xmlns:wp="http://schemas.openxmlformats.org/drawingml/2006/wordprocessingDrawing" xmlns:r="http://schemas.openxmlformats.org/officeDocument/2006/relationships" xmlns:w14="http://schemas.microsoft.com/office/word/2010/wordml">
+              <w:rPr>
+                <w:rFonts w:ascii="serif" w:hAnsi="serif" w:eastAsia="serif" w:cs="serif"/>
+                <w:i w:val="false"/>
+                <w:b w:val="true"/>
+                <w:u w:val="none"/>
+                <w:sz w:val="20"/>
+                <w:szCs w:val="20"/>
+                <w:color w:val="000000"/>
+              </w:rPr>
+              <w:t xml:space="preserve">Mean Income HH</w:t>
+            </w:r>
+          </w:p>
+        </w:tc>
+        <w:tc>
+          <w:tcPr>
+            <w:tcBorders>
+              <w:bottom w:val="single" w:sz="12" w:space="0" w:color="666666"/>
+              <w:top w:val="single" w:sz="12" w:space="0" w:color="666666"/>
+              <w:left w:val="none" w:sz="0" w:space="0" w:color="000000"/>
+              <w:right w:val="none" w:sz="0" w:space="0" w:color="000000"/>
+            </w:tcBorders>
+            <w:shd w:val="clear" w:color="auto" w:fill="F2F2F2"/>
+            <w:tcMar>
+              <w:top w:w="0" w:type="dxa"/>
+              <w:bottom w:w="0" w:type="dxa"/>
+              <w:left w:w="0" w:type="dxa"/>
+              <w:right w:w="0" w:type="dxa"/>
+            </w:tcMar>
+            <w:vAlign w:val="center"/>
+          </w:tcPr>
+          <w:p>
+            <w:pPr>
+              <w:jc w:val="center"/>
+              <w:pBdr>
+                <w:bottom w:val="none" w:sz="0" w:space="0" w:color="000000"/>
+                <w:top w:val="none" w:sz="0" w:space="0" w:color="000000"/>
+                <w:left w:val="none" w:sz="0" w:space="0" w:color="000000"/>
+                <w:right w:val="none" w:sz="0" w:space="0" w:color="000000"/>
+              </w:pBdr>
+              <w:spacing w:after="100" w:before="100" w:line="240"/>
+              <w:ind w:left="100" w:right="100" w:firstLine="0" w:firstLineChars="0"/>
+              <w:rPr>
+                <w:rFonts w:ascii="serif" w:hAnsi="serif" w:eastAsia="serif" w:cs="serif"/>
+                <w:i w:val="false"/>
+                <w:b w:val="true"/>
+                <w:u w:val="none"/>
+                <w:sz w:val="20"/>
+                <w:szCs w:val="20"/>
+                <w:color w:val="000000"/>
+              </w:rPr>
+            </w:pPr>
+            <w:r xmlns:w="http://schemas.openxmlformats.org/wordprocessingml/2006/main" xmlns:wp="http://schemas.openxmlformats.org/drawingml/2006/wordprocessingDrawing" xmlns:r="http://schemas.openxmlformats.org/officeDocument/2006/relationships" xmlns:w14="http://schemas.microsoft.com/office/word/2010/wordml">
+              <w:rPr>
+                <w:rFonts w:ascii="serif" w:hAnsi="serif" w:eastAsia="serif" w:cs="serif"/>
+                <w:i w:val="false"/>
+                <w:b w:val="true"/>
+                <w:u w:val="none"/>
+                <w:sz w:val="20"/>
+                <w:szCs w:val="20"/>
+                <w:color w:val="000000"/>
+              </w:rPr>
+              <w:t xml:space="preserve">Mean Income Clan</w:t>
+            </w:r>
+          </w:p>
+        </w:tc>
+        <w:tc>
+          <w:tcPr>
+            <w:tcBorders>
+              <w:bottom w:val="single" w:sz="12" w:space="0" w:color="666666"/>
+              <w:top w:val="single" w:sz="12" w:space="0" w:color="666666"/>
+              <w:left w:val="none" w:sz="0" w:space="0" w:color="000000"/>
+              <w:right w:val="none" w:sz="0" w:space="0" w:color="000000"/>
+            </w:tcBorders>
+            <w:shd w:val="clear" w:color="auto" w:fill="F2F2F2"/>
+            <w:tcMar>
+              <w:top w:w="0" w:type="dxa"/>
+              <w:bottom w:w="0" w:type="dxa"/>
+              <w:left w:w="0" w:type="dxa"/>
+              <w:right w:w="0" w:type="dxa"/>
+            </w:tcMar>
+            <w:vAlign w:val="center"/>
+          </w:tcPr>
+          <w:p>
+            <w:pPr>
+              <w:jc w:val="center"/>
+              <w:pBdr>
+                <w:bottom w:val="none" w:sz="0" w:space="0" w:color="000000"/>
+                <w:top w:val="none" w:sz="0" w:space="0" w:color="000000"/>
+                <w:left w:val="none" w:sz="0" w:space="0" w:color="000000"/>
+                <w:right w:val="none" w:sz="0" w:space="0" w:color="000000"/>
+              </w:pBdr>
+              <w:spacing w:after="100" w:before="100" w:line="240"/>
+              <w:ind w:left="100" w:right="100" w:firstLine="0" w:firstLineChars="0"/>
+              <w:rPr>
+                <w:rFonts w:ascii="serif" w:hAnsi="serif" w:eastAsia="serif" w:cs="serif"/>
+                <w:i w:val="false"/>
+                <w:b w:val="true"/>
+                <w:u w:val="none"/>
+                <w:sz w:val="20"/>
+                <w:szCs w:val="20"/>
+                <w:color w:val="000000"/>
+              </w:rPr>
+            </w:pPr>
+            <w:r xmlns:w="http://schemas.openxmlformats.org/wordprocessingml/2006/main" xmlns:wp="http://schemas.openxmlformats.org/drawingml/2006/wordprocessingDrawing" xmlns:r="http://schemas.openxmlformats.org/officeDocument/2006/relationships" xmlns:w14="http://schemas.microsoft.com/office/word/2010/wordml">
+              <w:rPr>
+                <w:rFonts w:ascii="serif" w:hAnsi="serif" w:eastAsia="serif" w:cs="serif"/>
+                <w:i w:val="false"/>
+                <w:b w:val="true"/>
+                <w:u w:val="none"/>
+                <w:sz w:val="20"/>
+                <w:szCs w:val="20"/>
+                <w:color w:val="000000"/>
+              </w:rPr>
+              <w:t xml:space="preserve">Median Income HH</w:t>
+            </w:r>
+          </w:p>
+        </w:tc>
+        <w:tc>
+          <w:tcPr>
+            <w:tcBorders>
+              <w:bottom w:val="single" w:sz="12" w:space="0" w:color="666666"/>
+              <w:top w:val="single" w:sz="12" w:space="0" w:color="666666"/>
+              <w:left w:val="none" w:sz="0" w:space="0" w:color="000000"/>
+              <w:right w:val="none" w:sz="0" w:space="0" w:color="000000"/>
+            </w:tcBorders>
+            <w:shd w:val="clear" w:color="auto" w:fill="F2F2F2"/>
+            <w:tcMar>
+              <w:top w:w="0" w:type="dxa"/>
+              <w:bottom w:w="0" w:type="dxa"/>
+              <w:left w:w="0" w:type="dxa"/>
+              <w:right w:w="0" w:type="dxa"/>
+            </w:tcMar>
+            <w:vAlign w:val="center"/>
+          </w:tcPr>
+          <w:p>
+            <w:pPr>
+              <w:jc w:val="center"/>
+              <w:pBdr>
+                <w:bottom w:val="none" w:sz="0" w:space="0" w:color="000000"/>
+                <w:top w:val="none" w:sz="0" w:space="0" w:color="000000"/>
+                <w:left w:val="none" w:sz="0" w:space="0" w:color="000000"/>
+                <w:right w:val="none" w:sz="0" w:space="0" w:color="000000"/>
+              </w:pBdr>
+              <w:spacing w:after="100" w:before="100" w:line="240"/>
+              <w:ind w:left="100" w:right="100" w:firstLine="0" w:firstLineChars="0"/>
+              <w:rPr>
+                <w:rFonts w:ascii="serif" w:hAnsi="serif" w:eastAsia="serif" w:cs="serif"/>
+                <w:i w:val="false"/>
+                <w:b w:val="true"/>
+                <w:u w:val="none"/>
+                <w:sz w:val="20"/>
+                <w:szCs w:val="20"/>
+                <w:color w:val="000000"/>
+              </w:rPr>
+            </w:pPr>
+            <w:r xmlns:w="http://schemas.openxmlformats.org/wordprocessingml/2006/main" xmlns:wp="http://schemas.openxmlformats.org/drawingml/2006/wordprocessingDrawing" xmlns:r="http://schemas.openxmlformats.org/officeDocument/2006/relationships" xmlns:w14="http://schemas.microsoft.com/office/word/2010/wordml">
+              <w:rPr>
+                <w:rFonts w:ascii="serif" w:hAnsi="serif" w:eastAsia="serif" w:cs="serif"/>
+                <w:i w:val="false"/>
+                <w:b w:val="true"/>
+                <w:u w:val="none"/>
+                <w:sz w:val="20"/>
+                <w:szCs w:val="20"/>
+                <w:color w:val="000000"/>
+              </w:rPr>
+              <w:t xml:space="preserve">Median Income Clan</w:t>
+            </w:r>
+          </w:p>
+        </w:tc>
+      </w:tr>
+      <w:tr>
+        <w:trPr>
+          <w:trHeight w:val="360" w:hRule="auto"/>
+        </w:trPr>
+        body1
+        <w:tc>
+          <w:tcPr>
+            <w:tcBorders>
+              <w:bottom w:val="none" w:sz="0" w:space="0" w:color="000000"/>
+              <w:top w:val="single" w:sz="12" w:space="0" w:color="666666"/>
+              <w:left w:val="none" w:sz="0" w:space="0" w:color="000000"/>
+              <w:right w:val="none" w:sz="0" w:space="0" w:color="000000"/>
+            </w:tcBorders>
+            <w:shd w:val="clear" w:color="auto" w:fill="FFFFFF"/>
+            <w:tcMar>
+              <w:top w:w="0" w:type="dxa"/>
+              <w:bottom w:w="0" w:type="dxa"/>
+              <w:left w:w="0" w:type="dxa"/>
+              <w:right w:w="0" w:type="dxa"/>
+            </w:tcMar>
+            <w:vAlign w:val="center"/>
+          </w:tcPr>
+          <w:p>
+            <w:pPr>
+              <w:jc w:val="left"/>
+              <w:pBdr>
+                <w:bottom w:val="none" w:sz="0" w:space="0" w:color="000000"/>
+                <w:top w:val="none" w:sz="0" w:space="0" w:color="000000"/>
+                <w:left w:val="none" w:sz="0" w:space="0" w:color="000000"/>
+                <w:right w:val="none" w:sz="0" w:space="0" w:color="000000"/>
+              </w:pBdr>
+              <w:spacing w:after="100" w:before="100" w:line="240"/>
+              <w:ind w:left="100" w:right="100" w:firstLine="0" w:firstLineChars="0"/>
+              <w:rPr>
+                <w:rFonts w:ascii="serif" w:hAnsi="serif" w:eastAsia="serif" w:cs="serif"/>
+                <w:i w:val="false"/>
+                <w:b w:val="true"/>
+                <w:u w:val="none"/>
+                <w:sz w:val="20"/>
+                <w:szCs w:val="20"/>
+                <w:color w:val="000000"/>
+              </w:rPr>
+            </w:pPr>
+            <w:r xmlns:w="http://schemas.openxmlformats.org/wordprocessingml/2006/main" xmlns:wp="http://schemas.openxmlformats.org/drawingml/2006/wordprocessingDrawing" xmlns:r="http://schemas.openxmlformats.org/officeDocument/2006/relationships" xmlns:w14="http://schemas.microsoft.com/office/word/2010/wordml">
+              <w:rPr>
+                <w:rFonts w:ascii="serif" w:hAnsi="serif" w:eastAsia="serif" w:cs="serif"/>
+                <w:i w:val="false"/>
+                <w:b w:val="true"/>
+                <w:u w:val="none"/>
+                <w:sz w:val="20"/>
+                <w:szCs w:val="20"/>
+                <w:color w:val="000000"/>
+              </w:rPr>
+              <w:t xml:space="preserve">Black</w:t>
+            </w:r>
+          </w:p>
+        </w:tc>
+        <w:tc>
+          <w:tcPr>
+            <w:tcBorders>
+              <w:bottom w:val="none" w:sz="0" w:space="0" w:color="000000"/>
+              <w:top w:val="single" w:sz="12" w:space="0" w:color="666666"/>
+              <w:left w:val="none" w:sz="0" w:space="0" w:color="000000"/>
+              <w:right w:val="none" w:sz="0" w:space="0" w:color="000000"/>
+            </w:tcBorders>
+            <w:shd w:val="clear" w:color="auto" w:fill="FFFFFF"/>
+            <w:tcMar>
+              <w:top w:w="0" w:type="dxa"/>
+              <w:bottom w:w="0" w:type="dxa"/>
+              <w:left w:w="0" w:type="dxa"/>
+              <w:right w:w="0" w:type="dxa"/>
+            </w:tcMar>
+            <w:vAlign w:val="center"/>
+          </w:tcPr>
+          <w:p>
+            <w:pPr>
+              <w:jc w:val="center"/>
+              <w:pBdr>
+                <w:bottom w:val="none" w:sz="0" w:space="0" w:color="000000"/>
+                <w:top w:val="none" w:sz="0" w:space="0" w:color="000000"/>
+                <w:left w:val="none" w:sz="0" w:space="0" w:color="000000"/>
+                <w:right w:val="none" w:sz="0" w:space="0" w:color="000000"/>
+              </w:pBdr>
+              <w:spacing w:after="100" w:before="100" w:line="240"/>
+              <w:ind w:left="100" w:right="100" w:firstLine="0" w:firstLineChars="0"/>
+              <w:rPr>
+                <w:rFonts w:ascii="serif" w:hAnsi="serif" w:eastAsia="serif" w:cs="serif"/>
+                <w:i w:val="false"/>
+                <w:b w:val="false"/>
+                <w:u w:val="none"/>
+                <w:sz w:val="20"/>
+                <w:szCs w:val="20"/>
+                <w:color w:val="000000"/>
+              </w:rPr>
+            </w:pPr>
+            <w:r xmlns:w="http://schemas.openxmlformats.org/wordprocessingml/2006/main" xmlns:wp="http://schemas.openxmlformats.org/drawingml/2006/wordprocessingDrawing" xmlns:r="http://schemas.openxmlformats.org/officeDocument/2006/relationships" xmlns:w14="http://schemas.microsoft.com/office/word/2010/wordml">
+              <w:rPr>
+                <w:rFonts w:ascii="serif" w:hAnsi="serif" w:eastAsia="serif" w:cs="serif"/>
+                <w:i w:val="false"/>
+                <w:b w:val="false"/>
+                <w:u w:val="none"/>
+                <w:sz w:val="20"/>
+                <w:szCs w:val="20"/>
+                <w:color w:val="000000"/>
+              </w:rPr>
+              <w:t xml:space="preserve">36,205</w:t>
+            </w:r>
+          </w:p>
+        </w:tc>
+        <w:tc>
+          <w:tcPr>
+            <w:tcBorders>
+              <w:bottom w:val="none" w:sz="0" w:space="0" w:color="000000"/>
+              <w:top w:val="single" w:sz="12" w:space="0" w:color="666666"/>
+              <w:left w:val="none" w:sz="0" w:space="0" w:color="000000"/>
+              <w:right w:val="none" w:sz="0" w:space="0" w:color="000000"/>
+            </w:tcBorders>
+            <w:shd w:val="clear" w:color="auto" w:fill="FFFFFF"/>
+            <w:tcMar>
+              <w:top w:w="0" w:type="dxa"/>
+              <w:bottom w:w="0" w:type="dxa"/>
+              <w:left w:w="0" w:type="dxa"/>
+              <w:right w:w="0" w:type="dxa"/>
+            </w:tcMar>
+            <w:vAlign w:val="center"/>
+          </w:tcPr>
+          <w:p>
+            <w:pPr>
+              <w:jc w:val="center"/>
+              <w:pBdr>
+                <w:bottom w:val="none" w:sz="0" w:space="0" w:color="000000"/>
+                <w:top w:val="none" w:sz="0" w:space="0" w:color="000000"/>
+                <w:left w:val="none" w:sz="0" w:space="0" w:color="000000"/>
+                <w:right w:val="none" w:sz="0" w:space="0" w:color="000000"/>
+              </w:pBdr>
+              <w:spacing w:after="100" w:before="100" w:line="240"/>
+              <w:ind w:left="100" w:right="100" w:firstLine="0" w:firstLineChars="0"/>
+              <w:rPr>
+                <w:rFonts w:ascii="serif" w:hAnsi="serif" w:eastAsia="serif" w:cs="serif"/>
+                <w:i w:val="false"/>
+                <w:b w:val="false"/>
+                <w:u w:val="none"/>
+                <w:sz w:val="20"/>
+                <w:szCs w:val="20"/>
+                <w:color w:val="000000"/>
+              </w:rPr>
+            </w:pPr>
+            <w:r xmlns:w="http://schemas.openxmlformats.org/wordprocessingml/2006/main" xmlns:wp="http://schemas.openxmlformats.org/drawingml/2006/wordprocessingDrawing" xmlns:r="http://schemas.openxmlformats.org/officeDocument/2006/relationships" xmlns:w14="http://schemas.microsoft.com/office/word/2010/wordml">
+              <w:rPr>
+                <w:rFonts w:ascii="serif" w:hAnsi="serif" w:eastAsia="serif" w:cs="serif"/>
+                <w:i w:val="false"/>
+                <w:b w:val="false"/>
+                <w:u w:val="none"/>
+                <w:sz w:val="20"/>
+                <w:szCs w:val="20"/>
+                <w:color w:val="000000"/>
+              </w:rPr>
+              <w:t xml:space="preserve">60,000</w:t>
+            </w:r>
+          </w:p>
+        </w:tc>
+        <w:tc>
+          <w:tcPr>
+            <w:tcBorders>
+              <w:bottom w:val="none" w:sz="0" w:space="0" w:color="000000"/>
+              <w:top w:val="single" w:sz="12" w:space="0" w:color="666666"/>
+              <w:left w:val="none" w:sz="0" w:space="0" w:color="000000"/>
+              <w:right w:val="none" w:sz="0" w:space="0" w:color="000000"/>
+            </w:tcBorders>
+            <w:shd w:val="clear" w:color="auto" w:fill="FFFFFF"/>
+            <w:tcMar>
+              <w:top w:w="0" w:type="dxa"/>
+              <w:bottom w:w="0" w:type="dxa"/>
+              <w:left w:w="0" w:type="dxa"/>
+              <w:right w:w="0" w:type="dxa"/>
+            </w:tcMar>
+            <w:vAlign w:val="center"/>
+          </w:tcPr>
+          <w:p>
+            <w:pPr>
+              <w:jc w:val="center"/>
+              <w:pBdr>
+                <w:bottom w:val="none" w:sz="0" w:space="0" w:color="000000"/>
+                <w:top w:val="none" w:sz="0" w:space="0" w:color="000000"/>
+                <w:left w:val="none" w:sz="0" w:space="0" w:color="000000"/>
+                <w:right w:val="none" w:sz="0" w:space="0" w:color="000000"/>
+              </w:pBdr>
+              <w:spacing w:after="100" w:before="100" w:line="240"/>
+              <w:ind w:left="100" w:right="100" w:firstLine="0" w:firstLineChars="0"/>
+              <w:rPr>
+                <w:rFonts w:ascii="serif" w:hAnsi="serif" w:eastAsia="serif" w:cs="serif"/>
+                <w:i w:val="false"/>
+                <w:b w:val="false"/>
+                <w:u w:val="none"/>
+                <w:sz w:val="20"/>
+                <w:szCs w:val="20"/>
+                <w:color w:val="000000"/>
+              </w:rPr>
+            </w:pPr>
+            <w:r xmlns:w="http://schemas.openxmlformats.org/wordprocessingml/2006/main" xmlns:wp="http://schemas.openxmlformats.org/drawingml/2006/wordprocessingDrawing" xmlns:r="http://schemas.openxmlformats.org/officeDocument/2006/relationships" xmlns:w14="http://schemas.microsoft.com/office/word/2010/wordml">
+              <w:rPr>
+                <w:rFonts w:ascii="serif" w:hAnsi="serif" w:eastAsia="serif" w:cs="serif"/>
+                <w:i w:val="false"/>
+                <w:b w:val="false"/>
+                <w:u w:val="none"/>
+                <w:sz w:val="20"/>
+                <w:szCs w:val="20"/>
+                <w:color w:val="000000"/>
+              </w:rPr>
+              <w:t xml:space="preserve">17,621</w:t>
+            </w:r>
+          </w:p>
+        </w:tc>
+        <w:tc>
+          <w:tcPr>
+            <w:tcBorders>
+              <w:bottom w:val="none" w:sz="0" w:space="0" w:color="000000"/>
+              <w:top w:val="single" w:sz="12" w:space="0" w:color="666666"/>
+              <w:left w:val="none" w:sz="0" w:space="0" w:color="000000"/>
+              <w:right w:val="none" w:sz="0" w:space="0" w:color="000000"/>
+            </w:tcBorders>
+            <w:shd w:val="clear" w:color="auto" w:fill="FFFFFF"/>
+            <w:tcMar>
+              <w:top w:w="0" w:type="dxa"/>
+              <w:bottom w:w="0" w:type="dxa"/>
+              <w:left w:w="0" w:type="dxa"/>
+              <w:right w:w="0" w:type="dxa"/>
+            </w:tcMar>
+            <w:vAlign w:val="center"/>
+          </w:tcPr>
+          <w:p>
+            <w:pPr>
+              <w:jc w:val="center"/>
+              <w:pBdr>
+                <w:bottom w:val="none" w:sz="0" w:space="0" w:color="000000"/>
+                <w:top w:val="none" w:sz="0" w:space="0" w:color="000000"/>
+                <w:left w:val="none" w:sz="0" w:space="0" w:color="000000"/>
+                <w:right w:val="none" w:sz="0" w:space="0" w:color="000000"/>
+              </w:pBdr>
+              <w:spacing w:after="100" w:before="100" w:line="240"/>
+              <w:ind w:left="100" w:right="100" w:firstLine="0" w:firstLineChars="0"/>
+              <w:rPr>
+                <w:rFonts w:ascii="serif" w:hAnsi="serif" w:eastAsia="serif" w:cs="serif"/>
+                <w:i w:val="false"/>
+                <w:b w:val="false"/>
+                <w:u w:val="none"/>
+                <w:sz w:val="20"/>
+                <w:szCs w:val="20"/>
+                <w:color w:val="000000"/>
+              </w:rPr>
+            </w:pPr>
+            <w:r xmlns:w="http://schemas.openxmlformats.org/wordprocessingml/2006/main" xmlns:wp="http://schemas.openxmlformats.org/drawingml/2006/wordprocessingDrawing" xmlns:r="http://schemas.openxmlformats.org/officeDocument/2006/relationships" xmlns:w14="http://schemas.microsoft.com/office/word/2010/wordml">
+              <w:rPr>
+                <w:rFonts w:ascii="serif" w:hAnsi="serif" w:eastAsia="serif" w:cs="serif"/>
+                <w:i w:val="false"/>
+                <w:b w:val="false"/>
+                <w:u w:val="none"/>
+                <w:sz w:val="20"/>
+                <w:szCs w:val="20"/>
+                <w:color w:val="000000"/>
+              </w:rPr>
+              <w:t xml:space="preserve">36,562</w:t>
+            </w:r>
+          </w:p>
+        </w:tc>
+      </w:tr>
+      <w:tr>
+        <w:trPr>
+          <w:trHeight w:val="360" w:hRule="auto"/>
+        </w:trPr>
+        body2
+        <w:tc>
+          <w:tcPr>
+            <w:tcBorders>
+              <w:bottom w:val="single" w:sz="4" w:space="0" w:color="999999"/>
+              <w:top w:val="none" w:sz="0" w:space="0" w:color="000000"/>
+              <w:left w:val="none" w:sz="0" w:space="0" w:color="000000"/>
+              <w:right w:val="none" w:sz="0" w:space="0" w:color="000000"/>
+            </w:tcBorders>
+            <w:shd w:val="clear" w:color="auto" w:fill="FFFFFF"/>
+            <w:tcMar>
+              <w:top w:w="0" w:type="dxa"/>
+              <w:bottom w:w="0" w:type="dxa"/>
+              <w:left w:w="0" w:type="dxa"/>
+              <w:right w:w="0" w:type="dxa"/>
+            </w:tcMar>
+            <w:vAlign w:val="center"/>
+          </w:tcPr>
+          <w:p>
+            <w:pPr>
+              <w:jc w:val="left"/>
+              <w:pBdr>
+                <w:bottom w:val="none" w:sz="0" w:space="0" w:color="000000"/>
+                <w:top w:val="none" w:sz="0" w:space="0" w:color="000000"/>
+                <w:left w:val="none" w:sz="0" w:space="0" w:color="000000"/>
+                <w:right w:val="none" w:sz="0" w:space="0" w:color="000000"/>
+              </w:pBdr>
+              <w:spacing w:after="100" w:before="100" w:line="240"/>
+              <w:ind w:left="100" w:right="100" w:firstLine="0" w:firstLineChars="0"/>
+              <w:rPr>
+                <w:rFonts w:ascii="serif" w:hAnsi="serif" w:eastAsia="serif" w:cs="serif"/>
+                <w:i w:val="false"/>
+                <w:b w:val="true"/>
+                <w:u w:val="none"/>
+                <w:sz w:val="20"/>
+                <w:szCs w:val="20"/>
+                <w:color w:val="000000"/>
+              </w:rPr>
+            </w:pPr>
+            <w:r xmlns:w="http://schemas.openxmlformats.org/wordprocessingml/2006/main" xmlns:wp="http://schemas.openxmlformats.org/drawingml/2006/wordprocessingDrawing" xmlns:r="http://schemas.openxmlformats.org/officeDocument/2006/relationships" xmlns:w14="http://schemas.microsoft.com/office/word/2010/wordml">
+              <w:rPr>
+                <w:rFonts w:ascii="serif" w:hAnsi="serif" w:eastAsia="serif" w:cs="serif"/>
+                <w:i w:val="false"/>
+                <w:b w:val="true"/>
+                <w:u w:val="none"/>
+                <w:sz w:val="20"/>
+                <w:szCs w:val="20"/>
+                <w:color w:val="000000"/>
+              </w:rPr>
+              <w:t xml:space="preserve">Non-Black</w:t>
+            </w:r>
+          </w:p>
+        </w:tc>
+        <w:tc>
+          <w:tcPr>
+            <w:tcBorders>
+              <w:bottom w:val="single" w:sz="4" w:space="0" w:color="999999"/>
+              <w:top w:val="none" w:sz="0" w:space="0" w:color="000000"/>
+              <w:left w:val="none" w:sz="0" w:space="0" w:color="000000"/>
+              <w:right w:val="none" w:sz="0" w:space="0" w:color="000000"/>
+            </w:tcBorders>
+            <w:shd w:val="clear" w:color="auto" w:fill="FFFFFF"/>
+            <w:tcMar>
+              <w:top w:w="0" w:type="dxa"/>
+              <w:bottom w:w="0" w:type="dxa"/>
+              <w:left w:w="0" w:type="dxa"/>
+              <w:right w:w="0" w:type="dxa"/>
+            </w:tcMar>
+            <w:vAlign w:val="center"/>
+          </w:tcPr>
+          <w:p>
+            <w:pPr>
+              <w:jc w:val="center"/>
+              <w:pBdr>
+                <w:bottom w:val="none" w:sz="0" w:space="0" w:color="000000"/>
+                <w:top w:val="none" w:sz="0" w:space="0" w:color="000000"/>
+                <w:left w:val="none" w:sz="0" w:space="0" w:color="000000"/>
+                <w:right w:val="none" w:sz="0" w:space="0" w:color="000000"/>
+              </w:pBdr>
+              <w:spacing w:after="100" w:before="100" w:line="240"/>
+              <w:ind w:left="100" w:right="100" w:firstLine="0" w:firstLineChars="0"/>
+              <w:rPr>
+                <w:rFonts w:ascii="serif" w:hAnsi="serif" w:eastAsia="serif" w:cs="serif"/>
+                <w:i w:val="false"/>
+                <w:b w:val="false"/>
+                <w:u w:val="none"/>
+                <w:sz w:val="20"/>
+                <w:szCs w:val="20"/>
+                <w:color w:val="000000"/>
+              </w:rPr>
+            </w:pPr>
+            <w:r xmlns:w="http://schemas.openxmlformats.org/wordprocessingml/2006/main" xmlns:wp="http://schemas.openxmlformats.org/drawingml/2006/wordprocessingDrawing" xmlns:r="http://schemas.openxmlformats.org/officeDocument/2006/relationships" xmlns:w14="http://schemas.microsoft.com/office/word/2010/wordml">
+              <w:rPr>
+                <w:rFonts w:ascii="serif" w:hAnsi="serif" w:eastAsia="serif" w:cs="serif"/>
+                <w:i w:val="false"/>
+                <w:b w:val="false"/>
+                <w:u w:val="none"/>
+                <w:sz w:val="20"/>
+                <w:szCs w:val="20"/>
+                <w:color w:val="000000"/>
+              </w:rPr>
+              <w:t xml:space="preserve">56,600</w:t>
+            </w:r>
+          </w:p>
+        </w:tc>
+        <w:tc>
+          <w:tcPr>
+            <w:tcBorders>
+              <w:bottom w:val="single" w:sz="4" w:space="0" w:color="999999"/>
+              <w:top w:val="none" w:sz="0" w:space="0" w:color="000000"/>
+              <w:left w:val="none" w:sz="0" w:space="0" w:color="000000"/>
+              <w:right w:val="none" w:sz="0" w:space="0" w:color="000000"/>
+            </w:tcBorders>
+            <w:shd w:val="clear" w:color="auto" w:fill="FFFFFF"/>
+            <w:tcMar>
+              <w:top w:w="0" w:type="dxa"/>
+              <w:bottom w:w="0" w:type="dxa"/>
+              <w:left w:w="0" w:type="dxa"/>
+              <w:right w:w="0" w:type="dxa"/>
+            </w:tcMar>
+            <w:vAlign w:val="center"/>
+          </w:tcPr>
+          <w:p>
+            <w:pPr>
+              <w:jc w:val="center"/>
+              <w:pBdr>
+                <w:bottom w:val="none" w:sz="0" w:space="0" w:color="000000"/>
+                <w:top w:val="none" w:sz="0" w:space="0" w:color="000000"/>
+                <w:left w:val="none" w:sz="0" w:space="0" w:color="000000"/>
+                <w:right w:val="none" w:sz="0" w:space="0" w:color="000000"/>
+              </w:pBdr>
+              <w:spacing w:after="100" w:before="100" w:line="240"/>
+              <w:ind w:left="100" w:right="100" w:firstLine="0" w:firstLineChars="0"/>
+              <w:rPr>
+                <w:rFonts w:ascii="serif" w:hAnsi="serif" w:eastAsia="serif" w:cs="serif"/>
+                <w:i w:val="false"/>
+                <w:b w:val="false"/>
+                <w:u w:val="none"/>
+                <w:sz w:val="20"/>
+                <w:szCs w:val="20"/>
+                <w:color w:val="000000"/>
+              </w:rPr>
+            </w:pPr>
+            <w:r xmlns:w="http://schemas.openxmlformats.org/wordprocessingml/2006/main" xmlns:wp="http://schemas.openxmlformats.org/drawingml/2006/wordprocessingDrawing" xmlns:r="http://schemas.openxmlformats.org/officeDocument/2006/relationships" xmlns:w14="http://schemas.microsoft.com/office/word/2010/wordml">
+              <w:rPr>
+                <w:rFonts w:ascii="serif" w:hAnsi="serif" w:eastAsia="serif" w:cs="serif"/>
+                <w:i w:val="false"/>
+                <w:b w:val="false"/>
+                <w:u w:val="none"/>
+                <w:sz w:val="20"/>
+                <w:szCs w:val="20"/>
+                <w:color w:val="000000"/>
+              </w:rPr>
+              <w:t xml:space="preserve">108,522</w:t>
+            </w:r>
+          </w:p>
+        </w:tc>
+        <w:tc>
+          <w:tcPr>
+            <w:tcBorders>
+              <w:bottom w:val="single" w:sz="4" w:space="0" w:color="999999"/>
+              <w:top w:val="none" w:sz="0" w:space="0" w:color="000000"/>
+              <w:left w:val="none" w:sz="0" w:space="0" w:color="000000"/>
+              <w:right w:val="none" w:sz="0" w:space="0" w:color="000000"/>
+            </w:tcBorders>
+            <w:shd w:val="clear" w:color="auto" w:fill="FFFFFF"/>
+            <w:tcMar>
+              <w:top w:w="0" w:type="dxa"/>
+              <w:bottom w:w="0" w:type="dxa"/>
+              <w:left w:w="0" w:type="dxa"/>
+              <w:right w:w="0" w:type="dxa"/>
+            </w:tcMar>
+            <w:vAlign w:val="center"/>
+          </w:tcPr>
+          <w:p>
+            <w:pPr>
+              <w:jc w:val="center"/>
+              <w:pBdr>
+                <w:bottom w:val="none" w:sz="0" w:space="0" w:color="000000"/>
+                <w:top w:val="none" w:sz="0" w:space="0" w:color="000000"/>
+                <w:left w:val="none" w:sz="0" w:space="0" w:color="000000"/>
+                <w:right w:val="none" w:sz="0" w:space="0" w:color="000000"/>
+              </w:pBdr>
+              <w:spacing w:after="100" w:before="100" w:line="240"/>
+              <w:ind w:left="100" w:right="100" w:firstLine="0" w:firstLineChars="0"/>
+              <w:rPr>
+                <w:rFonts w:ascii="serif" w:hAnsi="serif" w:eastAsia="serif" w:cs="serif"/>
+                <w:i w:val="false"/>
+                <w:b w:val="false"/>
+                <w:u w:val="none"/>
+                <w:sz w:val="20"/>
+                <w:szCs w:val="20"/>
+                <w:color w:val="000000"/>
+              </w:rPr>
+            </w:pPr>
+            <w:r xmlns:w="http://schemas.openxmlformats.org/wordprocessingml/2006/main" xmlns:wp="http://schemas.openxmlformats.org/drawingml/2006/wordprocessingDrawing" xmlns:r="http://schemas.openxmlformats.org/officeDocument/2006/relationships" xmlns:w14="http://schemas.microsoft.com/office/word/2010/wordml">
+              <w:rPr>
+                <w:rFonts w:ascii="serif" w:hAnsi="serif" w:eastAsia="serif" w:cs="serif"/>
+                <w:i w:val="false"/>
+                <w:b w:val="false"/>
+                <w:u w:val="none"/>
+                <w:sz w:val="20"/>
+                <w:szCs w:val="20"/>
+                <w:color w:val="000000"/>
+              </w:rPr>
+              <w:t xml:space="preserve">29,233</w:t>
+            </w:r>
+          </w:p>
+        </w:tc>
+        <w:tc>
+          <w:tcPr>
+            <w:tcBorders>
+              <w:bottom w:val="single" w:sz="4" w:space="0" w:color="999999"/>
+              <w:top w:val="none" w:sz="0" w:space="0" w:color="000000"/>
+              <w:left w:val="none" w:sz="0" w:space="0" w:color="000000"/>
+              <w:right w:val="none" w:sz="0" w:space="0" w:color="000000"/>
+            </w:tcBorders>
+            <w:shd w:val="clear" w:color="auto" w:fill="FFFFFF"/>
+            <w:tcMar>
+              <w:top w:w="0" w:type="dxa"/>
+              <w:bottom w:w="0" w:type="dxa"/>
+              <w:left w:w="0" w:type="dxa"/>
+              <w:right w:w="0" w:type="dxa"/>
+            </w:tcMar>
+            <w:vAlign w:val="center"/>
+          </w:tcPr>
+          <w:p>
+            <w:pPr>
+              <w:jc w:val="center"/>
+              <w:pBdr>
+                <w:bottom w:val="none" w:sz="0" w:space="0" w:color="000000"/>
+                <w:top w:val="none" w:sz="0" w:space="0" w:color="000000"/>
+                <w:left w:val="none" w:sz="0" w:space="0" w:color="000000"/>
+                <w:right w:val="none" w:sz="0" w:space="0" w:color="000000"/>
+              </w:pBdr>
+              <w:spacing w:after="100" w:before="100" w:line="240"/>
+              <w:ind w:left="100" w:right="100" w:firstLine="0" w:firstLineChars="0"/>
+              <w:rPr>
+                <w:rFonts w:ascii="serif" w:hAnsi="serif" w:eastAsia="serif" w:cs="serif"/>
+                <w:i w:val="false"/>
+                <w:b w:val="false"/>
+                <w:u w:val="none"/>
+                <w:sz w:val="20"/>
+                <w:szCs w:val="20"/>
+                <w:color w:val="000000"/>
+              </w:rPr>
+            </w:pPr>
+            <w:r xmlns:w="http://schemas.openxmlformats.org/wordprocessingml/2006/main" xmlns:wp="http://schemas.openxmlformats.org/drawingml/2006/wordprocessingDrawing" xmlns:r="http://schemas.openxmlformats.org/officeDocument/2006/relationships" xmlns:w14="http://schemas.microsoft.com/office/word/2010/wordml">
+              <w:rPr>
+                <w:rFonts w:ascii="serif" w:hAnsi="serif" w:eastAsia="serif" w:cs="serif"/>
+                <w:i w:val="false"/>
+                <w:b w:val="false"/>
+                <w:u w:val="none"/>
+                <w:sz w:val="20"/>
+                <w:szCs w:val="20"/>
+                <w:color w:val="000000"/>
+              </w:rPr>
+              <w:t xml:space="preserve">62,916</w:t>
+            </w:r>
+          </w:p>
+        </w:tc>
+      </w:tr>
+      <w:tr>
+        <w:trPr>
+          <w:trHeight w:val="360" w:hRule="auto"/>
+        </w:trPr>
+        body3
+        <w:tc>
+          <w:tcPr>
+            <w:tcBorders>
+              <w:bottom w:val="single" w:sz="12" w:space="0" w:color="666666"/>
+              <w:top w:val="single" w:sz="4" w:space="0" w:color="999999"/>
+              <w:left w:val="none" w:sz="0" w:space="0" w:color="000000"/>
+              <w:right w:val="none" w:sz="0" w:space="0" w:color="000000"/>
+            </w:tcBorders>
+            <w:shd w:val="clear" w:color="auto" w:fill="F2F2F2"/>
+            <w:tcMar>
+              <w:top w:w="0" w:type="dxa"/>
+              <w:bottom w:w="0" w:type="dxa"/>
+              <w:left w:w="0" w:type="dxa"/>
+              <w:right w:w="0" w:type="dxa"/>
+            </w:tcMar>
+            <w:vAlign w:val="center"/>
+          </w:tcPr>
+          <w:p>
+            <w:pPr>
+              <w:jc w:val="left"/>
+              <w:pBdr>
+                <w:bottom w:val="none" w:sz="0" w:space="0" w:color="000000"/>
+                <w:top w:val="none" w:sz="0" w:space="0" w:color="000000"/>
+                <w:left w:val="none" w:sz="0" w:space="0" w:color="000000"/>
+                <w:right w:val="none" w:sz="0" w:space="0" w:color="000000"/>
+              </w:pBdr>
+              <w:spacing w:after="100" w:before="100" w:line="240"/>
+              <w:ind w:left="100" w:right="100" w:firstLine="0" w:firstLineChars="0"/>
+              <w:rPr>
+                <w:rFonts w:ascii="serif" w:hAnsi="serif" w:eastAsia="serif" w:cs="serif"/>
+                <w:i w:val="false"/>
+                <w:b w:val="true"/>
+                <w:u w:val="none"/>
+                <w:sz w:val="20"/>
+                <w:szCs w:val="20"/>
+                <w:color w:val="000000"/>
+              </w:rPr>
+            </w:pPr>
+            <w:r xmlns:w="http://schemas.openxmlformats.org/wordprocessingml/2006/main" xmlns:wp="http://schemas.openxmlformats.org/drawingml/2006/wordprocessingDrawing" xmlns:r="http://schemas.openxmlformats.org/officeDocument/2006/relationships" xmlns:w14="http://schemas.microsoft.com/office/word/2010/wordml">
+              <w:rPr>
+                <w:rFonts w:ascii="serif" w:hAnsi="serif" w:eastAsia="serif" w:cs="serif"/>
+                <w:i w:val="false"/>
+                <w:b w:val="true"/>
+                <w:u w:val="none"/>
+                <w:sz w:val="20"/>
+                <w:szCs w:val="20"/>
+                <w:color w:val="000000"/>
+              </w:rPr>
+              <w:t xml:space="preserve">Ratio</w:t>
+            </w:r>
+          </w:p>
+        </w:tc>
+        <w:tc>
+          <w:tcPr>
+            <w:tcBorders>
+              <w:bottom w:val="single" w:sz="12" w:space="0" w:color="666666"/>
+              <w:top w:val="single" w:sz="4" w:space="0" w:color="999999"/>
+              <w:left w:val="none" w:sz="0" w:space="0" w:color="000000"/>
+              <w:right w:val="none" w:sz="0" w:space="0" w:color="000000"/>
+            </w:tcBorders>
+            <w:shd w:val="clear" w:color="auto" w:fill="F2F2F2"/>
+            <w:tcMar>
+              <w:top w:w="0" w:type="dxa"/>
+              <w:bottom w:w="0" w:type="dxa"/>
+              <w:left w:w="0" w:type="dxa"/>
+              <w:right w:w="0" w:type="dxa"/>
+            </w:tcMar>
+            <w:vAlign w:val="center"/>
+          </w:tcPr>
+          <w:p>
+            <w:pPr>
+              <w:jc w:val="center"/>
+              <w:pBdr>
+                <w:bottom w:val="none" w:sz="0" w:space="0" w:color="000000"/>
+                <w:top w:val="none" w:sz="0" w:space="0" w:color="000000"/>
+                <w:left w:val="none" w:sz="0" w:space="0" w:color="000000"/>
+                <w:right w:val="none" w:sz="0" w:space="0" w:color="000000"/>
+              </w:pBdr>
+              <w:spacing w:after="100" w:before="100" w:line="240"/>
+              <w:ind w:left="100" w:right="100" w:firstLine="0" w:firstLineChars="0"/>
+              <w:rPr>
+                <w:rFonts w:ascii="serif" w:hAnsi="serif" w:eastAsia="serif" w:cs="serif"/>
+                <w:i w:val="false"/>
+                <w:b w:val="false"/>
+                <w:u w:val="none"/>
+                <w:sz w:val="20"/>
+                <w:szCs w:val="20"/>
+                <w:color w:val="000000"/>
+              </w:rPr>
+            </w:pPr>
+            <w:r xmlns:w="http://schemas.openxmlformats.org/wordprocessingml/2006/main" xmlns:wp="http://schemas.openxmlformats.org/drawingml/2006/wordprocessingDrawing" xmlns:r="http://schemas.openxmlformats.org/officeDocument/2006/relationships" xmlns:w14="http://schemas.microsoft.com/office/word/2010/wordml">
+              <w:rPr>
+                <w:rFonts w:ascii="serif" w:hAnsi="serif" w:eastAsia="serif" w:cs="serif"/>
+                <w:i w:val="false"/>
+                <w:b w:val="false"/>
+                <w:u w:val="none"/>
+                <w:sz w:val="20"/>
+                <w:szCs w:val="20"/>
+                <w:color w:val="000000"/>
+              </w:rPr>
+              <w:t xml:space="preserve">0.64</w:t>
+            </w:r>
+          </w:p>
+        </w:tc>
+        <w:tc>
+          <w:tcPr>
+            <w:tcBorders>
+              <w:bottom w:val="single" w:sz="12" w:space="0" w:color="666666"/>
+              <w:top w:val="single" w:sz="4" w:space="0" w:color="999999"/>
+              <w:left w:val="none" w:sz="0" w:space="0" w:color="000000"/>
+              <w:right w:val="none" w:sz="0" w:space="0" w:color="000000"/>
+            </w:tcBorders>
+            <w:shd w:val="clear" w:color="auto" w:fill="F2F2F2"/>
+            <w:tcMar>
+              <w:top w:w="0" w:type="dxa"/>
+              <w:bottom w:w="0" w:type="dxa"/>
+              <w:left w:w="0" w:type="dxa"/>
+              <w:right w:w="0" w:type="dxa"/>
+            </w:tcMar>
+            <w:vAlign w:val="center"/>
+          </w:tcPr>
+          <w:p>
+            <w:pPr>
+              <w:jc w:val="center"/>
+              <w:pBdr>
+                <w:bottom w:val="none" w:sz="0" w:space="0" w:color="000000"/>
+                <w:top w:val="none" w:sz="0" w:space="0" w:color="000000"/>
+                <w:left w:val="none" w:sz="0" w:space="0" w:color="000000"/>
+                <w:right w:val="none" w:sz="0" w:space="0" w:color="000000"/>
+              </w:pBdr>
+              <w:spacing w:after="100" w:before="100" w:line="240"/>
+              <w:ind w:left="100" w:right="100" w:firstLine="0" w:firstLineChars="0"/>
+              <w:rPr>
+                <w:rFonts w:ascii="serif" w:hAnsi="serif" w:eastAsia="serif" w:cs="serif"/>
+                <w:i w:val="false"/>
+                <w:b w:val="false"/>
+                <w:u w:val="none"/>
+                <w:sz w:val="20"/>
+                <w:szCs w:val="20"/>
+                <w:color w:val="000000"/>
+              </w:rPr>
+            </w:pPr>
+            <w:r xmlns:w="http://schemas.openxmlformats.org/wordprocessingml/2006/main" xmlns:wp="http://schemas.openxmlformats.org/drawingml/2006/wordprocessingDrawing" xmlns:r="http://schemas.openxmlformats.org/officeDocument/2006/relationships" xmlns:w14="http://schemas.microsoft.com/office/word/2010/wordml">
+              <w:rPr>
+                <w:rFonts w:ascii="serif" w:hAnsi="serif" w:eastAsia="serif" w:cs="serif"/>
+                <w:i w:val="false"/>
+                <w:b w:val="false"/>
+                <w:u w:val="none"/>
+                <w:sz w:val="20"/>
+                <w:szCs w:val="20"/>
+                <w:color w:val="000000"/>
+              </w:rPr>
+              <w:t xml:space="preserve">0.55</w:t>
+            </w:r>
+          </w:p>
+        </w:tc>
+        <w:tc>
+          <w:tcPr>
+            <w:tcBorders>
+              <w:bottom w:val="single" w:sz="12" w:space="0" w:color="666666"/>
+              <w:top w:val="single" w:sz="4" w:space="0" w:color="999999"/>
+              <w:left w:val="none" w:sz="0" w:space="0" w:color="000000"/>
+              <w:right w:val="none" w:sz="0" w:space="0" w:color="000000"/>
+            </w:tcBorders>
+            <w:shd w:val="clear" w:color="auto" w:fill="F2F2F2"/>
+            <w:tcMar>
+              <w:top w:w="0" w:type="dxa"/>
+              <w:bottom w:w="0" w:type="dxa"/>
+              <w:left w:w="0" w:type="dxa"/>
+              <w:right w:w="0" w:type="dxa"/>
+            </w:tcMar>
+            <w:vAlign w:val="center"/>
+          </w:tcPr>
+          <w:p>
+            <w:pPr>
+              <w:jc w:val="center"/>
+              <w:pBdr>
+                <w:bottom w:val="none" w:sz="0" w:space="0" w:color="000000"/>
+                <w:top w:val="none" w:sz="0" w:space="0" w:color="000000"/>
+                <w:left w:val="none" w:sz="0" w:space="0" w:color="000000"/>
+                <w:right w:val="none" w:sz="0" w:space="0" w:color="000000"/>
+              </w:pBdr>
+              <w:spacing w:after="100" w:before="100" w:line="240"/>
+              <w:ind w:left="100" w:right="100" w:firstLine="0" w:firstLineChars="0"/>
+              <w:rPr>
+                <w:rFonts w:ascii="serif" w:hAnsi="serif" w:eastAsia="serif" w:cs="serif"/>
+                <w:i w:val="false"/>
+                <w:b w:val="false"/>
+                <w:u w:val="none"/>
+                <w:sz w:val="20"/>
+                <w:szCs w:val="20"/>
+                <w:color w:val="000000"/>
+              </w:rPr>
+            </w:pPr>
+            <w:r xmlns:w="http://schemas.openxmlformats.org/wordprocessingml/2006/main" xmlns:wp="http://schemas.openxmlformats.org/drawingml/2006/wordprocessingDrawing" xmlns:r="http://schemas.openxmlformats.org/officeDocument/2006/relationships" xmlns:w14="http://schemas.microsoft.com/office/word/2010/wordml">
+              <w:rPr>
+                <w:rFonts w:ascii="serif" w:hAnsi="serif" w:eastAsia="serif" w:cs="serif"/>
+                <w:i w:val="false"/>
+                <w:b w:val="false"/>
+                <w:u w:val="none"/>
+                <w:sz w:val="20"/>
+                <w:szCs w:val="20"/>
+                <w:color w:val="000000"/>
+              </w:rPr>
               <w:t xml:space="preserve">0.60</w:t>
             </w:r>
           </w:p>
@@ -2011,214 +3331,6 @@
             </w:r>
           </w:p>
         </w:tc>
-        <w:tc>
-          <w:tcPr>
-            <w:tcBorders>
-              <w:bottom w:val="single" w:sz="12" w:space="0" w:color="666666"/>
-              <w:top w:val="single" w:sz="4" w:space="0" w:color="999999"/>
-              <w:left w:val="none" w:sz="0" w:space="0" w:color="000000"/>
-              <w:right w:val="none" w:sz="0" w:space="0" w:color="000000"/>
-            </w:tcBorders>
-            <w:shd w:val="clear" w:color="auto" w:fill="F2F2F2"/>
-            <w:tcMar>
-              <w:top w:w="0" w:type="dxa"/>
-              <w:bottom w:w="0" w:type="dxa"/>
-              <w:left w:w="0" w:type="dxa"/>
-              <w:right w:w="0" w:type="dxa"/>
-            </w:tcMar>
-            <w:vAlign w:val="center"/>
-          </w:tcPr>
-          <w:p>
-            <w:pPr>
-              <w:jc w:val="center"/>
-              <w:pBdr>
-                <w:bottom w:val="none" w:sz="0" w:space="0" w:color="000000"/>
-                <w:top w:val="none" w:sz="0" w:space="0" w:color="000000"/>
-                <w:left w:val="none" w:sz="0" w:space="0" w:color="000000"/>
-                <w:right w:val="none" w:sz="0" w:space="0" w:color="000000"/>
-              </w:pBdr>
-              <w:spacing w:after="100" w:before="100" w:line="240"/>
-              <w:ind w:left="100" w:right="100" w:firstLine="0" w:firstLineChars="0"/>
-              <w:rPr>
-                <w:rFonts w:ascii="serif" w:hAnsi="serif" w:eastAsia="serif" w:cs="serif"/>
-                <w:i w:val="false"/>
-                <w:b w:val="false"/>
-                <w:u w:val="none"/>
-                <w:sz w:val="20"/>
-                <w:szCs w:val="20"/>
-                <w:color w:val="000000"/>
-              </w:rPr>
-            </w:pPr>
-            <w:r xmlns:w="http://schemas.openxmlformats.org/wordprocessingml/2006/main" xmlns:wp="http://schemas.openxmlformats.org/drawingml/2006/wordprocessingDrawing" xmlns:r="http://schemas.openxmlformats.org/officeDocument/2006/relationships" xmlns:w14="http://schemas.microsoft.com/office/word/2010/wordml">
-              <w:rPr>
-                <w:rFonts w:ascii="serif" w:hAnsi="serif" w:eastAsia="serif" w:cs="serif"/>
-                <w:i w:val="false"/>
-                <w:b w:val="false"/>
-                <w:u w:val="none"/>
-                <w:sz w:val="20"/>
-                <w:szCs w:val="20"/>
-                <w:color w:val="000000"/>
-              </w:rPr>
-              <w:t xml:space="preserve">0.09</w:t>
-            </w:r>
-          </w:p>
-        </w:tc>
-        <w:tc>
-          <w:tcPr>
-            <w:tcBorders>
-              <w:bottom w:val="single" w:sz="12" w:space="0" w:color="666666"/>
-              <w:top w:val="single" w:sz="4" w:space="0" w:color="999999"/>
-              <w:left w:val="none" w:sz="0" w:space="0" w:color="000000"/>
-              <w:right w:val="none" w:sz="0" w:space="0" w:color="000000"/>
-            </w:tcBorders>
-            <w:shd w:val="clear" w:color="auto" w:fill="F2F2F2"/>
-            <w:tcMar>
-              <w:top w:w="0" w:type="dxa"/>
-              <w:bottom w:w="0" w:type="dxa"/>
-              <w:left w:w="0" w:type="dxa"/>
-              <w:right w:w="0" w:type="dxa"/>
-            </w:tcMar>
-            <w:vAlign w:val="center"/>
-          </w:tcPr>
-          <w:p>
-            <w:pPr>
-              <w:jc w:val="center"/>
-              <w:pBdr>
-                <w:bottom w:val="none" w:sz="0" w:space="0" w:color="000000"/>
-                <w:top w:val="none" w:sz="0" w:space="0" w:color="000000"/>
-                <w:left w:val="none" w:sz="0" w:space="0" w:color="000000"/>
-                <w:right w:val="none" w:sz="0" w:space="0" w:color="000000"/>
-              </w:pBdr>
-              <w:spacing w:after="100" w:before="100" w:line="240"/>
-              <w:ind w:left="100" w:right="100" w:firstLine="0" w:firstLineChars="0"/>
-              <w:rPr>
-                <w:rFonts w:ascii="serif" w:hAnsi="serif" w:eastAsia="serif" w:cs="serif"/>
-                <w:i w:val="false"/>
-                <w:b w:val="false"/>
-                <w:u w:val="none"/>
-                <w:sz w:val="20"/>
-                <w:szCs w:val="20"/>
-                <w:color w:val="000000"/>
-              </w:rPr>
-            </w:pPr>
-            <w:r xmlns:w="http://schemas.openxmlformats.org/wordprocessingml/2006/main" xmlns:wp="http://schemas.openxmlformats.org/drawingml/2006/wordprocessingDrawing" xmlns:r="http://schemas.openxmlformats.org/officeDocument/2006/relationships" xmlns:w14="http://schemas.microsoft.com/office/word/2010/wordml">
-              <w:rPr>
-                <w:rFonts w:ascii="serif" w:hAnsi="serif" w:eastAsia="serif" w:cs="serif"/>
-                <w:i w:val="false"/>
-                <w:b w:val="false"/>
-                <w:u w:val="none"/>
-                <w:sz w:val="20"/>
-                <w:szCs w:val="20"/>
-                <w:color w:val="000000"/>
-              </w:rPr>
-              <w:t xml:space="preserve">0.19</w:t>
-            </w:r>
-          </w:p>
-        </w:tc>
-        <w:tc>
-          <w:tcPr>
-            <w:tcBorders>
-              <w:bottom w:val="single" w:sz="12" w:space="0" w:color="666666"/>
-              <w:top w:val="single" w:sz="4" w:space="0" w:color="999999"/>
-              <w:left w:val="none" w:sz="0" w:space="0" w:color="000000"/>
-              <w:right w:val="none" w:sz="0" w:space="0" w:color="000000"/>
-            </w:tcBorders>
-            <w:shd w:val="clear" w:color="auto" w:fill="F2F2F2"/>
-            <w:tcMar>
-              <w:top w:w="0" w:type="dxa"/>
-              <w:bottom w:w="0" w:type="dxa"/>
-              <w:left w:w="0" w:type="dxa"/>
-              <w:right w:w="0" w:type="dxa"/>
-            </w:tcMar>
-            <w:vAlign w:val="center"/>
-          </w:tcPr>
-          <w:p>
-            <w:pPr>
-              <w:jc w:val="center"/>
-              <w:pBdr>
-                <w:bottom w:val="none" w:sz="0" w:space="0" w:color="000000"/>
-                <w:top w:val="none" w:sz="0" w:space="0" w:color="000000"/>
-                <w:left w:val="none" w:sz="0" w:space="0" w:color="000000"/>
-                <w:right w:val="none" w:sz="0" w:space="0" w:color="000000"/>
-              </w:pBdr>
-              <w:spacing w:after="100" w:before="100" w:line="240"/>
-              <w:ind w:left="100" w:right="100" w:firstLine="0" w:firstLineChars="0"/>
-              <w:rPr>
-                <w:rFonts w:ascii="serif" w:hAnsi="serif" w:eastAsia="serif" w:cs="serif"/>
-                <w:i w:val="false"/>
-                <w:b w:val="false"/>
-                <w:u w:val="none"/>
-                <w:sz w:val="20"/>
-                <w:szCs w:val="20"/>
-                <w:color w:val="000000"/>
-              </w:rPr>
-            </w:pPr>
-            <w:r xmlns:w="http://schemas.openxmlformats.org/wordprocessingml/2006/main" xmlns:wp="http://schemas.openxmlformats.org/drawingml/2006/wordprocessingDrawing" xmlns:r="http://schemas.openxmlformats.org/officeDocument/2006/relationships" xmlns:w14="http://schemas.microsoft.com/office/word/2010/wordml">
-              <w:rPr>
-                <w:rFonts w:ascii="serif" w:hAnsi="serif" w:eastAsia="serif" w:cs="serif"/>
-                <w:i w:val="false"/>
-                <w:b w:val="false"/>
-                <w:u w:val="none"/>
-                <w:sz w:val="20"/>
-                <w:szCs w:val="20"/>
-                <w:color w:val="000000"/>
-              </w:rPr>
-              <w:t xml:space="preserve">2.44</w:t>
-            </w:r>
-          </w:p>
-        </w:tc>
-        <w:tc>
-          <w:tcPr>
-            <w:tcBorders>
-              <w:bottom w:val="single" w:sz="12" w:space="0" w:color="666666"/>
-              <w:top w:val="single" w:sz="4" w:space="0" w:color="999999"/>
-              <w:left w:val="none" w:sz="0" w:space="0" w:color="000000"/>
-              <w:right w:val="none" w:sz="0" w:space="0" w:color="000000"/>
-            </w:tcBorders>
-            <w:shd w:val="clear" w:color="auto" w:fill="F2F2F2"/>
-            <w:tcMar>
-              <w:top w:w="0" w:type="dxa"/>
-              <w:bottom w:w="0" w:type="dxa"/>
-              <w:left w:w="0" w:type="dxa"/>
-              <w:right w:w="0" w:type="dxa"/>
-            </w:tcMar>
-            <w:vAlign w:val="center"/>
-          </w:tcPr>
-          <w:p>
-            <w:pPr>
-              <w:jc w:val="center"/>
-              <w:pBdr>
-                <w:bottom w:val="none" w:sz="0" w:space="0" w:color="000000"/>
-                <w:top w:val="none" w:sz="0" w:space="0" w:color="000000"/>
-                <w:left w:val="none" w:sz="0" w:space="0" w:color="000000"/>
-                <w:right w:val="none" w:sz="0" w:space="0" w:color="000000"/>
-              </w:pBdr>
-              <w:spacing w:after="100" w:before="100" w:line="240"/>
-              <w:ind w:left="100" w:right="100" w:firstLine="0" w:firstLineChars="0"/>
-              <w:rPr>
-                <w:rFonts w:ascii="serif" w:hAnsi="serif" w:eastAsia="serif" w:cs="serif"/>
-                <w:i w:val="false"/>
-                <w:b w:val="false"/>
-                <w:u w:val="none"/>
-                <w:sz w:val="20"/>
-                <w:szCs w:val="20"/>
-                <w:color w:val="000000"/>
-              </w:rPr>
-            </w:pPr>
-            <w:r xmlns:w="http://schemas.openxmlformats.org/wordprocessingml/2006/main" xmlns:wp="http://schemas.openxmlformats.org/drawingml/2006/wordprocessingDrawing" xmlns:r="http://schemas.openxmlformats.org/officeDocument/2006/relationships" xmlns:w14="http://schemas.microsoft.com/office/word/2010/wordml">
-              <w:rPr>
-                <w:rFonts w:ascii="serif" w:hAnsi="serif" w:eastAsia="serif" w:cs="serif"/>
-                <w:i w:val="false"/>
-                <w:b w:val="false"/>
-                <w:u w:val="none"/>
-                <w:sz w:val="20"/>
-                <w:szCs w:val="20"/>
-                <w:color w:val="000000"/>
-              </w:rPr>
-              <w:t xml:space="preserve">3.18</w:t>
-            </w:r>
-          </w:p>
-        </w:tc>
       </w:tr>
     </w:tbl>
     <w:p>
@@ -2230,35 +3342,7 @@
           <w:i/>
           <w:iCs/>
         </w:rPr>
-        <w:t xml:space="preserve">Note: All values are weighted using PSID family and clan weights and pooled across all years. Income and wealth are size-standardised (divided by household or clan size). Wealth includes home equity.</w:t>
-      </w:r>
-      <w:r>
-        <w:rPr>
-          <w:i/>
-          <w:iCs/>
-        </w:rPr>
-        <w:t xml:space="preserve"> </w:t>
-      </w:r>
-      <w:r>
-        <w:rPr>
-          <w:i/>
-          <w:iCs/>
-        </w:rPr>
-        <w:t xml:space="preserve">‘0 Wealth’</w:t>
-      </w:r>
-      <w:r>
-        <w:rPr>
-          <w:i/>
-          <w:iCs/>
-        </w:rPr>
-        <w:t xml:space="preserve"> </w:t>
-      </w:r>
-      <w:r>
-        <w:rPr>
-          <w:i/>
-          <w:iCs/>
-        </w:rPr>
-        <w:t xml:space="preserve">indicates wealth &lt;= 0. Ratio row shows Black / Non-Black.</w:t>
+        <w:t xml:space="preserve">Below are two figures that show the information in the tables. These (or a combination of these) could be used instead of tables. I (AEB) found the tables easier to interpret, so that’s what I took a stab at first.</w:t>
       </w:r>
     </w:p>
     <w:p>
@@ -2266,6 +3350,124 @@
         <w:pStyle w:val="BodyText"/>
       </w:pPr>
       <w:r>
+        <w:drawing>
+          <wp:inline>
+            <wp:extent cx="5334000" cy="4191000"/>
+            <wp:effectExtent b="0" l="0" r="0" t="0"/>
+            <wp:docPr descr="" title="" id="20" name="Picture"/>
+            <a:graphic>
+              <a:graphicData uri="http://schemas.openxmlformats.org/drawingml/2006/picture">
+                <pic:pic>
+                  <pic:nvPicPr>
+                    <pic:cNvPr descr="../9_figures/output/figure3.pdf" id="21" name="Picture"/>
+                    <pic:cNvPicPr>
+                      <a:picLocks noChangeArrowheads="1" noChangeAspect="1"/>
+                    </pic:cNvPicPr>
+                  </pic:nvPicPr>
+                  <pic:blipFill>
+                    <a:blip r:embed="rId19"/>
+                    <a:stretch>
+                      <a:fillRect/>
+                    </a:stretch>
+                  </pic:blipFill>
+                  <pic:spPr bwMode="auto">
+                    <a:xfrm>
+                      <a:off x="0" y="0"/>
+                      <a:ext cx="5334000" cy="4191000"/>
+                    </a:xfrm>
+                    <a:prstGeom prst="rect">
+                      <a:avLst/>
+                    </a:prstGeom>
+                    <a:noFill/>
+                    <a:ln w="9525">
+                      <a:noFill/>
+                      <a:headEnd/>
+                      <a:tailEnd/>
+                    </a:ln>
+                  </pic:spPr>
+                </pic:pic>
+              </a:graphicData>
+            </a:graphic>
+          </wp:inline>
+        </w:drawing>
+      </w:r>
+    </w:p>
+    <w:p>
+      <w:pPr>
+        <w:pStyle w:val="BodyText"/>
+      </w:pPr>
+      <w:r>
+        <w:rPr>
+          <w:i/>
+          <w:iCs/>
+        </w:rPr>
+        <w:t xml:space="preserve">Note: Lines show the ratio of weighted mean income (Panel A) or wealth (Panel B) for Black relative to Non-Black households and clans. Weighted mean income for Black HH is $36,205, $56,600 for Non-Black HH, $60,000 for Black clans, and $108,522 for Non-Black clans. The income ratio changed by -5.2% for households (0.65 in 1969 to 0.62 in 2023) and -7.8% for clans (0.63 to 0.58). Weighted mean wealth for Black HH is $89,761, $476,552 for Non-Black HH, $147,662 for Black clans, and $818,198 for Non-Black clans (includes home equity). The wealth ratio changed by 1.0% for households (0.18 in 1984 to 0.18 in 2023) and -13.7% for clans (0.23 to 0.20). On average across all years, the income ratio is -0.006 lower for households than clans, and the wealth ratio is 0.014 higher for households than clans. Solid lines = households; dotted lines = clans.</w:t>
+      </w:r>
+    </w:p>
+    <w:p>
+      <w:pPr>
+        <w:pStyle w:val="BodyText"/>
+      </w:pPr>
+      <w:r>
+        <w:drawing>
+          <wp:inline>
+            <wp:extent cx="5334000" cy="4191000"/>
+            <wp:effectExtent b="0" l="0" r="0" t="0"/>
+            <wp:docPr descr="" title="" id="23" name="Picture"/>
+            <a:graphic>
+              <a:graphicData uri="http://schemas.openxmlformats.org/drawingml/2006/picture">
+                <pic:pic>
+                  <pic:nvPicPr>
+                    <pic:cNvPr descr="../9_figures/output/figure4.pdf" id="24" name="Picture"/>
+                    <pic:cNvPicPr>
+                      <a:picLocks noChangeArrowheads="1" noChangeAspect="1"/>
+                    </pic:cNvPicPr>
+                  </pic:nvPicPr>
+                  <pic:blipFill>
+                    <a:blip r:embed="rId22"/>
+                    <a:stretch>
+                      <a:fillRect/>
+                    </a:stretch>
+                  </pic:blipFill>
+                  <pic:spPr bwMode="auto">
+                    <a:xfrm>
+                      <a:off x="0" y="0"/>
+                      <a:ext cx="5334000" cy="4191000"/>
+                    </a:xfrm>
+                    <a:prstGeom prst="rect">
+                      <a:avLst/>
+                    </a:prstGeom>
+                    <a:noFill/>
+                    <a:ln w="9525">
+                      <a:noFill/>
+                      <a:headEnd/>
+                      <a:tailEnd/>
+                    </a:ln>
+                  </pic:spPr>
+                </pic:pic>
+              </a:graphicData>
+            </a:graphic>
+          </wp:inline>
+        </w:drawing>
+      </w:r>
+    </w:p>
+    <w:p>
+      <w:pPr>
+        <w:pStyle w:val="BodyText"/>
+      </w:pPr>
+      <w:r>
+        <w:rPr>
+          <w:i/>
+          <w:iCs/>
+        </w:rPr>
+        <w:t xml:space="preserve">Note: Lines show the ratio of weighted median income (Panel A) or wealth (Panel B) for Black relative to Non-Black households and clans. The weighted median income for Black HHs is $17,621, $29,233 for Non-Black HHs, $36,562 for Black clans, and $62,916 for Non-Black clans. The income ratio changed by 5.8% for households (0.59 in 1969 to 0.62 in 2023) and 0.2% for clans (0.57 to 0.57). Weighted median wealth for Black HHs is $6,908, $79,216 for Non-Black HHs, $58,326 for Black clans, and $306,988 for Non-Black clans (includes home equity). The wealth ratio changed by -4.6% for households (0.07 in 1984 to 0.07 in 2023) and 7.5% for clans (0.20 to 0.22). On average across all years, the income ratio is -0.044 lower for households than clans, and the wealth ratio is -0.112 lower for households than clans. Solid lines = households; dotted lines = clans.</w:t>
+      </w:r>
+    </w:p>
+    <w:p>
+      <w:pPr>
+        <w:pStyle w:val="BodyText"/>
+      </w:pPr>
+      <w:r>
         <w:rPr>
           <w:b/>
           <w:bCs/>
@@ -2277,6 +3479,16 @@
       </w:r>
       <w:r>
         <w:t xml:space="preserve">Across all specifications, estimated inequality is lower when using clans rather than households as the unit of analysis. This finding is robust across race, different inclusion criteria for income and wealth measures, different samples, alternative measures of inequality, and when adjusting for household and clan size. Results from sensitivity analyses are available in Appendix C and D.</w:t>
+      </w:r>
+      <w:r>
+        <w:t xml:space="preserve"> </w:t>
+      </w:r>
+      <w:r>
+        <w:rPr>
+          <w:i/>
+          <w:iCs/>
+        </w:rPr>
+        <w:t xml:space="preserve">This mini-section should change or be deleted.</w:t>
       </w:r>
     </w:p>
     <w:bookmarkEnd w:id="25"/>
@@ -2320,7 +3532,7 @@
         <w:t xml:space="preserve"> </w:t>
       </w:r>
       <w:r>
-        <w:t xml:space="preserve">[11, 13, 20]</w:t>
+        <w:t xml:space="preserve">[11, 13, 23]</w:t>
       </w:r>
       <w:r>
         <w:t xml:space="preserve">, or limitations of the PSID’s coverage of the top of the wealth distribution, where much wealth inequality is generated. Together, these patterns reinforce the importance of examining inequality at multiple levels of social organization.</w:t>
@@ -2337,7 +3549,7 @@
         <w:t xml:space="preserve"> </w:t>
       </w:r>
       <w:r>
-        <w:t xml:space="preserve">[21–23]</w:t>
+        <w:t xml:space="preserve">[24–26]</w:t>
       </w:r>
       <w:r>
         <w:t xml:space="preserve"> </w:t>
@@ -2347,7 +3559,7 @@
       </w:r>
     </w:p>
     <w:bookmarkEnd w:id="26"/>
-    <w:bookmarkStart w:id="27" w:name="materials-and-methods"/>
+    <w:bookmarkStart w:id="28" w:name="materials-and-methods"/>
     <w:p>
       <w:pPr>
         <w:pStyle w:val="Heading1"/>
@@ -2396,7 +3608,16 @@
         <w:pStyle w:val="BodyText"/>
       </w:pPr>
       <w:r>
-        <w:t xml:space="preserve">The PSID has collected income data since its inception but began collecting wealth data only in 1984. As a result, analytic samples differ: income analyses include 242,200 household-years and 64,292 clan-years, representing 2,906 unique clans; wealth analyses include 122,069 household-years and 26,655 clan-years, representing 2,636 unique clans.</w:t>
+        <w:t xml:space="preserve">Additionally, although all households belong to a clan, not all extended family members are observed in the PSID in every year. In some cases (especially in earlier years)</w:t>
+      </w:r>
+      <w:r>
+        <w:rPr>
+          <w:rStyle w:val="FootnoteReference"/>
+        </w:rPr>
+        <w:footnoteReference w:id="27"/>
+      </w:r>
+      <w:r>
+        <w:t xml:space="preserve">, PSID clans consist of only a single observed household, rendering household and clan-level measures identical. These observations are excluded from the main analyses because they do not capture extended family dynamics and are a result of survey limitations, rather than social reality. Including these single household clans reduces the household–clan inequality gap for income and wealth but does not eliminate it (see Appendix C2).</w:t>
       </w:r>
     </w:p>
     <w:p>
@@ -2404,6 +3625,14 @@
         <w:pStyle w:val="BodyText"/>
       </w:pPr>
       <w:r>
+        <w:t xml:space="preserve">The PSID has collected income data since its inception but began collecting wealth data only in 1984. As a result, analytic samples differ: income analyses include 242,200 household-years and 64,292 clan-years, representing 2,906 unique clans; wealth analyses include 122,069 household-years and 26,655 clan-years, representing 2,636 unique clans.</w:t>
+      </w:r>
+    </w:p>
+    <w:p>
+      <w:pPr>
+        <w:pStyle w:val="BodyText"/>
+      </w:pPr>
+      <w:r>
         <w:rPr>
           <w:b/>
           <w:bCs/>
@@ -2420,10 +3649,10 @@
         <w:t xml:space="preserve"> </w:t>
       </w:r>
       <w:r>
-        <w:t xml:space="preserve">[5, 17, 20]</w:t>
-      </w:r>
-      <w:r>
-        <w:t xml:space="preserve">. Aggregate measures for income and wealth are provided by the PSID. Income includes earnings, asset income, transfers, and income from farming and gardening. Wealth includes non-primary real estate, business equity, stocks, bonds, vehicles, retirement accounts, and bank accounts, and includes home equity.</w:t>
+        <w:t xml:space="preserve">[5, 17, 23]</w:t>
+      </w:r>
+      <w:r>
+        <w:t xml:space="preserve">. Aggregate measures for income and wealth are provided by the PSID. Income includes earnings, asset income, transfers, and income from farming and gardening. Wealth includes non-primary real estate, business equity, stocks, bonds, vehicles, retirement accounts, and bank accounts, and includes home equity. As a sensitivity analysis, we compare Gini coefficients for wealth measures that exclude home equity (see Appendix C3). When home equity is excluded, estimated inequality is lower at both the household and clan level, but the difference between household and clan-level Gini coefficients remains similar.</w:t>
       </w:r>
     </w:p>
     <w:p>
@@ -2437,10 +3666,10 @@
         <w:t xml:space="preserve"> </w:t>
       </w:r>
       <w:r>
-        <w:t xml:space="preserve">[20, 24]</w:t>
-      </w:r>
-      <w:r>
-        <w:t xml:space="preserve">. All income and wealth values are adjusted for inflation. Additionally, analyses set negative values of income and wealth to zero so that Gini coefficients remain in the 0 to 1 range (see Appendix D1 and F1). To construct clan-level measures, we aggregate household income and wealth for all households in a clan within each clan-year.</w:t>
+        <w:t xml:space="preserve">[23, 27]</w:t>
+      </w:r>
+      <w:r>
+        <w:t xml:space="preserve">. All income and wealth values are adjusted for inflation. Additionally, analyses set negative values of income and wealth to zero so that Gini coefficients are interpretable by remaining in the 0 to 1 range. When negative values are included, Gini coefficents are about the same (see Appendix C4).</w:t>
       </w:r>
     </w:p>
     <w:p>
@@ -2448,7 +3677,7 @@
         <w:pStyle w:val="BodyText"/>
       </w:pPr>
       <w:r>
-        <w:t xml:space="preserve">All results presented are weighted. Using weights does not meaningfully change results (see Appendix D4 and F4). Household-level weights are provided by the PSID. The PSID constructs family weights from individual weights using the fair shares method, which assumes that the probability of observing any individual within a family equals the probability of observing the family itself. We extend this approach to construct clan-level weights using the same fair shares principle. Clan weights assume that the probability of observing a family within a clan equals the probability of observing the clan itself. These weights are applied to total clan income or wealth (rather than mean income or wealth) to avoid double standardization by household counts. In effect, clan weights already incorporate the number of households within a clan. As a result, each clan’s influence reflects the representation of the average household within that clan, rather than scaling mechanically with the clan’s total number of households.</w:t>
+        <w:t xml:space="preserve">To construct clan-level measures, we aggregate household income and wealth for all households in a clan within each clan-year. Measures are divided by the number of people in a household or number of households within a clan to standardize by household and clan size, respectively. Adjusting for size descreased inequality and magnifies the difference between household and clan Gini coefficients. Nonetheless, less inequality is estimated when clans are the unit of analysis whether income and wealth are adjusted for size or not (see Appendix C5).</w:t>
       </w:r>
     </w:p>
     <w:p>
@@ -2456,6 +3685,14 @@
         <w:pStyle w:val="BodyText"/>
       </w:pPr>
       <w:r>
+        <w:t xml:space="preserve">All results presented are weighted. Using weights does not meaningfully change results (see Appendix C6). Household-level weights are provided by the PSID. The PSID constructs family weights from individual weights using the fair shares method, which assumes that the probability of observing any individual within a family equals the probability of observing the family itself. We extend this approach to construct clan-level weights using the same fair shares principle. Clan weights assume that the probability of observing a family within a clan equals the probability of observing the clan itself. As a result, each clan’s influence reflects the representation of the average household within that clan, rather than scaling mechanically with the clan’s total number of households.</w:t>
+      </w:r>
+    </w:p>
+    <w:p>
+      <w:pPr>
+        <w:pStyle w:val="BodyText"/>
+      </w:pPr>
+      <w:r>
         <w:rPr>
           <w:b/>
           <w:bCs/>
@@ -2472,7 +3709,7 @@
         <w:t xml:space="preserve"> </w:t>
       </w:r>
       <w:r>
-        <w:t xml:space="preserve">[25]</w:t>
+        <w:t xml:space="preserve">[28]</w:t>
       </w:r>
       <w:r>
         <w:t xml:space="preserve">. Black households are all households with a Black head of household. Black clans are clans in which more than half of the households within it identify as Black. Analyses by race and ethnicity are limited to Black and non-Black categories because there are relatively few clans in the PSID data (2,906 for income and 2,636 for wealth). Additionally, the genealogical design of the PSID reflects the demographics of the United States at the time the survey began in 1968, which constrains analyses of clans for demographic groups that were not prominent at that time. Although the PSID incorporated additional samples over time to reflect the changing demographics of the United States in the PSID sample, ethnicity analyses remain limited because Hispanic/Latino households do not form consistent multigenerational lineages over the full panel and therefore have limited clans.</w:t>
@@ -2493,16 +3730,25 @@
         <w:t xml:space="preserve"> </w:t>
       </w:r>
       <w:r>
-        <w:t xml:space="preserve">Inequality is measured using the standard Gini coefficient, which ranges from 0 (perfect equality) to 1 (perfect inequality). Although widely used, the Gini has well-known limitations: it cannot distinguish between different inequality patterns and is most sensitive to variation in the middle of the income or wealth distribution</w:t>
-      </w:r>
-      <w:r>
-        <w:t xml:space="preserve"> </w:t>
-      </w:r>
-      <w:r>
-        <w:t xml:space="preserve">[26–28]</w:t>
-      </w:r>
-      <w:r>
-        <w:t xml:space="preserve">. These features make it well suited to the PSID, which underrepresents wealthy households compared with surveys such as the Survey of Consumer Finance.</w:t>
+        <w:t xml:space="preserve">Inequality is measured using the standard Gini coefficient, which ranges from 0 (perfect equality) to 1 (perfect inequality). While the Gini index is a widely-used measure of inequality, it has well-known limitations. First, the Gini places greater weight on differences around the middle of the income or wealth distribution, making it well suited to the PSID, which underrepresents wealthy households compared with surveys such as the Survey of Consumer Finance</w:t>
+      </w:r>
+      <w:r>
+        <w:t xml:space="preserve"> </w:t>
+      </w:r>
+      <w:r>
+        <w:t xml:space="preserve">[29–31]</w:t>
+      </w:r>
+      <w:r>
+        <w:t xml:space="preserve">. To assess whether our results depend on where inequality is concentrated along the distribution, we also examine two related measures, referred to as the Gini’s “nuclear family”</w:t>
+      </w:r>
+      <w:r>
+        <w:t xml:space="preserve"> </w:t>
+      </w:r>
+      <w:r>
+        <w:t xml:space="preserve">[32]</w:t>
+      </w:r>
+      <w:r>
+        <w:t xml:space="preserve">. Across all measures, we find that estimated inequality is consistently lower when measured at the clan level than at the household level for both income and wealth (see Appendix G).</w:t>
       </w:r>
     </w:p>
     <w:p>
@@ -2513,8 +3759,8 @@
         <w:t xml:space="preserve">Gini coefficients are calculated separately for income and wealth to reflect their distinct dimensions of inequality. Estimates of Gini coefficients in our data are comparable to estimates that other studies have found, though there is more variation in wealth coefficients, likely because the PSID excludes wealthy households (see Appendix B).</w:t>
       </w:r>
     </w:p>
-    <w:bookmarkEnd w:id="27"/>
-    <w:bookmarkStart w:id="39" w:name="appendix"/>
+    <w:bookmarkEnd w:id="28"/>
+    <w:bookmarkStart w:id="40" w:name="appendix"/>
     <w:p>
       <w:pPr>
         <w:pStyle w:val="Heading1"/>
@@ -2523,7 +3769,7 @@
         <w:t xml:space="preserve">Appendix</w:t>
       </w:r>
     </w:p>
-    <w:bookmarkStart w:id="37" w:name="appendix-a-simulating-gini-coefficients"/>
+    <w:bookmarkStart w:id="38" w:name="appendix-a-simulating-gini-coefficients"/>
     <w:p>
       <w:pPr>
         <w:pStyle w:val="Heading2"/>
@@ -2564,18 +3810,18 @@
           <wp:inline>
             <wp:extent cx="5334000" cy="4000500"/>
             <wp:effectExtent b="0" l="0" r="0" t="0"/>
-            <wp:docPr descr="" title="" id="29" name="Picture"/>
+            <wp:docPr descr="" title="" id="30" name="Picture"/>
             <a:graphic>
               <a:graphicData uri="http://schemas.openxmlformats.org/drawingml/2006/picture">
                 <pic:pic>
                   <pic:nvPicPr>
-                    <pic:cNvPr descr="/Users/amanda/Desktop/clan_project/10_draft/output/write_files/figure-docx/appendix-a1-1.png" id="30" name="Picture"/>
+                    <pic:cNvPr descr="/Users/amanda/Desktop/clan_project/10_draft/output/write_files/figure-docx/appendix-a1-1.png" id="31" name="Picture"/>
                     <pic:cNvPicPr>
                       <a:picLocks noChangeArrowheads="1" noChangeAspect="1"/>
                     </pic:cNvPicPr>
                   </pic:nvPicPr>
                   <pic:blipFill>
-                    <a:blip r:embed="rId28"/>
+                    <a:blip r:embed="rId29"/>
                     <a:stretch>
                       <a:fillRect/>
                     </a:stretch>
@@ -2621,18 +3867,18 @@
           <wp:inline>
             <wp:extent cx="5334000" cy="4000500"/>
             <wp:effectExtent b="0" l="0" r="0" t="0"/>
-            <wp:docPr descr="" title="" id="32" name="Picture"/>
+            <wp:docPr descr="" title="" id="33" name="Picture"/>
             <a:graphic>
               <a:graphicData uri="http://schemas.openxmlformats.org/drawingml/2006/picture">
                 <pic:pic>
                   <pic:nvPicPr>
-                    <pic:cNvPr descr="/Users/amanda/Desktop/clan_project/10_draft/output/write_files/figure-docx/appendix-a2-1.png" id="33" name="Picture"/>
+                    <pic:cNvPr descr="/Users/amanda/Desktop/clan_project/10_draft/output/write_files/figure-docx/appendix-a2-1.png" id="34" name="Picture"/>
                     <pic:cNvPicPr>
                       <a:picLocks noChangeArrowheads="1" noChangeAspect="1"/>
                     </pic:cNvPicPr>
                   </pic:nvPicPr>
                   <pic:blipFill>
-                    <a:blip r:embed="rId31"/>
+                    <a:blip r:embed="rId32"/>
                     <a:stretch>
                       <a:fillRect/>
                     </a:stretch>
@@ -2683,18 +3929,18 @@
           <wp:inline>
             <wp:extent cx="5334000" cy="4103076"/>
             <wp:effectExtent b="0" l="0" r="0" t="0"/>
-            <wp:docPr descr="" title="" id="35" name="Picture"/>
+            <wp:docPr descr="" title="" id="36" name="Picture"/>
             <a:graphic>
               <a:graphicData uri="http://schemas.openxmlformats.org/drawingml/2006/picture">
                 <pic:pic>
                   <pic:nvPicPr>
-                    <pic:cNvPr descr="/Users/amanda/Desktop/clan_project/10_draft/output/write_files/figure-docx/appendix-a3-1.png" id="36" name="Picture"/>
+                    <pic:cNvPr descr="/Users/amanda/Desktop/clan_project/10_draft/output/write_files/figure-docx/appendix-a3-1.png" id="37" name="Picture"/>
                     <pic:cNvPicPr>
                       <a:picLocks noChangeArrowheads="1" noChangeAspect="1"/>
                     </pic:cNvPicPr>
                   </pic:nvPicPr>
                   <pic:blipFill>
-                    <a:blip r:embed="rId34"/>
+                    <a:blip r:embed="rId35"/>
                     <a:stretch>
                       <a:fillRect/>
                     </a:stretch>
@@ -2726,8 +3972,8 @@
         <w:br w:type="page"/>
       </w:r>
     </w:p>
-    <w:bookmarkEnd w:id="37"/>
-    <w:bookmarkStart w:id="38" w:name="X8f4b25e330c8c7d4282a452909c1adb149e7ace"/>
+    <w:bookmarkEnd w:id="38"/>
+    <w:bookmarkStart w:id="39" w:name="X8f4b25e330c8c7d4282a452909c1adb149e7ace"/>
     <w:p>
       <w:pPr>
         <w:pStyle w:val="Heading2"/>
@@ -2755,7 +4001,7 @@
         <w:t xml:space="preserve"> </w:t>
       </w:r>
       <w:r>
-        <w:t xml:space="preserve">[1, 29]</w:t>
+        <w:t xml:space="preserve">[1, 33]</w:t>
       </w:r>
       <w:r>
         <w:t xml:space="preserve">. FRED uses data from the World Bank on U.S. households and the Census uses data from the Current Population Survey (CPS). Gini coefficient benchmarks for wealth rely on estimates from research papers based on data from the PSID or Survey of Consumer Finances (SCF)</w:t>
@@ -2764,7 +4010,7 @@
         <w:t xml:space="preserve"> </w:t>
       </w:r>
       <w:r>
-        <w:t xml:space="preserve">[30, 31]</w:t>
+        <w:t xml:space="preserve">[34, 35]</w:t>
       </w:r>
       <w:r>
         <w:t xml:space="preserve">.</w:t>
@@ -6924,15 +8170,24 @@
         </w:tc>
       </w:tr>
     </w:tbl>
-    <w:bookmarkEnd w:id="38"/>
     <w:bookmarkEnd w:id="39"/>
-    <w:bookmarkStart w:id="43" w:name="X0725f81ad50d659f5f315d5b9354a8278899984"/>
+    <w:bookmarkEnd w:id="40"/>
+    <w:bookmarkStart w:id="65" w:name="X1a48765accbb976c449929efb9c303c48aeac11"/>
     <w:p>
       <w:pPr>
         <w:pStyle w:val="Heading1"/>
       </w:pPr>
       <w:r>
-        <w:t xml:space="preserve">Appendix C: Alternative Inequality Measures</w:t>
+        <w:t xml:space="preserve">Appendix C: Sensitivity Analyses — Gini Coefficients</w:t>
+      </w:r>
+    </w:p>
+    <w:bookmarkStart w:id="44" w:name="X2af1039fa4a14e53aec9c9fa061f4e8992f7595"/>
+    <w:p>
+      <w:pPr>
+        <w:pStyle w:val="Heading2"/>
+      </w:pPr>
+      <w:r>
+        <w:t xml:space="preserve">Appendix C1: Gini Coefficients by Race Subgroup</w:t>
       </w:r>
     </w:p>
     <w:p>
@@ -6942,20 +8197,363 @@
       <w:r>
         <w:drawing>
           <wp:inline>
-            <wp:extent cx="5334000" cy="4953000"/>
+            <wp:extent cx="5334000" cy="4191000"/>
             <wp:effectExtent b="0" l="0" r="0" t="0"/>
-            <wp:docPr descr="" title="" id="41" name="Picture"/>
+            <wp:docPr descr="" title="" id="42" name="Picture"/>
             <a:graphic>
               <a:graphicData uri="http://schemas.openxmlformats.org/drawingml/2006/picture">
                 <pic:pic>
                   <pic:nvPicPr>
-                    <pic:cNvPr descr="/Users/amanda/Desktop/clan_project/10_draft/output/write_files/figure-docx/appendix-c-1.png" id="42" name="Picture"/>
+                    <pic:cNvPr descr="/Users/amanda/Desktop/clan_project/10_draft/output/write_files/figure-docx/appendix-c1-1.png" id="43" name="Picture"/>
                     <pic:cNvPicPr>
                       <a:picLocks noChangeArrowheads="1" noChangeAspect="1"/>
                     </pic:cNvPicPr>
                   </pic:nvPicPr>
                   <pic:blipFill>
-                    <a:blip r:embed="rId40"/>
+                    <a:blip r:embed="rId41"/>
+                    <a:stretch>
+                      <a:fillRect/>
+                    </a:stretch>
+                  </pic:blipFill>
+                  <pic:spPr bwMode="auto">
+                    <a:xfrm>
+                      <a:off x="0" y="0"/>
+                      <a:ext cx="5334000" cy="4191000"/>
+                    </a:xfrm>
+                    <a:prstGeom prst="rect">
+                      <a:avLst/>
+                    </a:prstGeom>
+                    <a:noFill/>
+                    <a:ln w="9525">
+                      <a:noFill/>
+                      <a:headEnd/>
+                      <a:tailEnd/>
+                    </a:ln>
+                  </pic:spPr>
+                </pic:pic>
+              </a:graphicData>
+            </a:graphic>
+          </wp:inline>
+        </w:drawing>
+      </w:r>
+    </w:p>
+    <w:bookmarkEnd w:id="44"/>
+    <w:bookmarkStart w:id="48" w:name="X05171309a402648ffa9946822f50c48bfc2d2fb"/>
+    <w:p>
+      <w:pPr>
+        <w:pStyle w:val="Heading2"/>
+      </w:pPr>
+      <w:r>
+        <w:t xml:space="preserve">Appendix C2: Sensitivity — Single-Household Clans</w:t>
+      </w:r>
+    </w:p>
+    <w:p>
+      <w:pPr>
+        <w:pStyle w:val="FirstParagraph"/>
+      </w:pPr>
+      <w:r>
+        <w:drawing>
+          <wp:inline>
+            <wp:extent cx="5334000" cy="4191000"/>
+            <wp:effectExtent b="0" l="0" r="0" t="0"/>
+            <wp:docPr descr="" title="" id="46" name="Picture"/>
+            <a:graphic>
+              <a:graphicData uri="http://schemas.openxmlformats.org/drawingml/2006/picture">
+                <pic:pic>
+                  <pic:nvPicPr>
+                    <pic:cNvPr descr="/Users/amanda/Desktop/clan_project/10_draft/output/write_files/figure-docx/appendix-c2-1.png" id="47" name="Picture"/>
+                    <pic:cNvPicPr>
+                      <a:picLocks noChangeArrowheads="1" noChangeAspect="1"/>
+                    </pic:cNvPicPr>
+                  </pic:nvPicPr>
+                  <pic:blipFill>
+                    <a:blip r:embed="rId45"/>
+                    <a:stretch>
+                      <a:fillRect/>
+                    </a:stretch>
+                  </pic:blipFill>
+                  <pic:spPr bwMode="auto">
+                    <a:xfrm>
+                      <a:off x="0" y="0"/>
+                      <a:ext cx="5334000" cy="4191000"/>
+                    </a:xfrm>
+                    <a:prstGeom prst="rect">
+                      <a:avLst/>
+                    </a:prstGeom>
+                    <a:noFill/>
+                    <a:ln w="9525">
+                      <a:noFill/>
+                      <a:headEnd/>
+                      <a:tailEnd/>
+                    </a:ln>
+                  </pic:spPr>
+                </pic:pic>
+              </a:graphicData>
+            </a:graphic>
+          </wp:inline>
+        </w:drawing>
+      </w:r>
+    </w:p>
+    <w:bookmarkEnd w:id="48"/>
+    <w:bookmarkStart w:id="52" w:name="X0135a91ed4579dbd4101e9315fdc7d38edce4c7"/>
+    <w:p>
+      <w:pPr>
+        <w:pStyle w:val="Heading2"/>
+      </w:pPr>
+      <w:r>
+        <w:t xml:space="preserve">Appendix C3: Sensitivity — Wealth With and Without Home Equity</w:t>
+      </w:r>
+    </w:p>
+    <w:p>
+      <w:pPr>
+        <w:pStyle w:val="FirstParagraph"/>
+      </w:pPr>
+      <w:r>
+        <w:drawing>
+          <wp:inline>
+            <wp:extent cx="5334000" cy="2667000"/>
+            <wp:effectExtent b="0" l="0" r="0" t="0"/>
+            <wp:docPr descr="" title="" id="50" name="Picture"/>
+            <a:graphic>
+              <a:graphicData uri="http://schemas.openxmlformats.org/drawingml/2006/picture">
+                <pic:pic>
+                  <pic:nvPicPr>
+                    <pic:cNvPr descr="/Users/amanda/Desktop/clan_project/10_draft/output/write_files/figure-docx/appendix-c3-1.png" id="51" name="Picture"/>
+                    <pic:cNvPicPr>
+                      <a:picLocks noChangeArrowheads="1" noChangeAspect="1"/>
+                    </pic:cNvPicPr>
+                  </pic:nvPicPr>
+                  <pic:blipFill>
+                    <a:blip r:embed="rId49"/>
+                    <a:stretch>
+                      <a:fillRect/>
+                    </a:stretch>
+                  </pic:blipFill>
+                  <pic:spPr bwMode="auto">
+                    <a:xfrm>
+                      <a:off x="0" y="0"/>
+                      <a:ext cx="5334000" cy="2667000"/>
+                    </a:xfrm>
+                    <a:prstGeom prst="rect">
+                      <a:avLst/>
+                    </a:prstGeom>
+                    <a:noFill/>
+                    <a:ln w="9525">
+                      <a:noFill/>
+                      <a:headEnd/>
+                      <a:tailEnd/>
+                    </a:ln>
+                  </pic:spPr>
+                </pic:pic>
+              </a:graphicData>
+            </a:graphic>
+          </wp:inline>
+        </w:drawing>
+      </w:r>
+    </w:p>
+    <w:bookmarkEnd w:id="52"/>
+    <w:bookmarkStart w:id="56" w:name="appendix-c4-sensitivity-negative-values"/>
+    <w:p>
+      <w:pPr>
+        <w:pStyle w:val="Heading2"/>
+      </w:pPr>
+      <w:r>
+        <w:t xml:space="preserve">Appendix C4: Sensitivity — Negative Values</w:t>
+      </w:r>
+    </w:p>
+    <w:p>
+      <w:pPr>
+        <w:pStyle w:val="FirstParagraph"/>
+      </w:pPr>
+      <w:r>
+        <w:drawing>
+          <wp:inline>
+            <wp:extent cx="5334000" cy="4191000"/>
+            <wp:effectExtent b="0" l="0" r="0" t="0"/>
+            <wp:docPr descr="" title="" id="54" name="Picture"/>
+            <a:graphic>
+              <a:graphicData uri="http://schemas.openxmlformats.org/drawingml/2006/picture">
+                <pic:pic>
+                  <pic:nvPicPr>
+                    <pic:cNvPr descr="/Users/amanda/Desktop/clan_project/10_draft/output/write_files/figure-docx/appendix-c4-1.png" id="55" name="Picture"/>
+                    <pic:cNvPicPr>
+                      <a:picLocks noChangeArrowheads="1" noChangeAspect="1"/>
+                    </pic:cNvPicPr>
+                  </pic:nvPicPr>
+                  <pic:blipFill>
+                    <a:blip r:embed="rId53"/>
+                    <a:stretch>
+                      <a:fillRect/>
+                    </a:stretch>
+                  </pic:blipFill>
+                  <pic:spPr bwMode="auto">
+                    <a:xfrm>
+                      <a:off x="0" y="0"/>
+                      <a:ext cx="5334000" cy="4191000"/>
+                    </a:xfrm>
+                    <a:prstGeom prst="rect">
+                      <a:avLst/>
+                    </a:prstGeom>
+                    <a:noFill/>
+                    <a:ln w="9525">
+                      <a:noFill/>
+                      <a:headEnd/>
+                      <a:tailEnd/>
+                    </a:ln>
+                  </pic:spPr>
+                </pic:pic>
+              </a:graphicData>
+            </a:graphic>
+          </wp:inline>
+        </w:drawing>
+      </w:r>
+    </w:p>
+    <w:bookmarkEnd w:id="56"/>
+    <w:bookmarkStart w:id="60" w:name="X77e9005b9b6a06de423e46c0fd275669ef06bbc"/>
+    <w:p>
+      <w:pPr>
+        <w:pStyle w:val="Heading2"/>
+      </w:pPr>
+      <w:r>
+        <w:t xml:space="preserve">Appendix C5: Sensitivity — Size Standardization</w:t>
+      </w:r>
+    </w:p>
+    <w:p>
+      <w:pPr>
+        <w:pStyle w:val="FirstParagraph"/>
+      </w:pPr>
+      <w:r>
+        <w:drawing>
+          <wp:inline>
+            <wp:extent cx="5334000" cy="4191000"/>
+            <wp:effectExtent b="0" l="0" r="0" t="0"/>
+            <wp:docPr descr="" title="" id="58" name="Picture"/>
+            <a:graphic>
+              <a:graphicData uri="http://schemas.openxmlformats.org/drawingml/2006/picture">
+                <pic:pic>
+                  <pic:nvPicPr>
+                    <pic:cNvPr descr="/Users/amanda/Desktop/clan_project/10_draft/output/write_files/figure-docx/appendix-c5-1.png" id="59" name="Picture"/>
+                    <pic:cNvPicPr>
+                      <a:picLocks noChangeArrowheads="1" noChangeAspect="1"/>
+                    </pic:cNvPicPr>
+                  </pic:nvPicPr>
+                  <pic:blipFill>
+                    <a:blip r:embed="rId57"/>
+                    <a:stretch>
+                      <a:fillRect/>
+                    </a:stretch>
+                  </pic:blipFill>
+                  <pic:spPr bwMode="auto">
+                    <a:xfrm>
+                      <a:off x="0" y="0"/>
+                      <a:ext cx="5334000" cy="4191000"/>
+                    </a:xfrm>
+                    <a:prstGeom prst="rect">
+                      <a:avLst/>
+                    </a:prstGeom>
+                    <a:noFill/>
+                    <a:ln w="9525">
+                      <a:noFill/>
+                      <a:headEnd/>
+                      <a:tailEnd/>
+                    </a:ln>
+                  </pic:spPr>
+                </pic:pic>
+              </a:graphicData>
+            </a:graphic>
+          </wp:inline>
+        </w:drawing>
+      </w:r>
+    </w:p>
+    <w:bookmarkEnd w:id="60"/>
+    <w:bookmarkStart w:id="64" w:name="appendix-c6-sensitivity-weighting"/>
+    <w:p>
+      <w:pPr>
+        <w:pStyle w:val="Heading2"/>
+      </w:pPr>
+      <w:r>
+        <w:t xml:space="preserve">Appendix C6: Sensitivity — Weighting</w:t>
+      </w:r>
+    </w:p>
+    <w:p>
+      <w:pPr>
+        <w:pStyle w:val="FirstParagraph"/>
+      </w:pPr>
+      <w:r>
+        <w:drawing>
+          <wp:inline>
+            <wp:extent cx="5334000" cy="4191000"/>
+            <wp:effectExtent b="0" l="0" r="0" t="0"/>
+            <wp:docPr descr="" title="" id="62" name="Picture"/>
+            <a:graphic>
+              <a:graphicData uri="http://schemas.openxmlformats.org/drawingml/2006/picture">
+                <pic:pic>
+                  <pic:nvPicPr>
+                    <pic:cNvPr descr="/Users/amanda/Desktop/clan_project/10_draft/output/write_files/figure-docx/appendix-c6-1.png" id="63" name="Picture"/>
+                    <pic:cNvPicPr>
+                      <a:picLocks noChangeArrowheads="1" noChangeAspect="1"/>
+                    </pic:cNvPicPr>
+                  </pic:nvPicPr>
+                  <pic:blipFill>
+                    <a:blip r:embed="rId61"/>
+                    <a:stretch>
+                      <a:fillRect/>
+                    </a:stretch>
+                  </pic:blipFill>
+                  <pic:spPr bwMode="auto">
+                    <a:xfrm>
+                      <a:off x="0" y="0"/>
+                      <a:ext cx="5334000" cy="4191000"/>
+                    </a:xfrm>
+                    <a:prstGeom prst="rect">
+                      <a:avLst/>
+                    </a:prstGeom>
+                    <a:noFill/>
+                    <a:ln w="9525">
+                      <a:noFill/>
+                      <a:headEnd/>
+                      <a:tailEnd/>
+                    </a:ln>
+                  </pic:spPr>
+                </pic:pic>
+              </a:graphicData>
+            </a:graphic>
+          </wp:inline>
+        </w:drawing>
+      </w:r>
+    </w:p>
+    <w:bookmarkEnd w:id="64"/>
+    <w:bookmarkEnd w:id="65"/>
+    <w:bookmarkStart w:id="147" w:name="Xbdbdfc1a62708dc07a090fee8b3b74e63e756a2"/>
+    <w:p>
+      <w:pPr>
+        <w:pStyle w:val="Heading1"/>
+      </w:pPr>
+      <w:r>
+        <w:t xml:space="preserve">Appendix D: Alternative Inequality Measures</w:t>
+      </w:r>
+    </w:p>
+    <w:p>
+      <w:pPr>
+        <w:pStyle w:val="FirstParagraph"/>
+      </w:pPr>
+      <w:r>
+        <w:drawing>
+          <wp:inline>
+            <wp:extent cx="5334000" cy="4953000"/>
+            <wp:effectExtent b="0" l="0" r="0" t="0"/>
+            <wp:docPr descr="" title="" id="67" name="Picture"/>
+            <a:graphic>
+              <a:graphicData uri="http://schemas.openxmlformats.org/drawingml/2006/picture">
+                <pic:pic>
+                  <pic:nvPicPr>
+                    <pic:cNvPr descr="/Users/amanda/Desktop/clan_project/10_draft/output/write_files/figure-docx/appendix-d-1.png" id="68" name="Picture"/>
+                    <pic:cNvPicPr>
+                      <a:picLocks noChangeArrowheads="1" noChangeAspect="1"/>
+                    </pic:cNvPicPr>
+                  </pic:nvPicPr>
+                  <pic:blipFill>
+                    <a:blip r:embed="rId66"/>
                     <a:stretch>
                       <a:fillRect/>
                     </a:stretch>
@@ -6982,635 +8580,8 @@
         </w:drawing>
       </w:r>
     </w:p>
-    <w:bookmarkEnd w:id="43"/>
-    <w:bookmarkStart w:id="47" w:name="appendix-d1-sensitivity-negative-values"/>
-    <w:p>
-      <w:pPr>
-        <w:pStyle w:val="Heading1"/>
-      </w:pPr>
-      <w:r>
-        <w:t xml:space="preserve">Appendix D1: Sensitivity — Negative Values</w:t>
-      </w:r>
-    </w:p>
-    <w:p>
-      <w:pPr>
-        <w:pStyle w:val="FirstParagraph"/>
-      </w:pPr>
-      <w:r>
-        <w:drawing>
-          <wp:inline>
-            <wp:extent cx="5334000" cy="4191000"/>
-            <wp:effectExtent b="0" l="0" r="0" t="0"/>
-            <wp:docPr descr="" title="" id="45" name="Picture"/>
-            <a:graphic>
-              <a:graphicData uri="http://schemas.openxmlformats.org/drawingml/2006/picture">
-                <pic:pic>
-                  <pic:nvPicPr>
-                    <pic:cNvPr descr="/Users/amanda/Desktop/clan_project/10_draft/output/write_files/figure-docx/appendix-d1-1.png" id="46" name="Picture"/>
-                    <pic:cNvPicPr>
-                      <a:picLocks noChangeArrowheads="1" noChangeAspect="1"/>
-                    </pic:cNvPicPr>
-                  </pic:nvPicPr>
-                  <pic:blipFill>
-                    <a:blip r:embed="rId44"/>
-                    <a:stretch>
-                      <a:fillRect/>
-                    </a:stretch>
-                  </pic:blipFill>
-                  <pic:spPr bwMode="auto">
-                    <a:xfrm>
-                      <a:off x="0" y="0"/>
-                      <a:ext cx="5334000" cy="4191000"/>
-                    </a:xfrm>
-                    <a:prstGeom prst="rect">
-                      <a:avLst/>
-                    </a:prstGeom>
-                    <a:noFill/>
-                    <a:ln w="9525">
-                      <a:noFill/>
-                      <a:headEnd/>
-                      <a:tailEnd/>
-                    </a:ln>
-                  </pic:spPr>
-                </pic:pic>
-              </a:graphicData>
-            </a:graphic>
-          </wp:inline>
-        </w:drawing>
-      </w:r>
-    </w:p>
-    <w:bookmarkEnd w:id="47"/>
-    <w:bookmarkStart w:id="51" w:name="X2c0ca198151b488f0a5fd9ab3a13059241107bf"/>
-    <w:p>
-      <w:pPr>
-        <w:pStyle w:val="Heading1"/>
-      </w:pPr>
-      <w:r>
-        <w:t xml:space="preserve">Appendix D2: Sensitivity — Wealth With and Without Home Equity</w:t>
-      </w:r>
-    </w:p>
-    <w:p>
-      <w:pPr>
-        <w:pStyle w:val="FirstParagraph"/>
-      </w:pPr>
-      <w:r>
-        <w:drawing>
-          <wp:inline>
-            <wp:extent cx="5334000" cy="2667000"/>
-            <wp:effectExtent b="0" l="0" r="0" t="0"/>
-            <wp:docPr descr="" title="" id="49" name="Picture"/>
-            <a:graphic>
-              <a:graphicData uri="http://schemas.openxmlformats.org/drawingml/2006/picture">
-                <pic:pic>
-                  <pic:nvPicPr>
-                    <pic:cNvPr descr="/Users/amanda/Desktop/clan_project/10_draft/output/write_files/figure-docx/appendix-d2-1.png" id="50" name="Picture"/>
-                    <pic:cNvPicPr>
-                      <a:picLocks noChangeArrowheads="1" noChangeAspect="1"/>
-                    </pic:cNvPicPr>
-                  </pic:nvPicPr>
-                  <pic:blipFill>
-                    <a:blip r:embed="rId48"/>
-                    <a:stretch>
-                      <a:fillRect/>
-                    </a:stretch>
-                  </pic:blipFill>
-                  <pic:spPr bwMode="auto">
-                    <a:xfrm>
-                      <a:off x="0" y="0"/>
-                      <a:ext cx="5334000" cy="2667000"/>
-                    </a:xfrm>
-                    <a:prstGeom prst="rect">
-                      <a:avLst/>
-                    </a:prstGeom>
-                    <a:noFill/>
-                    <a:ln w="9525">
-                      <a:noFill/>
-                      <a:headEnd/>
-                      <a:tailEnd/>
-                    </a:ln>
-                  </pic:spPr>
-                </pic:pic>
-              </a:graphicData>
-            </a:graphic>
-          </wp:inline>
-        </w:drawing>
-      </w:r>
-    </w:p>
-    <w:bookmarkEnd w:id="51"/>
-    <w:bookmarkStart w:id="55" w:name="X796f0aa327689e7912dc08c18898cdb7c82e5b7"/>
-    <w:p>
-      <w:pPr>
-        <w:pStyle w:val="Heading1"/>
-      </w:pPr>
-      <w:r>
-        <w:t xml:space="preserve">Appendix D3: Sensitivity — Single-Household Clans</w:t>
-      </w:r>
-    </w:p>
-    <w:p>
-      <w:pPr>
-        <w:pStyle w:val="FirstParagraph"/>
-      </w:pPr>
-      <w:r>
-        <w:drawing>
-          <wp:inline>
-            <wp:extent cx="5334000" cy="4191000"/>
-            <wp:effectExtent b="0" l="0" r="0" t="0"/>
-            <wp:docPr descr="" title="" id="53" name="Picture"/>
-            <a:graphic>
-              <a:graphicData uri="http://schemas.openxmlformats.org/drawingml/2006/picture">
-                <pic:pic>
-                  <pic:nvPicPr>
-                    <pic:cNvPr descr="/Users/amanda/Desktop/clan_project/10_draft/output/write_files/figure-docx/appendix-d3-1.png" id="54" name="Picture"/>
-                    <pic:cNvPicPr>
-                      <a:picLocks noChangeArrowheads="1" noChangeAspect="1"/>
-                    </pic:cNvPicPr>
-                  </pic:nvPicPr>
-                  <pic:blipFill>
-                    <a:blip r:embed="rId52"/>
-                    <a:stretch>
-                      <a:fillRect/>
-                    </a:stretch>
-                  </pic:blipFill>
-                  <pic:spPr bwMode="auto">
-                    <a:xfrm>
-                      <a:off x="0" y="0"/>
-                      <a:ext cx="5334000" cy="4191000"/>
-                    </a:xfrm>
-                    <a:prstGeom prst="rect">
-                      <a:avLst/>
-                    </a:prstGeom>
-                    <a:noFill/>
-                    <a:ln w="9525">
-                      <a:noFill/>
-                      <a:headEnd/>
-                      <a:tailEnd/>
-                    </a:ln>
-                  </pic:spPr>
-                </pic:pic>
-              </a:graphicData>
-            </a:graphic>
-          </wp:inline>
-        </w:drawing>
-      </w:r>
-    </w:p>
-    <w:bookmarkEnd w:id="55"/>
-    <w:bookmarkStart w:id="59" w:name="appendix-d4-sensitivity-weighting"/>
-    <w:p>
-      <w:pPr>
-        <w:pStyle w:val="Heading1"/>
-      </w:pPr>
-      <w:r>
-        <w:t xml:space="preserve">Appendix D4: Sensitivity — Weighting</w:t>
-      </w:r>
-    </w:p>
-    <w:p>
-      <w:pPr>
-        <w:pStyle w:val="FirstParagraph"/>
-      </w:pPr>
-      <w:r>
-        <w:drawing>
-          <wp:inline>
-            <wp:extent cx="5334000" cy="4191000"/>
-            <wp:effectExtent b="0" l="0" r="0" t="0"/>
-            <wp:docPr descr="" title="" id="57" name="Picture"/>
-            <a:graphic>
-              <a:graphicData uri="http://schemas.openxmlformats.org/drawingml/2006/picture">
-                <pic:pic>
-                  <pic:nvPicPr>
-                    <pic:cNvPr descr="/Users/amanda/Desktop/clan_project/10_draft/output/write_files/figure-docx/appendix-d4-1.png" id="58" name="Picture"/>
-                    <pic:cNvPicPr>
-                      <a:picLocks noChangeArrowheads="1" noChangeAspect="1"/>
-                    </pic:cNvPicPr>
-                  </pic:nvPicPr>
-                  <pic:blipFill>
-                    <a:blip r:embed="rId56"/>
-                    <a:stretch>
-                      <a:fillRect/>
-                    </a:stretch>
-                  </pic:blipFill>
-                  <pic:spPr bwMode="auto">
-                    <a:xfrm>
-                      <a:off x="0" y="0"/>
-                      <a:ext cx="5334000" cy="4191000"/>
-                    </a:xfrm>
-                    <a:prstGeom prst="rect">
-                      <a:avLst/>
-                    </a:prstGeom>
-                    <a:noFill/>
-                    <a:ln w="9525">
-                      <a:noFill/>
-                      <a:headEnd/>
-                      <a:tailEnd/>
-                    </a:ln>
-                  </pic:spPr>
-                </pic:pic>
-              </a:graphicData>
-            </a:graphic>
-          </wp:inline>
-        </w:drawing>
-      </w:r>
-    </w:p>
-    <w:bookmarkEnd w:id="59"/>
-    <w:bookmarkStart w:id="63" w:name="X47e0622b93f76056e7f4ad3b772b6ce26b8cfe3"/>
-    <w:p>
-      <w:pPr>
-        <w:pStyle w:val="Heading1"/>
-      </w:pPr>
-      <w:r>
-        <w:t xml:space="preserve">Appendix D5: Sensitivity — Size Standardization</w:t>
-      </w:r>
-    </w:p>
-    <w:p>
-      <w:pPr>
-        <w:pStyle w:val="FirstParagraph"/>
-      </w:pPr>
-      <w:r>
-        <w:drawing>
-          <wp:inline>
-            <wp:extent cx="5334000" cy="4191000"/>
-            <wp:effectExtent b="0" l="0" r="0" t="0"/>
-            <wp:docPr descr="" title="" id="61" name="Picture"/>
-            <a:graphic>
-              <a:graphicData uri="http://schemas.openxmlformats.org/drawingml/2006/picture">
-                <pic:pic>
-                  <pic:nvPicPr>
-                    <pic:cNvPr descr="/Users/amanda/Desktop/clan_project/10_draft/output/write_files/figure-docx/appendix-d5-1.png" id="62" name="Picture"/>
-                    <pic:cNvPicPr>
-                      <a:picLocks noChangeArrowheads="1" noChangeAspect="1"/>
-                    </pic:cNvPicPr>
-                  </pic:nvPicPr>
-                  <pic:blipFill>
-                    <a:blip r:embed="rId60"/>
-                    <a:stretch>
-                      <a:fillRect/>
-                    </a:stretch>
-                  </pic:blipFill>
-                  <pic:spPr bwMode="auto">
-                    <a:xfrm>
-                      <a:off x="0" y="0"/>
-                      <a:ext cx="5334000" cy="4191000"/>
-                    </a:xfrm>
-                    <a:prstGeom prst="rect">
-                      <a:avLst/>
-                    </a:prstGeom>
-                    <a:noFill/>
-                    <a:ln w="9525">
-                      <a:noFill/>
-                      <a:headEnd/>
-                      <a:tailEnd/>
-                    </a:ln>
-                  </pic:spPr>
-                </pic:pic>
-              </a:graphicData>
-            </a:graphic>
-          </wp:inline>
-        </w:drawing>
-      </w:r>
-    </w:p>
-    <w:bookmarkEnd w:id="63"/>
-    <w:bookmarkStart w:id="67" w:name="X750f075da32d67249c4b5a4cf57648e8a17e2c3"/>
-    <w:p>
-      <w:pPr>
-        <w:pStyle w:val="Heading1"/>
-      </w:pPr>
-      <w:r>
-        <w:t xml:space="preserve">Appendix D6: Gini Coefficients by Race Subgroup</w:t>
-      </w:r>
-    </w:p>
-    <w:p>
-      <w:pPr>
-        <w:pStyle w:val="FirstParagraph"/>
-      </w:pPr>
-      <w:r>
-        <w:drawing>
-          <wp:inline>
-            <wp:extent cx="5334000" cy="4191000"/>
-            <wp:effectExtent b="0" l="0" r="0" t="0"/>
-            <wp:docPr descr="" title="" id="65" name="Picture"/>
-            <a:graphic>
-              <a:graphicData uri="http://schemas.openxmlformats.org/drawingml/2006/picture">
-                <pic:pic>
-                  <pic:nvPicPr>
-                    <pic:cNvPr descr="/Users/amanda/Desktop/clan_project/10_draft/output/write_files/figure-docx/appendix-d6-1.png" id="66" name="Picture"/>
-                    <pic:cNvPicPr>
-                      <a:picLocks noChangeArrowheads="1" noChangeAspect="1"/>
-                    </pic:cNvPicPr>
-                  </pic:nvPicPr>
-                  <pic:blipFill>
-                    <a:blip r:embed="rId64"/>
-                    <a:stretch>
-                      <a:fillRect/>
-                    </a:stretch>
-                  </pic:blipFill>
-                  <pic:spPr bwMode="auto">
-                    <a:xfrm>
-                      <a:off x="0" y="0"/>
-                      <a:ext cx="5334000" cy="4191000"/>
-                    </a:xfrm>
-                    <a:prstGeom prst="rect">
-                      <a:avLst/>
-                    </a:prstGeom>
-                    <a:noFill/>
-                    <a:ln w="9525">
-                      <a:noFill/>
-                      <a:headEnd/>
-                      <a:tailEnd/>
-                    </a:ln>
-                  </pic:spPr>
-                </pic:pic>
-              </a:graphicData>
-            </a:graphic>
-          </wp:inline>
-        </w:drawing>
-      </w:r>
-    </w:p>
-    <w:bookmarkEnd w:id="67"/>
-    <w:bookmarkStart w:id="71" w:name="X3ca48920e7b797c3dd18e23810b9df77528cee2"/>
-    <w:p>
-      <w:pPr>
-        <w:pStyle w:val="Heading1"/>
-      </w:pPr>
-      <w:r>
-        <w:t xml:space="preserve">Appendix E: Distribution of Income and Wealth</w:t>
-      </w:r>
-    </w:p>
-    <w:p>
-      <w:pPr>
-        <w:pStyle w:val="FirstParagraph"/>
-      </w:pPr>
-      <w:r>
-        <w:drawing>
-          <wp:inline>
-            <wp:extent cx="5334000" cy="4191000"/>
-            <wp:effectExtent b="0" l="0" r="0" t="0"/>
-            <wp:docPr descr="" title="" id="69" name="Picture"/>
-            <a:graphic>
-              <a:graphicData uri="http://schemas.openxmlformats.org/drawingml/2006/picture">
-                <pic:pic>
-                  <pic:nvPicPr>
-                    <pic:cNvPr descr="/Users/amanda/Desktop/clan_project/10_draft/output/write_files/figure-docx/appendix-e-1.png" id="70" name="Picture"/>
-                    <pic:cNvPicPr>
-                      <a:picLocks noChangeArrowheads="1" noChangeAspect="1"/>
-                    </pic:cNvPicPr>
-                  </pic:nvPicPr>
-                  <pic:blipFill>
-                    <a:blip r:embed="rId68"/>
-                    <a:stretch>
-                      <a:fillRect/>
-                    </a:stretch>
-                  </pic:blipFill>
-                  <pic:spPr bwMode="auto">
-                    <a:xfrm>
-                      <a:off x="0" y="0"/>
-                      <a:ext cx="5334000" cy="4191000"/>
-                    </a:xfrm>
-                    <a:prstGeom prst="rect">
-                      <a:avLst/>
-                    </a:prstGeom>
-                    <a:noFill/>
-                    <a:ln w="9525">
-                      <a:noFill/>
-                      <a:headEnd/>
-                      <a:tailEnd/>
-                    </a:ln>
-                  </pic:spPr>
-                </pic:pic>
-              </a:graphicData>
-            </a:graphic>
-          </wp:inline>
-        </w:drawing>
-      </w:r>
-    </w:p>
-    <w:bookmarkEnd w:id="71"/>
-    <w:bookmarkStart w:id="75" w:name="appendix-f1-race-ratios-negative-values"/>
-    <w:p>
-      <w:pPr>
-        <w:pStyle w:val="Heading1"/>
-      </w:pPr>
-      <w:r>
-        <w:t xml:space="preserve">Appendix F1: Race Ratios — Negative Values</w:t>
-      </w:r>
-    </w:p>
-    <w:p>
-      <w:pPr>
-        <w:pStyle w:val="FirstParagraph"/>
-      </w:pPr>
-      <w:r>
-        <w:drawing>
-          <wp:inline>
-            <wp:extent cx="5334000" cy="4191000"/>
-            <wp:effectExtent b="0" l="0" r="0" t="0"/>
-            <wp:docPr descr="" title="" id="73" name="Picture"/>
-            <a:graphic>
-              <a:graphicData uri="http://schemas.openxmlformats.org/drawingml/2006/picture">
-                <pic:pic>
-                  <pic:nvPicPr>
-                    <pic:cNvPr descr="/Users/amanda/Desktop/clan_project/10_draft/output/write_files/figure-docx/appendix-f1-1.png" id="74" name="Picture"/>
-                    <pic:cNvPicPr>
-                      <a:picLocks noChangeArrowheads="1" noChangeAspect="1"/>
-                    </pic:cNvPicPr>
-                  </pic:nvPicPr>
-                  <pic:blipFill>
-                    <a:blip r:embed="rId72"/>
-                    <a:stretch>
-                      <a:fillRect/>
-                    </a:stretch>
-                  </pic:blipFill>
-                  <pic:spPr bwMode="auto">
-                    <a:xfrm>
-                      <a:off x="0" y="0"/>
-                      <a:ext cx="5334000" cy="4191000"/>
-                    </a:xfrm>
-                    <a:prstGeom prst="rect">
-                      <a:avLst/>
-                    </a:prstGeom>
-                    <a:noFill/>
-                    <a:ln w="9525">
-                      <a:noFill/>
-                      <a:headEnd/>
-                      <a:tailEnd/>
-                    </a:ln>
-                  </pic:spPr>
-                </pic:pic>
-              </a:graphicData>
-            </a:graphic>
-          </wp:inline>
-        </w:drawing>
-      </w:r>
-    </w:p>
-    <w:bookmarkEnd w:id="75"/>
-    <w:bookmarkStart w:id="79" w:name="Xe408c392d53d71a7a9d72befc7a6c94911a5caf"/>
-    <w:p>
-      <w:pPr>
-        <w:pStyle w:val="Heading1"/>
-      </w:pPr>
-      <w:r>
-        <w:t xml:space="preserve">Appendix F2: Race Ratios — Wealth With and Without Home Equity</w:t>
-      </w:r>
-    </w:p>
-    <w:p>
-      <w:pPr>
-        <w:pStyle w:val="FirstParagraph"/>
-      </w:pPr>
-      <w:r>
-        <w:drawing>
-          <wp:inline>
-            <wp:extent cx="5334000" cy="2667000"/>
-            <wp:effectExtent b="0" l="0" r="0" t="0"/>
-            <wp:docPr descr="" title="" id="77" name="Picture"/>
-            <a:graphic>
-              <a:graphicData uri="http://schemas.openxmlformats.org/drawingml/2006/picture">
-                <pic:pic>
-                  <pic:nvPicPr>
-                    <pic:cNvPr descr="/Users/amanda/Desktop/clan_project/10_draft/output/write_files/figure-docx/appendix-f2-1.png" id="78" name="Picture"/>
-                    <pic:cNvPicPr>
-                      <a:picLocks noChangeArrowheads="1" noChangeAspect="1"/>
-                    </pic:cNvPicPr>
-                  </pic:nvPicPr>
-                  <pic:blipFill>
-                    <a:blip r:embed="rId76"/>
-                    <a:stretch>
-                      <a:fillRect/>
-                    </a:stretch>
-                  </pic:blipFill>
-                  <pic:spPr bwMode="auto">
-                    <a:xfrm>
-                      <a:off x="0" y="0"/>
-                      <a:ext cx="5334000" cy="2667000"/>
-                    </a:xfrm>
-                    <a:prstGeom prst="rect">
-                      <a:avLst/>
-                    </a:prstGeom>
-                    <a:noFill/>
-                    <a:ln w="9525">
-                      <a:noFill/>
-                      <a:headEnd/>
-                      <a:tailEnd/>
-                    </a:ln>
-                  </pic:spPr>
-                </pic:pic>
-              </a:graphicData>
-            </a:graphic>
-          </wp:inline>
-        </w:drawing>
-      </w:r>
-    </w:p>
-    <w:bookmarkEnd w:id="79"/>
-    <w:bookmarkStart w:id="83" w:name="X9f0dd96eadad89e8a50793fc4b191c5f1b6409e"/>
-    <w:p>
-      <w:pPr>
-        <w:pStyle w:val="Heading1"/>
-      </w:pPr>
-      <w:r>
-        <w:t xml:space="preserve">Appendix F3: Race Ratios — Single-Household Clans</w:t>
-      </w:r>
-    </w:p>
-    <w:p>
-      <w:pPr>
-        <w:pStyle w:val="FirstParagraph"/>
-      </w:pPr>
-      <w:r>
-        <w:drawing>
-          <wp:inline>
-            <wp:extent cx="5334000" cy="4191000"/>
-            <wp:effectExtent b="0" l="0" r="0" t="0"/>
-            <wp:docPr descr="" title="" id="81" name="Picture"/>
-            <a:graphic>
-              <a:graphicData uri="http://schemas.openxmlformats.org/drawingml/2006/picture">
-                <pic:pic>
-                  <pic:nvPicPr>
-                    <pic:cNvPr descr="/Users/amanda/Desktop/clan_project/10_draft/output/write_files/figure-docx/appendix-f3-1.png" id="82" name="Picture"/>
-                    <pic:cNvPicPr>
-                      <a:picLocks noChangeArrowheads="1" noChangeAspect="1"/>
-                    </pic:cNvPicPr>
-                  </pic:nvPicPr>
-                  <pic:blipFill>
-                    <a:blip r:embed="rId80"/>
-                    <a:stretch>
-                      <a:fillRect/>
-                    </a:stretch>
-                  </pic:blipFill>
-                  <pic:spPr bwMode="auto">
-                    <a:xfrm>
-                      <a:off x="0" y="0"/>
-                      <a:ext cx="5334000" cy="4191000"/>
-                    </a:xfrm>
-                    <a:prstGeom prst="rect">
-                      <a:avLst/>
-                    </a:prstGeom>
-                    <a:noFill/>
-                    <a:ln w="9525">
-                      <a:noFill/>
-                      <a:headEnd/>
-                      <a:tailEnd/>
-                    </a:ln>
-                  </pic:spPr>
-                </pic:pic>
-              </a:graphicData>
-            </a:graphic>
-          </wp:inline>
-        </w:drawing>
-      </w:r>
-    </w:p>
-    <w:bookmarkEnd w:id="83"/>
-    <w:bookmarkStart w:id="154" w:name="appendix-f4-race-ratios-weighting"/>
-    <w:p>
-      <w:pPr>
-        <w:pStyle w:val="Heading1"/>
-      </w:pPr>
-      <w:r>
-        <w:t xml:space="preserve">Appendix F4: Race Ratios — Weighting</w:t>
-      </w:r>
-    </w:p>
-    <w:p>
-      <w:pPr>
-        <w:pStyle w:val="FirstParagraph"/>
-      </w:pPr>
-      <w:r>
-        <w:drawing>
-          <wp:inline>
-            <wp:extent cx="5334000" cy="4191000"/>
-            <wp:effectExtent b="0" l="0" r="0" t="0"/>
-            <wp:docPr descr="" title="" id="85" name="Picture"/>
-            <a:graphic>
-              <a:graphicData uri="http://schemas.openxmlformats.org/drawingml/2006/picture">
-                <pic:pic>
-                  <pic:nvPicPr>
-                    <pic:cNvPr descr="/Users/amanda/Desktop/clan_project/10_draft/output/write_files/figure-docx/appendix-f4-1.png" id="86" name="Picture"/>
-                    <pic:cNvPicPr>
-                      <a:picLocks noChangeArrowheads="1" noChangeAspect="1"/>
-                    </pic:cNvPicPr>
-                  </pic:nvPicPr>
-                  <pic:blipFill>
-                    <a:blip r:embed="rId84"/>
-                    <a:stretch>
-                      <a:fillRect/>
-                    </a:stretch>
-                  </pic:blipFill>
-                  <pic:spPr bwMode="auto">
-                    <a:xfrm>
-                      <a:off x="0" y="0"/>
-                      <a:ext cx="5334000" cy="4191000"/>
-                    </a:xfrm>
-                    <a:prstGeom prst="rect">
-                      <a:avLst/>
-                    </a:prstGeom>
-                    <a:noFill/>
-                    <a:ln w="9525">
-                      <a:noFill/>
-                      <a:headEnd/>
-                      <a:tailEnd/>
-                    </a:ln>
-                  </pic:spPr>
-                </pic:pic>
-              </a:graphicData>
-            </a:graphic>
-          </wp:inline>
-        </w:drawing>
-      </w:r>
-    </w:p>
-    <w:bookmarkStart w:id="153" w:name="refs"/>
-    <w:bookmarkStart w:id="88" w:name="ref-fred_gini_2025"/>
+    <w:bookmarkStart w:id="146" w:name="refs"/>
+    <w:bookmarkStart w:id="70" w:name="ref-fred_gini_2025"/>
     <w:p>
       <w:pPr>
         <w:pStyle w:val="Bibliography"/>
@@ -7663,7 +8634,7 @@
       <w:r>
         <w:t xml:space="preserve"> </w:t>
       </w:r>
-      <w:hyperlink r:id="rId87">
+      <w:hyperlink r:id="rId69">
         <w:r>
           <w:rPr>
             <w:rStyle w:val="Hyperlink"/>
@@ -7672,8 +8643,8 @@
         </w:r>
       </w:hyperlink>
     </w:p>
-    <w:bookmarkEnd w:id="88"/>
-    <w:bookmarkStart w:id="90" w:name="ref-barro_decline_2020"/>
+    <w:bookmarkEnd w:id="70"/>
+    <w:bookmarkStart w:id="72" w:name="ref-barro_decline_2020"/>
     <w:p>
       <w:pPr>
         <w:pStyle w:val="Bibliography"/>
@@ -7744,7 +8715,7 @@
       <w:r>
         <w:t xml:space="preserve"> </w:t>
       </w:r>
-      <w:hyperlink r:id="rId89">
+      <w:hyperlink r:id="rId71">
         <w:r>
           <w:rPr>
             <w:rStyle w:val="Hyperlink"/>
@@ -7753,8 +8724,8 @@
         </w:r>
       </w:hyperlink>
     </w:p>
-    <w:bookmarkEnd w:id="90"/>
-    <w:bookmarkStart w:id="93" w:name="ref-kuhn_income_2025"/>
+    <w:bookmarkEnd w:id="72"/>
+    <w:bookmarkStart w:id="75" w:name="ref-kuhn_income_2025"/>
     <w:p>
       <w:pPr>
         <w:pStyle w:val="Bibliography"/>
@@ -7840,7 +8811,7 @@
       <w:r>
         <w:t xml:space="preserve"> </w:t>
       </w:r>
-      <w:hyperlink r:id="rId91">
+      <w:hyperlink r:id="rId73">
         <w:r>
           <w:rPr>
             <w:rStyle w:val="Hyperlink"/>
@@ -7851,7 +8822,7 @@
       <w:r>
         <w:t xml:space="preserve">. doi:</w:t>
       </w:r>
-      <w:hyperlink r:id="rId92">
+      <w:hyperlink r:id="rId74">
         <w:r>
           <w:rPr>
             <w:rStyle w:val="Hyperlink"/>
@@ -7860,8 +8831,8 @@
         </w:r>
       </w:hyperlink>
     </w:p>
-    <w:bookmarkEnd w:id="93"/>
-    <w:bookmarkStart w:id="96" w:name="ref-auten_income_2024"/>
+    <w:bookmarkEnd w:id="75"/>
+    <w:bookmarkStart w:id="78" w:name="ref-auten_income_2024"/>
     <w:p>
       <w:pPr>
         <w:pStyle w:val="Bibliography"/>
@@ -7959,7 +8930,7 @@
       <w:r>
         <w:t xml:space="preserve"> </w:t>
       </w:r>
-      <w:hyperlink r:id="rId94">
+      <w:hyperlink r:id="rId76">
         <w:r>
           <w:rPr>
             <w:rStyle w:val="Hyperlink"/>
@@ -7970,7 +8941,7 @@
       <w:r>
         <w:t xml:space="preserve">. doi:</w:t>
       </w:r>
-      <w:hyperlink r:id="rId95">
+      <w:hyperlink r:id="rId77">
         <w:r>
           <w:rPr>
             <w:rStyle w:val="Hyperlink"/>
@@ -7979,8 +8950,8 @@
         </w:r>
       </w:hyperlink>
     </w:p>
-    <w:bookmarkEnd w:id="96"/>
-    <w:bookmarkStart w:id="99" w:name="ref-killewald_wealth_2017"/>
+    <w:bookmarkEnd w:id="78"/>
+    <w:bookmarkStart w:id="81" w:name="ref-killewald_wealth_2017"/>
     <w:p>
       <w:pPr>
         <w:pStyle w:val="Bibliography"/>
@@ -8021,7 +8992,7 @@
       <w:r>
         <w:t xml:space="preserve"> </w:t>
       </w:r>
-      <w:hyperlink r:id="rId97">
+      <w:hyperlink r:id="rId79">
         <w:r>
           <w:rPr>
             <w:rStyle w:val="Hyperlink"/>
@@ -8032,7 +9003,7 @@
       <w:r>
         <w:t xml:space="preserve">. doi:</w:t>
       </w:r>
-      <w:hyperlink r:id="rId98">
+      <w:hyperlink r:id="rId80">
         <w:r>
           <w:rPr>
             <w:rStyle w:val="Hyperlink"/>
@@ -8041,8 +9012,8 @@
         </w:r>
       </w:hyperlink>
     </w:p>
-    <w:bookmarkEnd w:id="99"/>
-    <w:bookmarkStart w:id="101" w:name="ref-saez_wealth_2016"/>
+    <w:bookmarkEnd w:id="81"/>
+    <w:bookmarkStart w:id="83" w:name="ref-saez_wealth_2016"/>
     <w:p>
       <w:pPr>
         <w:pStyle w:val="Bibliography"/>
@@ -8134,7 +9105,7 @@
       <w:r>
         <w:t xml:space="preserve"> </w:t>
       </w:r>
-      <w:hyperlink r:id="rId100">
+      <w:hyperlink r:id="rId82">
         <w:r>
           <w:rPr>
             <w:rStyle w:val="Hyperlink"/>
@@ -8145,7 +9116,7 @@
       <w:r>
         <w:t xml:space="preserve">. doi:</w:t>
       </w:r>
-      <w:hyperlink r:id="rId100">
+      <w:hyperlink r:id="rId82">
         <w:r>
           <w:rPr>
             <w:rStyle w:val="Hyperlink"/>
@@ -8154,8 +9125,8 @@
         </w:r>
       </w:hyperlink>
     </w:p>
-    <w:bookmarkEnd w:id="101"/>
-    <w:bookmarkStart w:id="102" w:name="ref-goode_world_1963"/>
+    <w:bookmarkEnd w:id="83"/>
+    <w:bookmarkStart w:id="84" w:name="ref-goode_world_1963"/>
     <w:p>
       <w:pPr>
         <w:pStyle w:val="Bibliography"/>
@@ -8173,8 +9144,8 @@
         <w:t xml:space="preserve">Goode WJ. World revolution and family patterns. Oxford, England: Free Press Glencoe; 1963.</w:t>
       </w:r>
     </w:p>
-    <w:bookmarkEnd w:id="102"/>
-    <w:bookmarkStart w:id="104" w:name="ref-parsons_essays_1954"/>
+    <w:bookmarkEnd w:id="84"/>
+    <w:bookmarkStart w:id="86" w:name="ref-parsons_essays_1954"/>
     <w:p>
       <w:pPr>
         <w:pStyle w:val="Bibliography"/>
@@ -8206,7 +9177,7 @@
       <w:r>
         <w:t xml:space="preserve">. 2nd ed. New York, NY, US: MacMillan Co; 1954. doi:</w:t>
       </w:r>
-      <w:hyperlink r:id="rId103">
+      <w:hyperlink r:id="rId85">
         <w:r>
           <w:rPr>
             <w:rStyle w:val="Hyperlink"/>
@@ -8215,8 +9186,8 @@
         </w:r>
       </w:hyperlink>
     </w:p>
-    <w:bookmarkEnd w:id="104"/>
-    <w:bookmarkStart w:id="106" w:name="ref-pilkauskas_beyond_2018"/>
+    <w:bookmarkEnd w:id="86"/>
+    <w:bookmarkStart w:id="88" w:name="ref-pilkauskas_beyond_2018"/>
     <w:p>
       <w:pPr>
         <w:pStyle w:val="Bibliography"/>
@@ -8296,7 +9267,7 @@
       <w:r>
         <w:t xml:space="preserve"> </w:t>
       </w:r>
-      <w:hyperlink r:id="rId105">
+      <w:hyperlink r:id="rId87">
         <w:r>
           <w:rPr>
             <w:rStyle w:val="Hyperlink"/>
@@ -8307,7 +9278,7 @@
       <w:r>
         <w:t xml:space="preserve">. doi:</w:t>
       </w:r>
-      <w:hyperlink r:id="rId105">
+      <w:hyperlink r:id="rId87">
         <w:r>
           <w:rPr>
             <w:rStyle w:val="Hyperlink"/>
@@ -8316,8 +9287,8 @@
         </w:r>
       </w:hyperlink>
     </w:p>
-    <w:bookmarkEnd w:id="106"/>
-    <w:bookmarkStart w:id="108" w:name="ref-mare_multigenerational_2011"/>
+    <w:bookmarkEnd w:id="88"/>
+    <w:bookmarkStart w:id="90" w:name="ref-mare_multigenerational_2011"/>
     <w:p>
       <w:pPr>
         <w:pStyle w:val="Bibliography"/>
@@ -8364,7 +9335,7 @@
       <w:r>
         <w:t xml:space="preserve"> </w:t>
       </w:r>
-      <w:hyperlink r:id="rId107">
+      <w:hyperlink r:id="rId89">
         <w:r>
           <w:rPr>
             <w:rStyle w:val="Hyperlink"/>
@@ -8375,7 +9346,7 @@
       <w:r>
         <w:t xml:space="preserve">. doi:</w:t>
       </w:r>
-      <w:hyperlink r:id="rId107">
+      <w:hyperlink r:id="rId89">
         <w:r>
           <w:rPr>
             <w:rStyle w:val="Hyperlink"/>
@@ -8384,8 +9355,8 @@
         </w:r>
       </w:hyperlink>
     </w:p>
-    <w:bookmarkEnd w:id="108"/>
-    <w:bookmarkStart w:id="110" w:name="ref-obrien_family_2024"/>
+    <w:bookmarkEnd w:id="90"/>
+    <w:bookmarkStart w:id="92" w:name="ref-obrien_family_2024"/>
     <w:p>
       <w:pPr>
         <w:pStyle w:val="Bibliography"/>
@@ -8417,7 +9388,7 @@
       <w:r>
         <w:t xml:space="preserve"> </w:t>
       </w:r>
-      <w:hyperlink r:id="rId109">
+      <w:hyperlink r:id="rId91">
         <w:r>
           <w:rPr>
             <w:rStyle w:val="Hyperlink"/>
@@ -8428,7 +9399,7 @@
       <w:r>
         <w:t xml:space="preserve">. doi:</w:t>
       </w:r>
-      <w:hyperlink r:id="rId109">
+      <w:hyperlink r:id="rId91">
         <w:r>
           <w:rPr>
             <w:rStyle w:val="Hyperlink"/>
@@ -8437,8 +9408,8 @@
         </w:r>
       </w:hyperlink>
     </w:p>
-    <w:bookmarkEnd w:id="110"/>
-    <w:bookmarkStart w:id="112" w:name="ref-shiffer-sebba_keeping_2025"/>
+    <w:bookmarkEnd w:id="92"/>
+    <w:bookmarkStart w:id="94" w:name="ref-shiffer-sebba_keeping_2025"/>
     <w:p>
       <w:pPr>
         <w:pStyle w:val="Bibliography"/>
@@ -8518,7 +9489,7 @@
       <w:r>
         <w:t xml:space="preserve"> </w:t>
       </w:r>
-      <w:hyperlink r:id="rId111">
+      <w:hyperlink r:id="rId93">
         <w:r>
           <w:rPr>
             <w:rStyle w:val="Hyperlink"/>
@@ -8529,7 +9500,7 @@
       <w:r>
         <w:t xml:space="preserve">. doi:</w:t>
       </w:r>
-      <w:hyperlink r:id="rId111">
+      <w:hyperlink r:id="rId93">
         <w:r>
           <w:rPr>
             <w:rStyle w:val="Hyperlink"/>
@@ -8538,8 +9509,8 @@
         </w:r>
       </w:hyperlink>
     </w:p>
-    <w:bookmarkEnd w:id="112"/>
-    <w:bookmarkStart w:id="115" w:name="ref-adermon_dynastic_2021"/>
+    <w:bookmarkEnd w:id="94"/>
+    <w:bookmarkStart w:id="97" w:name="ref-adermon_dynastic_2021"/>
     <w:p>
       <w:pPr>
         <w:pStyle w:val="Bibliography"/>
@@ -8598,7 +9569,7 @@
       <w:r>
         <w:t xml:space="preserve"> </w:t>
       </w:r>
-      <w:hyperlink r:id="rId113">
+      <w:hyperlink r:id="rId95">
         <w:r>
           <w:rPr>
             <w:rStyle w:val="Hyperlink"/>
@@ -8609,7 +9580,7 @@
       <w:r>
         <w:t xml:space="preserve">. doi:</w:t>
       </w:r>
-      <w:hyperlink r:id="rId114">
+      <w:hyperlink r:id="rId96">
         <w:r>
           <w:rPr>
             <w:rStyle w:val="Hyperlink"/>
@@ -8618,8 +9589,8 @@
         </w:r>
       </w:hyperlink>
     </w:p>
-    <w:bookmarkEnd w:id="115"/>
-    <w:bookmarkStart w:id="118" w:name="ref-hallsten_shadow_2023"/>
+    <w:bookmarkEnd w:id="97"/>
+    <w:bookmarkStart w:id="100" w:name="ref-hallsten_shadow_2023"/>
     <w:p>
       <w:pPr>
         <w:pStyle w:val="Bibliography"/>
@@ -8717,7 +9688,7 @@
       <w:r>
         <w:t xml:space="preserve"> </w:t>
       </w:r>
-      <w:hyperlink r:id="rId116">
+      <w:hyperlink r:id="rId98">
         <w:r>
           <w:rPr>
             <w:rStyle w:val="Hyperlink"/>
@@ -8728,7 +9699,7 @@
       <w:r>
         <w:t xml:space="preserve">. doi:</w:t>
       </w:r>
-      <w:hyperlink r:id="rId117">
+      <w:hyperlink r:id="rId99">
         <w:r>
           <w:rPr>
             <w:rStyle w:val="Hyperlink"/>
@@ -8737,8 +9708,8 @@
         </w:r>
       </w:hyperlink>
     </w:p>
-    <w:bookmarkEnd w:id="118"/>
-    <w:bookmarkStart w:id="120" w:name="ref-song_shared_2019"/>
+    <w:bookmarkEnd w:id="100"/>
+    <w:bookmarkStart w:id="102" w:name="ref-song_shared_2019"/>
     <w:p>
       <w:pPr>
         <w:pStyle w:val="Bibliography"/>
@@ -8794,7 +9765,7 @@
       <w:r>
         <w:t xml:space="preserve">. Demography. 2019;56(3):891–916. doi:</w:t>
       </w:r>
-      <w:hyperlink r:id="rId119">
+      <w:hyperlink r:id="rId101">
         <w:r>
           <w:rPr>
             <w:rStyle w:val="Hyperlink"/>
@@ -8803,8 +9774,8 @@
         </w:r>
       </w:hyperlink>
     </w:p>
-    <w:bookmarkEnd w:id="120"/>
-    <w:bookmarkStart w:id="121" w:name="ref-shiffer-sebba_concentration_2022"/>
+    <w:bookmarkEnd w:id="102"/>
+    <w:bookmarkStart w:id="103" w:name="ref-shiffer-sebba_concentration_2022"/>
     <w:p>
       <w:pPr>
         <w:pStyle w:val="Bibliography"/>
@@ -8894,8 +9865,8 @@
         <w:t xml:space="preserve">. 2022.</w:t>
       </w:r>
     </w:p>
-    <w:bookmarkEnd w:id="121"/>
-    <w:bookmarkStart w:id="123" w:name="ref-hallsten_grand_2017"/>
+    <w:bookmarkEnd w:id="103"/>
+    <w:bookmarkStart w:id="105" w:name="ref-hallsten_grand_2017"/>
     <w:p>
       <w:pPr>
         <w:pStyle w:val="Bibliography"/>
@@ -8975,7 +9946,7 @@
       <w:r>
         <w:t xml:space="preserve">. American Sociological Review. 2017;82(2):328–360. doi:</w:t>
       </w:r>
-      <w:hyperlink r:id="rId122">
+      <w:hyperlink r:id="rId104">
         <w:r>
           <w:rPr>
             <w:rStyle w:val="Hyperlink"/>
@@ -8984,8 +9955,8 @@
         </w:r>
       </w:hyperlink>
     </w:p>
-    <w:bookmarkEnd w:id="123"/>
-    <w:bookmarkStart w:id="124" w:name="ref-insolera_overview_2021"/>
+    <w:bookmarkEnd w:id="105"/>
+    <w:bookmarkStart w:id="106" w:name="ref-insolera_overview_2021"/>
     <w:p>
       <w:pPr>
         <w:pStyle w:val="Bibliography"/>
@@ -9087,8 +10058,8 @@
         <w:t xml:space="preserve">).</w:t>
       </w:r>
     </w:p>
-    <w:bookmarkEnd w:id="124"/>
-    <w:bookmarkStart w:id="126" w:name="ref-pfeffer_measuring_2016"/>
+    <w:bookmarkEnd w:id="106"/>
+    <w:bookmarkStart w:id="108" w:name="ref-pfeffer_measuring_2016"/>
     <w:p>
       <w:pPr>
         <w:pStyle w:val="Bibliography"/>
@@ -9168,7 +10139,7 @@
       <w:r>
         <w:t xml:space="preserve">. Journal of Economic and Social Measurement. 2016;41(2):103–120. doi:</w:t>
       </w:r>
-      <w:hyperlink r:id="rId125">
+      <w:hyperlink r:id="rId107">
         <w:r>
           <w:rPr>
             <w:rStyle w:val="Hyperlink"/>
@@ -9177,8 +10148,8 @@
         </w:r>
       </w:hyperlink>
     </w:p>
-    <w:bookmarkEnd w:id="126"/>
-    <w:bookmarkStart w:id="127" w:name="ref-pfeffer_determinants_2017"/>
+    <w:bookmarkEnd w:id="108"/>
+    <w:bookmarkStart w:id="110" w:name="ref-oliver_black_2013"/>
     <w:p>
       <w:pPr>
         <w:pStyle w:val="Bibliography"/>
@@ -9193,7 +10164,7 @@
         <w:t xml:space="preserve">	</w:t>
       </w:r>
       <w:r>
-        <w:t xml:space="preserve">Pfeffer FT, Griffin J. Determinants of</w:t>
+        <w:t xml:space="preserve">Oliver M, Shapiro T. Black</w:t>
       </w:r>
       <w:r>
         <w:t xml:space="preserve"> </w:t>
@@ -9205,14 +10176,73 @@
         <w:t xml:space="preserve"> </w:t>
       </w:r>
       <w:r>
-        <w:t xml:space="preserve">Fluctuations</w:t>
-      </w:r>
-      <w:r>
-        <w:t xml:space="preserve">. PWIE. 2017;11(1):87–108.</w:t>
-      </w:r>
+        <w:t xml:space="preserve">/</w:t>
+      </w:r>
+      <w:r>
+        <w:t xml:space="preserve"> </w:t>
+      </w:r>
+      <w:r>
+        <w:t xml:space="preserve">White</w:t>
+      </w:r>
+      <w:r>
+        <w:t xml:space="preserve"> </w:t>
+      </w:r>
+      <w:r>
+        <w:t xml:space="preserve">Wealth</w:t>
+      </w:r>
+      <w:r>
+        <w:t xml:space="preserve">:</w:t>
+      </w:r>
+      <w:r>
+        <w:t xml:space="preserve"> </w:t>
+      </w:r>
+      <w:r>
+        <w:t xml:space="preserve">A</w:t>
+      </w:r>
+      <w:r>
+        <w:t xml:space="preserve"> </w:t>
+      </w:r>
+      <w:r>
+        <w:t xml:space="preserve">New</w:t>
+      </w:r>
+      <w:r>
+        <w:t xml:space="preserve"> </w:t>
+      </w:r>
+      <w:r>
+        <w:t xml:space="preserve">Perspective</w:t>
+      </w:r>
+      <w:r>
+        <w:t xml:space="preserve"> </w:t>
+      </w:r>
+      <w:r>
+        <w:t xml:space="preserve">on</w:t>
+      </w:r>
+      <w:r>
+        <w:t xml:space="preserve"> </w:t>
+      </w:r>
+      <w:r>
+        <w:t xml:space="preserve">Racial</w:t>
+      </w:r>
+      <w:r>
+        <w:t xml:space="preserve"> </w:t>
+      </w:r>
+      <w:r>
+        <w:t xml:space="preserve">Inequality</w:t>
+      </w:r>
+      <w:r>
+        <w:t xml:space="preserve">. 2nd ed. New York: Routledge; 2013. doi:</w:t>
+      </w:r>
+      <w:hyperlink r:id="rId109">
+        <w:r>
+          <w:rPr>
+            <w:rStyle w:val="Hyperlink"/>
+          </w:rPr>
+          <w:t xml:space="preserve">10.4324/9780203707425</w:t>
+        </w:r>
+      </w:hyperlink>
     </w:p>
-    <w:bookmarkEnd w:id="127"/>
-    <w:bookmarkStart w:id="130" w:name="ref-corak_income_2013"/>
+    <w:bookmarkEnd w:id="110"/>
+    <w:bookmarkStart w:id="113" w:name="ref-beckert_durable_2022"/>
     <w:p>
       <w:pPr>
         <w:pStyle w:val="Bibliography"/>
@@ -9227,6 +10257,203 @@
         <w:t xml:space="preserve">	</w:t>
       </w:r>
       <w:r>
+        <w:t xml:space="preserve">Beckert J. Durable</w:t>
+      </w:r>
+      <w:r>
+        <w:t xml:space="preserve"> </w:t>
+      </w:r>
+      <w:r>
+        <w:t xml:space="preserve">Wealth</w:t>
+      </w:r>
+      <w:r>
+        <w:t xml:space="preserve">:</w:t>
+      </w:r>
+      <w:r>
+        <w:t xml:space="preserve"> </w:t>
+      </w:r>
+      <w:r>
+        <w:t xml:space="preserve">Institutions</w:t>
+      </w:r>
+      <w:r>
+        <w:t xml:space="preserve">,</w:t>
+      </w:r>
+      <w:r>
+        <w:t xml:space="preserve"> </w:t>
+      </w:r>
+      <w:r>
+        <w:t xml:space="preserve">Mechanisms</w:t>
+      </w:r>
+      <w:r>
+        <w:t xml:space="preserve">, and</w:t>
+      </w:r>
+      <w:r>
+        <w:t xml:space="preserve"> </w:t>
+      </w:r>
+      <w:r>
+        <w:t xml:space="preserve">Practices</w:t>
+      </w:r>
+      <w:r>
+        <w:t xml:space="preserve"> </w:t>
+      </w:r>
+      <w:r>
+        <w:t xml:space="preserve">of</w:t>
+      </w:r>
+      <w:r>
+        <w:t xml:space="preserve"> </w:t>
+      </w:r>
+      <w:r>
+        <w:t xml:space="preserve">Wealth</w:t>
+      </w:r>
+      <w:r>
+        <w:t xml:space="preserve"> </w:t>
+      </w:r>
+      <w:r>
+        <w:t xml:space="preserve">Perpetuation</w:t>
+      </w:r>
+      <w:r>
+        <w:t xml:space="preserve">. Annual Review of Sociology. 2022 [accessed 2025 Dec 16];48:233–255.</w:t>
+      </w:r>
+      <w:r>
+        <w:t xml:space="preserve"> </w:t>
+      </w:r>
+      <w:hyperlink r:id="rId111">
+        <w:r>
+          <w:rPr>
+            <w:rStyle w:val="Hyperlink"/>
+          </w:rPr>
+          <w:t xml:space="preserve">https://www-annualreviews-org.turing.library.northwestern.edu/content/journals/10.1146/annurev-soc-030320-115024</w:t>
+        </w:r>
+      </w:hyperlink>
+      <w:r>
+        <w:t xml:space="preserve">. doi:</w:t>
+      </w:r>
+      <w:hyperlink r:id="rId112">
+        <w:r>
+          <w:rPr>
+            <w:rStyle w:val="Hyperlink"/>
+          </w:rPr>
+          <w:t xml:space="preserve">doi.org/10.1146/annurev-soc-030320-115024</w:t>
+        </w:r>
+      </w:hyperlink>
+    </w:p>
+    <w:bookmarkEnd w:id="113"/>
+    <w:bookmarkStart w:id="116" w:name="ref-obrien_structural_2020"/>
+    <w:p>
+      <w:pPr>
+        <w:pStyle w:val="Bibliography"/>
+      </w:pPr>
+      <w:r>
+        <w:t xml:space="preserve">[22]</w:t>
+      </w:r>
+      <w:r>
+        <w:t xml:space="preserve"> </w:t>
+      </w:r>
+      <w:r>
+        <w:t xml:space="preserve">	</w:t>
+      </w:r>
+      <w:r>
+        <w:t xml:space="preserve">O’Brien R, Neman T, Seltzer N, Evans L, Venkataramani A. Structural racism, economic opportunity and racial health disparities:</w:t>
+      </w:r>
+      <w:r>
+        <w:t xml:space="preserve"> </w:t>
+      </w:r>
+      <w:r>
+        <w:t xml:space="preserve">Evidence</w:t>
+      </w:r>
+      <w:r>
+        <w:t xml:space="preserve"> </w:t>
+      </w:r>
+      <w:r>
+        <w:t xml:space="preserve">from</w:t>
+      </w:r>
+      <w:r>
+        <w:t xml:space="preserve"> </w:t>
+      </w:r>
+      <w:r>
+        <w:t xml:space="preserve">U</w:t>
+      </w:r>
+      <w:r>
+        <w:t xml:space="preserve">.</w:t>
+      </w:r>
+      <w:r>
+        <w:t xml:space="preserve">S</w:t>
+      </w:r>
+      <w:r>
+        <w:t xml:space="preserve">. counties. SSM - Population Health. 2020 [accessed 2025 Dec 18];11:100564.</w:t>
+      </w:r>
+      <w:r>
+        <w:t xml:space="preserve"> </w:t>
+      </w:r>
+      <w:hyperlink r:id="rId114">
+        <w:r>
+          <w:rPr>
+            <w:rStyle w:val="Hyperlink"/>
+          </w:rPr>
+          <w:t xml:space="preserve">https://www.sciencedirect.com/science/article/pii/S2352827319303623</w:t>
+        </w:r>
+      </w:hyperlink>
+      <w:r>
+        <w:t xml:space="preserve">. doi:</w:t>
+      </w:r>
+      <w:hyperlink r:id="rId115">
+        <w:r>
+          <w:rPr>
+            <w:rStyle w:val="Hyperlink"/>
+          </w:rPr>
+          <w:t xml:space="preserve">10.1016/j.ssmph.2020.100564</w:t>
+        </w:r>
+      </w:hyperlink>
+    </w:p>
+    <w:bookmarkEnd w:id="116"/>
+    <w:bookmarkStart w:id="117" w:name="ref-pfeffer_determinants_2017"/>
+    <w:p>
+      <w:pPr>
+        <w:pStyle w:val="Bibliography"/>
+      </w:pPr>
+      <w:r>
+        <w:t xml:space="preserve">[23]</w:t>
+      </w:r>
+      <w:r>
+        <w:t xml:space="preserve"> </w:t>
+      </w:r>
+      <w:r>
+        <w:t xml:space="preserve">	</w:t>
+      </w:r>
+      <w:r>
+        <w:t xml:space="preserve">Pfeffer FT, Griffin J. Determinants of</w:t>
+      </w:r>
+      <w:r>
+        <w:t xml:space="preserve"> </w:t>
+      </w:r>
+      <w:r>
+        <w:t xml:space="preserve">Wealth</w:t>
+      </w:r>
+      <w:r>
+        <w:t xml:space="preserve"> </w:t>
+      </w:r>
+      <w:r>
+        <w:t xml:space="preserve">Fluctuations</w:t>
+      </w:r>
+      <w:r>
+        <w:t xml:space="preserve">. PWIE. 2017;11(1):87–108.</w:t>
+      </w:r>
+    </w:p>
+    <w:bookmarkEnd w:id="117"/>
+    <w:bookmarkStart w:id="120" w:name="ref-corak_income_2013"/>
+    <w:p>
+      <w:pPr>
+        <w:pStyle w:val="Bibliography"/>
+      </w:pPr>
+      <w:r>
+        <w:t xml:space="preserve">[24]</w:t>
+      </w:r>
+      <w:r>
+        <w:t xml:space="preserve"> </w:t>
+      </w:r>
+      <w:r>
+        <w:t xml:space="preserve">	</w:t>
+      </w:r>
+      <w:r>
         <w:t xml:space="preserve">Corak M. Income</w:t>
       </w:r>
       <w:r>
@@ -9277,7 +10504,7 @@
       <w:r>
         <w:t xml:space="preserve"> </w:t>
       </w:r>
-      <w:hyperlink r:id="rId128">
+      <w:hyperlink r:id="rId118">
         <w:r>
           <w:rPr>
             <w:rStyle w:val="Hyperlink"/>
@@ -9288,7 +10515,7 @@
       <w:r>
         <w:t xml:space="preserve">. doi:</w:t>
       </w:r>
-      <w:hyperlink r:id="rId129">
+      <w:hyperlink r:id="rId119">
         <w:r>
           <w:rPr>
             <w:rStyle w:val="Hyperlink"/>
@@ -9297,14 +10524,14 @@
         </w:r>
       </w:hyperlink>
     </w:p>
-    <w:bookmarkEnd w:id="130"/>
-    <w:bookmarkStart w:id="132" w:name="ref-ermisch_parents_2012"/>
+    <w:bookmarkEnd w:id="120"/>
+    <w:bookmarkStart w:id="122" w:name="ref-ermisch_parents_2012"/>
     <w:p>
       <w:pPr>
         <w:pStyle w:val="Bibliography"/>
       </w:pPr>
       <w:r>
-        <w:t xml:space="preserve">[22]</w:t>
+        <w:t xml:space="preserve">[25]</w:t>
       </w:r>
       <w:r>
         <w:t xml:space="preserve"> </w:t>
@@ -9372,7 +10599,7 @@
       <w:r>
         <w:t xml:space="preserve"> </w:t>
       </w:r>
-      <w:hyperlink r:id="rId131">
+      <w:hyperlink r:id="rId121">
         <w:r>
           <w:rPr>
             <w:rStyle w:val="Hyperlink"/>
@@ -9381,14 +10608,14 @@
         </w:r>
       </w:hyperlink>
     </w:p>
-    <w:bookmarkEnd w:id="132"/>
-    <w:bookmarkStart w:id="134" w:name="ref-jerrim_income_2015"/>
+    <w:bookmarkEnd w:id="122"/>
+    <w:bookmarkStart w:id="124" w:name="ref-jerrim_income_2015"/>
     <w:p>
       <w:pPr>
         <w:pStyle w:val="Bibliography"/>
       </w:pPr>
       <w:r>
-        <w:t xml:space="preserve">[23]</w:t>
+        <w:t xml:space="preserve">[26]</w:t>
       </w:r>
       <w:r>
         <w:t xml:space="preserve"> </w:t>
@@ -9471,7 +10698,7 @@
       <w:r>
         <w:t xml:space="preserve">? Social Forces. 2015;94. doi:</w:t>
       </w:r>
-      <w:hyperlink r:id="rId133">
+      <w:hyperlink r:id="rId123">
         <w:r>
           <w:rPr>
             <w:rStyle w:val="Hyperlink"/>
@@ -9480,14 +10707,14 @@
         </w:r>
       </w:hyperlink>
     </w:p>
-    <w:bookmarkEnd w:id="134"/>
-    <w:bookmarkStart w:id="137" w:name="ref-si_multiple_2021"/>
+    <w:bookmarkEnd w:id="124"/>
+    <w:bookmarkStart w:id="127" w:name="ref-si_multiple_2021"/>
     <w:p>
       <w:pPr>
         <w:pStyle w:val="Bibliography"/>
       </w:pPr>
       <w:r>
-        <w:t xml:space="preserve">[24]</w:t>
+        <w:t xml:space="preserve">[27]</w:t>
       </w:r>
       <w:r>
         <w:t xml:space="preserve"> </w:t>
@@ -9579,7 +10806,7 @@
       <w:r>
         <w:t xml:space="preserve"> </w:t>
       </w:r>
-      <w:hyperlink r:id="rId135">
+      <w:hyperlink r:id="rId125">
         <w:r>
           <w:rPr>
             <w:rStyle w:val="Hyperlink"/>
@@ -9590,7 +10817,7 @@
       <w:r>
         <w:t xml:space="preserve">. doi:</w:t>
       </w:r>
-      <w:hyperlink r:id="rId136">
+      <w:hyperlink r:id="rId126">
         <w:r>
           <w:rPr>
             <w:rStyle w:val="Hyperlink"/>
@@ -9599,14 +10826,14 @@
         </w:r>
       </w:hyperlink>
     </w:p>
-    <w:bookmarkEnd w:id="137"/>
-    <w:bookmarkStart w:id="138" w:name="ref-sayer_women_2004"/>
+    <w:bookmarkEnd w:id="127"/>
+    <w:bookmarkStart w:id="128" w:name="ref-sayer_women_2004"/>
     <w:p>
       <w:pPr>
         <w:pStyle w:val="Bibliography"/>
       </w:pPr>
       <w:r>
-        <w:t xml:space="preserve">[25]</w:t>
+        <w:t xml:space="preserve">[28]</w:t>
       </w:r>
       <w:r>
         <w:t xml:space="preserve"> </w:t>
@@ -9636,14 +10863,14 @@
         <w:t xml:space="preserve">. Russell Sage Foundation; 2004.</w:t>
       </w:r>
     </w:p>
-    <w:bookmarkEnd w:id="138"/>
-    <w:bookmarkStart w:id="141" w:name="ref-de_maio_income_2007"/>
+    <w:bookmarkEnd w:id="128"/>
+    <w:bookmarkStart w:id="131" w:name="ref-atkinson_measurement_1970"/>
     <w:p>
       <w:pPr>
         <w:pStyle w:val="Bibliography"/>
       </w:pPr>
       <w:r>
-        <w:t xml:space="preserve">[26]</w:t>
+        <w:t xml:space="preserve">[29]</w:t>
       </w:r>
       <w:r>
         <w:t xml:space="preserve"> </w:t>
@@ -9652,6 +10879,47 @@
         <w:t xml:space="preserve">	</w:t>
       </w:r>
       <w:r>
+        <w:t xml:space="preserve">Atkinson AB. On the measurement of inequality. Journal of Economic Theory. 1970 [accessed 2025 July 18];2(3):244–263.</w:t>
+      </w:r>
+      <w:r>
+        <w:t xml:space="preserve"> </w:t>
+      </w:r>
+      <w:hyperlink r:id="rId129">
+        <w:r>
+          <w:rPr>
+            <w:rStyle w:val="Hyperlink"/>
+          </w:rPr>
+          <w:t xml:space="preserve">https://www.sciencedirect.com/science/article/pii/0022053170900396</w:t>
+        </w:r>
+      </w:hyperlink>
+      <w:r>
+        <w:t xml:space="preserve">. doi:</w:t>
+      </w:r>
+      <w:hyperlink r:id="rId130">
+        <w:r>
+          <w:rPr>
+            <w:rStyle w:val="Hyperlink"/>
+          </w:rPr>
+          <w:t xml:space="preserve">10.1016/0022-0531(70)90039-6</w:t>
+        </w:r>
+      </w:hyperlink>
+    </w:p>
+    <w:bookmarkEnd w:id="131"/>
+    <w:bookmarkStart w:id="134" w:name="ref-de_maio_income_2007"/>
+    <w:p>
+      <w:pPr>
+        <w:pStyle w:val="Bibliography"/>
+      </w:pPr>
+      <w:r>
+        <w:t xml:space="preserve">[30]</w:t>
+      </w:r>
+      <w:r>
+        <w:t xml:space="preserve"> </w:t>
+      </w:r>
+      <w:r>
+        <w:t xml:space="preserve">	</w:t>
+      </w:r>
+      <w:r>
         <w:t xml:space="preserve">De Maio F. Income</w:t>
       </w:r>
       <w:r>
@@ -9672,7 +10940,7 @@
       <w:r>
         <w:t xml:space="preserve"> </w:t>
       </w:r>
-      <w:hyperlink r:id="rId139">
+      <w:hyperlink r:id="rId132">
         <w:r>
           <w:rPr>
             <w:rStyle w:val="Hyperlink"/>
@@ -9683,7 +10951,7 @@
       <w:r>
         <w:t xml:space="preserve">. doi:</w:t>
       </w:r>
-      <w:hyperlink r:id="rId140">
+      <w:hyperlink r:id="rId133">
         <w:r>
           <w:rPr>
             <w:rStyle w:val="Hyperlink"/>
@@ -9692,14 +10960,14 @@
         </w:r>
       </w:hyperlink>
     </w:p>
-    <w:bookmarkEnd w:id="141"/>
-    <w:bookmarkStart w:id="144" w:name="ref-kawachi_relationship_1997"/>
+    <w:bookmarkEnd w:id="134"/>
+    <w:bookmarkStart w:id="137" w:name="ref-kawachi_relationship_1997"/>
     <w:p>
       <w:pPr>
         <w:pStyle w:val="Bibliography"/>
       </w:pPr>
       <w:r>
-        <w:t xml:space="preserve">[27]</w:t>
+        <w:t xml:space="preserve">[31]</w:t>
       </w:r>
       <w:r>
         <w:t xml:space="preserve"> </w:t>
@@ -9725,7 +10993,7 @@
       <w:r>
         <w:t xml:space="preserve"> </w:t>
       </w:r>
-      <w:hyperlink r:id="rId142">
+      <w:hyperlink r:id="rId135">
         <w:r>
           <w:rPr>
             <w:rStyle w:val="Hyperlink"/>
@@ -9736,7 +11004,7 @@
       <w:r>
         <w:t xml:space="preserve">. doi:</w:t>
       </w:r>
-      <w:hyperlink r:id="rId143">
+      <w:hyperlink r:id="rId136">
         <w:r>
           <w:rPr>
             <w:rStyle w:val="Hyperlink"/>
@@ -9745,14 +11013,14 @@
         </w:r>
       </w:hyperlink>
     </w:p>
-    <w:bookmarkEnd w:id="144"/>
-    <w:bookmarkStart w:id="147" w:name="ref-aaberge_ginis_2007"/>
+    <w:bookmarkEnd w:id="137"/>
+    <w:bookmarkStart w:id="140" w:name="ref-aaberge_ginis_2007"/>
     <w:p>
       <w:pPr>
         <w:pStyle w:val="Bibliography"/>
       </w:pPr>
       <w:r>
-        <w:t xml:space="preserve">[28]</w:t>
+        <w:t xml:space="preserve">[32]</w:t>
       </w:r>
       <w:r>
         <w:t xml:space="preserve"> </w:t>
@@ -9766,7 +11034,7 @@
       <w:r>
         <w:t xml:space="preserve"> </w:t>
       </w:r>
-      <w:hyperlink r:id="rId145">
+      <w:hyperlink r:id="rId138">
         <w:r>
           <w:rPr>
             <w:rStyle w:val="Hyperlink"/>
@@ -9777,7 +11045,7 @@
       <w:r>
         <w:t xml:space="preserve">. doi:</w:t>
       </w:r>
-      <w:hyperlink r:id="rId146">
+      <w:hyperlink r:id="rId139">
         <w:r>
           <w:rPr>
             <w:rStyle w:val="Hyperlink"/>
@@ -9786,14 +11054,14 @@
         </w:r>
       </w:hyperlink>
     </w:p>
-    <w:bookmarkEnd w:id="147"/>
-    <w:bookmarkStart w:id="149" w:name="ref-noauthor_table_nodate"/>
+    <w:bookmarkEnd w:id="140"/>
+    <w:bookmarkStart w:id="142" w:name="ref-noauthor_table_nodate"/>
     <w:p>
       <w:pPr>
         <w:pStyle w:val="Bibliography"/>
       </w:pPr>
       <w:r>
-        <w:t xml:space="preserve">[29]</w:t>
+        <w:t xml:space="preserve">[33]</w:t>
       </w:r>
       <w:r>
         <w:t xml:space="preserve"> </w:t>
@@ -9885,7 +11153,7 @@
       <w:r>
         <w:t xml:space="preserve"> </w:t>
       </w:r>
-      <w:hyperlink r:id="rId148">
+      <w:hyperlink r:id="rId141">
         <w:r>
           <w:rPr>
             <w:rStyle w:val="Hyperlink"/>
@@ -9894,14 +11162,14 @@
         </w:r>
       </w:hyperlink>
     </w:p>
-    <w:bookmarkEnd w:id="149"/>
-    <w:bookmarkStart w:id="150" w:name="ref-wolff_size_209"/>
+    <w:bookmarkEnd w:id="142"/>
+    <w:bookmarkStart w:id="143" w:name="ref-wolff_size_209"/>
     <w:p>
       <w:pPr>
         <w:pStyle w:val="Bibliography"/>
       </w:pPr>
       <w:r>
-        <w:t xml:space="preserve">[30]</w:t>
+        <w:t xml:space="preserve">[34]</w:t>
       </w:r>
       <w:r>
         <w:t xml:space="preserve"> </w:t>
@@ -10054,14 +11322,14 @@
         <w:t xml:space="preserve">. Panel Study of Income Dynamics; 209 AD.</w:t>
       </w:r>
     </w:p>
-    <w:bookmarkEnd w:id="150"/>
-    <w:bookmarkStart w:id="152" w:name="ref-pfeffer_wealth_2013"/>
+    <w:bookmarkEnd w:id="143"/>
+    <w:bookmarkStart w:id="145" w:name="ref-pfeffer_wealth_2013"/>
     <w:p>
       <w:pPr>
         <w:pStyle w:val="Bibliography"/>
       </w:pPr>
       <w:r>
-        <w:t xml:space="preserve">[31]</w:t>
+        <w:t xml:space="preserve">[35]</w:t>
       </w:r>
       <w:r>
         <w:t xml:space="preserve"> </w:t>
@@ -10099,7 +11367,7 @@
       <w:r>
         <w:t xml:space="preserve">. The Annals of the American Academy of Political and Social Science. 2013;650(1):98–123. doi:</w:t>
       </w:r>
-      <w:hyperlink r:id="rId151">
+      <w:hyperlink r:id="rId144">
         <w:r>
           <w:rPr>
             <w:rStyle w:val="Hyperlink"/>
@@ -10108,9 +11376,9 @@
         </w:r>
       </w:hyperlink>
     </w:p>
-    <w:bookmarkEnd w:id="152"/>
-    <w:bookmarkEnd w:id="153"/>
-    <w:bookmarkEnd w:id="154"/>
+    <w:bookmarkEnd w:id="145"/>
+    <w:bookmarkEnd w:id="146"/>
+    <w:bookmarkEnd w:id="147"/>
     <w:sectPr>
       <w:footnotePr>
         <w:numRestart w:val="eachSect"/>
@@ -10165,6 +11433,25 @@
       </w:r>
       <w:r>
         <w:t xml:space="preserve">. In this case, a focus on households elevates the importance of live-in extended family members and downplays the importance of extended family members who do not co-reside.</w:t>
+      </w:r>
+    </w:p>
+  </w:footnote>
+  <w:footnote w:id="27">
+    <w:p>
+      <w:pPr>
+        <w:pStyle w:val="FootnoteText"/>
+      </w:pPr>
+      <w:r>
+        <w:rPr>
+          <w:rStyle w:val="FootnoteReference"/>
+        </w:rPr>
+        <w:footnoteRef/>
+      </w:r>
+      <w:r>
+        <w:t xml:space="preserve"> </w:t>
+      </w:r>
+      <w:r>
+        <w:t xml:space="preserve">The prevalence of single-household clans dropped by 75% between 1969 and 1980. However, overall trends remain similar regardless of whether this earlier period is excluded.</w:t>
       </w:r>
     </w:p>
   </w:footnote>

</xml_diff>

<commit_message>
Fig 3 updates and Make
</commit_message>
<xml_diff>
--- a/10_draft/output/write.docx
+++ b/10_draft/output/write.docx
@@ -23,7 +23,7 @@
         <w:pStyle w:val="Date"/>
       </w:pPr>
       <w:r>
-        <w:t xml:space="preserve">April 02, 2026</w:t>
+        <w:t xml:space="preserve">April 10, 2026</w:t>
       </w:r>
     </w:p>
     <w:bookmarkStart w:id="9" w:name="abstract"/>
@@ -40,7 +40,7 @@
         <w:pStyle w:val="FirstParagraph"/>
       </w:pPr>
       <w:r>
-        <w:t xml:space="preserve">Most macro-level studies of inequality treat households as the primary unit of analysis, focusing on disparities between households. As a result, far less is known about inequality between extended families. Building on research highlighting the importance of intergenerational family ties, we examine income and wealth inequality in the United States using both households and intergenerational extended families—hereafter referred to as clans. Using data from the Panel Study of Income Dynamics (PSID), we calculate Gini coefficients for income and wealth at the household and clan levels from 1969 to 2023. We find that both income and wealth inequality are higher when measured at the household level than at the clan level. Wealth inequality has increased at similar rates across both units, whereas income inequality has grown more rapidly at the clan level than at the household level. These divergent patterns reflect differences in where inequality emerges within the distributions: the gap between household and clan wealth inequality is driven primarily by those in the middle of the wealth distribution, while the gap in income inequality is driven by units across the entire income distribution. Finally, although the mean racial wealth gap between Black and non-Black households and clans is similar, the median racial wealth gap is more pronounced at the household level. Together, these findings underscore the importance of considering extended families—in addition to households—when examining contemporary patterns of inequality in the United States.</w:t>
+        <w:t xml:space="preserve">Most macro-level studies of inequality treat households as the primary unit of analysis, focusing on disparities between households. As a result, far less is known about inequality between extended families. Building on research highlighting the importance of intergenerational family ties, we examine income and wealth inequality in the United States using both households and intergenerational extended families—hereafter referred to as clans. Using data from the Panel Study of Income Dynamics (PSID), we calculate Gini coefficients for income and wealth at the household and clan levels from 1968 to 2023. We find that both income and wealth inequality are higher when measured at the household level than at the clan level. Wealth inequality has increased at similar rates across both units, whereas income inequality has grown more rapidly at the clan level than at the household level. These divergent patterns reflect differences in where inequality emerges within the distributions: the gap between household and clan wealth inequality is driven primarily by those in the middle of the wealth distribution, while the gap in income inequality is driven by units across the entire income distribution. Finally, although the mean racial wealth gap between Black and non-Black households and clans is similar, the median racial wealth gap is more pronounced at the household level. Together, these findings underscore the importance of considering extended families—in addition to households—when examining contemporary patterns of inequality in the United States.</w:t>
       </w:r>
     </w:p>
     <w:bookmarkEnd w:id="9"/>
@@ -228,7 +228,7 @@
         <w:pStyle w:val="BodyText"/>
       </w:pPr>
       <w:r>
-        <w:t xml:space="preserve">We calculate Gini coefficients for both income and wealth at the household and clan levels from 1969 to 2023. Conceptually, the Gini can be understood as the average difference between any two units in a population. Arithmetically, it is the average absolute difference between all pairs of observations, normalized by the mean. The Gini is often illustrated with the Lorenz curve, which plots the cumulative share of income or wealth against the cumulative share of the population—whether defined as households or clans. Perfect equality appears as a 45° line where income or wealth is distributed evenly; greater inequality pulls the curve farther below this line. The Gini summarizes this deviation from perfect equality. Comparing household- and clan-level Ginis therefore shows whether the average difference between households is larger or smaller than the average difference between clans.</w:t>
+        <w:t xml:space="preserve">We calculate Gini coefficients for both income and wealth at the household and clan levels from 1968 to 2023. Conceptually, the Gini can be understood as the average difference between any two units in a population. Arithmetically, it is the average absolute difference between all pairs of observations, normalized by the mean. The Gini is often illustrated with the Lorenz curve, which plots the cumulative share of income or wealth against the cumulative share of the population—whether defined as households or clans. Perfect equality appears as a 45° line where income or wealth is distributed evenly; greater inequality pulls the curve farther below this line. The Gini summarizes this deviation from perfect equality. Comparing household- and clan-level Ginis therefore shows whether the average difference between households is larger or smaller than the average difference between clans.</w:t>
       </w:r>
     </w:p>
     <w:p>
@@ -264,7 +264,7 @@
         <w:t xml:space="preserve"> </w:t>
       </w:r>
       <w:r>
-        <w:t xml:space="preserve">Figure 1 depicts income and wealth inequality for all households and clans over time. Reflecting available data, Panel A plots income Gini coefficients from 1969 to 2023 and Panel B plots wealth Gini coefficients from 1984 to 2023. Inequality is lower when using clans as the unit of analysis rather than households. The Gini coefficient for income falls by 0.12 points on average (from 0.43 to 0.31), a 28.34% decline, while the wealth Gini falls by 0.16 points on average (from 0.82 to 0.66), about a 19.6% decrease. Taken together, these results indicate that both wealth and income inequality are higher when measured using households versus extended family units.</w:t>
+        <w:t xml:space="preserve">Figure 1 depicts income and wealth inequality for all households and clans over time. Reflecting available data, Panel A plots income Gini coefficients from 1968 to 2023 and Panel B plots wealth Gini coefficients from 1984 to 2023. Inequality is lower when using clans as the unit of analysis rather than households. The Gini coefficient for income falls by 0.12 points on average (from 0.43 to 0.31), a 28.34% decline, while the wealth Gini falls by 0.16 points on average (from 0.82 to 0.66), about a 19.6% decrease. Taken together, these results indicate that both wealth and income inequality are higher when measured using households versus extended family units.</w:t>
       </w:r>
     </w:p>
     <w:p>
@@ -323,7 +323,14 @@
           <w:i/>
           <w:iCs/>
         </w:rPr>
-        <w:t xml:space="preserve">Note: Gini coefficients estimated from weighted PSID data. Weighted mean income: $107,534 (households), $415,687 (clans). Weighted mean wealth: $490,457 (households), $1,884,939 (clans; includes home equity). Income Gini changed by 16.0% for households (0.41 in 1969 to 0.48 in 2023) and by 20.6% for clans (0.30 to 0.36). Wealth Gini changed by 4.5% for households (0.78 in 1984 to 0.81 in 2023) and by 4.4% for clans (0.61 to 0.64). On average across all years, the income Gini is 0.123 higher for households than clans; the wealth Gini is 0.160 higher. Solid lines = households; dotted lines = clans.</w:t>
+        <w:t xml:space="preserve">Note: Gini coefficients estimated from weighted PSID data. Weighted mean income: $107,534 (households), $415,687 (clans). Weighted mean wealth: $490,457 (households), $1,884,939 (clans; includes home equity). Income Gini changed by 16.0% for households (0.41 in 1968 to 0.48 in 2022) and by 20.6% for clans (0.30 to 0.36). Wealth Gini changed by 4.5% for households (0.78 in 1984 to 0.81 in 2023) and by 4.4% for clans (0.61 to 0.64). On average across all years, the income Gini is 0.123 higher for households than clans; the wealth Gini is 0.160 higher.</w:t>
+      </w:r>
+      <w:r>
+        <w:rPr>
+          <w:i/>
+          <w:iCs/>
+        </w:rPr>
+        <w:t xml:space="preserve"> </w:t>
       </w:r>
     </w:p>
     <w:p>
@@ -459,7 +466,7 @@
           <w:i/>
           <w:iCs/>
         </w:rPr>
-        <w:t xml:space="preserve">Note: Lorenz curves are estimated from weighted data using PSID family and clan weights. Wealth includes home equity. Solid lines = households; dotted lines = clans. Income in 1984: weighted mean (median) $27,647 ($22,520) for households, $85,338 ($71,914) for clans. Income in 2023: $297,591 ($196,196) for households, $1,487,913 ($1,059,244) for clans.</w:t>
+        <w:t xml:space="preserve">Note: Lorenz curves are estimated from weighted data using PSID family and clan weights. Wealth includes home equity.Income in 1984: weighted mean (median) $27,647 ($22,520) for households, $85,338 ($71,914) for clans. Income in 2023: $297,591 ($196,196) for households, $1,487,913 ($1,059,244) for clans.</w:t>
       </w:r>
     </w:p>
     <w:p>
@@ -562,7 +569,7 @@
           <w:i/>
           <w:iCs/>
         </w:rPr>
-        <w:t xml:space="preserve">Note: Lines show the ratio of Black to Non-Black wealth for households and clans (includes home equity). Panel A uses weighted means; Panel B uses weighted medians. Weighted mean wealth: Black HH $89,761, Non-Black HH $476,552, Black clans $147,662, Non-Black clans $818,198. Mean ratio changed by 1.0% for households (0.18 in 1984 to 0.18 in 2023) and -13.7% for clans (0.23 to 0.20). On average across all years, the mean ratio is 0.014 higher for households than clans. Weighted median wealth: Black HH $6,908, Non-Black HH $79,216, Black clans $58,326, Non-Black clans $306,988. Median ratio changed by -4.6% for households (0.07 in 1984 to 0.07 in 2023) and 7.5% for clans (0.20 to 0.22). On average across all years, the median ratio is -0.112 higher for households than clans. Solid lines = households; dotted lines = clans.</w:t>
+        <w:t xml:space="preserve">Note: Lines show the ratio of Black to Non-Black wealth for households and clans (includes home equity), using weighted medians. Weighted median wealth: Black HH $6,908, Non-Black HH $79,216, Black clans $58,326, Non-Black clans $306,988. Median ratio changed by -4.6% for households (0.07 in 1984 to 0.07 in 2023) and 7.5% for clans (0.20 to 0.22). On average across all years, the median ratio is -0.112 higher for households than clans. See Appendix E for mean wealth ratios.</w:t>
       </w:r>
     </w:p>
     <w:p>
@@ -740,7 +747,7 @@
         <w:t xml:space="preserve">[5, 17, 23]</w:t>
       </w:r>
       <w:r>
-        <w:t xml:space="preserve">. Aggregate measures for income and wealth are provided by the PSID. Income includes earnings, asset income, transfers, and income from farming and gardening. Wealth includes non-primary real estate, business equity, stocks, bonds, vehicles, retirement accounts, and bank accounts, and includes home equity. As a sensitivity analysis, we compare Gini coefficients for wealth measures that exclude home equity (see Appendix C3). When home equity is excluded, estimated inequality is lower at both the household and clan level, but the difference between household and clan-level Gini coefficients remains similar.</w:t>
+        <w:t xml:space="preserve">. Aggregate measures for income and wealth are provided by the PSID. Income includes earnings, asset income, transfers, and income from farming and gardening. Income is recorded for the year prior to when the survey is fielded. For example, survey data collected in 2023 asks about income in 2022. Wealth includes non-primary real estate, business equity, stocks, bonds, vehicles, retirement accounts, and bank accounts, and includes home equity. As a sensitivity analysis, we compare Gini coefficients for wealth measures that exclude home equity (see Appendix C3). When home equity is excluded, estimated inequality is lower at both the household and clan level, but the difference between household and clan-level Gini coefficients remains similar.</w:t>
       </w:r>
     </w:p>
     <w:p>
@@ -5752,22 +5759,13 @@
       </w:r>
     </w:p>
     <w:bookmarkEnd w:id="66"/>
-    <w:bookmarkStart w:id="165" w:name="X5f622d6d803146b163d9253c739d30f2df1566c"/>
+    <w:bookmarkStart w:id="70" w:name="appendix-e-mean-wealth-ratios"/>
     <w:p>
       <w:pPr>
         <w:pStyle w:val="Heading1"/>
       </w:pPr>
       <w:r>
-        <w:t xml:space="preserve">Appendix E: Sensitivity Analyses — Race Ratios</w:t>
-      </w:r>
-    </w:p>
-    <w:bookmarkStart w:id="70" w:name="X073d3e0376ec70413dc399942489db4bf540f8c"/>
-    <w:p>
-      <w:pPr>
-        <w:pStyle w:val="Heading2"/>
-      </w:pPr>
-      <w:r>
-        <w:t xml:space="preserve">Appendix E1: Race Ratios — Single-Household Clans</w:t>
+        <w:t xml:space="preserve">Appendix E: Mean Wealth Ratios</w:t>
       </w:r>
     </w:p>
     <w:p>
@@ -5775,7 +5773,7 @@
         <w:pStyle w:val="FirstParagraph"/>
       </w:pPr>
       <w:r>
-        <w:t xml:space="preserve">Appendix E1 shows Black / Non-Black wealth ratios when single-household clans are excluded (main specification, left panels) versus included (right panels). Panel A shows mean wealth ratios and Panel B shows median wealth ratios. Including single-household clans minimizes but does not eliminate the difference between household and clan race ratios.</w:t>
+        <w:t xml:space="preserve">Appendix E shows Black / Non-Black wealth ratios using weighted means for households and clans. Panel A shows the median wealth ratio (as in Figure 3) and Panel B shows the mean wealth ratio.</w:t>
       </w:r>
     </w:p>
     <w:p>
@@ -5792,7 +5790,7 @@
               <a:graphicData uri="http://schemas.openxmlformats.org/drawingml/2006/picture">
                 <pic:pic>
                   <pic:nvPicPr>
-                    <pic:cNvPr descr="/Users/amanda/Desktop/clan_project/10_draft/output/write_files/figure-docx/appendix-e1-1.png" id="69" name="Picture"/>
+                    <pic:cNvPr descr="/Users/amanda/Desktop/clan_project/10_draft/output/write_files/figure-docx/appendix-e-1.png" id="69" name="Picture"/>
                     <pic:cNvPicPr>
                       <a:picLocks noChangeArrowheads="1" noChangeAspect="1"/>
                     </pic:cNvPicPr>
@@ -5826,13 +5824,22 @@
       </w:r>
     </w:p>
     <w:bookmarkEnd w:id="70"/>
-    <w:bookmarkStart w:id="74" w:name="X44cd73c19ec5053c9965e5c699439a9e1cd6656"/>
+    <w:bookmarkStart w:id="169" w:name="Xcb67444dabb8bef906448ddac13bb8f671ea2d1"/>
+    <w:p>
+      <w:pPr>
+        <w:pStyle w:val="Heading1"/>
+      </w:pPr>
+      <w:r>
+        <w:t xml:space="preserve">Appendix F: Sensitivity Analyses — Race Ratios</w:t>
+      </w:r>
+    </w:p>
+    <w:bookmarkStart w:id="74" w:name="Xdacf5f8268f7e32ded330e1ac8914f6f3f1aa6f"/>
     <w:p>
       <w:pPr>
         <w:pStyle w:val="Heading2"/>
       </w:pPr>
       <w:r>
-        <w:t xml:space="preserve">Appendix E2: Race Ratios — Wealth With and Without Home Equity</w:t>
+        <w:t xml:space="preserve">Appendix F1: Race Ratios — Single-Household Clans</w:t>
       </w:r>
     </w:p>
     <w:p>
@@ -5840,7 +5847,7 @@
         <w:pStyle w:val="FirstParagraph"/>
       </w:pPr>
       <w:r>
-        <w:t xml:space="preserve">Appendix E2 compares Black / Non-Black wealth ratios when home equity is included (main specification, left panels) versus excluded (right panels). Panel A shows mean wealth ratios and Panel B shows median wealth ratios.</w:t>
+        <w:t xml:space="preserve">Appendix F1 shows Black / Non-Black wealth ratios when single-household clans are excluded (main specification, left panels) versus included (right panels). Panel A shows median wealth ratios and Panel B shows mean wealth ratios. Including single-household clans minimizes but does not eliminate the difference between household and clan race ratios.</w:t>
       </w:r>
     </w:p>
     <w:p>
@@ -5857,7 +5864,7 @@
               <a:graphicData uri="http://schemas.openxmlformats.org/drawingml/2006/picture">
                 <pic:pic>
                   <pic:nvPicPr>
-                    <pic:cNvPr descr="/Users/amanda/Desktop/clan_project/10_draft/output/write_files/figure-docx/appendix-e2-1.png" id="73" name="Picture"/>
+                    <pic:cNvPr descr="/Users/amanda/Desktop/clan_project/10_draft/output/write_files/figure-docx/appendix-f1-1.png" id="73" name="Picture"/>
                     <pic:cNvPicPr>
                       <a:picLocks noChangeArrowheads="1" noChangeAspect="1"/>
                     </pic:cNvPicPr>
@@ -5891,13 +5898,13 @@
       </w:r>
     </w:p>
     <w:bookmarkEnd w:id="74"/>
-    <w:bookmarkStart w:id="78" w:name="appendix-e3-race-ratios-negative-values"/>
+    <w:bookmarkStart w:id="78" w:name="Xe408c392d53d71a7a9d72befc7a6c94911a5caf"/>
     <w:p>
       <w:pPr>
         <w:pStyle w:val="Heading2"/>
       </w:pPr>
       <w:r>
-        <w:t xml:space="preserve">Appendix E3: Race Ratios — Negative Values</w:t>
+        <w:t xml:space="preserve">Appendix F2: Race Ratios — Wealth With and Without Home Equity</w:t>
       </w:r>
     </w:p>
     <w:p>
@@ -5905,7 +5912,7 @@
         <w:pStyle w:val="FirstParagraph"/>
       </w:pPr>
       <w:r>
-        <w:t xml:space="preserve">Appendix E3 shows Black / Non-Black wealth ratios when negative wealth values are excluded (main specification, left panels) versus included (right panels). Panel A shows mean wealth ratios and Panel B shows median wealth ratios. Including negative values does not substantially change the estimated race ratios.</w:t>
+        <w:t xml:space="preserve">Appendix F2 compares Black / Non-Black wealth ratios when home equity is included (main specification, left panels) versus excluded (right panels). Panel A shows median wealth ratios and Panel B shows mean wealth ratios.</w:t>
       </w:r>
     </w:p>
     <w:p>
@@ -5922,7 +5929,7 @@
               <a:graphicData uri="http://schemas.openxmlformats.org/drawingml/2006/picture">
                 <pic:pic>
                   <pic:nvPicPr>
-                    <pic:cNvPr descr="/Users/amanda/Desktop/clan_project/10_draft/output/write_files/figure-docx/appendix-e3-1.png" id="77" name="Picture"/>
+                    <pic:cNvPr descr="/Users/amanda/Desktop/clan_project/10_draft/output/write_files/figure-docx/appendix-f2-1.png" id="77" name="Picture"/>
                     <pic:cNvPicPr>
                       <a:picLocks noChangeArrowheads="1" noChangeAspect="1"/>
                     </pic:cNvPicPr>
@@ -5956,13 +5963,13 @@
       </w:r>
     </w:p>
     <w:bookmarkEnd w:id="78"/>
-    <w:bookmarkStart w:id="82" w:name="X60547b172595a275f95838a3eaedea0d02c0ba7"/>
+    <w:bookmarkStart w:id="82" w:name="appendix-f3-race-ratios-negative-values"/>
     <w:p>
       <w:pPr>
         <w:pStyle w:val="Heading2"/>
       </w:pPr>
       <w:r>
-        <w:t xml:space="preserve">Appendix E4: Race Ratios — Size Standardization</w:t>
+        <w:t xml:space="preserve">Appendix F3: Race Ratios — Negative Values</w:t>
       </w:r>
     </w:p>
     <w:p>
@@ -5970,7 +5977,7 @@
         <w:pStyle w:val="FirstParagraph"/>
       </w:pPr>
       <w:r>
-        <w:t xml:space="preserve">Appendix E4 compares Black / Non-Black wealth ratios when wealth is size-standardized by household and clan size (main specification, left panels) versus unadjusted (right panels). Panel A shows mean wealth ratios and Panel B shows median wealth ratios.</w:t>
+        <w:t xml:space="preserve">Appendix F3 shows Black / Non-Black wealth ratios when negative wealth values are excluded (main specification, left panels) versus included (right panels). Panel A shows median wealth ratios and Panel B shows mean wealth ratios. Including negative values does not substantially change the estimated race ratios.</w:t>
       </w:r>
     </w:p>
     <w:p>
@@ -5987,7 +5994,7 @@
               <a:graphicData uri="http://schemas.openxmlformats.org/drawingml/2006/picture">
                 <pic:pic>
                   <pic:nvPicPr>
-                    <pic:cNvPr descr="/Users/amanda/Desktop/clan_project/10_draft/output/write_files/figure-docx/appendix-e4-1.png" id="81" name="Picture"/>
+                    <pic:cNvPr descr="/Users/amanda/Desktop/clan_project/10_draft/output/write_files/figure-docx/appendix-f3-1.png" id="81" name="Picture"/>
                     <pic:cNvPicPr>
                       <a:picLocks noChangeArrowheads="1" noChangeAspect="1"/>
                     </pic:cNvPicPr>
@@ -6021,13 +6028,13 @@
       </w:r>
     </w:p>
     <w:bookmarkEnd w:id="82"/>
-    <w:bookmarkStart w:id="164" w:name="appendix-e5-race-ratios-weighting"/>
+    <w:bookmarkStart w:id="86" w:name="X6da171898a54c1627d338b576a8481086bbba7a"/>
     <w:p>
       <w:pPr>
         <w:pStyle w:val="Heading2"/>
       </w:pPr>
       <w:r>
-        <w:t xml:space="preserve">Appendix E5: Race Ratios — Weighting</w:t>
+        <w:t xml:space="preserve">Appendix F4: Race Ratios — Size Standardization</w:t>
       </w:r>
     </w:p>
     <w:p>
@@ -6035,7 +6042,7 @@
         <w:pStyle w:val="FirstParagraph"/>
       </w:pPr>
       <w:r>
-        <w:t xml:space="preserve">Appendix E5 shows Black / Non-Black wealth ratios using weighted estimates (main specification, left panels) versus unweighted estimates (right panels). Panel A shows mean wealth ratios and Panel B shows median wealth ratios. Weighting does not substantially change the estimated race ratios.</w:t>
+        <w:t xml:space="preserve">Appendix F4 compares Black / Non-Black wealth ratios when wealth is size-standardized by household and clan size (main specification, left panels) versus unadjusted (right panels). Panel A shows median wealth ratios and Panel B shows mean wealth ratios.</w:t>
       </w:r>
     </w:p>
     <w:p>
@@ -6052,7 +6059,7 @@
               <a:graphicData uri="http://schemas.openxmlformats.org/drawingml/2006/picture">
                 <pic:pic>
                   <pic:nvPicPr>
-                    <pic:cNvPr descr="/Users/amanda/Desktop/clan_project/10_draft/output/write_files/figure-docx/appendix-e5-1.png" id="85" name="Picture"/>
+                    <pic:cNvPr descr="/Users/amanda/Desktop/clan_project/10_draft/output/write_files/figure-docx/appendix-f4-1.png" id="85" name="Picture"/>
                     <pic:cNvPicPr>
                       <a:picLocks noChangeArrowheads="1" noChangeAspect="1"/>
                     </pic:cNvPicPr>
@@ -6085,8 +6092,73 @@
         </w:drawing>
       </w:r>
     </w:p>
-    <w:bookmarkStart w:id="163" w:name="refs"/>
-    <w:bookmarkStart w:id="87" w:name="ref-fred_gini_2025"/>
+    <w:bookmarkEnd w:id="86"/>
+    <w:bookmarkStart w:id="168" w:name="appendix-f5-race-ratios-weighting"/>
+    <w:p>
+      <w:pPr>
+        <w:pStyle w:val="Heading2"/>
+      </w:pPr>
+      <w:r>
+        <w:t xml:space="preserve">Appendix F5: Race Ratios — Weighting</w:t>
+      </w:r>
+    </w:p>
+    <w:p>
+      <w:pPr>
+        <w:pStyle w:val="FirstParagraph"/>
+      </w:pPr>
+      <w:r>
+        <w:t xml:space="preserve">Appendix F5 shows Black / Non-Black wealth ratios using weighted estimates (main specification, left panels) versus unweighted estimates (right panels). Panel A shows median wealth ratios and Panel B shows mean wealth ratios. Weighting does not substantially change the estimated race ratios.</w:t>
+      </w:r>
+    </w:p>
+    <w:p>
+      <w:pPr>
+        <w:pStyle w:val="BodyText"/>
+      </w:pPr>
+      <w:r>
+        <w:drawing>
+          <wp:inline>
+            <wp:extent cx="5334000" cy="4191000"/>
+            <wp:effectExtent b="0" l="0" r="0" t="0"/>
+            <wp:docPr descr="" title="" id="88" name="Picture"/>
+            <a:graphic>
+              <a:graphicData uri="http://schemas.openxmlformats.org/drawingml/2006/picture">
+                <pic:pic>
+                  <pic:nvPicPr>
+                    <pic:cNvPr descr="/Users/amanda/Desktop/clan_project/10_draft/output/write_files/figure-docx/appendix-f5-1.png" id="89" name="Picture"/>
+                    <pic:cNvPicPr>
+                      <a:picLocks noChangeArrowheads="1" noChangeAspect="1"/>
+                    </pic:cNvPicPr>
+                  </pic:nvPicPr>
+                  <pic:blipFill>
+                    <a:blip r:embed="rId87"/>
+                    <a:stretch>
+                      <a:fillRect/>
+                    </a:stretch>
+                  </pic:blipFill>
+                  <pic:spPr bwMode="auto">
+                    <a:xfrm>
+                      <a:off x="0" y="0"/>
+                      <a:ext cx="5334000" cy="4191000"/>
+                    </a:xfrm>
+                    <a:prstGeom prst="rect">
+                      <a:avLst/>
+                    </a:prstGeom>
+                    <a:noFill/>
+                    <a:ln w="9525">
+                      <a:noFill/>
+                      <a:headEnd/>
+                      <a:tailEnd/>
+                    </a:ln>
+                  </pic:spPr>
+                </pic:pic>
+              </a:graphicData>
+            </a:graphic>
+          </wp:inline>
+        </w:drawing>
+      </w:r>
+    </w:p>
+    <w:bookmarkStart w:id="167" w:name="refs"/>
+    <w:bookmarkStart w:id="91" w:name="ref-fred_gini_2025"/>
     <w:p>
       <w:pPr>
         <w:pStyle w:val="Bibliography"/>
@@ -6139,7 +6211,7 @@
       <w:r>
         <w:t xml:space="preserve"> </w:t>
       </w:r>
-      <w:hyperlink r:id="rId86">
+      <w:hyperlink r:id="rId90">
         <w:r>
           <w:rPr>
             <w:rStyle w:val="Hyperlink"/>
@@ -6148,8 +6220,8 @@
         </w:r>
       </w:hyperlink>
     </w:p>
-    <w:bookmarkEnd w:id="87"/>
-    <w:bookmarkStart w:id="89" w:name="ref-barro_decline_2020"/>
+    <w:bookmarkEnd w:id="91"/>
+    <w:bookmarkStart w:id="93" w:name="ref-barro_decline_2020"/>
     <w:p>
       <w:pPr>
         <w:pStyle w:val="Bibliography"/>
@@ -6220,7 +6292,7 @@
       <w:r>
         <w:t xml:space="preserve"> </w:t>
       </w:r>
-      <w:hyperlink r:id="rId88">
+      <w:hyperlink r:id="rId92">
         <w:r>
           <w:rPr>
             <w:rStyle w:val="Hyperlink"/>
@@ -6229,8 +6301,8 @@
         </w:r>
       </w:hyperlink>
     </w:p>
-    <w:bookmarkEnd w:id="89"/>
-    <w:bookmarkStart w:id="92" w:name="ref-kuhn_income_2025"/>
+    <w:bookmarkEnd w:id="93"/>
+    <w:bookmarkStart w:id="96" w:name="ref-kuhn_income_2025"/>
     <w:p>
       <w:pPr>
         <w:pStyle w:val="Bibliography"/>
@@ -6316,7 +6388,7 @@
       <w:r>
         <w:t xml:space="preserve"> </w:t>
       </w:r>
-      <w:hyperlink r:id="rId90">
+      <w:hyperlink r:id="rId94">
         <w:r>
           <w:rPr>
             <w:rStyle w:val="Hyperlink"/>
@@ -6327,7 +6399,7 @@
       <w:r>
         <w:t xml:space="preserve">. doi:</w:t>
       </w:r>
-      <w:hyperlink r:id="rId91">
+      <w:hyperlink r:id="rId95">
         <w:r>
           <w:rPr>
             <w:rStyle w:val="Hyperlink"/>
@@ -6336,8 +6408,8 @@
         </w:r>
       </w:hyperlink>
     </w:p>
-    <w:bookmarkEnd w:id="92"/>
-    <w:bookmarkStart w:id="95" w:name="ref-auten_income_2024"/>
+    <w:bookmarkEnd w:id="96"/>
+    <w:bookmarkStart w:id="99" w:name="ref-auten_income_2024"/>
     <w:p>
       <w:pPr>
         <w:pStyle w:val="Bibliography"/>
@@ -6435,7 +6507,7 @@
       <w:r>
         <w:t xml:space="preserve"> </w:t>
       </w:r>
-      <w:hyperlink r:id="rId93">
+      <w:hyperlink r:id="rId97">
         <w:r>
           <w:rPr>
             <w:rStyle w:val="Hyperlink"/>
@@ -6446,7 +6518,7 @@
       <w:r>
         <w:t xml:space="preserve">. doi:</w:t>
       </w:r>
-      <w:hyperlink r:id="rId94">
+      <w:hyperlink r:id="rId98">
         <w:r>
           <w:rPr>
             <w:rStyle w:val="Hyperlink"/>
@@ -6455,8 +6527,8 @@
         </w:r>
       </w:hyperlink>
     </w:p>
-    <w:bookmarkEnd w:id="95"/>
-    <w:bookmarkStart w:id="98" w:name="ref-killewald_wealth_2017"/>
+    <w:bookmarkEnd w:id="99"/>
+    <w:bookmarkStart w:id="102" w:name="ref-killewald_wealth_2017"/>
     <w:p>
       <w:pPr>
         <w:pStyle w:val="Bibliography"/>
@@ -6497,7 +6569,7 @@
       <w:r>
         <w:t xml:space="preserve"> </w:t>
       </w:r>
-      <w:hyperlink r:id="rId96">
+      <w:hyperlink r:id="rId100">
         <w:r>
           <w:rPr>
             <w:rStyle w:val="Hyperlink"/>
@@ -6508,7 +6580,7 @@
       <w:r>
         <w:t xml:space="preserve">. doi:</w:t>
       </w:r>
-      <w:hyperlink r:id="rId97">
+      <w:hyperlink r:id="rId101">
         <w:r>
           <w:rPr>
             <w:rStyle w:val="Hyperlink"/>
@@ -6517,8 +6589,8 @@
         </w:r>
       </w:hyperlink>
     </w:p>
-    <w:bookmarkEnd w:id="98"/>
-    <w:bookmarkStart w:id="100" w:name="ref-saez_wealth_2016"/>
+    <w:bookmarkEnd w:id="102"/>
+    <w:bookmarkStart w:id="104" w:name="ref-saez_wealth_2016"/>
     <w:p>
       <w:pPr>
         <w:pStyle w:val="Bibliography"/>
@@ -6610,7 +6682,7 @@
       <w:r>
         <w:t xml:space="preserve"> </w:t>
       </w:r>
-      <w:hyperlink r:id="rId99">
+      <w:hyperlink r:id="rId103">
         <w:r>
           <w:rPr>
             <w:rStyle w:val="Hyperlink"/>
@@ -6621,7 +6693,7 @@
       <w:r>
         <w:t xml:space="preserve">. doi:</w:t>
       </w:r>
-      <w:hyperlink r:id="rId99">
+      <w:hyperlink r:id="rId103">
         <w:r>
           <w:rPr>
             <w:rStyle w:val="Hyperlink"/>
@@ -6630,8 +6702,8 @@
         </w:r>
       </w:hyperlink>
     </w:p>
-    <w:bookmarkEnd w:id="100"/>
-    <w:bookmarkStart w:id="101" w:name="ref-goode_world_1963"/>
+    <w:bookmarkEnd w:id="104"/>
+    <w:bookmarkStart w:id="105" w:name="ref-goode_world_1963"/>
     <w:p>
       <w:pPr>
         <w:pStyle w:val="Bibliography"/>
@@ -6649,8 +6721,8 @@
         <w:t xml:space="preserve">Goode WJ. World revolution and family patterns. Oxford, England: Free Press Glencoe; 1963.</w:t>
       </w:r>
     </w:p>
-    <w:bookmarkEnd w:id="101"/>
-    <w:bookmarkStart w:id="103" w:name="ref-parsons_essays_1954"/>
+    <w:bookmarkEnd w:id="105"/>
+    <w:bookmarkStart w:id="107" w:name="ref-parsons_essays_1954"/>
     <w:p>
       <w:pPr>
         <w:pStyle w:val="Bibliography"/>
@@ -6682,7 +6754,7 @@
       <w:r>
         <w:t xml:space="preserve">. 2nd ed. New York, NY, US: MacMillan Co; 1954. doi:</w:t>
       </w:r>
-      <w:hyperlink r:id="rId102">
+      <w:hyperlink r:id="rId106">
         <w:r>
           <w:rPr>
             <w:rStyle w:val="Hyperlink"/>
@@ -6691,8 +6763,8 @@
         </w:r>
       </w:hyperlink>
     </w:p>
-    <w:bookmarkEnd w:id="103"/>
-    <w:bookmarkStart w:id="105" w:name="ref-pilkauskas_beyond_2018"/>
+    <w:bookmarkEnd w:id="107"/>
+    <w:bookmarkStart w:id="109" w:name="ref-pilkauskas_beyond_2018"/>
     <w:p>
       <w:pPr>
         <w:pStyle w:val="Bibliography"/>
@@ -6772,7 +6844,7 @@
       <w:r>
         <w:t xml:space="preserve"> </w:t>
       </w:r>
-      <w:hyperlink r:id="rId104">
+      <w:hyperlink r:id="rId108">
         <w:r>
           <w:rPr>
             <w:rStyle w:val="Hyperlink"/>
@@ -6783,7 +6855,7 @@
       <w:r>
         <w:t xml:space="preserve">. doi:</w:t>
       </w:r>
-      <w:hyperlink r:id="rId104">
+      <w:hyperlink r:id="rId108">
         <w:r>
           <w:rPr>
             <w:rStyle w:val="Hyperlink"/>
@@ -6792,8 +6864,8 @@
         </w:r>
       </w:hyperlink>
     </w:p>
-    <w:bookmarkEnd w:id="105"/>
-    <w:bookmarkStart w:id="107" w:name="ref-mare_multigenerational_2011"/>
+    <w:bookmarkEnd w:id="109"/>
+    <w:bookmarkStart w:id="111" w:name="ref-mare_multigenerational_2011"/>
     <w:p>
       <w:pPr>
         <w:pStyle w:val="Bibliography"/>
@@ -6840,7 +6912,7 @@
       <w:r>
         <w:t xml:space="preserve"> </w:t>
       </w:r>
-      <w:hyperlink r:id="rId106">
+      <w:hyperlink r:id="rId110">
         <w:r>
           <w:rPr>
             <w:rStyle w:val="Hyperlink"/>
@@ -6851,7 +6923,7 @@
       <w:r>
         <w:t xml:space="preserve">. doi:</w:t>
       </w:r>
-      <w:hyperlink r:id="rId106">
+      <w:hyperlink r:id="rId110">
         <w:r>
           <w:rPr>
             <w:rStyle w:val="Hyperlink"/>
@@ -6860,8 +6932,8 @@
         </w:r>
       </w:hyperlink>
     </w:p>
-    <w:bookmarkEnd w:id="107"/>
-    <w:bookmarkStart w:id="109" w:name="ref-obrien_family_2024"/>
+    <w:bookmarkEnd w:id="111"/>
+    <w:bookmarkStart w:id="113" w:name="ref-obrien_family_2024"/>
     <w:p>
       <w:pPr>
         <w:pStyle w:val="Bibliography"/>
@@ -6893,7 +6965,7 @@
       <w:r>
         <w:t xml:space="preserve"> </w:t>
       </w:r>
-      <w:hyperlink r:id="rId108">
+      <w:hyperlink r:id="rId112">
         <w:r>
           <w:rPr>
             <w:rStyle w:val="Hyperlink"/>
@@ -6904,7 +6976,7 @@
       <w:r>
         <w:t xml:space="preserve">. doi:</w:t>
       </w:r>
-      <w:hyperlink r:id="rId108">
+      <w:hyperlink r:id="rId112">
         <w:r>
           <w:rPr>
             <w:rStyle w:val="Hyperlink"/>
@@ -6913,8 +6985,8 @@
         </w:r>
       </w:hyperlink>
     </w:p>
-    <w:bookmarkEnd w:id="109"/>
-    <w:bookmarkStart w:id="111" w:name="ref-shiffer-sebba_keeping_2025"/>
+    <w:bookmarkEnd w:id="113"/>
+    <w:bookmarkStart w:id="115" w:name="ref-shiffer-sebba_keeping_2025"/>
     <w:p>
       <w:pPr>
         <w:pStyle w:val="Bibliography"/>
@@ -6994,7 +7066,7 @@
       <w:r>
         <w:t xml:space="preserve"> </w:t>
       </w:r>
-      <w:hyperlink r:id="rId110">
+      <w:hyperlink r:id="rId114">
         <w:r>
           <w:rPr>
             <w:rStyle w:val="Hyperlink"/>
@@ -7005,7 +7077,7 @@
       <w:r>
         <w:t xml:space="preserve">. doi:</w:t>
       </w:r>
-      <w:hyperlink r:id="rId110">
+      <w:hyperlink r:id="rId114">
         <w:r>
           <w:rPr>
             <w:rStyle w:val="Hyperlink"/>
@@ -7014,8 +7086,8 @@
         </w:r>
       </w:hyperlink>
     </w:p>
-    <w:bookmarkEnd w:id="111"/>
-    <w:bookmarkStart w:id="114" w:name="ref-adermon_dynastic_2021"/>
+    <w:bookmarkEnd w:id="115"/>
+    <w:bookmarkStart w:id="118" w:name="ref-adermon_dynastic_2021"/>
     <w:p>
       <w:pPr>
         <w:pStyle w:val="Bibliography"/>
@@ -7074,7 +7146,7 @@
       <w:r>
         <w:t xml:space="preserve"> </w:t>
       </w:r>
-      <w:hyperlink r:id="rId112">
+      <w:hyperlink r:id="rId116">
         <w:r>
           <w:rPr>
             <w:rStyle w:val="Hyperlink"/>
@@ -7085,7 +7157,7 @@
       <w:r>
         <w:t xml:space="preserve">. doi:</w:t>
       </w:r>
-      <w:hyperlink r:id="rId113">
+      <w:hyperlink r:id="rId117">
         <w:r>
           <w:rPr>
             <w:rStyle w:val="Hyperlink"/>
@@ -7094,8 +7166,8 @@
         </w:r>
       </w:hyperlink>
     </w:p>
-    <w:bookmarkEnd w:id="114"/>
-    <w:bookmarkStart w:id="117" w:name="ref-hallsten_shadow_2023"/>
+    <w:bookmarkEnd w:id="118"/>
+    <w:bookmarkStart w:id="121" w:name="ref-hallsten_shadow_2023"/>
     <w:p>
       <w:pPr>
         <w:pStyle w:val="Bibliography"/>
@@ -7193,7 +7265,7 @@
       <w:r>
         <w:t xml:space="preserve"> </w:t>
       </w:r>
-      <w:hyperlink r:id="rId115">
+      <w:hyperlink r:id="rId119">
         <w:r>
           <w:rPr>
             <w:rStyle w:val="Hyperlink"/>
@@ -7204,7 +7276,7 @@
       <w:r>
         <w:t xml:space="preserve">. doi:</w:t>
       </w:r>
-      <w:hyperlink r:id="rId116">
+      <w:hyperlink r:id="rId120">
         <w:r>
           <w:rPr>
             <w:rStyle w:val="Hyperlink"/>
@@ -7213,8 +7285,8 @@
         </w:r>
       </w:hyperlink>
     </w:p>
-    <w:bookmarkEnd w:id="117"/>
-    <w:bookmarkStart w:id="119" w:name="ref-song_shared_2019"/>
+    <w:bookmarkEnd w:id="121"/>
+    <w:bookmarkStart w:id="123" w:name="ref-song_shared_2019"/>
     <w:p>
       <w:pPr>
         <w:pStyle w:val="Bibliography"/>
@@ -7270,7 +7342,7 @@
       <w:r>
         <w:t xml:space="preserve">. Demography. 2019;56(3):891–916. doi:</w:t>
       </w:r>
-      <w:hyperlink r:id="rId118">
+      <w:hyperlink r:id="rId122">
         <w:r>
           <w:rPr>
             <w:rStyle w:val="Hyperlink"/>
@@ -7279,8 +7351,8 @@
         </w:r>
       </w:hyperlink>
     </w:p>
-    <w:bookmarkEnd w:id="119"/>
-    <w:bookmarkStart w:id="120" w:name="ref-shiffer-sebba_concentration_2022"/>
+    <w:bookmarkEnd w:id="123"/>
+    <w:bookmarkStart w:id="124" w:name="ref-shiffer-sebba_concentration_2022"/>
     <w:p>
       <w:pPr>
         <w:pStyle w:val="Bibliography"/>
@@ -7370,8 +7442,8 @@
         <w:t xml:space="preserve">. 2022.</w:t>
       </w:r>
     </w:p>
-    <w:bookmarkEnd w:id="120"/>
-    <w:bookmarkStart w:id="122" w:name="ref-hallsten_grand_2017"/>
+    <w:bookmarkEnd w:id="124"/>
+    <w:bookmarkStart w:id="126" w:name="ref-hallsten_grand_2017"/>
     <w:p>
       <w:pPr>
         <w:pStyle w:val="Bibliography"/>
@@ -7451,7 +7523,7 @@
       <w:r>
         <w:t xml:space="preserve">. American Sociological Review. 2017;82(2):328–360. doi:</w:t>
       </w:r>
-      <w:hyperlink r:id="rId121">
+      <w:hyperlink r:id="rId125">
         <w:r>
           <w:rPr>
             <w:rStyle w:val="Hyperlink"/>
@@ -7460,8 +7532,8 @@
         </w:r>
       </w:hyperlink>
     </w:p>
-    <w:bookmarkEnd w:id="122"/>
-    <w:bookmarkStart w:id="123" w:name="ref-insolera_overview_2021"/>
+    <w:bookmarkEnd w:id="126"/>
+    <w:bookmarkStart w:id="127" w:name="ref-insolera_overview_2021"/>
     <w:p>
       <w:pPr>
         <w:pStyle w:val="Bibliography"/>
@@ -7563,8 +7635,8 @@
         <w:t xml:space="preserve">).</w:t>
       </w:r>
     </w:p>
-    <w:bookmarkEnd w:id="123"/>
-    <w:bookmarkStart w:id="125" w:name="ref-pfeffer_measuring_2016"/>
+    <w:bookmarkEnd w:id="127"/>
+    <w:bookmarkStart w:id="129" w:name="ref-pfeffer_measuring_2016"/>
     <w:p>
       <w:pPr>
         <w:pStyle w:val="Bibliography"/>
@@ -7644,7 +7716,7 @@
       <w:r>
         <w:t xml:space="preserve">. Journal of Economic and Social Measurement. 2016;41(2):103–120. doi:</w:t>
       </w:r>
-      <w:hyperlink r:id="rId124">
+      <w:hyperlink r:id="rId128">
         <w:r>
           <w:rPr>
             <w:rStyle w:val="Hyperlink"/>
@@ -7653,8 +7725,8 @@
         </w:r>
       </w:hyperlink>
     </w:p>
-    <w:bookmarkEnd w:id="125"/>
-    <w:bookmarkStart w:id="127" w:name="ref-oliver_black_2013"/>
+    <w:bookmarkEnd w:id="129"/>
+    <w:bookmarkStart w:id="131" w:name="ref-oliver_black_2013"/>
     <w:p>
       <w:pPr>
         <w:pStyle w:val="Bibliography"/>
@@ -7737,7 +7809,7 @@
       <w:r>
         <w:t xml:space="preserve">. 2nd ed. New York: Routledge; 2013. doi:</w:t>
       </w:r>
-      <w:hyperlink r:id="rId126">
+      <w:hyperlink r:id="rId130">
         <w:r>
           <w:rPr>
             <w:rStyle w:val="Hyperlink"/>
@@ -7746,8 +7818,8 @@
         </w:r>
       </w:hyperlink>
     </w:p>
-    <w:bookmarkEnd w:id="127"/>
-    <w:bookmarkStart w:id="130" w:name="ref-beckert_durable_2022"/>
+    <w:bookmarkEnd w:id="131"/>
+    <w:bookmarkStart w:id="134" w:name="ref-beckert_durable_2022"/>
     <w:p>
       <w:pPr>
         <w:pStyle w:val="Bibliography"/>
@@ -7821,7 +7893,7 @@
       <w:r>
         <w:t xml:space="preserve"> </w:t>
       </w:r>
-      <w:hyperlink r:id="rId128">
+      <w:hyperlink r:id="rId132">
         <w:r>
           <w:rPr>
             <w:rStyle w:val="Hyperlink"/>
@@ -7832,7 +7904,7 @@
       <w:r>
         <w:t xml:space="preserve">. doi:</w:t>
       </w:r>
-      <w:hyperlink r:id="rId129">
+      <w:hyperlink r:id="rId133">
         <w:r>
           <w:rPr>
             <w:rStyle w:val="Hyperlink"/>
@@ -7841,8 +7913,8 @@
         </w:r>
       </w:hyperlink>
     </w:p>
-    <w:bookmarkEnd w:id="130"/>
-    <w:bookmarkStart w:id="133" w:name="ref-obrien_structural_2020"/>
+    <w:bookmarkEnd w:id="134"/>
+    <w:bookmarkStart w:id="137" w:name="ref-obrien_structural_2020"/>
     <w:p>
       <w:pPr>
         <w:pStyle w:val="Bibliography"/>
@@ -7889,7 +7961,7 @@
       <w:r>
         <w:t xml:space="preserve"> </w:t>
       </w:r>
-      <w:hyperlink r:id="rId131">
+      <w:hyperlink r:id="rId135">
         <w:r>
           <w:rPr>
             <w:rStyle w:val="Hyperlink"/>
@@ -7900,7 +7972,7 @@
       <w:r>
         <w:t xml:space="preserve">. doi:</w:t>
       </w:r>
-      <w:hyperlink r:id="rId132">
+      <w:hyperlink r:id="rId136">
         <w:r>
           <w:rPr>
             <w:rStyle w:val="Hyperlink"/>
@@ -7909,8 +7981,8 @@
         </w:r>
       </w:hyperlink>
     </w:p>
-    <w:bookmarkEnd w:id="133"/>
-    <w:bookmarkStart w:id="134" w:name="ref-pfeffer_determinants_2017"/>
+    <w:bookmarkEnd w:id="137"/>
+    <w:bookmarkStart w:id="138" w:name="ref-pfeffer_determinants_2017"/>
     <w:p>
       <w:pPr>
         <w:pStyle w:val="Bibliography"/>
@@ -7943,8 +8015,8 @@
         <w:t xml:space="preserve">. PWIE. 2017;11(1):87–108.</w:t>
       </w:r>
     </w:p>
-    <w:bookmarkEnd w:id="134"/>
-    <w:bookmarkStart w:id="137" w:name="ref-corak_income_2013"/>
+    <w:bookmarkEnd w:id="138"/>
+    <w:bookmarkStart w:id="141" w:name="ref-corak_income_2013"/>
     <w:p>
       <w:pPr>
         <w:pStyle w:val="Bibliography"/>
@@ -8009,7 +8081,7 @@
       <w:r>
         <w:t xml:space="preserve"> </w:t>
       </w:r>
-      <w:hyperlink r:id="rId135">
+      <w:hyperlink r:id="rId139">
         <w:r>
           <w:rPr>
             <w:rStyle w:val="Hyperlink"/>
@@ -8020,7 +8092,7 @@
       <w:r>
         <w:t xml:space="preserve">. doi:</w:t>
       </w:r>
-      <w:hyperlink r:id="rId136">
+      <w:hyperlink r:id="rId140">
         <w:r>
           <w:rPr>
             <w:rStyle w:val="Hyperlink"/>
@@ -8029,8 +8101,8 @@
         </w:r>
       </w:hyperlink>
     </w:p>
-    <w:bookmarkEnd w:id="137"/>
-    <w:bookmarkStart w:id="139" w:name="ref-ermisch_parents_2012"/>
+    <w:bookmarkEnd w:id="141"/>
+    <w:bookmarkStart w:id="143" w:name="ref-ermisch_parents_2012"/>
     <w:p>
       <w:pPr>
         <w:pStyle w:val="Bibliography"/>
@@ -8104,7 +8176,7 @@
       <w:r>
         <w:t xml:space="preserve"> </w:t>
       </w:r>
-      <w:hyperlink r:id="rId138">
+      <w:hyperlink r:id="rId142">
         <w:r>
           <w:rPr>
             <w:rStyle w:val="Hyperlink"/>
@@ -8113,8 +8185,8 @@
         </w:r>
       </w:hyperlink>
     </w:p>
-    <w:bookmarkEnd w:id="139"/>
-    <w:bookmarkStart w:id="141" w:name="ref-jerrim_income_2015"/>
+    <w:bookmarkEnd w:id="143"/>
+    <w:bookmarkStart w:id="145" w:name="ref-jerrim_income_2015"/>
     <w:p>
       <w:pPr>
         <w:pStyle w:val="Bibliography"/>
@@ -8203,7 +8275,7 @@
       <w:r>
         <w:t xml:space="preserve">? Social Forces. 2015;94. doi:</w:t>
       </w:r>
-      <w:hyperlink r:id="rId140">
+      <w:hyperlink r:id="rId144">
         <w:r>
           <w:rPr>
             <w:rStyle w:val="Hyperlink"/>
@@ -8212,8 +8284,8 @@
         </w:r>
       </w:hyperlink>
     </w:p>
-    <w:bookmarkEnd w:id="141"/>
-    <w:bookmarkStart w:id="144" w:name="ref-si_multiple_2021"/>
+    <w:bookmarkEnd w:id="145"/>
+    <w:bookmarkStart w:id="148" w:name="ref-si_multiple_2021"/>
     <w:p>
       <w:pPr>
         <w:pStyle w:val="Bibliography"/>
@@ -8311,7 +8383,7 @@
       <w:r>
         <w:t xml:space="preserve"> </w:t>
       </w:r>
-      <w:hyperlink r:id="rId142">
+      <w:hyperlink r:id="rId146">
         <w:r>
           <w:rPr>
             <w:rStyle w:val="Hyperlink"/>
@@ -8322,7 +8394,7 @@
       <w:r>
         <w:t xml:space="preserve">. doi:</w:t>
       </w:r>
-      <w:hyperlink r:id="rId143">
+      <w:hyperlink r:id="rId147">
         <w:r>
           <w:rPr>
             <w:rStyle w:val="Hyperlink"/>
@@ -8331,8 +8403,8 @@
         </w:r>
       </w:hyperlink>
     </w:p>
-    <w:bookmarkEnd w:id="144"/>
-    <w:bookmarkStart w:id="145" w:name="ref-sayer_women_2004"/>
+    <w:bookmarkEnd w:id="148"/>
+    <w:bookmarkStart w:id="149" w:name="ref-sayer_women_2004"/>
     <w:p>
       <w:pPr>
         <w:pStyle w:val="Bibliography"/>
@@ -8368,8 +8440,8 @@
         <w:t xml:space="preserve">. Russell Sage Foundation; 2004.</w:t>
       </w:r>
     </w:p>
-    <w:bookmarkEnd w:id="145"/>
-    <w:bookmarkStart w:id="148" w:name="ref-atkinson_measurement_1970"/>
+    <w:bookmarkEnd w:id="149"/>
+    <w:bookmarkStart w:id="152" w:name="ref-atkinson_measurement_1970"/>
     <w:p>
       <w:pPr>
         <w:pStyle w:val="Bibliography"/>
@@ -8389,7 +8461,7 @@
       <w:r>
         <w:t xml:space="preserve"> </w:t>
       </w:r>
-      <w:hyperlink r:id="rId146">
+      <w:hyperlink r:id="rId150">
         <w:r>
           <w:rPr>
             <w:rStyle w:val="Hyperlink"/>
@@ -8400,7 +8472,7 @@
       <w:r>
         <w:t xml:space="preserve">. doi:</w:t>
       </w:r>
-      <w:hyperlink r:id="rId147">
+      <w:hyperlink r:id="rId151">
         <w:r>
           <w:rPr>
             <w:rStyle w:val="Hyperlink"/>
@@ -8409,8 +8481,8 @@
         </w:r>
       </w:hyperlink>
     </w:p>
-    <w:bookmarkEnd w:id="148"/>
-    <w:bookmarkStart w:id="151" w:name="ref-de_maio_income_2007"/>
+    <w:bookmarkEnd w:id="152"/>
+    <w:bookmarkStart w:id="155" w:name="ref-de_maio_income_2007"/>
     <w:p>
       <w:pPr>
         <w:pStyle w:val="Bibliography"/>
@@ -8445,7 +8517,7 @@
       <w:r>
         <w:t xml:space="preserve"> </w:t>
       </w:r>
-      <w:hyperlink r:id="rId149">
+      <w:hyperlink r:id="rId153">
         <w:r>
           <w:rPr>
             <w:rStyle w:val="Hyperlink"/>
@@ -8456,7 +8528,7 @@
       <w:r>
         <w:t xml:space="preserve">. doi:</w:t>
       </w:r>
-      <w:hyperlink r:id="rId150">
+      <w:hyperlink r:id="rId154">
         <w:r>
           <w:rPr>
             <w:rStyle w:val="Hyperlink"/>
@@ -8465,8 +8537,8 @@
         </w:r>
       </w:hyperlink>
     </w:p>
-    <w:bookmarkEnd w:id="151"/>
-    <w:bookmarkStart w:id="154" w:name="ref-kawachi_relationship_1997"/>
+    <w:bookmarkEnd w:id="155"/>
+    <w:bookmarkStart w:id="158" w:name="ref-kawachi_relationship_1997"/>
     <w:p>
       <w:pPr>
         <w:pStyle w:val="Bibliography"/>
@@ -8498,7 +8570,7 @@
       <w:r>
         <w:t xml:space="preserve"> </w:t>
       </w:r>
-      <w:hyperlink r:id="rId152">
+      <w:hyperlink r:id="rId156">
         <w:r>
           <w:rPr>
             <w:rStyle w:val="Hyperlink"/>
@@ -8509,7 +8581,7 @@
       <w:r>
         <w:t xml:space="preserve">. doi:</w:t>
       </w:r>
-      <w:hyperlink r:id="rId153">
+      <w:hyperlink r:id="rId157">
         <w:r>
           <w:rPr>
             <w:rStyle w:val="Hyperlink"/>
@@ -8518,8 +8590,8 @@
         </w:r>
       </w:hyperlink>
     </w:p>
-    <w:bookmarkEnd w:id="154"/>
-    <w:bookmarkStart w:id="157" w:name="ref-aaberge_ginis_2007"/>
+    <w:bookmarkEnd w:id="158"/>
+    <w:bookmarkStart w:id="161" w:name="ref-aaberge_ginis_2007"/>
     <w:p>
       <w:pPr>
         <w:pStyle w:val="Bibliography"/>
@@ -8539,7 +8611,7 @@
       <w:r>
         <w:t xml:space="preserve"> </w:t>
       </w:r>
-      <w:hyperlink r:id="rId155">
+      <w:hyperlink r:id="rId159">
         <w:r>
           <w:rPr>
             <w:rStyle w:val="Hyperlink"/>
@@ -8550,7 +8622,7 @@
       <w:r>
         <w:t xml:space="preserve">. doi:</w:t>
       </w:r>
-      <w:hyperlink r:id="rId156">
+      <w:hyperlink r:id="rId160">
         <w:r>
           <w:rPr>
             <w:rStyle w:val="Hyperlink"/>
@@ -8559,8 +8631,8 @@
         </w:r>
       </w:hyperlink>
     </w:p>
-    <w:bookmarkEnd w:id="157"/>
-    <w:bookmarkStart w:id="159" w:name="ref-noauthor_table_nodate"/>
+    <w:bookmarkEnd w:id="161"/>
+    <w:bookmarkStart w:id="163" w:name="ref-noauthor_table_nodate"/>
     <w:p>
       <w:pPr>
         <w:pStyle w:val="Bibliography"/>
@@ -8658,7 +8730,7 @@
       <w:r>
         <w:t xml:space="preserve"> </w:t>
       </w:r>
-      <w:hyperlink r:id="rId158">
+      <w:hyperlink r:id="rId162">
         <w:r>
           <w:rPr>
             <w:rStyle w:val="Hyperlink"/>
@@ -8667,8 +8739,8 @@
         </w:r>
       </w:hyperlink>
     </w:p>
-    <w:bookmarkEnd w:id="159"/>
-    <w:bookmarkStart w:id="160" w:name="ref-wolff_size_209"/>
+    <w:bookmarkEnd w:id="163"/>
+    <w:bookmarkStart w:id="164" w:name="ref-wolff_size_209"/>
     <w:p>
       <w:pPr>
         <w:pStyle w:val="Bibliography"/>
@@ -8827,8 +8899,8 @@
         <w:t xml:space="preserve">. Panel Study of Income Dynamics; 209 AD.</w:t>
       </w:r>
     </w:p>
-    <w:bookmarkEnd w:id="160"/>
-    <w:bookmarkStart w:id="162" w:name="ref-pfeffer_wealth_2013"/>
+    <w:bookmarkEnd w:id="164"/>
+    <w:bookmarkStart w:id="166" w:name="ref-pfeffer_wealth_2013"/>
     <w:p>
       <w:pPr>
         <w:pStyle w:val="Bibliography"/>
@@ -8872,7 +8944,7 @@
       <w:r>
         <w:t xml:space="preserve">. The Annals of the American Academy of Political and Social Science. 2013;650(1):98–123. doi:</w:t>
       </w:r>
-      <w:hyperlink r:id="rId161">
+      <w:hyperlink r:id="rId165">
         <w:r>
           <w:rPr>
             <w:rStyle w:val="Hyperlink"/>
@@ -8881,10 +8953,10 @@
         </w:r>
       </w:hyperlink>
     </w:p>
-    <w:bookmarkEnd w:id="162"/>
-    <w:bookmarkEnd w:id="163"/>
-    <w:bookmarkEnd w:id="164"/>
-    <w:bookmarkEnd w:id="165"/>
+    <w:bookmarkEnd w:id="166"/>
+    <w:bookmarkEnd w:id="167"/>
+    <w:bookmarkEnd w:id="168"/>
+    <w:bookmarkEnd w:id="169"/>
     <w:sectPr>
       <w:footnotePr>
         <w:numRestart w:val="eachSect"/>

</xml_diff>